<commit_message>
Docs Ana exclusivos: remover Andressa e marcar autorreflexão pendente
Documento único e capítulos só sobre Ana Karina. Autorreflexão ABCD
registrada como não submetida/não enviada ao PL em 28/08.

Co-authored-by: Jonatas Andrade <jonatasandradedeveloper@users.noreply.github.com>
</commit_message>
<xml_diff>
--- a/DOCS-PEOPLE-LEAD/Ana-Karina/00-Documento-Unico.docx
+++ b/DOCS-PEOPLE-LEAD/Ana-Karina/00-Documento-Unico.docx
@@ -266,7 +266,7 @@
                 <w:i w:val="0"/>
                 <w:sz w:val="22"/>
               </w:rPr>
-              <w:t>Ana: autorreflexão ABCD 28/08 · PL: ABCD Form até 11/09</w:t>
+              <w:t>Ana: autorreflexão ABCD 28/08 (não submetida) · PL: 11/09</w:t>
             </w:r>
           </w:p>
         </w:tc>
@@ -328,7 +328,7 @@
           <w:i w:val="0"/>
           <w:sz w:val="22"/>
         </w:rPr>
-        <w:t>Associate no BANCO BRADESCO (adm. 01/04/2026) com entrega em homologação, Copilot/agentes de IA como diferencial, inglês C1+ e AZ-900. Swift e AI-900 → FY27. Não promover neste FY; destaque qualitativo. Input PL no ABCD Form até 11/09/2026.</w:t>
+        <w:t>Associate no BANCO BRADESCO (adm. 01/04/2026) com entrega em homologação, Copilot/agentes de IA como diferencial, inglês C1+ e AZ-900. Swift e AI-900 → FY27. Autorreflexão ABCD: ainda não submetida (28/08). Input PL até 11/09/2026.</w:t>
       </w:r>
     </w:p>
     <w:p>
@@ -549,7 +549,21 @@
           <w:i w:val="0"/>
           <w:sz w:val="22"/>
         </w:rPr>
-        <w:t>Anexo — Orientação geral do December Cycle (CALL da prática)</w:t>
+        <w:t>14. Orientação do ciclo (Ana Karina)</w:t>
+      </w:r>
+    </w:p>
+    <w:p>
+      <w:pPr>
+        <w:spacing w:after="120"/>
+      </w:pPr>
+      <w:r>
+        <w:rPr>
+          <w:rFonts w:ascii="Calibri" w:hAnsi="Calibri" w:eastAsia="Calibri"/>
+          <w:b w:val="0"/>
+          <w:i w:val="0"/>
+          <w:sz w:val="22"/>
+        </w:rPr>
+        <w:t>14. Orientação do ciclo (Ana Karina)</w:t>
       </w:r>
     </w:p>
     <w:p>
@@ -1844,29 +1858,20 @@
             <w:r>
               <w:rPr>
                 <w:rFonts w:ascii="Calibri" w:hAnsi="Calibri" w:eastAsia="Calibri"/>
+                <w:b/>
+                <w:i w:val="0"/>
+                <w:sz w:val="20"/>
+              </w:rPr>
+              <w:t>Não submetida</w:t>
+            </w:r>
+            <w:r>
+              <w:rPr>
+                <w:rFonts w:ascii="Calibri" w:hAnsi="Calibri" w:eastAsia="Calibri"/>
                 <w:b w:val="0"/>
                 <w:i w:val="0"/>
                 <w:sz w:val="20"/>
               </w:rPr>
-              <w:t xml:space="preserve">Autorreflexão — prazo </w:t>
-            </w:r>
-            <w:r>
-              <w:rPr>
-                <w:rFonts w:ascii="Calibri" w:hAnsi="Calibri" w:eastAsia="Calibri"/>
-                <w:b/>
-                <w:i w:val="0"/>
-                <w:sz w:val="20"/>
-              </w:rPr>
-              <w:t>28/08</w:t>
-            </w:r>
-            <w:r>
-              <w:rPr>
-                <w:rFonts w:ascii="Calibri" w:hAnsi="Calibri" w:eastAsia="Calibri"/>
-                <w:b w:val="0"/>
-                <w:i w:val="0"/>
-                <w:sz w:val="20"/>
-              </w:rPr>
-              <w:t>; confirmar submissão</w:t>
+              <w:t xml:space="preserve"> — Ana ainda não enviou ao PL (prazo 28/08)</w:t>
             </w:r>
           </w:p>
         </w:tc>
@@ -2049,7 +2054,7 @@
           <w:color w:val="555555"/>
           <w:sz w:val="22"/>
         </w:rPr>
-        <w:t xml:space="preserve">Correção 24/08: cliente oficial é </w:t>
+        <w:t xml:space="preserve">Cliente oficial: </w:t>
       </w:r>
       <w:r>
         <w:rPr>
@@ -2069,7 +2074,7 @@
           <w:color w:val="555555"/>
           <w:sz w:val="22"/>
         </w:rPr>
-        <w:t>. Não confundir com Andressa Silva (MAPFRE).</w:t>
+        <w:t xml:space="preserve"> — app nativo Kotlin/Android.</w:t>
       </w:r>
     </w:p>
     <w:p>
@@ -2106,7 +2111,7 @@
           <w:i w:val="0"/>
           <w:sz w:val="22"/>
         </w:rPr>
-        <w:t xml:space="preserve"> na admissão oficial 01/04/2026; ~8 meses ref. dez/2026), ainda na faculdade, com energia alta e projeto que ela gosta no </w:t>
+        <w:t xml:space="preserve"> na admissão oficial 01/04/2026), ainda na faculdade, com energia alta e projeto que ela gosta no </w:t>
       </w:r>
       <w:r>
         <w:rPr>
@@ -2124,7 +2129,18 @@
           <w:i w:val="0"/>
           <w:sz w:val="22"/>
         </w:rPr>
-        <w:t xml:space="preserve">. O crescimento dela está </w:t>
+        <w:t>.</w:t>
+      </w:r>
+    </w:p>
+    <w:p>
+      <w:r>
+        <w:rPr>
+          <w:rFonts w:ascii="Calibri" w:hAnsi="Calibri" w:eastAsia="Calibri"/>
+          <w:b w:val="0"/>
+          <w:i w:val="0"/>
+          <w:sz w:val="22"/>
+        </w:rPr>
+        <w:t xml:space="preserve">O risco principal dela: </w:t>
       </w:r>
       <w:r>
         <w:rPr>
@@ -2133,28 +2149,19 @@
           <w:i w:val="0"/>
           <w:sz w:val="22"/>
         </w:rPr>
-        <w:t>colado no cliente</w:t>
-      </w:r>
-      <w:r>
-        <w:rPr>
-          <w:rFonts w:ascii="Calibri" w:hAnsi="Calibri" w:eastAsia="Calibri"/>
-          <w:b w:val="0"/>
-          <w:i w:val="0"/>
-          <w:sz w:val="22"/>
-        </w:rPr>
-        <w:t>: app novo, linguagem nova, Copilot, agentes, acessibilidade, custo de token. Isso é exatamente o que a CALL da prática pediu (Copilot skill, IA no dia a dia, case que agrega além do contrato).</w:t>
-      </w:r>
-    </w:p>
-    <w:p>
-      <w:r>
-        <w:rPr>
-          <w:rFonts w:ascii="Calibri" w:hAnsi="Calibri" w:eastAsia="Calibri"/>
-          <w:b w:val="0"/>
-          <w:i w:val="0"/>
-          <w:sz w:val="22"/>
-        </w:rPr>
-        <w:t xml:space="preserve">O risco dela é o oposto do da Andressa Silva: </w:t>
-      </w:r>
+        <w:t>prioridades demais, pouca meta de entrega</w:t>
+      </w:r>
+      <w:r>
+        <w:rPr>
+          <w:rFonts w:ascii="Calibri" w:hAnsi="Calibri" w:eastAsia="Calibri"/>
+          <w:b w:val="0"/>
+          <w:i w:val="0"/>
+          <w:sz w:val="22"/>
+        </w:rPr>
+        <w:t>. Sete prioridades diluem o ciclo. Inglês C1+ já é vitória — não pode continuar como prioridade de crescimento. Swift é aposta de FY27. Certificação de IA ela mesma adiou, com razão, por causa da faculdade e do cliente.</w:t>
+      </w:r>
+    </w:p>
+    <w:p>
       <w:r>
         <w:rPr>
           <w:rFonts w:ascii="Calibri" w:hAnsi="Calibri" w:eastAsia="Calibri"/>
@@ -2162,16 +2169,34 @@
           <w:i w:val="0"/>
           <w:sz w:val="22"/>
         </w:rPr>
-        <w:t>prioridades demais, pouca meta de entrega</w:t>
-      </w:r>
-      <w:r>
-        <w:rPr>
-          <w:rFonts w:ascii="Calibri" w:hAnsi="Calibri" w:eastAsia="Calibri"/>
-          <w:b w:val="0"/>
-          <w:i w:val="0"/>
-          <w:sz w:val="22"/>
-        </w:rPr>
-        <w:t>. Sete prioridades diluem o ciclo. Inglês C1+ já é vitória — não pode continuar como prioridade de crescimento. Swift é aposta de FY27. Certificação de IA ela mesma adiou, com razão, por causa da faculdade e do cliente.</w:t>
+        <w:t>Autorreflexão ABCD:</w:t>
+      </w:r>
+      <w:r>
+        <w:rPr>
+          <w:rFonts w:ascii="Calibri" w:hAnsi="Calibri" w:eastAsia="Calibri"/>
+          <w:b w:val="0"/>
+          <w:i w:val="0"/>
+          <w:sz w:val="22"/>
+        </w:rPr>
+        <w:t xml:space="preserve"> até 28/08 </w:t>
+      </w:r>
+      <w:r>
+        <w:rPr>
+          <w:rFonts w:ascii="Calibri" w:hAnsi="Calibri" w:eastAsia="Calibri"/>
+          <w:b/>
+          <w:i w:val="0"/>
+          <w:sz w:val="22"/>
+        </w:rPr>
+        <w:t>não recebida</w:t>
+      </w:r>
+      <w:r>
+        <w:rPr>
+          <w:rFonts w:ascii="Calibri" w:hAnsi="Calibri" w:eastAsia="Calibri"/>
+          <w:b w:val="0"/>
+          <w:i w:val="0"/>
+          <w:sz w:val="22"/>
+        </w:rPr>
+        <w:t xml:space="preserve"> pelo People Lead — cobrar envio/submissão no Workday.</w:t>
       </w:r>
     </w:p>
     <w:p>
@@ -3093,7 +3118,25 @@
           <w:i w:val="0"/>
           <w:sz w:val="22"/>
         </w:rPr>
-        <w:t>☐ Workday ABCD — confirmar se submeteu em 28/08</w:t>
+        <w:t xml:space="preserve">☐ Workday ABCD — </w:t>
+      </w:r>
+      <w:r>
+        <w:rPr>
+          <w:rFonts w:ascii="Calibri" w:hAnsi="Calibri" w:eastAsia="Calibri"/>
+          <w:b/>
+          <w:i w:val="0"/>
+          <w:sz w:val="22"/>
+        </w:rPr>
+        <w:t>não submetida / não enviada ao PL</w:t>
+      </w:r>
+      <w:r>
+        <w:rPr>
+          <w:rFonts w:ascii="Calibri" w:hAnsi="Calibri" w:eastAsia="Calibri"/>
+          <w:b w:val="0"/>
+          <w:i w:val="0"/>
+          <w:sz w:val="22"/>
+        </w:rPr>
+        <w:t xml:space="preserve"> (cobrar Ana)</w:t>
       </w:r>
     </w:p>
     <w:p>
@@ -4342,7 +4385,7 @@
           <w:i w:val="0"/>
           <w:sz w:val="22"/>
         </w:rPr>
-        <w:t>Está no projeto certo para o momento (energia oposta à da Andressa).</w:t>
+        <w:t>Está no projeto certo para o momento — energia alta no Bradesco.</w:t>
       </w:r>
     </w:p>
     <w:p>
@@ -5601,11 +5644,20 @@
             <w:r>
               <w:rPr>
                 <w:rFonts w:ascii="Calibri" w:hAnsi="Calibri" w:eastAsia="Calibri"/>
+                <w:b/>
+                <w:i w:val="0"/>
+                <w:sz w:val="20"/>
+              </w:rPr>
+              <w:t>Não submetida</w:t>
+            </w:r>
+            <w:r>
+              <w:rPr>
+                <w:rFonts w:ascii="Calibri" w:hAnsi="Calibri" w:eastAsia="Calibri"/>
                 <w:b w:val="0"/>
                 <w:i w:val="0"/>
                 <w:sz w:val="20"/>
               </w:rPr>
-              <w:t xml:space="preserve">Pendente na call; fazer </w:t>
+              <w:t xml:space="preserve"> — combinado na call #2 para 28/08; PL </w:t>
             </w:r>
             <w:r>
               <w:rPr>
@@ -5614,16 +5666,7 @@
                 <w:i w:val="0"/>
                 <w:sz w:val="20"/>
               </w:rPr>
-              <w:t>28/08</w:t>
-            </w:r>
-            <w:r>
-              <w:rPr>
-                <w:rFonts w:ascii="Calibri" w:hAnsi="Calibri" w:eastAsia="Calibri"/>
-                <w:b w:val="0"/>
-                <w:i w:val="0"/>
-                <w:sz w:val="20"/>
-              </w:rPr>
-              <w:t xml:space="preserve"> (4 prioridades)</w:t>
+              <w:t>ainda não recebeu</w:t>
             </w:r>
           </w:p>
         </w:tc>
@@ -6035,11 +6078,11 @@
             <w:r>
               <w:rPr>
                 <w:rFonts w:ascii="Calibri" w:hAnsi="Calibri" w:eastAsia="Calibri"/>
-                <w:b w:val="0"/>
-                <w:i w:val="0"/>
-                <w:sz w:val="20"/>
-              </w:rPr>
-              <w:t>28/08</w:t>
+                <w:b/>
+                <w:i w:val="0"/>
+                <w:sz w:val="20"/>
+              </w:rPr>
+              <w:t>Pendente — cobrar submissão</w:t>
             </w:r>
           </w:p>
         </w:tc>
@@ -7610,7 +7653,7 @@
           <w:i w:val="0"/>
           <w:sz w:val="22"/>
         </w:rPr>
-        <w:t xml:space="preserve">☐ Ana: concluir ABCD Reflections </w:t>
+        <w:t xml:space="preserve">☐ Ana: concluir e </w:t>
       </w:r>
       <w:r>
         <w:rPr>
@@ -7619,16 +7662,25 @@
           <w:i w:val="0"/>
           <w:sz w:val="22"/>
         </w:rPr>
-        <w:t>28/08</w:t>
-      </w:r>
-      <w:r>
-        <w:rPr>
-          <w:rFonts w:ascii="Calibri" w:hAnsi="Calibri" w:eastAsia="Calibri"/>
-          <w:b w:val="0"/>
-          <w:i w:val="0"/>
-          <w:sz w:val="22"/>
-        </w:rPr>
-        <w:t xml:space="preserve"> (4 prioridades)</w:t>
+        <w:t>submeter</w:t>
+      </w:r>
+      <w:r>
+        <w:rPr>
+          <w:rFonts w:ascii="Calibri" w:hAnsi="Calibri" w:eastAsia="Calibri"/>
+          <w:b w:val="0"/>
+          <w:i w:val="0"/>
+          <w:sz w:val="22"/>
+        </w:rPr>
+        <w:t xml:space="preserve"> ABCD Reflections no Workday (4 prioridades) — </w:t>
+      </w:r>
+      <w:r>
+        <w:rPr>
+          <w:rFonts w:ascii="Calibri" w:hAnsi="Calibri" w:eastAsia="Calibri"/>
+          <w:b/>
+          <w:i w:val="0"/>
+          <w:sz w:val="22"/>
+        </w:rPr>
+        <w:t>pendente; PL ainda não recebeu</w:t>
       </w:r>
     </w:p>
     <w:p>
@@ -8429,7 +8481,7 @@
           <w:i w:val="0"/>
           <w:sz w:val="22"/>
         </w:rPr>
-        <w:t>Energia oposta à da Andressa Silva: Ana Karina está no projeto certo para o momento.</w:t>
+        <w:t>Energia alta no projeto Bradesco — está no projeto certo para o momento.</w:t>
       </w:r>
     </w:p>
     <w:p>
@@ -9049,7 +9101,7 @@
                 <w:i w:val="0"/>
                 <w:sz w:val="20"/>
               </w:rPr>
-              <w:t>melhor prioridade das duas mentoradas</w:t>
+              <w:t>principal diferencial dela no ciclo</w:t>
             </w:r>
           </w:p>
         </w:tc>
@@ -12021,7 +12073,25 @@
                 <w:i w:val="0"/>
                 <w:sz w:val="20"/>
               </w:rPr>
-              <w:t>Workday ABCD (28/08); feedback Jessica; revisores</w:t>
+              <w:t xml:space="preserve">Workday ABCD — </w:t>
+            </w:r>
+            <w:r>
+              <w:rPr>
+                <w:rFonts w:ascii="Calibri" w:hAnsi="Calibri" w:eastAsia="Calibri"/>
+                <w:b/>
+                <w:i w:val="0"/>
+                <w:sz w:val="20"/>
+              </w:rPr>
+              <w:t>submissão pendente</w:t>
+            </w:r>
+            <w:r>
+              <w:rPr>
+                <w:rFonts w:ascii="Calibri" w:hAnsi="Calibri" w:eastAsia="Calibri"/>
+                <w:b w:val="0"/>
+                <w:i w:val="0"/>
+                <w:sz w:val="20"/>
+              </w:rPr>
+              <w:t>; feedback Jessica; revisores</w:t>
             </w:r>
           </w:p>
         </w:tc>
@@ -18821,7 +18891,25 @@
           <w:i w:val="0"/>
           <w:sz w:val="22"/>
         </w:rPr>
-        <w:t>☐ Self-review submetido (profissional — prazo 28/08)</w:t>
+        <w:t xml:space="preserve">☐ Self-review submetido — </w:t>
+      </w:r>
+      <w:r>
+        <w:rPr>
+          <w:rFonts w:ascii="Calibri" w:hAnsi="Calibri" w:eastAsia="Calibri"/>
+          <w:b/>
+          <w:i w:val="0"/>
+          <w:sz w:val="22"/>
+        </w:rPr>
+        <w:t>NÃO</w:t>
+      </w:r>
+      <w:r>
+        <w:rPr>
+          <w:rFonts w:ascii="Calibri" w:hAnsi="Calibri" w:eastAsia="Calibri"/>
+          <w:b w:val="0"/>
+          <w:i w:val="0"/>
+          <w:sz w:val="22"/>
+        </w:rPr>
+        <w:t xml:space="preserve"> (Ana ainda não enviou/submeteu ao PL)</w:t>
       </w:r>
     </w:p>
     <w:p>
@@ -19243,7 +19331,16 @@
           <w:i w:val="0"/>
           <w:sz w:val="22"/>
         </w:rPr>
-        <w:t>☐ Confirmar se Ana submeteu autorreflexão ABCD (28/08)</w:t>
+        <w:t xml:space="preserve">☐ Confirmar submissão da autorreflexão ABCD — </w:t>
+      </w:r>
+      <w:r>
+        <w:rPr>
+          <w:rFonts w:ascii="Calibri" w:hAnsi="Calibri" w:eastAsia="Calibri"/>
+          <w:b/>
+          <w:i w:val="0"/>
+          <w:sz w:val="22"/>
+        </w:rPr>
+        <w:t>não recebida do PL até 28/08</w:t>
       </w:r>
     </w:p>
     <w:p>
@@ -19377,7 +19474,7 @@
           <w:i w:val="0"/>
           <w:sz w:val="22"/>
         </w:rPr>
-        <w:t>☐ Concluir ABCD Reflections no Workday (</w:t>
+        <w:t xml:space="preserve">☐ </w:t>
       </w:r>
       <w:r>
         <w:rPr>
@@ -19386,16 +19483,25 @@
           <w:i w:val="0"/>
           <w:sz w:val="22"/>
         </w:rPr>
-        <w:t>28/08</w:t>
-      </w:r>
-      <w:r>
-        <w:rPr>
-          <w:rFonts w:ascii="Calibri" w:hAnsi="Calibri" w:eastAsia="Calibri"/>
-          <w:b w:val="0"/>
-          <w:i w:val="0"/>
-          <w:sz w:val="22"/>
-        </w:rPr>
-        <w:t xml:space="preserve"> — combinado na call #2)</w:t>
+        <w:t>Submeter</w:t>
+      </w:r>
+      <w:r>
+        <w:rPr>
+          <w:rFonts w:ascii="Calibri" w:hAnsi="Calibri" w:eastAsia="Calibri"/>
+          <w:b w:val="0"/>
+          <w:i w:val="0"/>
+          <w:sz w:val="22"/>
+        </w:rPr>
+        <w:t xml:space="preserve"> ABCD Reflections no Workday (4 prioridades) — </w:t>
+      </w:r>
+      <w:r>
+        <w:rPr>
+          <w:rFonts w:ascii="Calibri" w:hAnsi="Calibri" w:eastAsia="Calibri"/>
+          <w:b/>
+          <w:i w:val="0"/>
+          <w:sz w:val="22"/>
+        </w:rPr>
+        <w:t>PENDENTE; PL aguardando</w:t>
       </w:r>
     </w:p>
     <w:p>
@@ -20464,7 +20570,7 @@
                 <w:i w:val="0"/>
                 <w:sz w:val="20"/>
               </w:rPr>
-              <w:t>Autorreflexão ABCD (Priorities → Submeta e Refleta)</w:t>
+              <w:t>Autorreflexão ABCD</w:t>
             </w:r>
           </w:p>
         </w:tc>
@@ -20481,6 +20587,15 @@
             <w:r>
               <w:rPr>
                 <w:rFonts w:ascii="Calibri" w:hAnsi="Calibri" w:eastAsia="Calibri"/>
+                <w:b w:val="0"/>
+                <w:i w:val="0"/>
+                <w:sz w:val="20"/>
+              </w:rPr>
+              <w:t xml:space="preserve">Prazo </w:t>
+            </w:r>
+            <w:r>
+              <w:rPr>
+                <w:rFonts w:ascii="Calibri" w:hAnsi="Calibri" w:eastAsia="Calibri"/>
                 <w:b/>
                 <w:i w:val="0"/>
                 <w:sz w:val="20"/>
@@ -20494,7 +20609,16 @@
                 <w:i w:val="0"/>
                 <w:sz w:val="20"/>
               </w:rPr>
-              <w:t xml:space="preserve"> (prazo da prática para self-review)</w:t>
+              <w:t xml:space="preserve"> · </w:t>
+            </w:r>
+            <w:r>
+              <w:rPr>
+                <w:rFonts w:ascii="Calibri" w:hAnsi="Calibri" w:eastAsia="Calibri"/>
+                <w:b/>
+                <w:i w:val="0"/>
+                <w:sz w:val="20"/>
+              </w:rPr>
+              <w:t>Status: não submetida / PL não recebeu</w:t>
             </w:r>
           </w:p>
         </w:tc>
@@ -21965,7 +22089,25 @@
           <w:i w:val="0"/>
           <w:sz w:val="22"/>
         </w:rPr>
-        <w:t>☐ Ana concluiu autorreflexão ABCD (4 prioridades) — confirmar</w:t>
+        <w:t xml:space="preserve">☐ Ana submeteu autorreflexão ABCD — </w:t>
+      </w:r>
+      <w:r>
+        <w:rPr>
+          <w:rFonts w:ascii="Calibri" w:hAnsi="Calibri" w:eastAsia="Calibri"/>
+          <w:b/>
+          <w:i w:val="0"/>
+          <w:sz w:val="22"/>
+        </w:rPr>
+        <w:t>NÃO</w:t>
+      </w:r>
+      <w:r>
+        <w:rPr>
+          <w:rFonts w:ascii="Calibri" w:hAnsi="Calibri" w:eastAsia="Calibri"/>
+          <w:b w:val="0"/>
+          <w:i w:val="0"/>
+          <w:sz w:val="22"/>
+        </w:rPr>
+        <w:t xml:space="preserve"> (cobrar)</w:t>
       </w:r>
     </w:p>
     <w:p>
@@ -22146,6 +22288,51 @@
       </w:pPr>
       <w:r>
         <w:t>Prioridades FY26 + ABCD Reflections · prazo 28/08</w:t>
+      </w:r>
+    </w:p>
+    <w:p>
+      <w:pPr>
+        <w:ind w:left="425"/>
+      </w:pPr>
+      <w:r>
+        <w:rPr>
+          <w:rFonts w:ascii="Calibri" w:hAnsi="Calibri" w:eastAsia="Calibri"/>
+          <w:b/>
+          <w:i w:val="0"/>
+          <w:color w:val="555555"/>
+          <w:sz w:val="22"/>
+        </w:rPr>
+        <w:t>Status:</w:t>
+      </w:r>
+      <w:r>
+        <w:rPr>
+          <w:rFonts w:ascii="Calibri" w:hAnsi="Calibri" w:eastAsia="Calibri"/>
+          <w:b w:val="0"/>
+          <w:i/>
+          <w:color w:val="555555"/>
+          <w:sz w:val="22"/>
+        </w:rPr>
+        <w:t xml:space="preserve"> autorreflexão </w:t>
+      </w:r>
+      <w:r>
+        <w:rPr>
+          <w:rFonts w:ascii="Calibri" w:hAnsi="Calibri" w:eastAsia="Calibri"/>
+          <w:b/>
+          <w:i w:val="0"/>
+          <w:color w:val="555555"/>
+          <w:sz w:val="22"/>
+        </w:rPr>
+        <w:t>não submetida</w:t>
+      </w:r>
+      <w:r>
+        <w:rPr>
+          <w:rFonts w:ascii="Calibri" w:hAnsi="Calibri" w:eastAsia="Calibri"/>
+          <w:b w:val="0"/>
+          <w:i/>
+          <w:color w:val="555555"/>
+          <w:sz w:val="22"/>
+        </w:rPr>
+        <w:t xml:space="preserve"> — Ana ainda não enviou ao People Lead.</w:t>
       </w:r>
     </w:p>
     <w:p>
@@ -24216,61 +24403,68 @@
       </w:r>
     </w:p>
     <w:p>
-      <w:r>
-        <w:rPr>
-          <w:rFonts w:ascii="Calibri" w:hAnsi="Calibri" w:eastAsia="Calibri"/>
-          <w:b w:val="0"/>
-          <w:i w:val="0"/>
-          <w:sz w:val="22"/>
-        </w:rPr>
-        <w:t>Use junto com o resumo da call e o doc de prioridades.</w:t>
-      </w:r>
-    </w:p>
-    <w:p>
-      <w:r>
-        <w:rPr>
-          <w:rFonts w:ascii="Calibri" w:hAnsi="Calibri" w:eastAsia="Calibri"/>
-          <w:b w:val="0"/>
-          <w:i w:val="0"/>
-          <w:sz w:val="22"/>
-        </w:rPr>
-        <w:t xml:space="preserve">Aqui está </w:t>
-      </w:r>
+      <w:pPr>
+        <w:ind w:left="425"/>
+      </w:pPr>
       <w:r>
         <w:rPr>
           <w:rFonts w:ascii="Calibri" w:hAnsi="Calibri" w:eastAsia="Calibri"/>
           <w:b/>
           <w:i w:val="0"/>
-          <w:sz w:val="22"/>
-        </w:rPr>
-        <w:t>só o caminho na tela</w:t>
-      </w:r>
-      <w:r>
-        <w:rPr>
-          <w:rFonts w:ascii="Calibri" w:hAnsi="Calibri" w:eastAsia="Calibri"/>
-          <w:b w:val="0"/>
-          <w:i w:val="0"/>
-          <w:sz w:val="22"/>
-        </w:rPr>
-        <w:t xml:space="preserve"> + textos para colar na </w:t>
+          <w:color w:val="555555"/>
+          <w:sz w:val="22"/>
+        </w:rPr>
+        <w:t>Status (28/08):</w:t>
+      </w:r>
+      <w:r>
+        <w:rPr>
+          <w:rFonts w:ascii="Calibri" w:hAnsi="Calibri" w:eastAsia="Calibri"/>
+          <w:b w:val="0"/>
+          <w:i/>
+          <w:color w:val="555555"/>
+          <w:sz w:val="22"/>
+        </w:rPr>
+        <w:t xml:space="preserve"> Ana </w:t>
       </w:r>
       <w:r>
         <w:rPr>
           <w:rFonts w:ascii="Calibri" w:hAnsi="Calibri" w:eastAsia="Calibri"/>
           <w:b/>
           <w:i w:val="0"/>
-          <w:sz w:val="22"/>
-        </w:rPr>
-        <w:t>Autorreflexão</w:t>
-      </w:r>
-      <w:r>
-        <w:rPr>
-          <w:rFonts w:ascii="Calibri" w:hAnsi="Calibri" w:eastAsia="Calibri"/>
-          <w:b w:val="0"/>
-          <w:i w:val="0"/>
-          <w:sz w:val="22"/>
-        </w:rPr>
-        <w:t>.</w:t>
+          <w:color w:val="555555"/>
+          <w:sz w:val="22"/>
+        </w:rPr>
+        <w:t>ainda não submeteu</w:t>
+      </w:r>
+      <w:r>
+        <w:rPr>
+          <w:rFonts w:ascii="Calibri" w:hAnsi="Calibri" w:eastAsia="Calibri"/>
+          <w:b w:val="0"/>
+          <w:i/>
+          <w:color w:val="555555"/>
+          <w:sz w:val="22"/>
+        </w:rPr>
+        <w:t xml:space="preserve"> a autorreflexão no Workday e </w:t>
+      </w:r>
+      <w:r>
+        <w:rPr>
+          <w:rFonts w:ascii="Calibri" w:hAnsi="Calibri" w:eastAsia="Calibri"/>
+          <w:b/>
+          <w:i w:val="0"/>
+          <w:color w:val="555555"/>
+          <w:sz w:val="22"/>
+        </w:rPr>
+        <w:t>não enviou</w:t>
+      </w:r>
+      <w:r>
+        <w:rPr>
+          <w:rFonts w:ascii="Calibri" w:hAnsi="Calibri" w:eastAsia="Calibri"/>
+          <w:b w:val="0"/>
+          <w:i/>
+          <w:color w:val="555555"/>
+          <w:sz w:val="22"/>
+        </w:rPr>
+        <w:t xml:space="preserve"> ao People Lead.   Este doc é o guia para ela preencher — textos prontos abaixo.</w:t>
       </w:r>
     </w:p>
     <w:p>
@@ -25805,7 +25999,7 @@
           <w:color w:val="555555"/>
           <w:sz w:val="22"/>
         </w:rPr>
-        <w:t xml:space="preserve"> leia a autoavaliação da Ana + feedback de </w:t>
+        <w:t xml:space="preserve"> rascunho baseado nas </w:t>
       </w:r>
       <w:r>
         <w:rPr>
@@ -25815,7 +26009,7 @@
           <w:color w:val="555555"/>
           <w:sz w:val="22"/>
         </w:rPr>
-        <w:t>Rafael Coloda</w:t>
+        <w:t>1:1s</w:t>
       </w:r>
       <w:r>
         <w:rPr>
@@ -25825,7 +26019,7 @@
           <w:color w:val="555555"/>
           <w:sz w:val="22"/>
         </w:rPr>
-        <w:t xml:space="preserve"> e </w:t>
+        <w:t xml:space="preserve"> (jul/ago). A </w:t>
       </w:r>
       <w:r>
         <w:rPr>
@@ -25835,7 +26029,7 @@
           <w:color w:val="555555"/>
           <w:sz w:val="22"/>
         </w:rPr>
-        <w:t>Jessica</w:t>
+        <w:t>autorreflexão da Ana ainda não foi submetida/enviada</w:t>
       </w:r>
       <w:r>
         <w:rPr>
@@ -25845,7 +26039,7 @@
           <w:color w:val="555555"/>
           <w:sz w:val="22"/>
         </w:rPr>
-        <w:t xml:space="preserve"> antes de colar.   Troque </w:t>
+        <w:t xml:space="preserve"> — quando chegar, cruzar e ajustar.   Troque </w:t>
       </w:r>
       <w:r>
         <w:rPr>
@@ -25865,7 +26059,7 @@
           <w:color w:val="555555"/>
           <w:sz w:val="22"/>
         </w:rPr>
-        <w:t xml:space="preserve"> por citações reais quando os feedbacks chegarem.   Tom: você representa ela na prática — firme, honesto, com evidência.</w:t>
+        <w:t xml:space="preserve"> por citações reais quando os feedbacks chegarem.</w:t>
       </w:r>
     </w:p>
     <w:p>
@@ -28926,29 +29120,20 @@
       <w:r>
         <w:rPr>
           <w:rFonts w:ascii="Calibri" w:hAnsi="Calibri" w:eastAsia="Calibri"/>
-          <w:b w:val="0"/>
-          <w:i w:val="0"/>
-          <w:sz w:val="22"/>
-        </w:rPr>
-        <w:t xml:space="preserve">A autoavaliação da Ana Karina é </w:t>
-      </w:r>
-      <w:r>
-        <w:rPr>
-          <w:rFonts w:ascii="Calibri" w:hAnsi="Calibri" w:eastAsia="Calibri"/>
           <w:b/>
           <w:i w:val="0"/>
           <w:sz w:val="22"/>
         </w:rPr>
-        <w:t>coerente</w:t>
-      </w:r>
-      <w:r>
-        <w:rPr>
-          <w:rFonts w:ascii="Calibri" w:hAnsi="Calibri" w:eastAsia="Calibri"/>
-          <w:b w:val="0"/>
-          <w:i w:val="0"/>
-          <w:sz w:val="22"/>
-        </w:rPr>
-        <w:t xml:space="preserve"> com o acompanhamento do People Lead nas 1:1s de 28/07 e 28/08. O PL </w:t>
+        <w:t>Pendente:</w:t>
+      </w:r>
+      <w:r>
+        <w:rPr>
+          <w:rFonts w:ascii="Calibri" w:hAnsi="Calibri" w:eastAsia="Calibri"/>
+          <w:b w:val="0"/>
+          <w:i w:val="0"/>
+          <w:sz w:val="22"/>
+        </w:rPr>
+        <w:t xml:space="preserve"> Ana Karina </w:t>
       </w:r>
       <w:r>
         <w:rPr>
@@ -28957,16 +29142,16 @@
           <w:i w:val="0"/>
           <w:sz w:val="22"/>
         </w:rPr>
-        <w:t>valida</w:t>
-      </w:r>
-      <w:r>
-        <w:rPr>
-          <w:rFonts w:ascii="Calibri" w:hAnsi="Calibri" w:eastAsia="Calibri"/>
-          <w:b w:val="0"/>
-          <w:i w:val="0"/>
-          <w:sz w:val="22"/>
-        </w:rPr>
-        <w:t xml:space="preserve"> entrega no cliente, IA aplicada e inglês C1+; </w:t>
+        <w:t>ainda não submeteu</w:t>
+      </w:r>
+      <w:r>
+        <w:rPr>
+          <w:rFonts w:ascii="Calibri" w:hAnsi="Calibri" w:eastAsia="Calibri"/>
+          <w:b w:val="0"/>
+          <w:i w:val="0"/>
+          <w:sz w:val="22"/>
+        </w:rPr>
+        <w:t xml:space="preserve"> a autorreflexão ABCD no Workday (28/08). Este rascunho do PL baseia-se nas </w:t>
       </w:r>
       <w:r>
         <w:rPr>
@@ -28975,16 +29160,45 @@
           <w:i w:val="0"/>
           <w:sz w:val="22"/>
         </w:rPr>
-        <w:t>ajusta expectativa</w:t>
-      </w:r>
-      <w:r>
-        <w:rPr>
-          <w:rFonts w:ascii="Calibri" w:hAnsi="Calibri" w:eastAsia="Calibri"/>
-          <w:b w:val="0"/>
-          <w:i w:val="0"/>
-          <w:sz w:val="22"/>
-        </w:rPr>
-        <w:t xml:space="preserve"> em Swift/voluntariado para FY27 sem reduzir o mérito do conjunto.</w:t>
+        <w:t>1:1s de 28/07 e 28/08</w:t>
+      </w:r>
+      <w:r>
+        <w:rPr>
+          <w:rFonts w:ascii="Calibri" w:hAnsi="Calibri" w:eastAsia="Calibri"/>
+          <w:b w:val="0"/>
+          <w:i w:val="0"/>
+          <w:sz w:val="22"/>
+        </w:rPr>
+        <w:t xml:space="preserve">. Quando ela submeter, revisar alinhamento e ajustar comentários antes do input de </w:t>
+      </w:r>
+      <w:r>
+        <w:rPr>
+          <w:rFonts w:ascii="Calibri" w:hAnsi="Calibri" w:eastAsia="Calibri"/>
+          <w:b/>
+          <w:i w:val="0"/>
+          <w:sz w:val="22"/>
+        </w:rPr>
+        <w:t>11/09</w:t>
+      </w:r>
+      <w:r>
+        <w:rPr>
+          <w:rFonts w:ascii="Calibri" w:hAnsi="Calibri" w:eastAsia="Calibri"/>
+          <w:b w:val="0"/>
+          <w:i w:val="0"/>
+          <w:sz w:val="22"/>
+        </w:rPr>
+        <w:t>.</w:t>
+      </w:r>
+    </w:p>
+    <w:p>
+      <w:r>
+        <w:rPr>
+          <w:rFonts w:ascii="Calibri" w:hAnsi="Calibri" w:eastAsia="Calibri"/>
+          <w:b w:val="0"/>
+          <w:i w:val="0"/>
+          <w:sz w:val="22"/>
+        </w:rPr>
+        <w:t>Expectativa prévia: autoavaliação coerente com o acompanhamento (entrega no cliente, IA aplicada, inglês C1+; Swift/voluntariado honestos para FY27).</w:t>
       </w:r>
     </w:p>
     <w:p>
@@ -29163,7 +29377,48 @@
           <w:i w:val="0"/>
           <w:sz w:val="22"/>
         </w:rPr>
-        <w:t>☐ Li a autoavaliação ABCD da Ana (4 prioridades)</w:t>
+        <w:t xml:space="preserve">☐ Ana </w:t>
+      </w:r>
+      <w:r>
+        <w:rPr>
+          <w:rFonts w:ascii="Calibri" w:hAnsi="Calibri" w:eastAsia="Calibri"/>
+          <w:b/>
+          <w:i w:val="0"/>
+          <w:sz w:val="22"/>
+        </w:rPr>
+        <w:t>submeteu</w:t>
+      </w:r>
+      <w:r>
+        <w:rPr>
+          <w:rFonts w:ascii="Calibri" w:hAnsi="Calibri" w:eastAsia="Calibri"/>
+          <w:b w:val="0"/>
+          <w:i w:val="0"/>
+          <w:sz w:val="22"/>
+        </w:rPr>
+        <w:t xml:space="preserve"> autorreflexão ABCD no Workday — </w:t>
+      </w:r>
+      <w:r>
+        <w:rPr>
+          <w:rFonts w:ascii="Calibri" w:hAnsi="Calibri" w:eastAsia="Calibri"/>
+          <w:b/>
+          <w:i w:val="0"/>
+          <w:sz w:val="22"/>
+        </w:rPr>
+        <w:t>NÃO (28/08) — cobrar</w:t>
+      </w:r>
+    </w:p>
+    <w:p>
+      <w:pPr>
+        <w:pStyle w:val="ListBullet"/>
+      </w:pPr>
+      <w:r>
+        <w:rPr>
+          <w:rFonts w:ascii="Calibri" w:hAnsi="Calibri" w:eastAsia="Calibri"/>
+          <w:b w:val="0"/>
+          <w:i w:val="0"/>
+          <w:sz w:val="22"/>
+        </w:rPr>
+        <w:t>☐ Quando submeter: ler e cruzar com este rascunho</w:t>
       </w:r>
     </w:p>
     <w:p>
@@ -29383,53 +29638,36 @@
         <w:pStyle w:val="Heading1"/>
       </w:pPr>
       <w:r>
-        <w:t>Anexo — Orientação geral do December Cycle</w:t>
-      </w:r>
-    </w:p>
-    <w:p>
-      <w:r>
-        <w:rPr>
-          <w:rFonts w:ascii="Calibri" w:hAnsi="Calibri" w:eastAsia="Calibri"/>
-          <w:b w:val="0"/>
-          <w:i w:val="0"/>
-          <w:sz w:val="22"/>
-        </w:rPr>
-        <w:t>Fonte: CALL geral da prática (Software / AI). Usar como bússola nas 1:1s, na autoavaliação e no plano de carreira.</w:t>
-      </w:r>
-    </w:p>
-    <w:p>
-      <w:pPr>
-        <w:ind w:left="425"/>
-      </w:pPr>
-      <w:r>
-        <w:rPr>
-          <w:rFonts w:ascii="Calibri" w:hAnsi="Calibri" w:eastAsia="Calibri"/>
-          <w:b w:val="0"/>
-          <w:i/>
-          <w:color w:val="555555"/>
-          <w:sz w:val="22"/>
-        </w:rPr>
-        <w:t xml:space="preserve">O processo que antes se chamava Year-End agora se chama </w:t>
+        <w:t>14. Orientação do ciclo (Ana Karina)</w:t>
+      </w:r>
+    </w:p>
+    <w:p>
+      <w:r>
+        <w:rPr>
+          <w:rFonts w:ascii="Calibri" w:hAnsi="Calibri" w:eastAsia="Calibri"/>
+          <w:b w:val="0"/>
+          <w:i w:val="0"/>
+          <w:sz w:val="22"/>
+        </w:rPr>
+        <w:t xml:space="preserve">Resumo do processo aplicável à </w:t>
       </w:r>
       <w:r>
         <w:rPr>
           <w:rFonts w:ascii="Calibri" w:hAnsi="Calibri" w:eastAsia="Calibri"/>
           <w:b/>
           <w:i w:val="0"/>
-          <w:color w:val="555555"/>
-          <w:sz w:val="22"/>
-        </w:rPr>
-        <w:t>December Cycle</w:t>
-      </w:r>
-      <w:r>
-        <w:rPr>
-          <w:rFonts w:ascii="Calibri" w:hAnsi="Calibri" w:eastAsia="Calibri"/>
-          <w:b w:val="0"/>
-          <w:i/>
-          <w:color w:val="555555"/>
-          <w:sz w:val="22"/>
-        </w:rPr>
-        <w:t>, para alinhar o discurso com a Accenture.</w:t>
+          <w:sz w:val="22"/>
+        </w:rPr>
+        <w:t>Ana Karina</w:t>
+      </w:r>
+      <w:r>
+        <w:rPr>
+          <w:rFonts w:ascii="Calibri" w:hAnsi="Calibri" w:eastAsia="Calibri"/>
+          <w:b w:val="0"/>
+          <w:i w:val="0"/>
+          <w:sz w:val="22"/>
+        </w:rPr>
+        <w:t xml:space="preserve"> no BANCO BRADESCO.</w:t>
       </w:r>
     </w:p>
     <w:p>
@@ -29437,18 +29675,7 @@
         <w:pStyle w:val="Heading3"/>
       </w:pPr>
       <w:r>
-        <w:t>Calendário (datas de referência)</w:t>
-      </w:r>
-    </w:p>
-    <w:p>
-      <w:r>
-        <w:rPr>
-          <w:rFonts w:ascii="Calibri" w:hAnsi="Calibri" w:eastAsia="Calibri"/>
-          <w:b w:val="0"/>
-          <w:i w:val="0"/>
-          <w:sz w:val="22"/>
-        </w:rPr>
-        <w:t>Datas ainda serão precisadas pelo Talent. Tratar os marcos abaixo como janela, não como dia fechado.</w:t>
+        <w:t>Prazos</w:t>
       </w:r>
     </w:p>
     <w:tbl>
@@ -29484,7 +29711,7 @@
                 <w:color w:val="FFFFFF"/>
                 <w:sz w:val="20"/>
               </w:rPr>
-              <w:t>Quando</w:t>
+              <w:t>Quem</w:t>
             </w:r>
           </w:p>
         </w:tc>
@@ -29509,7 +29736,7 @@
                 <w:color w:val="FFFFFF"/>
                 <w:sz w:val="20"/>
               </w:rPr>
-              <w:t>Etapa</w:t>
+              <w:t>O quê</w:t>
             </w:r>
           </w:p>
         </w:tc>
@@ -29534,7 +29761,7 @@
                 <w:color w:val="FFFFFF"/>
                 <w:sz w:val="20"/>
               </w:rPr>
-              <w:t>O que acontece</w:t>
+              <w:t>Prazo</w:t>
             </w:r>
           </w:p>
         </w:tc>
@@ -29557,7 +29784,7 @@
                 <w:i w:val="0"/>
                 <w:sz w:val="20"/>
               </w:rPr>
-              <w:t>Final de julho / início de agosto</w:t>
+              <w:t>Ana Karina</w:t>
             </w:r>
           </w:p>
         </w:tc>
@@ -29578,7 +29805,7 @@
                 <w:i w:val="0"/>
                 <w:sz w:val="20"/>
               </w:rPr>
-              <w:t>Prework</w:t>
+              <w:t>Autorreflexão ABCD (Priorities → Submeta e Refleta)</w:t>
             </w:r>
           </w:p>
         </w:tc>
@@ -29595,11 +29822,11 @@
             <w:r>
               <w:rPr>
                 <w:rFonts w:ascii="Calibri" w:hAnsi="Calibri" w:eastAsia="Calibri"/>
-                <w:b w:val="0"/>
-                <w:i w:val="0"/>
-                <w:sz w:val="20"/>
-              </w:rPr>
-              <w:t>Projetos preparam calibração das avaliações e última alocação</w:t>
+                <w:b/>
+                <w:i w:val="0"/>
+                <w:sz w:val="20"/>
+              </w:rPr>
+              <w:t>28/08/2026</w:t>
             </w:r>
           </w:p>
         </w:tc>
@@ -29623,7 +29850,7 @@
                 <w:i w:val="0"/>
                 <w:sz w:val="20"/>
               </w:rPr>
-              <w:t>Início de agosto</w:t>
+              <w:t>People Lead (Jônatas)</w:t>
             </w:r>
           </w:p>
         </w:tc>
@@ -29645,7 +29872,25 @@
                 <w:i w:val="0"/>
                 <w:sz w:val="20"/>
               </w:rPr>
-              <w:t>Checkpoint People Leads</w:t>
+              <w:t xml:space="preserve">Input </w:t>
+            </w:r>
+            <w:r>
+              <w:rPr>
+                <w:rFonts w:ascii="Calibri" w:hAnsi="Calibri" w:eastAsia="Calibri"/>
+                <w:b/>
+                <w:i w:val="0"/>
+                <w:sz w:val="20"/>
+              </w:rPr>
+              <w:t>ABCD Form</w:t>
+            </w:r>
+            <w:r>
+              <w:rPr>
+                <w:rFonts w:ascii="Calibri" w:hAnsi="Calibri" w:eastAsia="Calibri"/>
+                <w:b w:val="0"/>
+                <w:i w:val="0"/>
+                <w:sz w:val="20"/>
+              </w:rPr>
+              <w:t xml:space="preserve"> no Workday</w:t>
             </w:r>
           </w:p>
         </w:tc>
@@ -29663,11 +29908,11 @@
             <w:r>
               <w:rPr>
                 <w:rFonts w:ascii="Calibri" w:hAnsi="Calibri" w:eastAsia="Calibri"/>
-                <w:b w:val="0"/>
-                <w:i w:val="0"/>
-                <w:sz w:val="20"/>
-              </w:rPr>
-              <w:t>Agenda e regras das próximas etapas</w:t>
+                <w:b/>
+                <w:i w:val="0"/>
+                <w:sz w:val="20"/>
+              </w:rPr>
+              <w:t>Até 11/09/2026</w:t>
             </w:r>
           </w:p>
         </w:tc>
@@ -29690,7 +29935,7 @@
                 <w:i w:val="0"/>
                 <w:sz w:val="20"/>
               </w:rPr>
-              <w:t>Início / meados de setembro</w:t>
+              <w:t>Talent</w:t>
             </w:r>
           </w:p>
         </w:tc>
@@ -29711,7 +29956,7 @@
                 <w:i w:val="0"/>
                 <w:sz w:val="20"/>
               </w:rPr>
-              <w:t>Avaliação no sistema</w:t>
+              <w:t>Talent Discussions (Practice Lead + VPs)</w:t>
             </w:r>
           </w:p>
         </w:tc>
@@ -29732,368 +29977,7 @@
                 <w:i w:val="0"/>
                 <w:sz w:val="20"/>
               </w:rPr>
-              <w:t>People Leads imputam avaliações no Workday (</w:t>
-            </w:r>
-            <w:r>
-              <w:rPr>
-                <w:rFonts w:ascii="Calibri" w:hAnsi="Calibri" w:eastAsia="Calibri"/>
-                <w:b/>
-                <w:i w:val="0"/>
-                <w:sz w:val="20"/>
-              </w:rPr>
-              <w:t>prazo máximo: 11/09</w:t>
-            </w:r>
-            <w:r>
-              <w:rPr>
-                <w:rFonts w:ascii="Calibri" w:hAnsi="Calibri" w:eastAsia="Calibri"/>
-                <w:b w:val="0"/>
-                <w:i w:val="0"/>
-                <w:sz w:val="20"/>
-              </w:rPr>
-              <w:t xml:space="preserve"> — confirmado Talent para Ana Karina)</w:t>
-            </w:r>
-          </w:p>
-        </w:tc>
-      </w:tr>
-      <w:tr>
-        <w:tc>
-          <w:tcPr>
-            <w:tcW w:type="dxa" w:w="3249"/>
-            <w:shd w:fill="F3F6FA" w:val="clear"/>
-          </w:tcPr>
-          <w:p>
-            <w:r>
-              <w:rPr>
-                <w:sz w:val="20"/>
-              </w:rPr>
-            </w:r>
-            <w:r>
-              <w:rPr>
-                <w:rFonts w:ascii="Calibri" w:hAnsi="Calibri" w:eastAsia="Calibri"/>
-                <w:b w:val="0"/>
-                <w:i w:val="0"/>
-                <w:sz w:val="20"/>
-              </w:rPr>
               <w:t>Após 11/09</w:t>
-            </w:r>
-          </w:p>
-        </w:tc>
-        <w:tc>
-          <w:tcPr>
-            <w:tcW w:type="dxa" w:w="3249"/>
-            <w:shd w:fill="F3F6FA" w:val="clear"/>
-          </w:tcPr>
-          <w:p>
-            <w:r>
-              <w:rPr>
-                <w:sz w:val="20"/>
-              </w:rPr>
-            </w:r>
-            <w:r>
-              <w:rPr>
-                <w:rFonts w:ascii="Calibri" w:hAnsi="Calibri" w:eastAsia="Calibri"/>
-                <w:b w:val="0"/>
-                <w:i w:val="0"/>
-                <w:sz w:val="20"/>
-              </w:rPr>
-              <w:t>Talent Discussions</w:t>
-            </w:r>
-          </w:p>
-        </w:tc>
-        <w:tc>
-          <w:tcPr>
-            <w:tcW w:type="dxa" w:w="3249"/>
-            <w:shd w:fill="F3F6FA" w:val="clear"/>
-          </w:tcPr>
-          <w:p>
-            <w:r>
-              <w:rPr>
-                <w:sz w:val="20"/>
-              </w:rPr>
-            </w:r>
-            <w:r>
-              <w:rPr>
-                <w:rFonts w:ascii="Calibri" w:hAnsi="Calibri" w:eastAsia="Calibri"/>
-                <w:b w:val="0"/>
-                <w:i w:val="0"/>
-                <w:sz w:val="20"/>
-              </w:rPr>
-              <w:t xml:space="preserve">Practice Lead + VPs discutem inputs; podem haver </w:t>
-            </w:r>
-            <w:r>
-              <w:rPr>
-                <w:rFonts w:ascii="Calibri" w:hAnsi="Calibri" w:eastAsia="Calibri"/>
-                <w:b/>
-                <w:i w:val="0"/>
-                <w:sz w:val="20"/>
-              </w:rPr>
-              <w:t>ajustes</w:t>
-            </w:r>
-          </w:p>
-        </w:tc>
-      </w:tr>
-      <w:tr>
-        <w:tc>
-          <w:tcPr>
-            <w:tcW w:type="dxa" w:w="3249"/>
-          </w:tcPr>
-          <w:p>
-            <w:r>
-              <w:rPr>
-                <w:sz w:val="20"/>
-              </w:rPr>
-            </w:r>
-            <w:r>
-              <w:rPr>
-                <w:rFonts w:ascii="Calibri" w:hAnsi="Calibri" w:eastAsia="Calibri"/>
-                <w:b w:val="0"/>
-                <w:i w:val="0"/>
-                <w:sz w:val="20"/>
-              </w:rPr>
-              <w:t>Meados de setembro</w:t>
-            </w:r>
-          </w:p>
-        </w:tc>
-        <w:tc>
-          <w:tcPr>
-            <w:tcW w:type="dxa" w:w="3249"/>
-          </w:tcPr>
-          <w:p>
-            <w:r>
-              <w:rPr>
-                <w:sz w:val="20"/>
-              </w:rPr>
-            </w:r>
-            <w:r>
-              <w:rPr>
-                <w:rFonts w:ascii="Calibri" w:hAnsi="Calibri" w:eastAsia="Calibri"/>
-                <w:b w:val="0"/>
-                <w:i w:val="0"/>
-                <w:sz w:val="20"/>
-              </w:rPr>
-              <w:t>Calibração das práticas</w:t>
-            </w:r>
-          </w:p>
-        </w:tc>
-        <w:tc>
-          <w:tcPr>
-            <w:tcW w:type="dxa" w:w="3249"/>
-          </w:tcPr>
-          <w:p>
-            <w:r>
-              <w:rPr>
-                <w:sz w:val="20"/>
-              </w:rPr>
-            </w:r>
-            <w:r>
-              <w:rPr>
-                <w:rFonts w:ascii="Calibri" w:hAnsi="Calibri" w:eastAsia="Calibri"/>
-                <w:b w:val="0"/>
-                <w:i w:val="0"/>
-                <w:sz w:val="20"/>
-              </w:rPr>
-              <w:t>Talent Leads marcam quem está pronto para o próximo nível e fecham avaliações de todo mundo</w:t>
-            </w:r>
-          </w:p>
-        </w:tc>
-      </w:tr>
-      <w:tr>
-        <w:tc>
-          <w:tcPr>
-            <w:tcW w:type="dxa" w:w="3249"/>
-            <w:shd w:fill="F3F6FA" w:val="clear"/>
-          </w:tcPr>
-          <w:p>
-            <w:r>
-              <w:rPr>
-                <w:sz w:val="20"/>
-              </w:rPr>
-            </w:r>
-            <w:r>
-              <w:rPr>
-                <w:rFonts w:ascii="Calibri" w:hAnsi="Calibri" w:eastAsia="Calibri"/>
-                <w:b w:val="0"/>
-                <w:i w:val="0"/>
-                <w:sz w:val="20"/>
-              </w:rPr>
-              <w:t>Outubro</w:t>
-            </w:r>
-          </w:p>
-        </w:tc>
-        <w:tc>
-          <w:tcPr>
-            <w:tcW w:type="dxa" w:w="3249"/>
-            <w:shd w:fill="F3F6FA" w:val="clear"/>
-          </w:tcPr>
-          <w:p>
-            <w:r>
-              <w:rPr>
-                <w:sz w:val="20"/>
-              </w:rPr>
-            </w:r>
-            <w:r>
-              <w:rPr>
-                <w:rFonts w:ascii="Calibri" w:hAnsi="Calibri" w:eastAsia="Calibri"/>
-                <w:b w:val="0"/>
-                <w:i w:val="0"/>
-                <w:sz w:val="20"/>
-              </w:rPr>
-              <w:t>Rewards</w:t>
-            </w:r>
-          </w:p>
-        </w:tc>
-        <w:tc>
-          <w:tcPr>
-            <w:tcW w:type="dxa" w:w="3249"/>
-            <w:shd w:fill="F3F6FA" w:val="clear"/>
-          </w:tcPr>
-          <w:p>
-            <w:r>
-              <w:rPr>
-                <w:sz w:val="20"/>
-              </w:rPr>
-            </w:r>
-            <w:r>
-              <w:rPr>
-                <w:rFonts w:ascii="Calibri" w:hAnsi="Calibri" w:eastAsia="Calibri"/>
-                <w:b w:val="0"/>
-                <w:i w:val="0"/>
-                <w:sz w:val="20"/>
-              </w:rPr>
-              <w:t>Distribuição de % de promoção, mérito (se houver) e PPR</w:t>
-            </w:r>
-          </w:p>
-        </w:tc>
-      </w:tr>
-      <w:tr>
-        <w:tc>
-          <w:tcPr>
-            <w:tcW w:type="dxa" w:w="3249"/>
-          </w:tcPr>
-          <w:p>
-            <w:r>
-              <w:rPr>
-                <w:sz w:val="20"/>
-              </w:rPr>
-            </w:r>
-            <w:r>
-              <w:rPr>
-                <w:rFonts w:ascii="Calibri" w:hAnsi="Calibri" w:eastAsia="Calibri"/>
-                <w:b w:val="0"/>
-                <w:i w:val="0"/>
-                <w:sz w:val="20"/>
-              </w:rPr>
-              <w:t>Início de novembro</w:t>
-            </w:r>
-          </w:p>
-        </w:tc>
-        <w:tc>
-          <w:tcPr>
-            <w:tcW w:type="dxa" w:w="3249"/>
-          </w:tcPr>
-          <w:p>
-            <w:r>
-              <w:rPr>
-                <w:sz w:val="20"/>
-              </w:rPr>
-            </w:r>
-            <w:r>
-              <w:rPr>
-                <w:rFonts w:ascii="Calibri" w:hAnsi="Calibri" w:eastAsia="Calibri"/>
-                <w:b w:val="0"/>
-                <w:i w:val="0"/>
-                <w:sz w:val="20"/>
-              </w:rPr>
-              <w:t>Divulgação</w:t>
-            </w:r>
-          </w:p>
-        </w:tc>
-        <w:tc>
-          <w:tcPr>
-            <w:tcW w:type="dxa" w:w="3249"/>
-          </w:tcPr>
-          <w:p>
-            <w:r>
-              <w:rPr>
-                <w:sz w:val="20"/>
-              </w:rPr>
-            </w:r>
-            <w:r>
-              <w:rPr>
-                <w:rFonts w:ascii="Calibri" w:hAnsi="Calibri" w:eastAsia="Calibri"/>
-                <w:b w:val="0"/>
-                <w:i w:val="0"/>
-                <w:sz w:val="20"/>
-              </w:rPr>
-              <w:t>Resultados para os profissionais; PLs marcam reunião de feedback</w:t>
-            </w:r>
-          </w:p>
-        </w:tc>
-      </w:tr>
-      <w:tr>
-        <w:tc>
-          <w:tcPr>
-            <w:tcW w:type="dxa" w:w="3249"/>
-            <w:shd w:fill="F3F6FA" w:val="clear"/>
-          </w:tcPr>
-          <w:p>
-            <w:r>
-              <w:rPr>
-                <w:sz w:val="20"/>
-              </w:rPr>
-            </w:r>
-            <w:r>
-              <w:rPr>
-                <w:rFonts w:ascii="Calibri" w:hAnsi="Calibri" w:eastAsia="Calibri"/>
-                <w:b w:val="0"/>
-                <w:i w:val="0"/>
-                <w:sz w:val="20"/>
-              </w:rPr>
-              <w:t>Início / meados de dezembro</w:t>
-            </w:r>
-          </w:p>
-        </w:tc>
-        <w:tc>
-          <w:tcPr>
-            <w:tcW w:type="dxa" w:w="3249"/>
-            <w:shd w:fill="F3F6FA" w:val="clear"/>
-          </w:tcPr>
-          <w:p>
-            <w:r>
-              <w:rPr>
-                <w:sz w:val="20"/>
-              </w:rPr>
-            </w:r>
-            <w:r>
-              <w:rPr>
-                <w:rFonts w:ascii="Calibri" w:hAnsi="Calibri" w:eastAsia="Calibri"/>
-                <w:b w:val="0"/>
-                <w:i w:val="0"/>
-                <w:sz w:val="20"/>
-              </w:rPr>
-              <w:t>Efetivação</w:t>
-            </w:r>
-          </w:p>
-        </w:tc>
-        <w:tc>
-          <w:tcPr>
-            <w:tcW w:type="dxa" w:w="3249"/>
-            <w:shd w:fill="F3F6FA" w:val="clear"/>
-          </w:tcPr>
-          <w:p>
-            <w:r>
-              <w:rPr>
-                <w:sz w:val="20"/>
-              </w:rPr>
-            </w:r>
-            <w:r>
-              <w:rPr>
-                <w:rFonts w:ascii="Calibri" w:hAnsi="Calibri" w:eastAsia="Calibri"/>
-                <w:b w:val="0"/>
-                <w:i w:val="0"/>
-                <w:sz w:val="20"/>
-              </w:rPr>
-              <w:t>Promoções, méritos e PPR entram em vigor</w:t>
             </w:r>
           </w:p>
         </w:tc>
@@ -30108,16 +29992,16 @@
           <w:i w:val="0"/>
           <w:sz w:val="22"/>
         </w:rPr>
-        <w:t>Hoje (28/08/2026):</w:t>
-      </w:r>
-      <w:r>
-        <w:rPr>
-          <w:rFonts w:ascii="Calibri" w:hAnsi="Calibri" w:eastAsia="Calibri"/>
-          <w:b w:val="0"/>
-          <w:i w:val="0"/>
-          <w:sz w:val="22"/>
-        </w:rPr>
-        <w:t xml:space="preserve"> prazo da autorreflexão do profissional (28/08). Input do People Lead no ABCD Form até </w:t>
+        <w:t>Status autorreflexão (28/08):</w:t>
+      </w:r>
+      <w:r>
+        <w:rPr>
+          <w:rFonts w:ascii="Calibri" w:hAnsi="Calibri" w:eastAsia="Calibri"/>
+          <w:b w:val="0"/>
+          <w:i w:val="0"/>
+          <w:sz w:val="22"/>
+        </w:rPr>
+        <w:t xml:space="preserve"> Ana </w:t>
       </w:r>
       <w:r>
         <w:rPr>
@@ -30126,16 +30010,16 @@
           <w:i w:val="0"/>
           <w:sz w:val="22"/>
         </w:rPr>
-        <w:t>11/09</w:t>
-      </w:r>
-      <w:r>
-        <w:rPr>
-          <w:rFonts w:ascii="Calibri" w:hAnsi="Calibri" w:eastAsia="Calibri"/>
-          <w:b w:val="0"/>
-          <w:i w:val="0"/>
-          <w:sz w:val="22"/>
-        </w:rPr>
-        <w:t>. Talent Discussions em seguida.</w:t>
+        <w:t>ainda não enviou / não submeteu</w:t>
+      </w:r>
+      <w:r>
+        <w:rPr>
+          <w:rFonts w:ascii="Calibri" w:hAnsi="Calibri" w:eastAsia="Calibri"/>
+          <w:b w:val="0"/>
+          <w:i w:val="0"/>
+          <w:sz w:val="22"/>
+        </w:rPr>
+        <w:t xml:space="preserve"> — PL aguardando.</w:t>
       </w:r>
     </w:p>
     <w:p>
@@ -30143,15 +30027,7 @@
         <w:pStyle w:val="Heading3"/>
       </w:pPr>
       <w:r>
-        <w:t>Papel de cada um</w:t>
-      </w:r>
-    </w:p>
-    <w:p>
-      <w:pPr>
-        <w:pStyle w:val="Heading3"/>
-      </w:pPr>
-      <w:r>
-        <w:t>Profissional (Andressa Silva — MAPFRE; Ana Karina — BANCO BRADESCO)</w:t>
+        <w:t>Papel da Ana neste ciclo</w:t>
       </w:r>
     </w:p>
     <w:p>
@@ -30161,20 +30037,11 @@
       <w:r>
         <w:rPr>
           <w:rFonts w:ascii="Calibri" w:hAnsi="Calibri" w:eastAsia="Calibri"/>
-          <w:b/>
-          <w:i w:val="0"/>
-          <w:sz w:val="22"/>
-        </w:rPr>
-        <w:t>Fechar as prioridades</w:t>
-      </w:r>
-      <w:r>
-        <w:rPr>
-          <w:rFonts w:ascii="Calibri" w:hAnsi="Calibri" w:eastAsia="Calibri"/>
-          <w:b w:val="0"/>
-          <w:i w:val="0"/>
-          <w:sz w:val="22"/>
-        </w:rPr>
-        <w:t xml:space="preserve"> definidas no início do FY. Não reescrever a história: refletir o que entregou, o que faltou e o que ficou em 100%.</w:t>
+          <w:b w:val="0"/>
+          <w:i w:val="0"/>
+          <w:sz w:val="22"/>
+        </w:rPr>
+        <w:t>Fechar prioridades FY26 com autoavaliação honesta no Workday.</w:t>
       </w:r>
     </w:p>
     <w:p>
@@ -30184,20 +30051,11 @@
       <w:r>
         <w:rPr>
           <w:rFonts w:ascii="Calibri" w:hAnsi="Calibri" w:eastAsia="Calibri"/>
-          <w:b/>
-          <w:i w:val="0"/>
-          <w:sz w:val="22"/>
-        </w:rPr>
-        <w:t>Fazer autoavaliação / self-reflection no Workday.</w:t>
-      </w:r>
-      <w:r>
-        <w:rPr>
-          <w:rFonts w:ascii="Calibri" w:hAnsi="Calibri" w:eastAsia="Calibri"/>
-          <w:b w:val="0"/>
-          <w:i w:val="0"/>
-          <w:sz w:val="22"/>
-        </w:rPr>
-        <w:t xml:space="preserve"> Quem não escreve some na calibração da prática.</w:t>
+          <w:b w:val="0"/>
+          <w:i w:val="0"/>
+          <w:sz w:val="22"/>
+        </w:rPr>
+        <w:t>Escolher revisores e pedir feedback (Rafael Coloda, Jessica).</w:t>
       </w:r>
     </w:p>
     <w:p>
@@ -30207,20 +30065,11 @@
       <w:r>
         <w:rPr>
           <w:rFonts w:ascii="Calibri" w:hAnsi="Calibri" w:eastAsia="Calibri"/>
-          <w:b/>
-          <w:i w:val="0"/>
-          <w:sz w:val="22"/>
-        </w:rPr>
-        <w:t>Escolher revisores</w:t>
-      </w:r>
-      <w:r>
-        <w:rPr>
-          <w:rFonts w:ascii="Calibri" w:hAnsi="Calibri" w:eastAsia="Calibri"/>
-          <w:b w:val="0"/>
-          <w:i w:val="0"/>
-          <w:sz w:val="22"/>
-        </w:rPr>
-        <w:t xml:space="preserve"> e conversar com eles. Levar o que fez em cada prioridade.</w:t>
+          <w:b w:val="0"/>
+          <w:i w:val="0"/>
+          <w:sz w:val="22"/>
+        </w:rPr>
+        <w:t>Conversar com o People Lead — trazer insumos para a representação na prática.</w:t>
       </w:r>
     </w:p>
     <w:p>
@@ -30230,95 +30079,11 @@
       <w:r>
         <w:rPr>
           <w:rFonts w:ascii="Calibri" w:hAnsi="Calibri" w:eastAsia="Calibri"/>
-          <w:b/>
-          <w:i w:val="0"/>
-          <w:sz w:val="22"/>
-        </w:rPr>
-        <w:t>Conversar com o People Lead agora.</w:t>
-      </w:r>
-      <w:r>
-        <w:rPr>
-          <w:rFonts w:ascii="Calibri" w:hAnsi="Calibri" w:eastAsia="Calibri"/>
-          <w:b w:val="0"/>
-          <w:i w:val="0"/>
-          <w:sz w:val="22"/>
-        </w:rPr>
-        <w:t xml:space="preserve"> O PL precisa dos insumos da autoavaliação para representar a pessoa na prática.</w:t>
-      </w:r>
-    </w:p>
-    <w:p>
-      <w:pPr>
-        <w:pStyle w:val="ListNumber"/>
-      </w:pPr>
-      <w:r>
-        <w:rPr>
-          <w:rFonts w:ascii="Calibri" w:hAnsi="Calibri" w:eastAsia="Calibri"/>
-          <w:b/>
-          <w:i w:val="0"/>
-          <w:sz w:val="22"/>
-        </w:rPr>
-        <w:t>Pedir feedback</w:t>
-      </w:r>
-      <w:r>
-        <w:rPr>
-          <w:rFonts w:ascii="Calibri" w:hAnsi="Calibri" w:eastAsia="Calibri"/>
-          <w:b w:val="0"/>
-          <w:i w:val="0"/>
-          <w:sz w:val="22"/>
-        </w:rPr>
-        <w:t xml:space="preserve"> de projeto, pares e cliente. Se não couber na ferramenta, salvar em arquivo e compartilhar com líder de projeto e People Lead.</w:t>
-      </w:r>
-    </w:p>
-    <w:p>
-      <w:pPr>
-        <w:pStyle w:val="ListNumber"/>
-      </w:pPr>
-      <w:r>
-        <w:rPr>
-          <w:rFonts w:ascii="Calibri" w:hAnsi="Calibri" w:eastAsia="Calibri"/>
-          <w:b/>
-          <w:i w:val="0"/>
-          <w:sz w:val="22"/>
-        </w:rPr>
-        <w:t>Manter compliance zerado</w:t>
-      </w:r>
-      <w:r>
-        <w:rPr>
-          <w:rFonts w:ascii="Calibri" w:hAnsi="Calibri" w:eastAsia="Calibri"/>
-          <w:b w:val="0"/>
-          <w:i w:val="0"/>
-          <w:sz w:val="22"/>
-        </w:rPr>
-        <w:t xml:space="preserve">, mini CV atualizado e skill de Copilot preenchido. Treinamento obrigatório </w:t>
-      </w:r>
-      <w:r>
-        <w:rPr>
-          <w:rFonts w:ascii="Calibri" w:hAnsi="Calibri" w:eastAsia="Calibri"/>
-          <w:b/>
-          <w:i w:val="0"/>
-          <w:sz w:val="22"/>
-        </w:rPr>
-        <w:t>não é negociável</w:t>
-      </w:r>
-      <w:r>
-        <w:rPr>
-          <w:rFonts w:ascii="Calibri" w:hAnsi="Calibri" w:eastAsia="Calibri"/>
-          <w:b w:val="0"/>
-          <w:i w:val="0"/>
-          <w:sz w:val="22"/>
-        </w:rPr>
-        <w:t xml:space="preserve"> e pode afetar bônus.</w:t>
-      </w:r>
-    </w:p>
-    <w:p>
-      <w:r>
-        <w:rPr>
-          <w:rFonts w:ascii="Calibri" w:hAnsi="Calibri" w:eastAsia="Calibri"/>
-          <w:b w:val="0"/>
-          <w:i w:val="0"/>
-          <w:sz w:val="22"/>
-        </w:rPr>
-        <w:t>Frase da CALL para usar na 1:1:</w:t>
+          <w:b w:val="0"/>
+          <w:i w:val="0"/>
+          <w:sz w:val="22"/>
+        </w:rPr>
+        <w:t>Manter compliance, mini CV e skill Copilot atualizados.</w:t>
       </w:r>
     </w:p>
     <w:p>
@@ -30333,7 +30098,7 @@
           <w:color w:val="555555"/>
           <w:sz w:val="22"/>
         </w:rPr>
-        <w:t>Você vai ser o seu próprio advogado neste momento, levando insumos para o People Lead. O People Lead vai ser o seu representante junto ao líder da prática.</w:t>
+        <w:t>Você é a advogada da própria performance. O People Lead representa você na calibração.</w:t>
       </w:r>
     </w:p>
     <w:p>
@@ -30341,7 +30106,7 @@
         <w:pStyle w:val="Heading3"/>
       </w:pPr>
       <w:r>
-        <w:t>People Lead (você)</w:t>
+        <w:t>Papel do People Lead</w:t>
       </w:r>
     </w:p>
     <w:p>
@@ -30355,7 +30120,7 @@
           <w:i w:val="0"/>
           <w:sz w:val="22"/>
         </w:rPr>
-        <w:t>Alinhar objetivos e expectativas.</w:t>
+        <w:t>Apoiar carreira e fechamento do Workday.</w:t>
       </w:r>
     </w:p>
     <w:p>
@@ -30369,7 +30134,25 @@
           <w:i w:val="0"/>
           <w:sz w:val="22"/>
         </w:rPr>
-        <w:t>Apoiar o crescimento de carreira.</w:t>
+        <w:t xml:space="preserve">Input no ABCD Form até </w:t>
+      </w:r>
+      <w:r>
+        <w:rPr>
+          <w:rFonts w:ascii="Calibri" w:hAnsi="Calibri" w:eastAsia="Calibri"/>
+          <w:b/>
+          <w:i w:val="0"/>
+          <w:sz w:val="22"/>
+        </w:rPr>
+        <w:t>11/09</w:t>
+      </w:r>
+      <w:r>
+        <w:rPr>
+          <w:rFonts w:ascii="Calibri" w:hAnsi="Calibri" w:eastAsia="Calibri"/>
+          <w:b w:val="0"/>
+          <w:i w:val="0"/>
+          <w:sz w:val="22"/>
+        </w:rPr>
+        <w:t xml:space="preserve"> com evidência (1:1s + feedback projeto).</w:t>
       </w:r>
     </w:p>
     <w:p>
@@ -30383,7 +30166,34 @@
           <w:i w:val="0"/>
           <w:sz w:val="22"/>
         </w:rPr>
-        <w:t>Avaliar no sistema, com evidência — não só com percepção da 1:1.</w:t>
+        <w:t xml:space="preserve">Quando a autorreflexão chegar, cruzar com o rascunho em </w:t>
+      </w:r>
+      <w:r>
+        <w:rPr>
+          <w:rFonts w:ascii="Consolas" w:hAnsi="Consolas" w:eastAsia="Consolas"/>
+          <w:b w:val="0"/>
+          <w:i w:val="0"/>
+          <w:color w:val="333333"/>
+          <w:sz w:val="18"/>
+        </w:rPr>
+        <w:t>12-abcd-form-people-lead-rascunho.md</w:t>
+      </w:r>
+      <w:r>
+        <w:rPr>
+          <w:rFonts w:ascii="Calibri" w:hAnsi="Calibri" w:eastAsia="Calibri"/>
+          <w:b w:val="0"/>
+          <w:i w:val="0"/>
+          <w:sz w:val="22"/>
+        </w:rPr>
+        <w:t>.</w:t>
+      </w:r>
+    </w:p>
+    <w:p>
+      <w:pPr>
+        <w:pStyle w:val="Heading3"/>
+      </w:pPr>
+      <w:r>
+        <w:t>Contatos</w:t>
       </w:r>
     </w:p>
     <w:p>
@@ -30397,7 +30207,25 @@
           <w:i w:val="0"/>
           <w:sz w:val="22"/>
         </w:rPr>
-        <w:t>Levar para o líder da prática: atuação, performance e questões comportamentais.</w:t>
+        <w:t xml:space="preserve">Gestor projeto: </w:t>
+      </w:r>
+      <w:r>
+        <w:rPr>
+          <w:rFonts w:ascii="Calibri" w:hAnsi="Calibri" w:eastAsia="Calibri"/>
+          <w:b/>
+          <w:i w:val="0"/>
+          <w:sz w:val="22"/>
+        </w:rPr>
+        <w:t>Rafael Coloda</w:t>
+      </w:r>
+      <w:r>
+        <w:rPr>
+          <w:rFonts w:ascii="Calibri" w:hAnsi="Calibri" w:eastAsia="Calibri"/>
+          <w:b w:val="0"/>
+          <w:i w:val="0"/>
+          <w:sz w:val="22"/>
+        </w:rPr>
+        <w:t xml:space="preserve"> — rafael.coloda@avanade.com</w:t>
       </w:r>
     </w:p>
     <w:p>
@@ -30411,7 +30239,7 @@
           <w:i w:val="0"/>
           <w:sz w:val="22"/>
         </w:rPr>
-        <w:t>Dar o feedback final de como foi o FY26.</w:t>
+        <w:t>HRBP: Cristiane Gennari · Cezar Pontalti</w:t>
       </w:r>
     </w:p>
     <w:p>
@@ -30425,937 +30253,7 @@
           <w:i w:val="0"/>
           <w:sz w:val="22"/>
         </w:rPr>
-        <w:t>Aprovar férias no ADP (mínimo 35 dias de antecedência).</w:t>
-      </w:r>
-    </w:p>
-    <w:p>
-      <w:pPr>
-        <w:pStyle w:val="Heading3"/>
-      </w:pPr>
-      <w:r>
-        <w:t>Talent / prática</w:t>
-      </w:r>
-    </w:p>
-    <w:p>
-      <w:r>
-        <w:rPr>
-          <w:rFonts w:ascii="Calibri" w:hAnsi="Calibri" w:eastAsia="Calibri"/>
-          <w:b w:val="0"/>
-          <w:i w:val="0"/>
-          <w:sz w:val="22"/>
-        </w:rPr>
-        <w:t>Refinam o que vem do projeto, do profissional e do People Lead. Decidem promoção, mérito e próximo nível com critérios do ciclo — não só com vontade da pessoa ou do PL.</w:t>
-      </w:r>
-    </w:p>
-    <w:p>
-      <w:pPr>
-        <w:pStyle w:val="Heading3"/>
-      </w:pPr>
-      <w:r>
-        <w:t>O que a CALL pediu além de avaliação</w:t>
-      </w:r>
-    </w:p>
-    <w:p>
-      <w:r>
-        <w:rPr>
-          <w:rFonts w:ascii="Calibri" w:hAnsi="Calibri" w:eastAsia="Calibri"/>
-          <w:b w:val="0"/>
-          <w:i w:val="0"/>
-          <w:sz w:val="22"/>
-        </w:rPr>
-        <w:t>Estes itens entram no checklist de cada pessoa porque a prática usa isso na mobilização e no fechamento.</w:t>
-      </w:r>
-    </w:p>
-    <w:tbl>
-      <w:tblPr>
-        <w:tblStyle w:val="TableGrid"/>
-        <w:tblW w:type="auto" w:w="0"/>
-        <w:tblLook w:firstColumn="1" w:firstRow="1" w:lastColumn="0" w:lastRow="0" w:noHBand="0" w:noVBand="1" w:val="04A0"/>
-      </w:tblPr>
-      <w:tblGrid>
-        <w:gridCol w:w="3249"/>
-        <w:gridCol w:w="3249"/>
-        <w:gridCol w:w="3249"/>
-      </w:tblGrid>
-      <w:tr>
-        <w:tc>
-          <w:tcPr>
-            <w:tcW w:type="dxa" w:w="3249"/>
-            <w:shd w:fill="1F3A5F" w:val="clear"/>
-          </w:tcPr>
-          <w:p>
-            <w:r>
-              <w:rPr>
-                <w:b/>
-                <w:color w:val="FFFFFF"/>
-                <w:sz w:val="20"/>
-              </w:rPr>
-            </w:r>
-            <w:r>
-              <w:rPr>
-                <w:rFonts w:ascii="Calibri" w:hAnsi="Calibri" w:eastAsia="Calibri"/>
-                <w:b/>
-                <w:i w:val="0"/>
-                <w:color w:val="FFFFFF"/>
-                <w:sz w:val="20"/>
-              </w:rPr>
-              <w:t>Tema</w:t>
-            </w:r>
-          </w:p>
-        </w:tc>
-        <w:tc>
-          <w:tcPr>
-            <w:tcW w:type="dxa" w:w="3249"/>
-            <w:shd w:fill="1F3A5F" w:val="clear"/>
-          </w:tcPr>
-          <w:p>
-            <w:r>
-              <w:rPr>
-                <w:b/>
-                <w:color w:val="FFFFFF"/>
-                <w:sz w:val="20"/>
-              </w:rPr>
-            </w:r>
-            <w:r>
-              <w:rPr>
-                <w:rFonts w:ascii="Calibri" w:hAnsi="Calibri" w:eastAsia="Calibri"/>
-                <w:b/>
-                <w:i w:val="0"/>
-                <w:color w:val="FFFFFF"/>
-                <w:sz w:val="20"/>
-              </w:rPr>
-              <w:t>Recado</w:t>
-            </w:r>
-          </w:p>
-        </w:tc>
-        <w:tc>
-          <w:tcPr>
-            <w:tcW w:type="dxa" w:w="3249"/>
-            <w:shd w:fill="1F3A5F" w:val="clear"/>
-          </w:tcPr>
-          <w:p>
-            <w:r>
-              <w:rPr>
-                <w:b/>
-                <w:color w:val="FFFFFF"/>
-                <w:sz w:val="20"/>
-              </w:rPr>
-            </w:r>
-            <w:r>
-              <w:rPr>
-                <w:rFonts w:ascii="Calibri" w:hAnsi="Calibri" w:eastAsia="Calibri"/>
-                <w:b/>
-                <w:i w:val="0"/>
-                <w:color w:val="FFFFFF"/>
-                <w:sz w:val="20"/>
-              </w:rPr>
-              <w:t>Como usar no acompanhamento</w:t>
-            </w:r>
-          </w:p>
-        </w:tc>
-      </w:tr>
-      <w:tr>
-        <w:tc>
-          <w:tcPr>
-            <w:tcW w:type="dxa" w:w="3249"/>
-          </w:tcPr>
-          <w:p>
-            <w:r>
-              <w:rPr>
-                <w:sz w:val="20"/>
-              </w:rPr>
-            </w:r>
-            <w:r>
-              <w:rPr>
-                <w:rFonts w:ascii="Calibri" w:hAnsi="Calibri" w:eastAsia="Calibri"/>
-                <w:b w:val="0"/>
-                <w:i w:val="0"/>
-                <w:sz w:val="20"/>
-              </w:rPr>
-              <w:t>Workday</w:t>
-            </w:r>
-          </w:p>
-        </w:tc>
-        <w:tc>
-          <w:tcPr>
-            <w:tcW w:type="dxa" w:w="3249"/>
-          </w:tcPr>
-          <w:p>
-            <w:r>
-              <w:rPr>
-                <w:sz w:val="20"/>
-              </w:rPr>
-            </w:r>
-            <w:r>
-              <w:rPr>
-                <w:rFonts w:ascii="Calibri" w:hAnsi="Calibri" w:eastAsia="Calibri"/>
-                <w:b w:val="0"/>
-                <w:i w:val="0"/>
-                <w:sz w:val="20"/>
-              </w:rPr>
-              <w:t>Não deixar avaliação vazia</w:t>
-            </w:r>
-          </w:p>
-        </w:tc>
-        <w:tc>
-          <w:tcPr>
-            <w:tcW w:type="dxa" w:w="3249"/>
-          </w:tcPr>
-          <w:p>
-            <w:r>
-              <w:rPr>
-                <w:sz w:val="20"/>
-              </w:rPr>
-            </w:r>
-            <w:r>
-              <w:rPr>
-                <w:rFonts w:ascii="Calibri" w:hAnsi="Calibri" w:eastAsia="Calibri"/>
-                <w:b w:val="0"/>
-                <w:i w:val="0"/>
-                <w:sz w:val="20"/>
-              </w:rPr>
-              <w:t>Conferir se prioridades + self-review estão preenchidos</w:t>
-            </w:r>
-          </w:p>
-        </w:tc>
-      </w:tr>
-      <w:tr>
-        <w:tc>
-          <w:tcPr>
-            <w:tcW w:type="dxa" w:w="3249"/>
-            <w:shd w:fill="F3F6FA" w:val="clear"/>
-          </w:tcPr>
-          <w:p>
-            <w:r>
-              <w:rPr>
-                <w:sz w:val="20"/>
-              </w:rPr>
-            </w:r>
-            <w:r>
-              <w:rPr>
-                <w:rFonts w:ascii="Calibri" w:hAnsi="Calibri" w:eastAsia="Calibri"/>
-                <w:b w:val="0"/>
-                <w:i w:val="0"/>
-                <w:sz w:val="20"/>
-              </w:rPr>
-              <w:t>Mini CV</w:t>
-            </w:r>
-          </w:p>
-        </w:tc>
-        <w:tc>
-          <w:tcPr>
-            <w:tcW w:type="dxa" w:w="3249"/>
-            <w:shd w:fill="F3F6FA" w:val="clear"/>
-          </w:tcPr>
-          <w:p>
-            <w:r>
-              <w:rPr>
-                <w:sz w:val="20"/>
-              </w:rPr>
-            </w:r>
-            <w:r>
-              <w:rPr>
-                <w:rFonts w:ascii="Calibri" w:hAnsi="Calibri" w:eastAsia="Calibri"/>
-                <w:b w:val="0"/>
-                <w:i w:val="0"/>
-                <w:sz w:val="20"/>
-              </w:rPr>
-              <w:t>Visibilidade para alocação</w:t>
-            </w:r>
-          </w:p>
-        </w:tc>
-        <w:tc>
-          <w:tcPr>
-            <w:tcW w:type="dxa" w:w="3249"/>
-            <w:shd w:fill="F3F6FA" w:val="clear"/>
-          </w:tcPr>
-          <w:p>
-            <w:r>
-              <w:rPr>
-                <w:sz w:val="20"/>
-              </w:rPr>
-            </w:r>
-            <w:r>
-              <w:rPr>
-                <w:rFonts w:ascii="Calibri" w:hAnsi="Calibri" w:eastAsia="Calibri"/>
-                <w:b w:val="0"/>
-                <w:i w:val="0"/>
-                <w:sz w:val="20"/>
-              </w:rPr>
-              <w:t xml:space="preserve">Atualizar entregas, stack e o skill </w:t>
-            </w:r>
-            <w:r>
-              <w:rPr>
-                <w:rFonts w:ascii="Calibri" w:hAnsi="Calibri" w:eastAsia="Calibri"/>
-                <w:b/>
-                <w:i w:val="0"/>
-                <w:sz w:val="20"/>
-              </w:rPr>
-              <w:t>Copilot</w:t>
-            </w:r>
-            <w:r>
-              <w:rPr>
-                <w:rFonts w:ascii="Calibri" w:hAnsi="Calibri" w:eastAsia="Calibri"/>
-                <w:b w:val="0"/>
-                <w:i w:val="0"/>
-                <w:sz w:val="20"/>
-              </w:rPr>
-              <w:t xml:space="preserve"> (primário se usa no dia a dia; secundário se só treinou)</w:t>
-            </w:r>
-          </w:p>
-        </w:tc>
-      </w:tr>
-      <w:tr>
-        <w:tc>
-          <w:tcPr>
-            <w:tcW w:type="dxa" w:w="3249"/>
-          </w:tcPr>
-          <w:p>
-            <w:r>
-              <w:rPr>
-                <w:sz w:val="20"/>
-              </w:rPr>
-            </w:r>
-            <w:r>
-              <w:rPr>
-                <w:rFonts w:ascii="Calibri" w:hAnsi="Calibri" w:eastAsia="Calibri"/>
-                <w:b w:val="0"/>
-                <w:i w:val="0"/>
-                <w:sz w:val="20"/>
-              </w:rPr>
-              <w:t>goFluent</w:t>
-            </w:r>
-          </w:p>
-        </w:tc>
-        <w:tc>
-          <w:tcPr>
-            <w:tcW w:type="dxa" w:w="3249"/>
-          </w:tcPr>
-          <w:p>
-            <w:r>
-              <w:rPr>
-                <w:sz w:val="20"/>
-              </w:rPr>
-            </w:r>
-            <w:r>
-              <w:rPr>
-                <w:rFonts w:ascii="Calibri" w:hAnsi="Calibri" w:eastAsia="Calibri"/>
-                <w:b w:val="0"/>
-                <w:i w:val="0"/>
-                <w:sz w:val="20"/>
-              </w:rPr>
-              <w:t>Teste de proficiência no login Accenture</w:t>
-            </w:r>
-          </w:p>
-        </w:tc>
-        <w:tc>
-          <w:tcPr>
-            <w:tcW w:type="dxa" w:w="3249"/>
-          </w:tcPr>
-          <w:p>
-            <w:r>
-              <w:rPr>
-                <w:sz w:val="20"/>
-              </w:rPr>
-            </w:r>
-            <w:r>
-              <w:rPr>
-                <w:rFonts w:ascii="Calibri" w:hAnsi="Calibri" w:eastAsia="Calibri"/>
-                <w:b w:val="0"/>
-                <w:i w:val="0"/>
-                <w:sz w:val="20"/>
-              </w:rPr>
-              <w:t>Registrar nível no mini CV; ajuda em staffing</w:t>
-            </w:r>
-          </w:p>
-        </w:tc>
-      </w:tr>
-      <w:tr>
-        <w:tc>
-          <w:tcPr>
-            <w:tcW w:type="dxa" w:w="3249"/>
-            <w:shd w:fill="F3F6FA" w:val="clear"/>
-          </w:tcPr>
-          <w:p>
-            <w:r>
-              <w:rPr>
-                <w:sz w:val="20"/>
-              </w:rPr>
-            </w:r>
-            <w:r>
-              <w:rPr>
-                <w:rFonts w:ascii="Calibri" w:hAnsi="Calibri" w:eastAsia="Calibri"/>
-                <w:b w:val="0"/>
-                <w:i w:val="0"/>
-                <w:sz w:val="20"/>
-              </w:rPr>
-              <w:t>Compliance</w:t>
-            </w:r>
-          </w:p>
-        </w:tc>
-        <w:tc>
-          <w:tcPr>
-            <w:tcW w:type="dxa" w:w="3249"/>
-            <w:shd w:fill="F3F6FA" w:val="clear"/>
-          </w:tcPr>
-          <w:p>
-            <w:r>
-              <w:rPr>
-                <w:sz w:val="20"/>
-              </w:rPr>
-            </w:r>
-            <w:r>
-              <w:rPr>
-                <w:rFonts w:ascii="Calibri" w:hAnsi="Calibri" w:eastAsia="Calibri"/>
-                <w:b w:val="0"/>
-                <w:i w:val="0"/>
-                <w:sz w:val="20"/>
-              </w:rPr>
-              <w:t>Itens obrigatórios zerados</w:t>
-            </w:r>
-          </w:p>
-        </w:tc>
-        <w:tc>
-          <w:tcPr>
-            <w:tcW w:type="dxa" w:w="3249"/>
-            <w:shd w:fill="F3F6FA" w:val="clear"/>
-          </w:tcPr>
-          <w:p>
-            <w:r>
-              <w:rPr>
-                <w:sz w:val="20"/>
-              </w:rPr>
-            </w:r>
-            <w:r>
-              <w:rPr>
-                <w:rFonts w:ascii="Calibri" w:hAnsi="Calibri" w:eastAsia="Calibri"/>
-                <w:b w:val="0"/>
-                <w:i w:val="0"/>
-                <w:sz w:val="20"/>
-              </w:rPr>
-              <w:t>Impacta avaliação e pode impactar bônus</w:t>
-            </w:r>
-          </w:p>
-        </w:tc>
-      </w:tr>
-      <w:tr>
-        <w:tc>
-          <w:tcPr>
-            <w:tcW w:type="dxa" w:w="3249"/>
-          </w:tcPr>
-          <w:p>
-            <w:r>
-              <w:rPr>
-                <w:sz w:val="20"/>
-              </w:rPr>
-            </w:r>
-            <w:r>
-              <w:rPr>
-                <w:rFonts w:ascii="Calibri" w:hAnsi="Calibri" w:eastAsia="Calibri"/>
-                <w:b w:val="0"/>
-                <w:i w:val="0"/>
-                <w:sz w:val="20"/>
-              </w:rPr>
-              <w:t>Copilot / agentes</w:t>
-            </w:r>
-          </w:p>
-        </w:tc>
-        <w:tc>
-          <w:tcPr>
-            <w:tcW w:type="dxa" w:w="3249"/>
-          </w:tcPr>
-          <w:p>
-            <w:r>
-              <w:rPr>
-                <w:sz w:val="20"/>
-              </w:rPr>
-            </w:r>
-            <w:r>
-              <w:rPr>
-                <w:rFonts w:ascii="Calibri" w:hAnsi="Calibri" w:eastAsia="Calibri"/>
-                <w:b w:val="0"/>
-                <w:i w:val="0"/>
-                <w:sz w:val="20"/>
-              </w:rPr>
-              <w:t>Empresa e projetos novos estão puxando isso</w:t>
-            </w:r>
-          </w:p>
-        </w:tc>
-        <w:tc>
-          <w:tcPr>
-            <w:tcW w:type="dxa" w:w="3249"/>
-          </w:tcPr>
-          <w:p>
-            <w:r>
-              <w:rPr>
-                <w:sz w:val="20"/>
-              </w:rPr>
-            </w:r>
-            <w:r>
-              <w:rPr>
-                <w:rFonts w:ascii="Calibri" w:hAnsi="Calibri" w:eastAsia="Calibri"/>
-                <w:b w:val="0"/>
-                <w:i w:val="0"/>
-                <w:sz w:val="20"/>
-              </w:rPr>
-              <w:t>Evidência de uso vale mais do que “quero aprender IA”</w:t>
-            </w:r>
-          </w:p>
-        </w:tc>
-      </w:tr>
-      <w:tr>
-        <w:tc>
-          <w:tcPr>
-            <w:tcW w:type="dxa" w:w="3249"/>
-            <w:shd w:fill="F3F6FA" w:val="clear"/>
-          </w:tcPr>
-          <w:p>
-            <w:r>
-              <w:rPr>
-                <w:sz w:val="20"/>
-              </w:rPr>
-            </w:r>
-            <w:r>
-              <w:rPr>
-                <w:rFonts w:ascii="Calibri" w:hAnsi="Calibri" w:eastAsia="Calibri"/>
-                <w:b w:val="0"/>
-                <w:i w:val="0"/>
-                <w:sz w:val="20"/>
-              </w:rPr>
-              <w:t>Comunidade da prática</w:t>
-            </w:r>
-          </w:p>
-        </w:tc>
-        <w:tc>
-          <w:tcPr>
-            <w:tcW w:type="dxa" w:w="3249"/>
-            <w:shd w:fill="F3F6FA" w:val="clear"/>
-          </w:tcPr>
-          <w:p>
-            <w:r>
-              <w:rPr>
-                <w:sz w:val="20"/>
-              </w:rPr>
-            </w:r>
-            <w:r>
-              <w:rPr>
-                <w:rFonts w:ascii="Calibri" w:hAnsi="Calibri" w:eastAsia="Calibri"/>
-                <w:b w:val="0"/>
-                <w:i w:val="0"/>
-                <w:sz w:val="20"/>
-              </w:rPr>
-              <w:t>Cases, library de ferramentas, participação</w:t>
-            </w:r>
-          </w:p>
-        </w:tc>
-        <w:tc>
-          <w:tcPr>
-            <w:tcW w:type="dxa" w:w="3249"/>
-            <w:shd w:fill="F3F6FA" w:val="clear"/>
-          </w:tcPr>
-          <w:p>
-            <w:r>
-              <w:rPr>
-                <w:sz w:val="20"/>
-              </w:rPr>
-            </w:r>
-            <w:r>
-              <w:rPr>
-                <w:rFonts w:ascii="Calibri" w:hAnsi="Calibri" w:eastAsia="Calibri"/>
-                <w:b w:val="0"/>
-                <w:i w:val="0"/>
-                <w:sz w:val="20"/>
-              </w:rPr>
-              <w:t>Ana Karina (Bradesco) já vive isso no cliente; Andressa Silva (MAPFRE) quase não aparece nesse radar</w:t>
-            </w:r>
-          </w:p>
-        </w:tc>
-      </w:tr>
-    </w:tbl>
-    <w:p/>
-    <w:p>
-      <w:pPr>
-        <w:pStyle w:val="Heading3"/>
-      </w:pPr>
-      <w:r>
-        <w:t>Férias (ADP) — o PL aprova</w:t>
-      </w:r>
-    </w:p>
-    <w:p>
-      <w:r>
-        <w:rPr>
-          <w:rFonts w:ascii="Calibri" w:hAnsi="Calibri" w:eastAsia="Calibri"/>
-          <w:b w:val="0"/>
-          <w:i w:val="0"/>
-          <w:sz w:val="22"/>
-        </w:rPr>
-        <w:t>Não é o foco do ciclo, mas o People Lead é o aprovador. Ter na manga se aparecer na 1:1:</w:t>
-      </w:r>
-    </w:p>
-    <w:p>
-      <w:pPr>
-        <w:pStyle w:val="ListBullet"/>
-      </w:pPr>
-      <w:r>
-        <w:rPr>
-          <w:rFonts w:ascii="Calibri" w:hAnsi="Calibri" w:eastAsia="Calibri"/>
-          <w:b w:val="0"/>
-          <w:i w:val="0"/>
-          <w:sz w:val="22"/>
-        </w:rPr>
-        <w:t xml:space="preserve">Período aquisitivo a partir de </w:t>
-      </w:r>
-      <w:r>
-        <w:rPr>
-          <w:rFonts w:ascii="Calibri" w:hAnsi="Calibri" w:eastAsia="Calibri"/>
-          <w:b/>
-          <w:i w:val="0"/>
-          <w:sz w:val="22"/>
-        </w:rPr>
-        <w:t>julho/2026</w:t>
-      </w:r>
-      <w:r>
-        <w:rPr>
-          <w:rFonts w:ascii="Calibri" w:hAnsi="Calibri" w:eastAsia="Calibri"/>
-          <w:b w:val="0"/>
-          <w:i w:val="0"/>
-          <w:sz w:val="22"/>
-        </w:rPr>
-        <w:t xml:space="preserve"> usa </w:t>
-      </w:r>
-      <w:r>
-        <w:rPr>
-          <w:rFonts w:ascii="Calibri" w:hAnsi="Calibri" w:eastAsia="Calibri"/>
-          <w:b/>
-          <w:i w:val="0"/>
-          <w:sz w:val="22"/>
-        </w:rPr>
-        <w:t>ADP</w:t>
-      </w:r>
-      <w:r>
-        <w:rPr>
-          <w:rFonts w:ascii="Calibri" w:hAnsi="Calibri" w:eastAsia="Calibri"/>
-          <w:b w:val="0"/>
-          <w:i w:val="0"/>
-          <w:sz w:val="22"/>
-        </w:rPr>
-        <w:t>.</w:t>
-      </w:r>
-    </w:p>
-    <w:p>
-      <w:pPr>
-        <w:pStyle w:val="ListBullet"/>
-      </w:pPr>
-      <w:r>
-        <w:rPr>
-          <w:rFonts w:ascii="Calibri" w:hAnsi="Calibri" w:eastAsia="Calibri"/>
-          <w:b w:val="0"/>
-          <w:i w:val="0"/>
-          <w:sz w:val="22"/>
-        </w:rPr>
-        <w:t xml:space="preserve">Agendar com </w:t>
-      </w:r>
-      <w:r>
-        <w:rPr>
-          <w:rFonts w:ascii="Calibri" w:hAnsi="Calibri" w:eastAsia="Calibri"/>
-          <w:b/>
-          <w:i w:val="0"/>
-          <w:sz w:val="22"/>
-        </w:rPr>
-        <w:t>no mínimo 35 dias</w:t>
-      </w:r>
-      <w:r>
-        <w:rPr>
-          <w:rFonts w:ascii="Calibri" w:hAnsi="Calibri" w:eastAsia="Calibri"/>
-          <w:b w:val="0"/>
-          <w:i w:val="0"/>
-          <w:sz w:val="22"/>
-        </w:rPr>
-        <w:t>.</w:t>
-      </w:r>
-    </w:p>
-    <w:p>
-      <w:pPr>
-        <w:pStyle w:val="ListBullet"/>
-      </w:pPr>
-      <w:r>
-        <w:rPr>
-          <w:rFonts w:ascii="Calibri" w:hAnsi="Calibri" w:eastAsia="Calibri"/>
-          <w:b w:val="0"/>
-          <w:i w:val="0"/>
-          <w:sz w:val="22"/>
-        </w:rPr>
-        <w:t xml:space="preserve">Um dos períodos com </w:t>
-      </w:r>
-      <w:r>
-        <w:rPr>
-          <w:rFonts w:ascii="Calibri" w:hAnsi="Calibri" w:eastAsia="Calibri"/>
-          <w:b/>
-          <w:i w:val="0"/>
-          <w:sz w:val="22"/>
-        </w:rPr>
-        <w:t>14 dias</w:t>
-      </w:r>
-      <w:r>
-        <w:rPr>
-          <w:rFonts w:ascii="Calibri" w:hAnsi="Calibri" w:eastAsia="Calibri"/>
-          <w:b w:val="0"/>
-          <w:i w:val="0"/>
-          <w:sz w:val="22"/>
-        </w:rPr>
-        <w:t xml:space="preserve">; os demais com no mínimo </w:t>
-      </w:r>
-      <w:r>
-        <w:rPr>
-          <w:rFonts w:ascii="Calibri" w:hAnsi="Calibri" w:eastAsia="Calibri"/>
-          <w:b/>
-          <w:i w:val="0"/>
-          <w:sz w:val="22"/>
-        </w:rPr>
-        <w:t>5</w:t>
-      </w:r>
-      <w:r>
-        <w:rPr>
-          <w:rFonts w:ascii="Calibri" w:hAnsi="Calibri" w:eastAsia="Calibri"/>
-          <w:b w:val="0"/>
-          <w:i w:val="0"/>
-          <w:sz w:val="22"/>
-        </w:rPr>
-        <w:t xml:space="preserve">; no máximo </w:t>
-      </w:r>
-      <w:r>
-        <w:rPr>
-          <w:rFonts w:ascii="Calibri" w:hAnsi="Calibri" w:eastAsia="Calibri"/>
-          <w:b/>
-          <w:i w:val="0"/>
-          <w:sz w:val="22"/>
-        </w:rPr>
-        <w:t>3</w:t>
-      </w:r>
-      <w:r>
-        <w:rPr>
-          <w:rFonts w:ascii="Calibri" w:hAnsi="Calibri" w:eastAsia="Calibri"/>
-          <w:b w:val="0"/>
-          <w:i w:val="0"/>
-          <w:sz w:val="22"/>
-        </w:rPr>
-        <w:t xml:space="preserve"> períodos.</w:t>
-      </w:r>
-    </w:p>
-    <w:p>
-      <w:pPr>
-        <w:pStyle w:val="ListBullet"/>
-      </w:pPr>
-      <w:r>
-        <w:rPr>
-          <w:rFonts w:ascii="Calibri" w:hAnsi="Calibri" w:eastAsia="Calibri"/>
-          <w:b w:val="0"/>
-          <w:i w:val="0"/>
-          <w:sz w:val="22"/>
-        </w:rPr>
-        <w:t xml:space="preserve">Agendamento é </w:t>
-      </w:r>
-      <w:r>
-        <w:rPr>
-          <w:rFonts w:ascii="Calibri" w:hAnsi="Calibri" w:eastAsia="Calibri"/>
-          <w:b/>
-          <w:i w:val="0"/>
-          <w:sz w:val="22"/>
-        </w:rPr>
-        <w:t>por período</w:t>
-      </w:r>
-      <w:r>
-        <w:rPr>
-          <w:rFonts w:ascii="Calibri" w:hAnsi="Calibri" w:eastAsia="Calibri"/>
-          <w:b w:val="0"/>
-          <w:i w:val="0"/>
-          <w:sz w:val="22"/>
-        </w:rPr>
-        <w:t>, não o ano inteiro de uma vez.</w:t>
-      </w:r>
-    </w:p>
-    <w:p>
-      <w:pPr>
-        <w:pStyle w:val="ListBullet"/>
-      </w:pPr>
-      <w:r>
-        <w:rPr>
-          <w:rFonts w:ascii="Calibri" w:hAnsi="Calibri" w:eastAsia="Calibri"/>
-          <w:b w:val="0"/>
-          <w:i w:val="0"/>
-          <w:sz w:val="22"/>
-        </w:rPr>
-        <w:t>Pagamento atrelado ao gozo (por isso os 35 dias): 48h antes do início.</w:t>
-      </w:r>
-    </w:p>
-    <w:p>
-      <w:pPr>
-        <w:pStyle w:val="ListBullet"/>
-      </w:pPr>
-      <w:r>
-        <w:rPr>
-          <w:rFonts w:ascii="Calibri" w:hAnsi="Calibri" w:eastAsia="Calibri"/>
-          <w:b w:val="0"/>
-          <w:i w:val="0"/>
-          <w:sz w:val="22"/>
-        </w:rPr>
-        <w:t>Início não pode ser sexta, sábado, domingo ou véspera de feriado.</w:t>
-      </w:r>
-    </w:p>
-    <w:p>
-      <w:pPr>
-        <w:pStyle w:val="ListBullet"/>
-      </w:pPr>
-      <w:r>
-        <w:rPr>
-          <w:rFonts w:ascii="Calibri" w:hAnsi="Calibri" w:eastAsia="Calibri"/>
-          <w:b w:val="0"/>
-          <w:i w:val="0"/>
-          <w:sz w:val="22"/>
-        </w:rPr>
-        <w:t>Saldo antigo: fluxo anterior (MyTime / MyCully) até zerar. Depois, ADP.</w:t>
-      </w:r>
-    </w:p>
-    <w:p>
-      <w:pPr>
-        <w:pStyle w:val="ListBullet"/>
-      </w:pPr>
-      <w:r>
-        <w:rPr>
-          <w:rFonts w:ascii="Calibri" w:hAnsi="Calibri" w:eastAsia="Calibri"/>
-          <w:b w:val="0"/>
-          <w:i w:val="0"/>
-          <w:sz w:val="22"/>
-        </w:rPr>
-        <w:t>Sem agendamento no prazo: férias compulsórias.</w:t>
-      </w:r>
-    </w:p>
-    <w:p>
-      <w:pPr>
-        <w:pStyle w:val="ListBullet"/>
-      </w:pPr>
-      <w:r>
-        <w:rPr>
-          <w:rFonts w:ascii="Calibri" w:hAnsi="Calibri" w:eastAsia="Calibri"/>
-          <w:b w:val="0"/>
-          <w:i w:val="0"/>
-          <w:sz w:val="22"/>
-        </w:rPr>
-        <w:t>Dúvidas: FAQ de férias, BP da pessoa, chamado no suporte / SharePoint.</w:t>
-      </w:r>
-    </w:p>
-    <w:p>
-      <w:pPr>
-        <w:pStyle w:val="Heading3"/>
-      </w:pPr>
-      <w:r>
-        <w:t>Como traduzir a CALL em pergunta de 1:1</w:t>
-      </w:r>
-    </w:p>
-    <w:p>
-      <w:r>
-        <w:rPr>
-          <w:rFonts w:ascii="Calibri" w:hAnsi="Calibri" w:eastAsia="Calibri"/>
-          <w:b w:val="0"/>
-          <w:i w:val="0"/>
-          <w:sz w:val="22"/>
-        </w:rPr>
-        <w:t>Não perguntar “você está bem no projeto?”. Perguntar o que o ciclo consegue calibrar:</w:t>
-      </w:r>
-    </w:p>
-    <w:p>
-      <w:pPr>
-        <w:pStyle w:val="ListNumber"/>
-      </w:pPr>
-      <w:r>
-        <w:rPr>
-          <w:rFonts w:ascii="Calibri" w:hAnsi="Calibri" w:eastAsia="Calibri"/>
-          <w:b w:val="0"/>
-          <w:i w:val="0"/>
-          <w:sz w:val="22"/>
-        </w:rPr>
-        <w:t>O que você entregou em cada prioridade, com exemplo?</w:t>
-      </w:r>
-    </w:p>
-    <w:p>
-      <w:pPr>
-        <w:pStyle w:val="ListNumber"/>
-      </w:pPr>
-      <w:r>
-        <w:rPr>
-          <w:rFonts w:ascii="Calibri" w:hAnsi="Calibri" w:eastAsia="Calibri"/>
-          <w:b w:val="0"/>
-          <w:i w:val="0"/>
-          <w:sz w:val="22"/>
-        </w:rPr>
-        <w:t>Quem pode confirmar isso (líder de projeto, par, cliente)?</w:t>
-      </w:r>
-    </w:p>
-    <w:p>
-      <w:pPr>
-        <w:pStyle w:val="ListNumber"/>
-      </w:pPr>
-      <w:r>
-        <w:rPr>
-          <w:rFonts w:ascii="Calibri" w:hAnsi="Calibri" w:eastAsia="Calibri"/>
-          <w:b w:val="0"/>
-          <w:i w:val="0"/>
-          <w:sz w:val="22"/>
-        </w:rPr>
-        <w:t>O que ficou abaixo do combinado e por quê?</w:t>
-      </w:r>
-    </w:p>
-    <w:p>
-      <w:pPr>
-        <w:pStyle w:val="ListNumber"/>
-      </w:pPr>
-      <w:r>
-        <w:rPr>
-          <w:rFonts w:ascii="Calibri" w:hAnsi="Calibri" w:eastAsia="Calibri"/>
-          <w:b w:val="0"/>
-          <w:i w:val="0"/>
-          <w:sz w:val="22"/>
-        </w:rPr>
-        <w:t>Sua percepção de performance é a mesma da liderança do projeto?</w:t>
-      </w:r>
-    </w:p>
-    <w:p>
-      <w:pPr>
-        <w:pStyle w:val="ListNumber"/>
-      </w:pPr>
-      <w:r>
-        <w:rPr>
-          <w:rFonts w:ascii="Calibri" w:hAnsi="Calibri" w:eastAsia="Calibri"/>
-          <w:b w:val="0"/>
-          <w:i w:val="0"/>
-          <w:sz w:val="22"/>
-        </w:rPr>
-        <w:t>Workday, compliance, mini CV e Copilot skill estão em dia?</w:t>
-      </w:r>
-    </w:p>
-    <w:p>
-      <w:pPr>
-        <w:pStyle w:val="ListNumber"/>
-      </w:pPr>
-      <w:r>
-        <w:rPr>
-          <w:rFonts w:ascii="Calibri" w:hAnsi="Calibri" w:eastAsia="Calibri"/>
-          <w:b w:val="0"/>
-          <w:i w:val="0"/>
-          <w:sz w:val="22"/>
-        </w:rPr>
-        <w:t>Você está pedindo o próximo nível este ano, ou o jogo é consolidar e crescer no FY27?</w:t>
-      </w:r>
-    </w:p>
-    <w:p>
-      <w:r>
-        <w:rPr>
-          <w:rFonts w:ascii="Calibri" w:hAnsi="Calibri" w:eastAsia="Calibri"/>
-          <w:b w:val="0"/>
-          <w:i w:val="0"/>
-          <w:sz w:val="22"/>
-        </w:rPr>
-        <w:t>Se a pessoa não tiver evidência, o PL não tem material para representá-la.</w:t>
+        <w:t>Workday (técnico): Career &amp; Performance BR</w:t>
       </w:r>
     </w:p>
     <w:sectPr>

</xml_diff>

<commit_message>
Regenerar Word Ana com nota de uso interno PL
Co-authored-by: Jonatas Andrade <jonatasandradedeveloper@users.noreply.github.com>
</commit_message>
<xml_diff>
--- a/DOCS-PEOPLE-LEAD/Ana-Karina/00-Documento-Unico.docx
+++ b/DOCS-PEOPLE-LEAD/Ana-Karina/00-Documento-Unico.docx
@@ -340,7 +340,7 @@
           <w:color w:val="555555"/>
           <w:sz w:val="20"/>
         </w:rPr>
-        <w:t>Este arquivo reúne TUDO sobre a Ana Karina: fichas, calls, histórico, prioridades, plano de carreira, Workday, autorreflexão dela e rascunho da sua avaliação (PL). Documento vivo — atualizar após cada 1:1.</w:t>
+        <w:t>Histórico interno do People Lead sobre Ana Karina — NÃO enviado à profissional. Textos de Workday/ABCD são referência sua (orientação verbal na call; cobrança; input PL até 11/09). Atualizar após cada 1:1.</w:t>
       </w:r>
     </w:p>
     <w:p>
@@ -354,6 +354,20 @@
       </w:pPr>
       <w:r>
         <w:t>Sumário</w:t>
+      </w:r>
+    </w:p>
+    <w:p>
+      <w:pPr>
+        <w:spacing w:after="120"/>
+      </w:pPr>
+      <w:r>
+        <w:rPr>
+          <w:rFonts w:ascii="Calibri" w:hAnsi="Calibri" w:eastAsia="Calibri"/>
+          <w:b w:val="0"/>
+          <w:i w:val="0"/>
+          <w:sz w:val="22"/>
+        </w:rPr>
+        <w:t>Nota — uso interno (não enviar à Ana)</w:t>
       </w:r>
     </w:p>
     <w:p>
@@ -588,7 +602,496 @@
         <w:pStyle w:val="Heading1"/>
       </w:pPr>
       <w:r>
+        <w:t>Nota — uso interno (não enviar à Ana)</w:t>
+      </w:r>
+    </w:p>
+    <w:p>
+      <w:r>
+        <w:rPr>
+          <w:rFonts w:ascii="Calibri" w:hAnsi="Calibri" w:eastAsia="Calibri"/>
+          <w:b/>
+          <w:i w:val="0"/>
+          <w:sz w:val="22"/>
+        </w:rPr>
+        <w:t>Confidencial · uso interno do People Lead (Jônatas)</w:t>
+      </w:r>
+    </w:p>
+    <w:p>
+      <w:r>
+        <w:rPr>
+          <w:rFonts w:ascii="Calibri" w:hAnsi="Calibri" w:eastAsia="Calibri"/>
+          <w:b w:val="0"/>
+          <w:i w:val="0"/>
+          <w:sz w:val="22"/>
+        </w:rPr>
+        <w:t>Esta pasta (</w:t>
+      </w:r>
+      <w:r>
+        <w:rPr>
+          <w:rFonts w:ascii="Consolas" w:hAnsi="Consolas" w:eastAsia="Consolas"/>
+          <w:b w:val="0"/>
+          <w:i w:val="0"/>
+          <w:color w:val="333333"/>
+          <w:sz w:val="18"/>
+        </w:rPr>
+        <w:t>people-lead/ana/</w:t>
+      </w:r>
+      <w:r>
+        <w:rPr>
+          <w:rFonts w:ascii="Calibri" w:hAnsi="Calibri" w:eastAsia="Calibri"/>
+          <w:b w:val="0"/>
+          <w:i w:val="0"/>
+          <w:sz w:val="22"/>
+        </w:rPr>
+        <w:t xml:space="preserve">) e os Word em </w:t>
+      </w:r>
+      <w:r>
+        <w:rPr>
+          <w:rFonts w:ascii="Consolas" w:hAnsi="Consolas" w:eastAsia="Consolas"/>
+          <w:b w:val="0"/>
+          <w:i w:val="0"/>
+          <w:color w:val="333333"/>
+          <w:sz w:val="18"/>
+        </w:rPr>
+        <w:t>DOCS-PEOPLE-LEAD/Ana-Karina/</w:t>
+      </w:r>
+      <w:r>
+        <w:rPr>
+          <w:rFonts w:ascii="Calibri" w:hAnsi="Calibri" w:eastAsia="Calibri"/>
+          <w:b w:val="0"/>
+          <w:i w:val="0"/>
+          <w:sz w:val="22"/>
+        </w:rPr>
+        <w:t xml:space="preserve"> são </w:t>
+      </w:r>
+      <w:r>
+        <w:rPr>
+          <w:rFonts w:ascii="Calibri" w:hAnsi="Calibri" w:eastAsia="Calibri"/>
+          <w:b/>
+          <w:i w:val="0"/>
+          <w:sz w:val="22"/>
+        </w:rPr>
+        <w:t>histórico de acompanhamento</w:t>
+      </w:r>
+      <w:r>
+        <w:rPr>
+          <w:rFonts w:ascii="Calibri" w:hAnsi="Calibri" w:eastAsia="Calibri"/>
+          <w:b w:val="0"/>
+          <w:i w:val="0"/>
+          <w:sz w:val="22"/>
+        </w:rPr>
+        <w:t xml:space="preserve"> da Ana Karina — </w:t>
+      </w:r>
+      <w:r>
+        <w:rPr>
+          <w:rFonts w:ascii="Calibri" w:hAnsi="Calibri" w:eastAsia="Calibri"/>
+          <w:b/>
+          <w:i w:val="0"/>
+          <w:sz w:val="22"/>
+        </w:rPr>
+        <w:t>não foram enviados à profissional</w:t>
+      </w:r>
+      <w:r>
+        <w:rPr>
+          <w:rFonts w:ascii="Calibri" w:hAnsi="Calibri" w:eastAsia="Calibri"/>
+          <w:b w:val="0"/>
+          <w:i w:val="0"/>
+          <w:sz w:val="22"/>
+        </w:rPr>
+        <w:t xml:space="preserve"> e </w:t>
+      </w:r>
+      <w:r>
+        <w:rPr>
+          <w:rFonts w:ascii="Calibri" w:hAnsi="Calibri" w:eastAsia="Calibri"/>
+          <w:b/>
+          <w:i w:val="0"/>
+          <w:sz w:val="22"/>
+        </w:rPr>
+        <w:t>não devem ser repassados como dossiê</w:t>
+      </w:r>
+      <w:r>
+        <w:rPr>
+          <w:rFonts w:ascii="Calibri" w:hAnsi="Calibri" w:eastAsia="Calibri"/>
+          <w:b w:val="0"/>
+          <w:i w:val="0"/>
+          <w:sz w:val="22"/>
+        </w:rPr>
+        <w:t>.</w:t>
+      </w:r>
+    </w:p>
+    <w:tbl>
+      <w:tblPr>
+        <w:tblStyle w:val="TableGrid"/>
+        <w:tblW w:type="auto" w:w="0"/>
+        <w:tblLook w:firstColumn="1" w:firstRow="1" w:lastColumn="0" w:lastRow="0" w:noHBand="0" w:noVBand="1" w:val="04A0"/>
+      </w:tblPr>
+      <w:tblGrid>
+        <w:gridCol w:w="4873"/>
+        <w:gridCol w:w="4873"/>
+      </w:tblGrid>
+      <w:tr>
+        <w:tc>
+          <w:tcPr>
+            <w:tcW w:type="dxa" w:w="4873"/>
+            <w:shd w:fill="1F3A5F" w:val="clear"/>
+          </w:tcPr>
+          <w:p>
+            <w:r>
+              <w:rPr>
+                <w:b/>
+                <w:color w:val="FFFFFF"/>
+                <w:sz w:val="20"/>
+              </w:rPr>
+            </w:r>
+            <w:r>
+              <w:rPr>
+                <w:rFonts w:ascii="Calibri" w:hAnsi="Calibri" w:eastAsia="Calibri"/>
+                <w:b/>
+                <w:i w:val="0"/>
+                <w:color w:val="FFFFFF"/>
+                <w:sz w:val="20"/>
+              </w:rPr>
+              <w:t>O que é</w:t>
+            </w:r>
+          </w:p>
+        </w:tc>
+        <w:tc>
+          <w:tcPr>
+            <w:tcW w:type="dxa" w:w="4873"/>
+            <w:shd w:fill="1F3A5F" w:val="clear"/>
+          </w:tcPr>
+          <w:p>
+            <w:r>
+              <w:rPr>
+                <w:b/>
+                <w:color w:val="FFFFFF"/>
+                <w:sz w:val="20"/>
+              </w:rPr>
+            </w:r>
+            <w:r>
+              <w:rPr>
+                <w:rFonts w:ascii="Calibri" w:hAnsi="Calibri" w:eastAsia="Calibri"/>
+                <w:b/>
+                <w:i w:val="0"/>
+                <w:color w:val="FFFFFF"/>
+                <w:sz w:val="20"/>
+              </w:rPr>
+              <w:t>Para quê</w:t>
+            </w:r>
+          </w:p>
+        </w:tc>
+      </w:tr>
+      <w:tr>
+        <w:tc>
+          <w:tcPr>
+            <w:tcW w:type="dxa" w:w="4873"/>
+          </w:tcPr>
+          <w:p>
+            <w:r>
+              <w:rPr>
+                <w:sz w:val="20"/>
+              </w:rPr>
+            </w:r>
+            <w:r>
+              <w:rPr>
+                <w:rFonts w:ascii="Calibri" w:hAnsi="Calibri" w:eastAsia="Calibri"/>
+                <w:b w:val="0"/>
+                <w:i w:val="0"/>
+                <w:sz w:val="20"/>
+              </w:rPr>
+              <w:t>Ficha, 1:1s, resumos de call</w:t>
+            </w:r>
+          </w:p>
+        </w:tc>
+        <w:tc>
+          <w:tcPr>
+            <w:tcW w:type="dxa" w:w="4873"/>
+          </w:tcPr>
+          <w:p>
+            <w:r>
+              <w:rPr>
+                <w:sz w:val="20"/>
+              </w:rPr>
+            </w:r>
+            <w:r>
+              <w:rPr>
+                <w:rFonts w:ascii="Calibri" w:hAnsi="Calibri" w:eastAsia="Calibri"/>
+                <w:b w:val="0"/>
+                <w:i w:val="0"/>
+                <w:sz w:val="20"/>
+              </w:rPr>
+              <w:t>Registrar o que foi dito e combinado</w:t>
+            </w:r>
+          </w:p>
+        </w:tc>
+      </w:tr>
+      <w:tr>
+        <w:tc>
+          <w:tcPr>
+            <w:tcW w:type="dxa" w:w="4873"/>
+            <w:shd w:fill="F3F6FA" w:val="clear"/>
+          </w:tcPr>
+          <w:p>
+            <w:r>
+              <w:rPr>
+                <w:sz w:val="20"/>
+              </w:rPr>
+            </w:r>
+            <w:r>
+              <w:rPr>
+                <w:rFonts w:ascii="Calibri" w:hAnsi="Calibri" w:eastAsia="Calibri"/>
+                <w:b w:val="0"/>
+                <w:i w:val="0"/>
+                <w:sz w:val="20"/>
+              </w:rPr>
+              <w:t>Prioridades, plano, insumos ciclo</w:t>
+            </w:r>
+          </w:p>
+        </w:tc>
+        <w:tc>
+          <w:tcPr>
+            <w:tcW w:type="dxa" w:w="4873"/>
+            <w:shd w:fill="F3F6FA" w:val="clear"/>
+          </w:tcPr>
+          <w:p>
+            <w:r>
+              <w:rPr>
+                <w:sz w:val="20"/>
+              </w:rPr>
+            </w:r>
+            <w:r>
+              <w:rPr>
+                <w:rFonts w:ascii="Calibri" w:hAnsi="Calibri" w:eastAsia="Calibri"/>
+                <w:b w:val="0"/>
+                <w:i w:val="0"/>
+                <w:sz w:val="20"/>
+              </w:rPr>
+              <w:t>Sua leitura e representação na calibração</w:t>
+            </w:r>
+          </w:p>
+        </w:tc>
+      </w:tr>
+      <w:tr>
+        <w:tc>
+          <w:tcPr>
+            <w:tcW w:type="dxa" w:w="4873"/>
+          </w:tcPr>
+          <w:p>
+            <w:r>
+              <w:rPr>
+                <w:sz w:val="20"/>
+              </w:rPr>
+            </w:r>
+            <w:r>
+              <w:rPr>
+                <w:rFonts w:ascii="Calibri" w:hAnsi="Calibri" w:eastAsia="Calibri"/>
+                <w:b w:val="0"/>
+                <w:i w:val="0"/>
+                <w:sz w:val="20"/>
+              </w:rPr>
+              <w:t>Textos “para colar” no Workday</w:t>
+            </w:r>
+          </w:p>
+        </w:tc>
+        <w:tc>
+          <w:tcPr>
+            <w:tcW w:type="dxa" w:w="4873"/>
+          </w:tcPr>
+          <w:p>
+            <w:r>
+              <w:rPr>
+                <w:sz w:val="20"/>
+              </w:rPr>
+            </w:r>
+            <w:r>
+              <w:rPr>
+                <w:rFonts w:ascii="Calibri" w:hAnsi="Calibri" w:eastAsia="Calibri"/>
+                <w:b/>
+                <w:i w:val="0"/>
+                <w:sz w:val="20"/>
+              </w:rPr>
+              <w:t>Sua referência</w:t>
+            </w:r>
+            <w:r>
+              <w:rPr>
+                <w:rFonts w:ascii="Calibri" w:hAnsi="Calibri" w:eastAsia="Calibri"/>
+                <w:b w:val="0"/>
+                <w:i w:val="0"/>
+                <w:sz w:val="20"/>
+              </w:rPr>
+              <w:t xml:space="preserve"> para orientar na call, cobrar ou montar o ABCD Form — a Ana preenche </w:t>
+            </w:r>
+            <w:r>
+              <w:rPr>
+                <w:rFonts w:ascii="Calibri" w:hAnsi="Calibri" w:eastAsia="Calibri"/>
+                <w:b/>
+                <w:i w:val="0"/>
+                <w:sz w:val="20"/>
+              </w:rPr>
+              <w:t>no Workday dela</w:t>
+            </w:r>
+            <w:r>
+              <w:rPr>
+                <w:rFonts w:ascii="Calibri" w:hAnsi="Calibri" w:eastAsia="Calibri"/>
+                <w:b w:val="0"/>
+                <w:i w:val="0"/>
+                <w:sz w:val="20"/>
+              </w:rPr>
+              <w:t>, por conta própria</w:t>
+            </w:r>
+          </w:p>
+        </w:tc>
+      </w:tr>
+      <w:tr>
+        <w:tc>
+          <w:tcPr>
+            <w:tcW w:type="dxa" w:w="4873"/>
+            <w:shd w:fill="F3F6FA" w:val="clear"/>
+          </w:tcPr>
+          <w:p>
+            <w:r>
+              <w:rPr>
+                <w:sz w:val="20"/>
+              </w:rPr>
+            </w:r>
+            <w:r>
+              <w:rPr>
+                <w:rFonts w:ascii="Calibri" w:hAnsi="Calibri" w:eastAsia="Calibri"/>
+                <w:b w:val="0"/>
+                <w:i w:val="0"/>
+                <w:sz w:val="20"/>
+              </w:rPr>
+              <w:t>Rascunho ABCD Form (PL)</w:t>
+            </w:r>
+          </w:p>
+        </w:tc>
+        <w:tc>
+          <w:tcPr>
+            <w:tcW w:type="dxa" w:w="4873"/>
+            <w:shd w:fill="F3F6FA" w:val="clear"/>
+          </w:tcPr>
+          <w:p>
+            <w:r>
+              <w:rPr>
+                <w:sz w:val="20"/>
+              </w:rPr>
+            </w:r>
+            <w:r>
+              <w:rPr>
+                <w:rFonts w:ascii="Calibri" w:hAnsi="Calibri" w:eastAsia="Calibri"/>
+                <w:b w:val="0"/>
+                <w:i w:val="0"/>
+                <w:sz w:val="20"/>
+              </w:rPr>
+              <w:t>Seu input até 11/09</w:t>
+            </w:r>
+          </w:p>
+        </w:tc>
+      </w:tr>
+    </w:tbl>
+    <w:p/>
+    <w:p>
+      <w:r>
+        <w:rPr>
+          <w:rFonts w:ascii="Calibri" w:hAnsi="Calibri" w:eastAsia="Calibri"/>
+          <w:b/>
+          <w:i w:val="0"/>
+          <w:sz w:val="22"/>
+        </w:rPr>
+        <w:t>Autorreflexão ABCD (Ana):</w:t>
+      </w:r>
+      <w:r>
+        <w:rPr>
+          <w:rFonts w:ascii="Calibri" w:hAnsi="Calibri" w:eastAsia="Calibri"/>
+          <w:b w:val="0"/>
+          <w:i w:val="0"/>
+          <w:sz w:val="22"/>
+        </w:rPr>
+        <w:t xml:space="preserve"> ainda </w:t>
+      </w:r>
+      <w:r>
+        <w:rPr>
+          <w:rFonts w:ascii="Calibri" w:hAnsi="Calibri" w:eastAsia="Calibri"/>
+          <w:b/>
+          <w:i w:val="0"/>
+          <w:sz w:val="22"/>
+        </w:rPr>
+        <w:t>não submetida</w:t>
+      </w:r>
+      <w:r>
+        <w:rPr>
+          <w:rFonts w:ascii="Calibri" w:hAnsi="Calibri" w:eastAsia="Calibri"/>
+          <w:b w:val="0"/>
+          <w:i w:val="0"/>
+          <w:sz w:val="22"/>
+        </w:rPr>
+        <w:t xml:space="preserve"> — ela não enviou ao PL. Orientação foi </w:t>
+      </w:r>
+      <w:r>
+        <w:rPr>
+          <w:rFonts w:ascii="Calibri" w:hAnsi="Calibri" w:eastAsia="Calibri"/>
+          <w:b/>
+          <w:i w:val="0"/>
+          <w:sz w:val="22"/>
+        </w:rPr>
+        <w:t>verbal</w:t>
+      </w:r>
+      <w:r>
+        <w:rPr>
+          <w:rFonts w:ascii="Calibri" w:hAnsi="Calibri" w:eastAsia="Calibri"/>
+          <w:b w:val="0"/>
+          <w:i w:val="0"/>
+          <w:sz w:val="22"/>
+        </w:rPr>
+        <w:t xml:space="preserve"> na 1:1 #2; guia escrito ficou só neste histórico.</w:t>
+      </w:r>
+    </w:p>
+    <w:p>
+      <w:r>
+        <w:br w:type="page"/>
+      </w:r>
+    </w:p>
+    <w:p>
+      <w:pPr>
+        <w:pStyle w:val="Heading1"/>
+      </w:pPr>
+      <w:r>
         <w:t>1. Ficha e contexto</w:t>
+      </w:r>
+    </w:p>
+    <w:p>
+      <w:pPr>
+        <w:ind w:left="425"/>
+      </w:pPr>
+      <w:r>
+        <w:rPr>
+          <w:rFonts w:ascii="Calibri" w:hAnsi="Calibri" w:eastAsia="Calibri"/>
+          <w:b/>
+          <w:i w:val="0"/>
+          <w:color w:val="555555"/>
+          <w:sz w:val="22"/>
+        </w:rPr>
+        <w:t>Uso interno People Lead</w:t>
+      </w:r>
+      <w:r>
+        <w:rPr>
+          <w:rFonts w:ascii="Calibri" w:hAnsi="Calibri" w:eastAsia="Calibri"/>
+          <w:b w:val="0"/>
+          <w:i/>
+          <w:color w:val="555555"/>
+          <w:sz w:val="22"/>
+        </w:rPr>
+        <w:t xml:space="preserve"> — histórico de acompanhamento. </w:t>
+      </w:r>
+      <w:r>
+        <w:rPr>
+          <w:rFonts w:ascii="Calibri" w:hAnsi="Calibri" w:eastAsia="Calibri"/>
+          <w:b/>
+          <w:i w:val="0"/>
+          <w:color w:val="555555"/>
+          <w:sz w:val="22"/>
+        </w:rPr>
+        <w:t>Não enviado à Ana.</w:t>
       </w:r>
     </w:p>
     <w:p>
@@ -4499,14 +5002,22 @@
       </w:r>
     </w:p>
     <w:p>
-      <w:r>
-        <w:rPr>
-          <w:rFonts w:ascii="Calibri" w:hAnsi="Calibri" w:eastAsia="Calibri"/>
-          <w:b w:val="0"/>
-          <w:i w:val="0"/>
-          <w:sz w:val="22"/>
-        </w:rPr>
-        <w:t xml:space="preserve">→ </w:t>
+      <w:pPr>
+        <w:pStyle w:val="Heading3"/>
+      </w:pPr>
+      <w:r>
+        <w:t>Notas PL — Workday ABCD (orientação verbal na call #2)</w:t>
+      </w:r>
+    </w:p>
+    <w:p>
+      <w:r>
+        <w:rPr>
+          <w:rFonts w:ascii="Calibri" w:hAnsi="Calibri" w:eastAsia="Calibri"/>
+          <w:b w:val="0"/>
+          <w:i w:val="0"/>
+          <w:sz w:val="22"/>
+        </w:rPr>
+        <w:t xml:space="preserve">Na 1:1 você orientou </w:t>
       </w:r>
       <w:r>
         <w:rPr>
@@ -4515,16 +5026,16 @@
           <w:i w:val="0"/>
           <w:sz w:val="22"/>
         </w:rPr>
-        <w:t>Atualização:</w:t>
-      </w:r>
-      <w:r>
-        <w:rPr>
-          <w:rFonts w:ascii="Calibri" w:hAnsi="Calibri" w:eastAsia="Calibri"/>
-          <w:b w:val="0"/>
-          <w:i w:val="0"/>
-          <w:sz w:val="22"/>
-        </w:rPr>
-        <w:t xml:space="preserve"> ver resumo da </w:t>
+        <w:t>verbalmente</w:t>
+      </w:r>
+      <w:r>
+        <w:rPr>
+          <w:rFonts w:ascii="Calibri" w:hAnsi="Calibri" w:eastAsia="Calibri"/>
+          <w:b w:val="0"/>
+          <w:i w:val="0"/>
+          <w:sz w:val="22"/>
+        </w:rPr>
+        <w:t xml:space="preserve"> (Priorities → Submeta e Refleta). </w:t>
       </w:r>
       <w:r>
         <w:rPr>
@@ -4533,16 +5044,18 @@
           <w:i w:val="0"/>
           <w:sz w:val="22"/>
         </w:rPr>
-        <w:t>1:1 #2 (28/08)</w:t>
-      </w:r>
-      <w:r>
-        <w:rPr>
-          <w:rFonts w:ascii="Calibri" w:hAnsi="Calibri" w:eastAsia="Calibri"/>
-          <w:b w:val="0"/>
-          <w:i w:val="0"/>
-          <w:sz w:val="22"/>
-        </w:rPr>
-        <w:t xml:space="preserve"> em </w:t>
+        <w:t>Nenhum guia escrito foi enviado à Ana.</w:t>
+      </w:r>
+    </w:p>
+    <w:p>
+      <w:r>
+        <w:rPr>
+          <w:rFonts w:ascii="Calibri" w:hAnsi="Calibri" w:eastAsia="Calibri"/>
+          <w:b w:val="0"/>
+          <w:i w:val="0"/>
+          <w:sz w:val="22"/>
+        </w:rPr>
+        <w:t xml:space="preserve">Referência interna (cobrança ou cruzamento após ela submeter): </w:t>
       </w:r>
       <w:r>
         <w:rPr>
@@ -4552,7 +5065,25 @@
           <w:color w:val="333333"/>
           <w:sz w:val="18"/>
         </w:rPr>
-        <w:t>10-resumo-call-2.md</w:t>
+        <w:t>09-autorreflexao-passo-a-passo.md</w:t>
+      </w:r>
+      <w:r>
+        <w:rPr>
+          <w:rFonts w:ascii="Calibri" w:hAnsi="Calibri" w:eastAsia="Calibri"/>
+          <w:b w:val="0"/>
+          <w:i w:val="0"/>
+          <w:sz w:val="22"/>
+        </w:rPr>
+        <w:t xml:space="preserve"> — </w:t>
+      </w:r>
+      <w:r>
+        <w:rPr>
+          <w:rFonts w:ascii="Calibri" w:hAnsi="Calibri" w:eastAsia="Calibri"/>
+          <w:b/>
+          <w:i w:val="0"/>
+          <w:sz w:val="22"/>
+        </w:rPr>
+        <w:t>não repassar como documento</w:t>
       </w:r>
       <w:r>
         <w:rPr>
@@ -4565,36 +5096,32 @@
       </w:r>
     </w:p>
     <w:p>
-      <w:pPr>
-        <w:pStyle w:val="Heading3"/>
-      </w:pPr>
-      <w:r>
-        <w:t>Ajuda para preencher a Autorreflexão (ABCD) — até 28/08</w:t>
-      </w:r>
-    </w:p>
-    <w:p>
-      <w:r>
-        <w:rPr>
-          <w:rFonts w:ascii="Calibri" w:hAnsi="Calibri" w:eastAsia="Calibri"/>
-          <w:b w:val="0"/>
-          <w:i w:val="0"/>
-          <w:sz w:val="22"/>
-        </w:rPr>
-        <w:t>Doc pronto com passo a passo na tela + textos para colar + Atualidade ≤150 caracteres:</w:t>
-      </w:r>
-    </w:p>
-    <w:p>
-      <w:pPr>
-        <w:pStyle w:val="ListBullet"/>
-      </w:pPr>
-      <w:r>
-        <w:rPr>
-          <w:rFonts w:ascii="Calibri" w:hAnsi="Calibri" w:eastAsia="Calibri"/>
-          <w:b w:val="0"/>
-          <w:i w:val="0"/>
-          <w:sz w:val="22"/>
-        </w:rPr>
-        <w:t xml:space="preserve">Markdown: </w:t>
+      <w:r>
+        <w:rPr>
+          <w:rFonts w:ascii="Calibri" w:hAnsi="Calibri" w:eastAsia="Calibri"/>
+          <w:b w:val="0"/>
+          <w:i w:val="0"/>
+          <w:sz w:val="22"/>
+        </w:rPr>
+        <w:t xml:space="preserve">→ Ver também resumo da </w:t>
+      </w:r>
+      <w:r>
+        <w:rPr>
+          <w:rFonts w:ascii="Calibri" w:hAnsi="Calibri" w:eastAsia="Calibri"/>
+          <w:b/>
+          <w:i w:val="0"/>
+          <w:sz w:val="22"/>
+        </w:rPr>
+        <w:t>1:1 #2 (28/08)</w:t>
+      </w:r>
+      <w:r>
+        <w:rPr>
+          <w:rFonts w:ascii="Calibri" w:hAnsi="Calibri" w:eastAsia="Calibri"/>
+          <w:b w:val="0"/>
+          <w:i w:val="0"/>
+          <w:sz w:val="22"/>
+        </w:rPr>
+        <w:t xml:space="preserve"> em </w:t>
       </w:r>
       <w:r>
         <w:rPr>
@@ -4604,120 +5131,54 @@
           <w:color w:val="333333"/>
           <w:sz w:val="18"/>
         </w:rPr>
-        <w:t>people-lead/ana/09-autorreflexao-passo-a-passo.md</w:t>
-      </w:r>
-    </w:p>
-    <w:p>
-      <w:pPr>
-        <w:pStyle w:val="ListBullet"/>
-      </w:pPr>
-      <w:r>
-        <w:rPr>
-          <w:rFonts w:ascii="Calibri" w:hAnsi="Calibri" w:eastAsia="Calibri"/>
-          <w:b w:val="0"/>
-          <w:i w:val="0"/>
-          <w:sz w:val="22"/>
-        </w:rPr>
-        <w:t xml:space="preserve">Word: </w:t>
-      </w:r>
-      <w:r>
-        <w:rPr>
-          <w:rFonts w:ascii="Consolas" w:hAnsi="Consolas" w:eastAsia="Consolas"/>
-          <w:b w:val="0"/>
-          <w:i w:val="0"/>
-          <w:color w:val="333333"/>
-          <w:sz w:val="18"/>
-        </w:rPr>
-        <w:t>DOCS-PEOPLE-LEAD/Ana-Karina/05-Autorreflexao-passo-a-passo.docx</w:t>
-      </w:r>
-    </w:p>
-    <w:p>
-      <w:r>
-        <w:rPr>
-          <w:rFonts w:ascii="Calibri" w:hAnsi="Calibri" w:eastAsia="Calibri"/>
-          <w:b w:val="0"/>
-          <w:i w:val="0"/>
-          <w:sz w:val="22"/>
-        </w:rPr>
-        <w:t xml:space="preserve">Resumo do caminho: Priorities Homepage → </w:t>
-      </w:r>
+        <w:t>10-resumo-call-2.md</w:t>
+      </w:r>
+      <w:r>
+        <w:rPr>
+          <w:rFonts w:ascii="Calibri" w:hAnsi="Calibri" w:eastAsia="Calibri"/>
+          <w:b w:val="0"/>
+          <w:i w:val="0"/>
+          <w:sz w:val="22"/>
+        </w:rPr>
+        <w:t>.</w:t>
+      </w:r>
+    </w:p>
+    <w:p>
+      <w:r>
+        <w:br w:type="page"/>
+      </w:r>
+    </w:p>
+    <w:p>
+      <w:pPr>
+        <w:pStyle w:val="Heading1"/>
+      </w:pPr>
+      <w:r>
+        <w:t>3. Resumo da 1:1 #2 (28/08/2026)</w:t>
+      </w:r>
+    </w:p>
+    <w:p>
+      <w:pPr>
+        <w:ind w:left="425"/>
+      </w:pPr>
       <w:r>
         <w:rPr>
           <w:rFonts w:ascii="Calibri" w:hAnsi="Calibri" w:eastAsia="Calibri"/>
           <w:b/>
           <w:i w:val="0"/>
-          <w:sz w:val="22"/>
-        </w:rPr>
-        <w:t>Edit &gt;</w:t>
-      </w:r>
-      <w:r>
-        <w:rPr>
-          <w:rFonts w:ascii="Calibri" w:hAnsi="Calibri" w:eastAsia="Calibri"/>
-          <w:b w:val="0"/>
-          <w:i w:val="0"/>
-          <w:sz w:val="22"/>
-        </w:rPr>
-        <w:t xml:space="preserve"> → </w:t>
-      </w:r>
-      <w:r>
-        <w:rPr>
-          <w:rFonts w:ascii="Calibri" w:hAnsi="Calibri" w:eastAsia="Calibri"/>
-          <w:b/>
-          <w:i w:val="0"/>
-          <w:sz w:val="22"/>
-        </w:rPr>
-        <w:t>Submeta e Refleta</w:t>
-      </w:r>
-      <w:r>
-        <w:rPr>
-          <w:rFonts w:ascii="Calibri" w:hAnsi="Calibri" w:eastAsia="Calibri"/>
-          <w:b w:val="0"/>
-          <w:i w:val="0"/>
-          <w:sz w:val="22"/>
-        </w:rPr>
-        <w:t xml:space="preserve"> → colar reflexão → slider → Atualidade (máx. 150) → </w:t>
-      </w:r>
-      <w:r>
-        <w:rPr>
-          <w:rFonts w:ascii="Calibri" w:hAnsi="Calibri" w:eastAsia="Calibri"/>
-          <w:b/>
-          <w:i w:val="0"/>
-          <w:sz w:val="22"/>
-        </w:rPr>
-        <w:t>Enviar</w:t>
-      </w:r>
-      <w:r>
-        <w:rPr>
-          <w:rFonts w:ascii="Calibri" w:hAnsi="Calibri" w:eastAsia="Calibri"/>
-          <w:b w:val="0"/>
-          <w:i w:val="0"/>
-          <w:sz w:val="22"/>
-        </w:rPr>
-        <w:t>.</w:t>
-      </w:r>
-    </w:p>
-    <w:p>
-      <w:r>
-        <w:rPr>
-          <w:rFonts w:ascii="Calibri" w:hAnsi="Calibri" w:eastAsia="Calibri"/>
-          <w:b w:val="0"/>
-          <w:i w:val="0"/>
-          <w:sz w:val="22"/>
-        </w:rPr>
-        <w:t>Agrupe as 7 metas em 4 categorias antes de refletir.</w:t>
-      </w:r>
-    </w:p>
-    <w:p>
-      <w:r>
-        <w:br w:type="page"/>
-      </w:r>
-    </w:p>
-    <w:p>
-      <w:pPr>
-        <w:pStyle w:val="Heading1"/>
-      </w:pPr>
-      <w:r>
-        <w:t>3. Resumo da 1:1 #2 (28/08/2026)</w:t>
+          <w:color w:val="555555"/>
+          <w:sz w:val="22"/>
+        </w:rPr>
+        <w:t>Uso interno People Lead</w:t>
+      </w:r>
+      <w:r>
+        <w:rPr>
+          <w:rFonts w:ascii="Calibri" w:hAnsi="Calibri" w:eastAsia="Calibri"/>
+          <w:b w:val="0"/>
+          <w:i/>
+          <w:color w:val="555555"/>
+          <w:sz w:val="22"/>
+        </w:rPr>
+        <w:t xml:space="preserve"> — histórico da conversa. Não enviado à Ana.</w:t>
       </w:r>
     </w:p>
     <w:p>
@@ -6537,32 +6998,83 @@
         <w:pStyle w:val="Heading3"/>
       </w:pPr>
       <w:r>
-        <w:t>Ajuda para preencher a Autorreflexão (ABCD)</w:t>
-      </w:r>
-    </w:p>
-    <w:p>
-      <w:r>
-        <w:rPr>
-          <w:rFonts w:ascii="Calibri" w:hAnsi="Calibri" w:eastAsia="Calibri"/>
-          <w:b w:val="0"/>
-          <w:i w:val="0"/>
-          <w:sz w:val="22"/>
-        </w:rPr>
-        <w:t>Doc com passo a passo + textos atualizados (homologação + agentes):</w:t>
-      </w:r>
-    </w:p>
-    <w:p>
-      <w:pPr>
-        <w:pStyle w:val="ListBullet"/>
-      </w:pPr>
-      <w:r>
-        <w:rPr>
-          <w:rFonts w:ascii="Calibri" w:hAnsi="Calibri" w:eastAsia="Calibri"/>
-          <w:b w:val="0"/>
-          <w:i w:val="0"/>
-          <w:sz w:val="22"/>
-        </w:rPr>
-        <w:t xml:space="preserve">Markdown: </w:t>
+        <w:t>Notas PL — Workday ABCD</w:t>
+      </w:r>
+    </w:p>
+    <w:p>
+      <w:r>
+        <w:rPr>
+          <w:rFonts w:ascii="Calibri" w:hAnsi="Calibri" w:eastAsia="Calibri"/>
+          <w:b w:val="0"/>
+          <w:i w:val="0"/>
+          <w:sz w:val="22"/>
+        </w:rPr>
+        <w:t xml:space="preserve">Orientação </w:t>
+      </w:r>
+      <w:r>
+        <w:rPr>
+          <w:rFonts w:ascii="Calibri" w:hAnsi="Calibri" w:eastAsia="Calibri"/>
+          <w:b/>
+          <w:i w:val="0"/>
+          <w:sz w:val="22"/>
+        </w:rPr>
+        <w:t>verbal</w:t>
+      </w:r>
+      <w:r>
+        <w:rPr>
+          <w:rFonts w:ascii="Calibri" w:hAnsi="Calibri" w:eastAsia="Calibri"/>
+          <w:b w:val="0"/>
+          <w:i w:val="0"/>
+          <w:sz w:val="22"/>
+        </w:rPr>
+        <w:t xml:space="preserve"> na call; </w:t>
+      </w:r>
+      <w:r>
+        <w:rPr>
+          <w:rFonts w:ascii="Calibri" w:hAnsi="Calibri" w:eastAsia="Calibri"/>
+          <w:b/>
+          <w:i w:val="0"/>
+          <w:sz w:val="22"/>
+        </w:rPr>
+        <w:t>guia escrito não enviado</w:t>
+      </w:r>
+      <w:r>
+        <w:rPr>
+          <w:rFonts w:ascii="Calibri" w:hAnsi="Calibri" w:eastAsia="Calibri"/>
+          <w:b w:val="0"/>
+          <w:i w:val="0"/>
+          <w:sz w:val="22"/>
+        </w:rPr>
+        <w:t xml:space="preserve"> à Ana. Autorreflexão: </w:t>
+      </w:r>
+      <w:r>
+        <w:rPr>
+          <w:rFonts w:ascii="Calibri" w:hAnsi="Calibri" w:eastAsia="Calibri"/>
+          <w:b/>
+          <w:i w:val="0"/>
+          <w:sz w:val="22"/>
+        </w:rPr>
+        <w:t>pendente</w:t>
+      </w:r>
+      <w:r>
+        <w:rPr>
+          <w:rFonts w:ascii="Calibri" w:hAnsi="Calibri" w:eastAsia="Calibri"/>
+          <w:b w:val="0"/>
+          <w:i w:val="0"/>
+          <w:sz w:val="22"/>
+        </w:rPr>
+        <w:t xml:space="preserve"> (28/08).</w:t>
+      </w:r>
+    </w:p>
+    <w:p>
+      <w:r>
+        <w:rPr>
+          <w:rFonts w:ascii="Calibri" w:hAnsi="Calibri" w:eastAsia="Calibri"/>
+          <w:b w:val="0"/>
+          <w:i w:val="0"/>
+          <w:sz w:val="22"/>
+        </w:rPr>
+        <w:t xml:space="preserve">Referência interna: </w:t>
       </w:r>
       <w:r>
         <w:rPr>
@@ -6572,221 +7084,54 @@
           <w:color w:val="333333"/>
           <w:sz w:val="18"/>
         </w:rPr>
-        <w:t>people-lead/ana/09-autorreflexao-passo-a-passo.md</w:t>
-      </w:r>
-    </w:p>
-    <w:p>
-      <w:pPr>
-        <w:pStyle w:val="ListBullet"/>
-      </w:pPr>
-      <w:r>
-        <w:rPr>
-          <w:rFonts w:ascii="Calibri" w:hAnsi="Calibri" w:eastAsia="Calibri"/>
-          <w:b w:val="0"/>
-          <w:i w:val="0"/>
-          <w:sz w:val="22"/>
-        </w:rPr>
-        <w:t xml:space="preserve">Word: </w:t>
-      </w:r>
-      <w:r>
-        <w:rPr>
-          <w:rFonts w:ascii="Consolas" w:hAnsi="Consolas" w:eastAsia="Consolas"/>
-          <w:b w:val="0"/>
-          <w:i w:val="0"/>
-          <w:color w:val="333333"/>
-          <w:sz w:val="18"/>
-        </w:rPr>
-        <w:t>DOCS-PEOPLE-LEAD/Ana-Karina/05-Autorreflexao-passo-a-passo.docx</w:t>
-      </w:r>
-    </w:p>
-    <w:p>
-      <w:r>
-        <w:rPr>
-          <w:rFonts w:ascii="Calibri" w:hAnsi="Calibri" w:eastAsia="Calibri"/>
-          <w:b w:val="0"/>
-          <w:i w:val="0"/>
-          <w:sz w:val="22"/>
-        </w:rPr>
-        <w:t xml:space="preserve">Resumo: Priorities Homepage → </w:t>
-      </w:r>
+        <w:t>09-autorreflexao-passo-a-passo.md</w:t>
+      </w:r>
+      <w:r>
+        <w:rPr>
+          <w:rFonts w:ascii="Calibri" w:hAnsi="Calibri" w:eastAsia="Calibri"/>
+          <w:b w:val="0"/>
+          <w:i w:val="0"/>
+          <w:sz w:val="22"/>
+        </w:rPr>
+        <w:t xml:space="preserve"> — usar só para cobrança ou cruzamento após submissão dela no Workday.</w:t>
+      </w:r>
+    </w:p>
+    <w:p>
+      <w:r>
+        <w:br w:type="page"/>
+      </w:r>
+    </w:p>
+    <w:p>
+      <w:pPr>
+        <w:pStyle w:val="Heading1"/>
+      </w:pPr>
+      <w:r>
+        <w:t>4. Histórico completo de 1:1s</w:t>
+      </w:r>
+    </w:p>
+    <w:p>
+      <w:pPr>
+        <w:ind w:left="425"/>
+      </w:pPr>
       <w:r>
         <w:rPr>
           <w:rFonts w:ascii="Calibri" w:hAnsi="Calibri" w:eastAsia="Calibri"/>
           <w:b/>
           <w:i w:val="0"/>
-          <w:sz w:val="22"/>
-        </w:rPr>
-        <w:t>Edit &gt;</w:t>
-      </w:r>
-      <w:r>
-        <w:rPr>
-          <w:rFonts w:ascii="Calibri" w:hAnsi="Calibri" w:eastAsia="Calibri"/>
-          <w:b w:val="0"/>
-          <w:i w:val="0"/>
-          <w:sz w:val="22"/>
-        </w:rPr>
-        <w:t xml:space="preserve"> → </w:t>
-      </w:r>
-      <w:r>
-        <w:rPr>
-          <w:rFonts w:ascii="Calibri" w:hAnsi="Calibri" w:eastAsia="Calibri"/>
-          <w:b/>
-          <w:i w:val="0"/>
-          <w:sz w:val="22"/>
-        </w:rPr>
-        <w:t>Submeta e Refleta</w:t>
-      </w:r>
-      <w:r>
-        <w:rPr>
-          <w:rFonts w:ascii="Calibri" w:hAnsi="Calibri" w:eastAsia="Calibri"/>
-          <w:b w:val="0"/>
-          <w:i w:val="0"/>
-          <w:sz w:val="22"/>
-        </w:rPr>
-        <w:t xml:space="preserve"> → colar reflexão → slider → Atualidade (máx. </w:t>
-      </w:r>
-      <w:r>
-        <w:rPr>
-          <w:rFonts w:ascii="Calibri" w:hAnsi="Calibri" w:eastAsia="Calibri"/>
-          <w:b/>
-          <w:i w:val="0"/>
-          <w:sz w:val="22"/>
-        </w:rPr>
-        <w:t>150</w:t>
-      </w:r>
-      <w:r>
-        <w:rPr>
-          <w:rFonts w:ascii="Calibri" w:hAnsi="Calibri" w:eastAsia="Calibri"/>
-          <w:b w:val="0"/>
-          <w:i w:val="0"/>
-          <w:sz w:val="22"/>
-        </w:rPr>
-        <w:t xml:space="preserve"> caracteres) → </w:t>
-      </w:r>
-      <w:r>
-        <w:rPr>
-          <w:rFonts w:ascii="Calibri" w:hAnsi="Calibri" w:eastAsia="Calibri"/>
-          <w:b/>
-          <w:i w:val="0"/>
-          <w:sz w:val="22"/>
-        </w:rPr>
-        <w:t>Enviar</w:t>
-      </w:r>
-      <w:r>
-        <w:rPr>
-          <w:rFonts w:ascii="Calibri" w:hAnsi="Calibri" w:eastAsia="Calibri"/>
-          <w:b w:val="0"/>
-          <w:i w:val="0"/>
-          <w:sz w:val="22"/>
-        </w:rPr>
-        <w:t>.</w:t>
-      </w:r>
-    </w:p>
-    <w:p>
-      <w:r>
-        <w:rPr>
-          <w:rFonts w:ascii="Calibri" w:hAnsi="Calibri" w:eastAsia="Calibri"/>
-          <w:b/>
-          <w:i w:val="0"/>
-          <w:sz w:val="22"/>
-        </w:rPr>
-        <w:t>Seu prazo (People Lead):</w:t>
-      </w:r>
-      <w:r>
-        <w:rPr>
-          <w:rFonts w:ascii="Calibri" w:hAnsi="Calibri" w:eastAsia="Calibri"/>
-          <w:b w:val="0"/>
-          <w:i w:val="0"/>
-          <w:sz w:val="22"/>
-        </w:rPr>
-        <w:t xml:space="preserve"> input </w:t>
-      </w:r>
-      <w:r>
-        <w:rPr>
-          <w:rFonts w:ascii="Calibri" w:hAnsi="Calibri" w:eastAsia="Calibri"/>
-          <w:b/>
-          <w:i w:val="0"/>
-          <w:sz w:val="22"/>
-        </w:rPr>
-        <w:t>ABCD Form</w:t>
-      </w:r>
-      <w:r>
-        <w:rPr>
-          <w:rFonts w:ascii="Calibri" w:hAnsi="Calibri" w:eastAsia="Calibri"/>
-          <w:b w:val="0"/>
-          <w:i w:val="0"/>
-          <w:sz w:val="22"/>
-        </w:rPr>
-        <w:t xml:space="preserve"> até </w:t>
-      </w:r>
-      <w:r>
-        <w:rPr>
-          <w:rFonts w:ascii="Calibri" w:hAnsi="Calibri" w:eastAsia="Calibri"/>
-          <w:b/>
-          <w:i w:val="0"/>
-          <w:sz w:val="22"/>
-        </w:rPr>
-        <w:t>11/09</w:t>
-      </w:r>
-      <w:r>
-        <w:rPr>
-          <w:rFonts w:ascii="Calibri" w:hAnsi="Calibri" w:eastAsia="Calibri"/>
-          <w:b w:val="0"/>
-          <w:i w:val="0"/>
-          <w:sz w:val="22"/>
-        </w:rPr>
-        <w:t xml:space="preserve"> — </w:t>
-      </w:r>
-      <w:r>
-        <w:rPr>
-          <w:rFonts w:ascii="Consolas" w:hAnsi="Consolas" w:eastAsia="Consolas"/>
-          <w:b w:val="0"/>
-          <w:i w:val="0"/>
-          <w:color w:val="333333"/>
-          <w:sz w:val="18"/>
-        </w:rPr>
-        <w:t>11-dados-oficiais-rh-ciclo.md</w:t>
-      </w:r>
-      <w:r>
-        <w:rPr>
-          <w:rFonts w:ascii="Calibri" w:hAnsi="Calibri" w:eastAsia="Calibri"/>
-          <w:b w:val="0"/>
-          <w:i w:val="0"/>
-          <w:sz w:val="22"/>
-        </w:rPr>
-        <w:t xml:space="preserve"> / </w:t>
-      </w:r>
-      <w:r>
-        <w:rPr>
-          <w:rFonts w:ascii="Consolas" w:hAnsi="Consolas" w:eastAsia="Consolas"/>
-          <w:b w:val="0"/>
-          <w:i w:val="0"/>
-          <w:color w:val="333333"/>
-          <w:sz w:val="18"/>
-        </w:rPr>
-        <w:t>07-Dados-Oficiais-RH-Ciclo.docx</w:t>
-      </w:r>
-      <w:r>
-        <w:rPr>
-          <w:rFonts w:ascii="Calibri" w:hAnsi="Calibri" w:eastAsia="Calibri"/>
-          <w:b w:val="0"/>
-          <w:i w:val="0"/>
-          <w:sz w:val="22"/>
-        </w:rPr>
-        <w:t>.</w:t>
-      </w:r>
-    </w:p>
-    <w:p>
-      <w:r>
-        <w:br w:type="page"/>
-      </w:r>
-    </w:p>
-    <w:p>
-      <w:pPr>
-        <w:pStyle w:val="Heading1"/>
-      </w:pPr>
-      <w:r>
-        <w:t>4. Histórico completo de 1:1s</w:t>
+          <w:color w:val="555555"/>
+          <w:sz w:val="22"/>
+        </w:rPr>
+        <w:t>Uso interno People Lead</w:t>
+      </w:r>
+      <w:r>
+        <w:rPr>
+          <w:rFonts w:ascii="Calibri" w:hAnsi="Calibri" w:eastAsia="Calibri"/>
+          <w:b w:val="0"/>
+          <w:i/>
+          <w:color w:val="555555"/>
+          <w:sz w:val="22"/>
+        </w:rPr>
+        <w:t xml:space="preserve"> — registro das conversas. Não enviado à Ana.</w:t>
       </w:r>
     </w:p>
     <w:p>
@@ -22287,7 +22632,7 @@
         <w:pStyle w:val="Heading3"/>
       </w:pPr>
       <w:r>
-        <w:t>Prioridades FY26 + ABCD Reflections · prazo 28/08</w:t>
+        <w:t>Referência interna PL — prioridades FY26 + ABCD · prazo 28/08</w:t>
       </w:r>
     </w:p>
     <w:p>
@@ -22302,7 +22647,7 @@
           <w:color w:val="555555"/>
           <w:sz w:val="22"/>
         </w:rPr>
-        <w:t>Status:</w:t>
+        <w:t>Uso interno People Lead</w:t>
       </w:r>
       <w:r>
         <w:rPr>
@@ -22312,7 +22657,7 @@
           <w:color w:val="555555"/>
           <w:sz w:val="22"/>
         </w:rPr>
-        <w:t xml:space="preserve"> autorreflexão </w:t>
+        <w:t xml:space="preserve"> — não documento enviado à Ana.   </w:t>
       </w:r>
       <w:r>
         <w:rPr>
@@ -22322,7 +22667,7 @@
           <w:color w:val="555555"/>
           <w:sz w:val="22"/>
         </w:rPr>
-        <w:t>não submetida</w:t>
+        <w:t>Status:</w:t>
       </w:r>
       <w:r>
         <w:rPr>
@@ -22332,7 +22677,27 @@
           <w:color w:val="555555"/>
           <w:sz w:val="22"/>
         </w:rPr>
-        <w:t xml:space="preserve"> — Ana ainda não enviou ao People Lead.</w:t>
+        <w:t xml:space="preserve"> autorreflexão </w:t>
+      </w:r>
+      <w:r>
+        <w:rPr>
+          <w:rFonts w:ascii="Calibri" w:hAnsi="Calibri" w:eastAsia="Calibri"/>
+          <w:b/>
+          <w:i w:val="0"/>
+          <w:color w:val="555555"/>
+          <w:sz w:val="22"/>
+        </w:rPr>
+        <w:t>não submetida</w:t>
+      </w:r>
+      <w:r>
+        <w:rPr>
+          <w:rFonts w:ascii="Calibri" w:hAnsi="Calibri" w:eastAsia="Calibri"/>
+          <w:b w:val="0"/>
+          <w:i/>
+          <w:color w:val="555555"/>
+          <w:sz w:val="22"/>
+        </w:rPr>
+        <w:t xml:space="preserve"> (28/08).</w:t>
       </w:r>
     </w:p>
     <w:p>
@@ -22354,7 +22719,7 @@
           <w:i w:val="0"/>
           <w:sz w:val="22"/>
         </w:rPr>
-        <w:t xml:space="preserve">Use este texto como </w:t>
+        <w:t xml:space="preserve">Use como </w:t>
       </w:r>
       <w:r>
         <w:rPr>
@@ -22363,16 +22728,34 @@
           <w:i w:val="0"/>
           <w:sz w:val="22"/>
         </w:rPr>
-        <w:t>base para colar</w:t>
-      </w:r>
-      <w:r>
-        <w:rPr>
-          <w:rFonts w:ascii="Calibri" w:hAnsi="Calibri" w:eastAsia="Calibri"/>
-          <w:b w:val="0"/>
-          <w:i w:val="0"/>
-          <w:sz w:val="22"/>
-        </w:rPr>
-        <w:t xml:space="preserve"> no Workday. Ajuste entregas reais do app e Enterprise ID dos revisores antes de enviar.</w:t>
+        <w:t>referência sua</w:t>
+      </w:r>
+      <w:r>
+        <w:rPr>
+          <w:rFonts w:ascii="Calibri" w:hAnsi="Calibri" w:eastAsia="Calibri"/>
+          <w:b w:val="0"/>
+          <w:i w:val="0"/>
+          <w:sz w:val="22"/>
+        </w:rPr>
+        <w:t xml:space="preserve"> (orientação verbal ou cruzamento depois que ela submeter). A Ana preenche no </w:t>
+      </w:r>
+      <w:r>
+        <w:rPr>
+          <w:rFonts w:ascii="Calibri" w:hAnsi="Calibri" w:eastAsia="Calibri"/>
+          <w:b/>
+          <w:i w:val="0"/>
+          <w:sz w:val="22"/>
+        </w:rPr>
+        <w:t>Workday dela</w:t>
+      </w:r>
+      <w:r>
+        <w:rPr>
+          <w:rFonts w:ascii="Calibri" w:hAnsi="Calibri" w:eastAsia="Calibri"/>
+          <w:b w:val="0"/>
+          <w:i w:val="0"/>
+          <w:sz w:val="22"/>
+        </w:rPr>
+        <w:t>.</w:t>
       </w:r>
     </w:p>
     <w:p>
@@ -24166,7 +24549,7 @@
         <w:pStyle w:val="Heading3"/>
       </w:pPr>
       <w:r>
-        <w:t>Checklist final (enviar até 28/08)</w:t>
+        <w:t>Checklist PL (acompanhar — doc interno, não enviado à Ana)</w:t>
       </w:r>
     </w:p>
     <w:p>
@@ -24180,7 +24563,16 @@
           <w:i w:val="0"/>
           <w:sz w:val="22"/>
         </w:rPr>
-        <w:t>☐ 4 prioridades (não 7) com categoria FY26</w:t>
+        <w:t xml:space="preserve">☐ Ana submeteu autorreflexão ABCD — </w:t>
+      </w:r>
+      <w:r>
+        <w:rPr>
+          <w:rFonts w:ascii="Calibri" w:hAnsi="Calibri" w:eastAsia="Calibri"/>
+          <w:b/>
+          <w:i w:val="0"/>
+          <w:sz w:val="22"/>
+        </w:rPr>
+        <w:t>NÃO (28/08)</w:t>
       </w:r>
     </w:p>
     <w:p>
@@ -24194,7 +24586,25 @@
           <w:i w:val="0"/>
           <w:sz w:val="22"/>
         </w:rPr>
-        <w:t>☐ Bradesco preenchido nas de Cliente</w:t>
+        <w:t xml:space="preserve">☐ Orientação Workday foi </w:t>
+      </w:r>
+      <w:r>
+        <w:rPr>
+          <w:rFonts w:ascii="Calibri" w:hAnsi="Calibri" w:eastAsia="Calibri"/>
+          <w:b/>
+          <w:i w:val="0"/>
+          <w:sz w:val="22"/>
+        </w:rPr>
+        <w:t>verbal</w:t>
+      </w:r>
+      <w:r>
+        <w:rPr>
+          <w:rFonts w:ascii="Calibri" w:hAnsi="Calibri" w:eastAsia="Calibri"/>
+          <w:b w:val="0"/>
+          <w:i w:val="0"/>
+          <w:sz w:val="22"/>
+        </w:rPr>
+        <w:t xml:space="preserve"> na call #2 (sem guia repassado)</w:t>
       </w:r>
     </w:p>
     <w:p>
@@ -24208,7 +24618,7 @@
           <w:i w:val="0"/>
           <w:sz w:val="22"/>
         </w:rPr>
-        <w:t>☐ Revisores com Enterprise ID</w:t>
+        <w:t>☐ Quando submeter: cruzar com histórico + rascunho PL (11/09)</w:t>
       </w:r>
     </w:p>
     <w:p>
@@ -24222,7 +24632,15 @@
           <w:i w:val="0"/>
           <w:sz w:val="22"/>
         </w:rPr>
-        <w:t>☐ Reflexão ABCD enviada nas 4</w:t>
+        <w:t>☐ Feedback Rafael Coloda / Jessica</w:t>
+      </w:r>
+    </w:p>
+    <w:p>
+      <w:pPr>
+        <w:pStyle w:val="Heading3"/>
+      </w:pPr>
+      <w:r>
+        <w:t>O que NÃO fazer</w:t>
       </w:r>
     </w:p>
     <w:p>
@@ -24236,7 +24654,7 @@
           <w:i w:val="0"/>
           <w:sz w:val="22"/>
         </w:rPr>
-        <w:t>☐ Copilot com exemplo concreto na reflexão de IA</w:t>
+        <w:t>Manter 7 prioridades soltas no FY26.</w:t>
       </w:r>
     </w:p>
     <w:p>
@@ -24250,7 +24668,7 @@
           <w:i w:val="0"/>
           <w:sz w:val="22"/>
         </w:rPr>
-        <w:t>☐ Inglês C1+ citado como resultado (não como meta aberta)</w:t>
+        <w:t>Deixar Swift como prioridade principal deste fechamento.</w:t>
       </w:r>
     </w:p>
     <w:p>
@@ -24264,15 +24682,25 @@
           <w:i w:val="0"/>
           <w:sz w:val="22"/>
         </w:rPr>
-        <w:t>☐ Avisar Jônatas: “Workday + ABCD enviados”</w:t>
-      </w:r>
-    </w:p>
-    <w:p>
-      <w:pPr>
-        <w:pStyle w:val="Heading3"/>
-      </w:pPr>
-      <w:r>
-        <w:t>O que NÃO fazer</w:t>
+        <w:t xml:space="preserve">Escrever certificação de IA como se o badge já existisse — foque no </w:t>
+      </w:r>
+      <w:r>
+        <w:rPr>
+          <w:rFonts w:ascii="Calibri" w:hAnsi="Calibri" w:eastAsia="Calibri"/>
+          <w:b/>
+          <w:i w:val="0"/>
+          <w:sz w:val="22"/>
+        </w:rPr>
+        <w:t>uso aplicado</w:t>
+      </w:r>
+      <w:r>
+        <w:rPr>
+          <w:rFonts w:ascii="Calibri" w:hAnsi="Calibri" w:eastAsia="Calibri"/>
+          <w:b w:val="0"/>
+          <w:i w:val="0"/>
+          <w:sz w:val="22"/>
+        </w:rPr>
+        <w:t>.</w:t>
       </w:r>
     </w:p>
     <w:p>
@@ -24286,35 +24714,7 @@
           <w:i w:val="0"/>
           <w:sz w:val="22"/>
         </w:rPr>
-        <w:t>Manter 7 prioridades soltas no FY26.</w:t>
-      </w:r>
-    </w:p>
-    <w:p>
-      <w:pPr>
-        <w:pStyle w:val="ListBullet"/>
-      </w:pPr>
-      <w:r>
-        <w:rPr>
-          <w:rFonts w:ascii="Calibri" w:hAnsi="Calibri" w:eastAsia="Calibri"/>
-          <w:b w:val="0"/>
-          <w:i w:val="0"/>
-          <w:sz w:val="22"/>
-        </w:rPr>
-        <w:t>Deixar Swift como prioridade principal deste fechamento.</w:t>
-      </w:r>
-    </w:p>
-    <w:p>
-      <w:pPr>
-        <w:pStyle w:val="ListBullet"/>
-      </w:pPr>
-      <w:r>
-        <w:rPr>
-          <w:rFonts w:ascii="Calibri" w:hAnsi="Calibri" w:eastAsia="Calibri"/>
-          <w:b w:val="0"/>
-          <w:i w:val="0"/>
-          <w:sz w:val="22"/>
-        </w:rPr>
-        <w:t xml:space="preserve">Escrever certificação de IA como se o badge já existisse — foque no </w:t>
+        <w:t xml:space="preserve">Esquecer de </w:t>
       </w:r>
       <w:r>
         <w:rPr>
@@ -24323,7 +24723,7 @@
           <w:i w:val="0"/>
           <w:sz w:val="22"/>
         </w:rPr>
-        <w:t>uso aplicado</w:t>
+        <w:t>Enviar</w:t>
       </w:r>
       <w:r>
         <w:rPr>
@@ -24336,18 +24736,19 @@
       </w:r>
     </w:p>
     <w:p>
-      <w:pPr>
-        <w:pStyle w:val="ListBullet"/>
-      </w:pPr>
-      <w:r>
-        <w:rPr>
-          <w:rFonts w:ascii="Calibri" w:hAnsi="Calibri" w:eastAsia="Calibri"/>
-          <w:b w:val="0"/>
-          <w:i w:val="0"/>
-          <w:sz w:val="22"/>
-        </w:rPr>
-        <w:t xml:space="preserve">Esquecer de </w:t>
-      </w:r>
+      <w:r>
+        <w:br w:type="page"/>
+      </w:r>
+    </w:p>
+    <w:p>
+      <w:pPr>
+        <w:pStyle w:val="Heading1"/>
+      </w:pPr>
+      <w:r>
+        <w:t>12. Autorreflexão ABCD — passo a passo (Ana)</w:t>
+      </w:r>
+    </w:p>
+    <w:p>
       <w:r>
         <w:rPr>
           <w:rFonts w:ascii="Calibri" w:hAnsi="Calibri" w:eastAsia="Calibri"/>
@@ -24355,40 +24756,18 @@
           <w:i w:val="0"/>
           <w:sz w:val="22"/>
         </w:rPr>
-        <w:t>Enviar</w:t>
-      </w:r>
-      <w:r>
-        <w:rPr>
-          <w:rFonts w:ascii="Calibri" w:hAnsi="Calibri" w:eastAsia="Calibri"/>
-          <w:b w:val="0"/>
-          <w:i w:val="0"/>
-          <w:sz w:val="22"/>
-        </w:rPr>
-        <w:t>.</w:t>
-      </w:r>
-    </w:p>
-    <w:p>
-      <w:r>
-        <w:br w:type="page"/>
-      </w:r>
-    </w:p>
-    <w:p>
-      <w:pPr>
-        <w:pStyle w:val="Heading1"/>
-      </w:pPr>
-      <w:r>
-        <w:t>12. Autorreflexão ABCD — passo a passo (Ana)</w:t>
-      </w:r>
-    </w:p>
-    <w:p>
-      <w:r>
-        <w:rPr>
-          <w:rFonts w:ascii="Calibri" w:hAnsi="Calibri" w:eastAsia="Calibri"/>
-          <w:b/>
-          <w:i w:val="0"/>
-          <w:sz w:val="22"/>
-        </w:rPr>
-        <w:t>Cliente: BANCO BRADESCO · Associate, Mobile · Prazo: 28/08</w:t>
+        <w:t>Referência interna do People Lead — não enviada à Ana</w:t>
+      </w:r>
+    </w:p>
+    <w:p>
+      <w:r>
+        <w:rPr>
+          <w:rFonts w:ascii="Calibri" w:hAnsi="Calibri" w:eastAsia="Calibri"/>
+          <w:b w:val="0"/>
+          <w:i w:val="0"/>
+          <w:sz w:val="22"/>
+        </w:rPr>
+        <w:t>Cliente: BANCO BRADESCO · Associate, Mobile · Prazo profissional: 28/08</w:t>
       </w:r>
     </w:p>
     <w:p>
@@ -24444,7 +24823,7 @@
           <w:color w:val="555555"/>
           <w:sz w:val="22"/>
         </w:rPr>
-        <w:t xml:space="preserve"> a autorreflexão no Workday e </w:t>
+        <w:t xml:space="preserve"> no Workday. Orientação na call #2 foi </w:t>
       </w:r>
       <w:r>
         <w:rPr>
@@ -24454,7 +24833,7 @@
           <w:color w:val="555555"/>
           <w:sz w:val="22"/>
         </w:rPr>
-        <w:t>não enviou</w:t>
+        <w:t>verbal</w:t>
       </w:r>
       <w:r>
         <w:rPr>
@@ -24464,7 +24843,47 @@
           <w:color w:val="555555"/>
           <w:sz w:val="22"/>
         </w:rPr>
-        <w:t xml:space="preserve"> ao People Lead.   Este doc é o guia para ela preencher — textos prontos abaixo.</w:t>
+        <w:t xml:space="preserve">; este arquivo é só </w:t>
+      </w:r>
+      <w:r>
+        <w:rPr>
+          <w:rFonts w:ascii="Calibri" w:hAnsi="Calibri" w:eastAsia="Calibri"/>
+          <w:b/>
+          <w:i w:val="0"/>
+          <w:color w:val="555555"/>
+          <w:sz w:val="22"/>
+        </w:rPr>
+        <w:t>seu histórico/referência</w:t>
+      </w:r>
+      <w:r>
+        <w:rPr>
+          <w:rFonts w:ascii="Calibri" w:hAnsi="Calibri" w:eastAsia="Calibri"/>
+          <w:b w:val="0"/>
+          <w:i/>
+          <w:color w:val="555555"/>
+          <w:sz w:val="22"/>
+        </w:rPr>
+        <w:t xml:space="preserve"> para cobrança ou apoio pontual — não repassar como documento para ela.   Textos abaixo: base se precisar </w:t>
+      </w:r>
+      <w:r>
+        <w:rPr>
+          <w:rFonts w:ascii="Calibri" w:hAnsi="Calibri" w:eastAsia="Calibri"/>
+          <w:b/>
+          <w:i w:val="0"/>
+          <w:color w:val="555555"/>
+          <w:sz w:val="22"/>
+        </w:rPr>
+        <w:t>orientar de novo na call</w:t>
+      </w:r>
+      <w:r>
+        <w:rPr>
+          <w:rFonts w:ascii="Calibri" w:hAnsi="Calibri" w:eastAsia="Calibri"/>
+          <w:b w:val="0"/>
+          <w:i/>
+          <w:color w:val="555555"/>
+          <w:sz w:val="22"/>
+        </w:rPr>
+        <w:t xml:space="preserve"> ou cruzar quando ela submeter.</w:t>
       </w:r>
     </w:p>
     <w:p>
@@ -25768,7 +26187,7 @@
           <w:i w:val="0"/>
           <w:sz w:val="22"/>
         </w:rPr>
-        <w:t xml:space="preserve">☐ Avisar o People Lead (Jônatas) no Teams  </w:t>
+        <w:t>☐ Ana avisou o PL quando submeter (cobrar)</w:t>
       </w:r>
     </w:p>
     <w:p>
@@ -25869,7 +26288,7 @@
           <w:i w:val="0"/>
           <w:sz w:val="22"/>
         </w:rPr>
-        <w:t>Prazo input PL: até 11/09/2026</w:t>
+        <w:t>Uso interno People Lead — não enviado à Ana · input até 11/09/2026</w:t>
       </w:r>
     </w:p>
     <w:p>

</xml_diff>

<commit_message>
Adicionar Justificativa da Recomendação da Ana Karina
Texto para colar no Workday no tom do último ciclo (estágio),
atualizado para Associate no Bradesco: consolidar, não promover.

Co-authored-by: Jonatas Andrade <jonatasandradedeveloper@users.noreply.github.com>
</commit_message>
<xml_diff>
--- a/DOCS-PEOPLE-LEAD/Ana-Karina/00-Documento-Unico.docx
+++ b/DOCS-PEOPLE-LEAD/Ana-Karina/00-Documento-Unico.docx
@@ -563,7 +563,21 @@
           <w:i w:val="0"/>
           <w:sz w:val="22"/>
         </w:rPr>
-        <w:t>14. Orientação do ciclo (Ana Karina)</w:t>
+        <w:t>14. Justificativa da Recomendação</w:t>
+      </w:r>
+    </w:p>
+    <w:p>
+      <w:pPr>
+        <w:spacing w:after="120"/>
+      </w:pPr>
+      <w:r>
+        <w:rPr>
+          <w:rFonts w:ascii="Calibri" w:hAnsi="Calibri" w:eastAsia="Calibri"/>
+          <w:b w:val="0"/>
+          <w:i w:val="0"/>
+          <w:sz w:val="22"/>
+        </w:rPr>
+        <w:t>15. Orientação do ciclo (Ana Karina)</w:t>
       </w:r>
     </w:p>
     <w:p>
@@ -18320,6 +18334,36 @@
       <w:r>
         <w:rPr>
           <w:rFonts w:ascii="Calibri" w:hAnsi="Calibri" w:eastAsia="Calibri"/>
+          <w:b/>
+          <w:i w:val="0"/>
+          <w:sz w:val="22"/>
+        </w:rPr>
+        <w:t>Justificativa da Recomendação (pronta para colar):</w:t>
+      </w:r>
+      <w:r>
+        <w:rPr>
+          <w:rFonts w:ascii="Calibri" w:hAnsi="Calibri" w:eastAsia="Calibri"/>
+          <w:b w:val="0"/>
+          <w:i w:val="0"/>
+          <w:sz w:val="22"/>
+        </w:rPr>
+        <w:t xml:space="preserve"> </w:t>
+      </w:r>
+      <w:r>
+        <w:rPr>
+          <w:rFonts w:ascii="Consolas" w:hAnsi="Consolas" w:eastAsia="Consolas"/>
+          <w:b w:val="0"/>
+          <w:i w:val="0"/>
+          <w:color w:val="333333"/>
+          <w:sz w:val="18"/>
+        </w:rPr>
+        <w:t>15-justificativa-recomendacao.md</w:t>
+      </w:r>
+    </w:p>
+    <w:p>
+      <w:r>
+        <w:rPr>
+          <w:rFonts w:ascii="Calibri" w:hAnsi="Calibri" w:eastAsia="Calibri"/>
           <w:b w:val="0"/>
           <w:i w:val="0"/>
           <w:sz w:val="22"/>
@@ -19598,7 +19642,7 @@
           <w:i w:val="0"/>
           <w:sz w:val="22"/>
         </w:rPr>
-        <w:t xml:space="preserve">☐ Enviar material Copilot + docs </w:t>
+        <w:t xml:space="preserve">☐ Pedir feedback </w:t>
       </w:r>
       <w:r>
         <w:rPr>
@@ -19607,117 +19651,16 @@
           <w:i w:val="0"/>
           <w:sz w:val="22"/>
         </w:rPr>
-        <w:t>PUG</w:t>
-      </w:r>
-      <w:r>
-        <w:rPr>
-          <w:rFonts w:ascii="Calibri" w:hAnsi="Calibri" w:eastAsia="Calibri"/>
-          <w:b w:val="0"/>
-          <w:i w:val="0"/>
-          <w:sz w:val="22"/>
-        </w:rPr>
-        <w:t xml:space="preserve"> para Ana</w:t>
-      </w:r>
-    </w:p>
-    <w:p>
-      <w:pPr>
-        <w:pStyle w:val="ListBullet"/>
-      </w:pPr>
-      <w:r>
-        <w:rPr>
-          <w:rFonts w:ascii="Calibri" w:hAnsi="Calibri" w:eastAsia="Calibri"/>
-          <w:b w:val="0"/>
-          <w:i w:val="0"/>
-          <w:sz w:val="22"/>
-        </w:rPr>
-        <w:t xml:space="preserve">☐ Falar com </w:t>
-      </w:r>
-      <w:r>
-        <w:rPr>
-          <w:rFonts w:ascii="Calibri" w:hAnsi="Calibri" w:eastAsia="Calibri"/>
-          <w:b/>
-          <w:i w:val="0"/>
-          <w:sz w:val="22"/>
-        </w:rPr>
-        <w:t>Jessica</w:t>
-      </w:r>
-      <w:r>
-        <w:rPr>
-          <w:rFonts w:ascii="Calibri" w:hAnsi="Calibri" w:eastAsia="Calibri"/>
-          <w:b w:val="0"/>
-          <w:i w:val="0"/>
-          <w:sz w:val="22"/>
-        </w:rPr>
-        <w:t xml:space="preserve"> para feedback no Workday</w:t>
-      </w:r>
-    </w:p>
-    <w:p>
-      <w:pPr>
-        <w:pStyle w:val="ListBullet"/>
-      </w:pPr>
-      <w:r>
-        <w:rPr>
-          <w:rFonts w:ascii="Calibri" w:hAnsi="Calibri" w:eastAsia="Calibri"/>
-          <w:b w:val="0"/>
-          <w:i w:val="0"/>
-          <w:sz w:val="22"/>
-        </w:rPr>
-        <w:t>☐ Pegar e-mail da Paula (CA anterior), se ainda não chegou</w:t>
-      </w:r>
-    </w:p>
-    <w:p>
-      <w:pPr>
-        <w:pStyle w:val="ListBullet"/>
-      </w:pPr>
-      <w:r>
-        <w:rPr>
-          <w:rFonts w:ascii="Calibri" w:hAnsi="Calibri" w:eastAsia="Calibri"/>
-          <w:b w:val="0"/>
-          <w:i w:val="0"/>
-          <w:sz w:val="22"/>
-        </w:rPr>
-        <w:t xml:space="preserve">☐ Confirmar submissão da autorreflexão ABCD — </w:t>
-      </w:r>
-      <w:r>
-        <w:rPr>
-          <w:rFonts w:ascii="Calibri" w:hAnsi="Calibri" w:eastAsia="Calibri"/>
-          <w:b/>
-          <w:i w:val="0"/>
-          <w:sz w:val="22"/>
-        </w:rPr>
-        <w:t>não recebida do PL até 28/08</w:t>
-      </w:r>
-    </w:p>
-    <w:p>
-      <w:pPr>
-        <w:pStyle w:val="ListBullet"/>
-      </w:pPr>
-      <w:r>
-        <w:rPr>
-          <w:rFonts w:ascii="Calibri" w:hAnsi="Calibri" w:eastAsia="Calibri"/>
-          <w:b w:val="0"/>
-          <w:i w:val="0"/>
-          <w:sz w:val="22"/>
-        </w:rPr>
-        <w:t xml:space="preserve">☐ </w:t>
-      </w:r>
-      <w:r>
-        <w:rPr>
-          <w:rFonts w:ascii="Calibri" w:hAnsi="Calibri" w:eastAsia="Calibri"/>
-          <w:b/>
-          <w:i w:val="0"/>
-          <w:sz w:val="22"/>
-        </w:rPr>
-        <w:t>Input ABCD Form no Workday — até 11/09/2026</w:t>
-      </w:r>
-      <w:r>
-        <w:rPr>
-          <w:rFonts w:ascii="Calibri" w:hAnsi="Calibri" w:eastAsia="Calibri"/>
-          <w:b w:val="0"/>
-          <w:i w:val="0"/>
-          <w:sz w:val="22"/>
-        </w:rPr>
-        <w:t xml:space="preserve"> — usar </w:t>
+        <w:t>Rafael Coloda</w:t>
+      </w:r>
+      <w:r>
+        <w:rPr>
+          <w:rFonts w:ascii="Calibri" w:hAnsi="Calibri" w:eastAsia="Calibri"/>
+          <w:b w:val="0"/>
+          <w:i w:val="0"/>
+          <w:sz w:val="22"/>
+        </w:rPr>
+        <w:t xml:space="preserve"> (e-mail pronto em </w:t>
       </w:r>
       <w:r>
         <w:rPr>
@@ -19727,7 +19670,223 @@
           <w:color w:val="333333"/>
           <w:sz w:val="18"/>
         </w:rPr>
+        <w:t>14-pedidos-feedback.md</w:t>
+      </w:r>
+      <w:r>
+        <w:rPr>
+          <w:rFonts w:ascii="Calibri" w:hAnsi="Calibri" w:eastAsia="Calibri"/>
+          <w:b w:val="0"/>
+          <w:i w:val="0"/>
+          <w:sz w:val="22"/>
+        </w:rPr>
+        <w:t>)</w:t>
+      </w:r>
+    </w:p>
+    <w:p>
+      <w:pPr>
+        <w:pStyle w:val="ListBullet"/>
+      </w:pPr>
+      <w:r>
+        <w:rPr>
+          <w:rFonts w:ascii="Calibri" w:hAnsi="Calibri" w:eastAsia="Calibri"/>
+          <w:b w:val="0"/>
+          <w:i w:val="0"/>
+          <w:sz w:val="22"/>
+        </w:rPr>
+        <w:t xml:space="preserve">☐ Pedir feedback </w:t>
+      </w:r>
+      <w:r>
+        <w:rPr>
+          <w:rFonts w:ascii="Calibri" w:hAnsi="Calibri" w:eastAsia="Calibri"/>
+          <w:b/>
+          <w:i w:val="0"/>
+          <w:sz w:val="22"/>
+        </w:rPr>
+        <w:t>Jessica</w:t>
+      </w:r>
+      <w:r>
+        <w:rPr>
+          <w:rFonts w:ascii="Calibri" w:hAnsi="Calibri" w:eastAsia="Calibri"/>
+          <w:b w:val="0"/>
+          <w:i w:val="0"/>
+          <w:sz w:val="22"/>
+        </w:rPr>
+        <w:t xml:space="preserve"> (Teams/Workday)</w:t>
+      </w:r>
+    </w:p>
+    <w:p>
+      <w:pPr>
+        <w:pStyle w:val="ListBullet"/>
+      </w:pPr>
+      <w:r>
+        <w:rPr>
+          <w:rFonts w:ascii="Calibri" w:hAnsi="Calibri" w:eastAsia="Calibri"/>
+          <w:b w:val="0"/>
+          <w:i w:val="0"/>
+          <w:sz w:val="22"/>
+        </w:rPr>
+        <w:t>☐ Cobrar Ana: autorreflexão + pedido de feedback no Workday</w:t>
+      </w:r>
+    </w:p>
+    <w:p>
+      <w:pPr>
+        <w:pStyle w:val="ListBullet"/>
+      </w:pPr>
+      <w:r>
+        <w:rPr>
+          <w:rFonts w:ascii="Calibri" w:hAnsi="Calibri" w:eastAsia="Calibri"/>
+          <w:b w:val="0"/>
+          <w:i w:val="0"/>
+          <w:sz w:val="22"/>
+        </w:rPr>
+        <w:t xml:space="preserve">☐ Enviar material Copilot + docs </w:t>
+      </w:r>
+      <w:r>
+        <w:rPr>
+          <w:rFonts w:ascii="Calibri" w:hAnsi="Calibri" w:eastAsia="Calibri"/>
+          <w:b/>
+          <w:i w:val="0"/>
+          <w:sz w:val="22"/>
+        </w:rPr>
+        <w:t>PUG</w:t>
+      </w:r>
+      <w:r>
+        <w:rPr>
+          <w:rFonts w:ascii="Calibri" w:hAnsi="Calibri" w:eastAsia="Calibri"/>
+          <w:b w:val="0"/>
+          <w:i w:val="0"/>
+          <w:sz w:val="22"/>
+        </w:rPr>
+        <w:t xml:space="preserve"> para Ana</w:t>
+      </w:r>
+    </w:p>
+    <w:p>
+      <w:pPr>
+        <w:pStyle w:val="ListBullet"/>
+      </w:pPr>
+      <w:r>
+        <w:rPr>
+          <w:rFonts w:ascii="Calibri" w:hAnsi="Calibri" w:eastAsia="Calibri"/>
+          <w:b w:val="0"/>
+          <w:i w:val="0"/>
+          <w:sz w:val="22"/>
+        </w:rPr>
+        <w:t xml:space="preserve">☐ Falar com </w:t>
+      </w:r>
+      <w:r>
+        <w:rPr>
+          <w:rFonts w:ascii="Calibri" w:hAnsi="Calibri" w:eastAsia="Calibri"/>
+          <w:b/>
+          <w:i w:val="0"/>
+          <w:sz w:val="22"/>
+        </w:rPr>
+        <w:t>Jessica</w:t>
+      </w:r>
+      <w:r>
+        <w:rPr>
+          <w:rFonts w:ascii="Calibri" w:hAnsi="Calibri" w:eastAsia="Calibri"/>
+          <w:b w:val="0"/>
+          <w:i w:val="0"/>
+          <w:sz w:val="22"/>
+        </w:rPr>
+        <w:t xml:space="preserve"> para feedback no Workday</w:t>
+      </w:r>
+    </w:p>
+    <w:p>
+      <w:pPr>
+        <w:pStyle w:val="ListBullet"/>
+      </w:pPr>
+      <w:r>
+        <w:rPr>
+          <w:rFonts w:ascii="Calibri" w:hAnsi="Calibri" w:eastAsia="Calibri"/>
+          <w:b w:val="0"/>
+          <w:i w:val="0"/>
+          <w:sz w:val="22"/>
+        </w:rPr>
+        <w:t>☐ Pegar e-mail da Paula (CA anterior), se ainda não chegou</w:t>
+      </w:r>
+    </w:p>
+    <w:p>
+      <w:pPr>
+        <w:pStyle w:val="ListBullet"/>
+      </w:pPr>
+      <w:r>
+        <w:rPr>
+          <w:rFonts w:ascii="Calibri" w:hAnsi="Calibri" w:eastAsia="Calibri"/>
+          <w:b w:val="0"/>
+          <w:i w:val="0"/>
+          <w:sz w:val="22"/>
+        </w:rPr>
+        <w:t xml:space="preserve">☐ Confirmar submissão da autorreflexão ABCD — </w:t>
+      </w:r>
+      <w:r>
+        <w:rPr>
+          <w:rFonts w:ascii="Calibri" w:hAnsi="Calibri" w:eastAsia="Calibri"/>
+          <w:b/>
+          <w:i w:val="0"/>
+          <w:sz w:val="22"/>
+        </w:rPr>
+        <w:t>não recebida do PL até 28/08</w:t>
+      </w:r>
+    </w:p>
+    <w:p>
+      <w:pPr>
+        <w:pStyle w:val="ListBullet"/>
+      </w:pPr>
+      <w:r>
+        <w:rPr>
+          <w:rFonts w:ascii="Calibri" w:hAnsi="Calibri" w:eastAsia="Calibri"/>
+          <w:b w:val="0"/>
+          <w:i w:val="0"/>
+          <w:sz w:val="22"/>
+        </w:rPr>
+        <w:t xml:space="preserve">☐ </w:t>
+      </w:r>
+      <w:r>
+        <w:rPr>
+          <w:rFonts w:ascii="Calibri" w:hAnsi="Calibri" w:eastAsia="Calibri"/>
+          <w:b/>
+          <w:i w:val="0"/>
+          <w:sz w:val="22"/>
+        </w:rPr>
+        <w:t>Input ABCD Form no Workday — até 11/09/2026</w:t>
+      </w:r>
+      <w:r>
+        <w:rPr>
+          <w:rFonts w:ascii="Calibri" w:hAnsi="Calibri" w:eastAsia="Calibri"/>
+          <w:b w:val="0"/>
+          <w:i w:val="0"/>
+          <w:sz w:val="22"/>
+        </w:rPr>
+        <w:t xml:space="preserve"> — usar </w:t>
+      </w:r>
+      <w:r>
+        <w:rPr>
+          <w:rFonts w:ascii="Consolas" w:hAnsi="Consolas" w:eastAsia="Consolas"/>
+          <w:b w:val="0"/>
+          <w:i w:val="0"/>
+          <w:color w:val="333333"/>
+          <w:sz w:val="18"/>
+        </w:rPr>
         <w:t>12-abcd-form-people-lead-rascunho.md</w:t>
+      </w:r>
+      <w:r>
+        <w:rPr>
+          <w:rFonts w:ascii="Calibri" w:hAnsi="Calibri" w:eastAsia="Calibri"/>
+          <w:b w:val="0"/>
+          <w:i w:val="0"/>
+          <w:sz w:val="22"/>
+        </w:rPr>
+        <w:t xml:space="preserve"> + </w:t>
+      </w:r>
+      <w:r>
+        <w:rPr>
+          <w:rFonts w:ascii="Calibri" w:hAnsi="Calibri" w:eastAsia="Calibri"/>
+          <w:b/>
+          <w:i w:val="0"/>
+          <w:sz w:val="22"/>
+        </w:rPr>
+        <w:t>`15-justificativa-recomendacao.md`</w:t>
       </w:r>
     </w:p>
     <w:p>
@@ -30057,7 +30216,1291 @@
         <w:pStyle w:val="Heading1"/>
       </w:pPr>
       <w:r>
-        <w:t>14. Orientação do ciclo (Ana Karina)</w:t>
+        <w:t>14. Justificativa da Recomendação</w:t>
+      </w:r>
+    </w:p>
+    <w:p>
+      <w:r>
+        <w:rPr>
+          <w:rFonts w:ascii="Calibri" w:hAnsi="Calibri" w:eastAsia="Calibri"/>
+          <w:b/>
+          <w:i w:val="0"/>
+          <w:sz w:val="22"/>
+        </w:rPr>
+        <w:t>Uso interno People Lead · Jônatas · Colar no Workday / ABCD Form</w:t>
+      </w:r>
+    </w:p>
+    <w:p>
+      <w:r>
+        <w:rPr>
+          <w:rFonts w:ascii="Calibri" w:hAnsi="Calibri" w:eastAsia="Calibri"/>
+          <w:b w:val="0"/>
+          <w:i w:val="0"/>
+          <w:sz w:val="22"/>
+        </w:rPr>
+        <w:t xml:space="preserve">Profissional: </w:t>
+      </w:r>
+      <w:r>
+        <w:rPr>
+          <w:rFonts w:ascii="Calibri" w:hAnsi="Calibri" w:eastAsia="Calibri"/>
+          <w:b/>
+          <w:i w:val="0"/>
+          <w:sz w:val="22"/>
+        </w:rPr>
+        <w:t>Ana Karina Caetano Dos Santos Marques</w:t>
+      </w:r>
+      <w:r>
+        <w:rPr>
+          <w:rFonts w:ascii="Calibri" w:hAnsi="Calibri" w:eastAsia="Calibri"/>
+          <w:b w:val="0"/>
+          <w:i w:val="0"/>
+          <w:sz w:val="22"/>
+        </w:rPr>
+        <w:t xml:space="preserve"> · </w:t>
+      </w:r>
+      <w:r>
+        <w:rPr>
+          <w:rFonts w:ascii="Calibri" w:hAnsi="Calibri" w:eastAsia="Calibri"/>
+          <w:b/>
+          <w:i w:val="0"/>
+          <w:sz w:val="22"/>
+        </w:rPr>
+        <w:t>12-Associate</w:t>
+      </w:r>
+      <w:r>
+        <w:rPr>
+          <w:rFonts w:ascii="Calibri" w:hAnsi="Calibri" w:eastAsia="Calibri"/>
+          <w:b w:val="0"/>
+          <w:i w:val="0"/>
+          <w:sz w:val="22"/>
+        </w:rPr>
+        <w:t>, Mobile &amp; Device Dev</w:t>
+      </w:r>
+    </w:p>
+    <w:p>
+      <w:r>
+        <w:rPr>
+          <w:rFonts w:ascii="Calibri" w:hAnsi="Calibri" w:eastAsia="Calibri"/>
+          <w:b w:val="0"/>
+          <w:i w:val="0"/>
+          <w:sz w:val="22"/>
+        </w:rPr>
+        <w:t xml:space="preserve">Cliente: </w:t>
+      </w:r>
+      <w:r>
+        <w:rPr>
+          <w:rFonts w:ascii="Calibri" w:hAnsi="Calibri" w:eastAsia="Calibri"/>
+          <w:b/>
+          <w:i w:val="0"/>
+          <w:sz w:val="22"/>
+        </w:rPr>
+        <w:t>BANCO BRADESCO</w:t>
+      </w:r>
+      <w:r>
+        <w:rPr>
+          <w:rFonts w:ascii="Calibri" w:hAnsi="Calibri" w:eastAsia="Calibri"/>
+          <w:b w:val="0"/>
+          <w:i w:val="0"/>
+          <w:sz w:val="22"/>
+        </w:rPr>
+        <w:t xml:space="preserve"> · Gestor: </w:t>
+      </w:r>
+      <w:r>
+        <w:rPr>
+          <w:rFonts w:ascii="Calibri" w:hAnsi="Calibri" w:eastAsia="Calibri"/>
+          <w:b/>
+          <w:i w:val="0"/>
+          <w:sz w:val="22"/>
+        </w:rPr>
+        <w:t>Rafael Coloda</w:t>
+      </w:r>
+      <w:r>
+        <w:rPr>
+          <w:rFonts w:ascii="Calibri" w:hAnsi="Calibri" w:eastAsia="Calibri"/>
+          <w:b w:val="0"/>
+          <w:i w:val="0"/>
+          <w:sz w:val="22"/>
+        </w:rPr>
+        <w:t xml:space="preserve"> · Admissão: </w:t>
+      </w:r>
+      <w:r>
+        <w:rPr>
+          <w:rFonts w:ascii="Calibri" w:hAnsi="Calibri" w:eastAsia="Calibri"/>
+          <w:b/>
+          <w:i w:val="0"/>
+          <w:sz w:val="22"/>
+        </w:rPr>
+        <w:t>01/04/2026</w:t>
+      </w:r>
+    </w:p>
+    <w:p>
+      <w:pPr>
+        <w:ind w:left="425"/>
+      </w:pPr>
+      <w:r>
+        <w:rPr>
+          <w:rFonts w:ascii="Calibri" w:hAnsi="Calibri" w:eastAsia="Calibri"/>
+          <w:b w:val="0"/>
+          <w:i/>
+          <w:color w:val="555555"/>
+          <w:sz w:val="22"/>
+        </w:rPr>
+        <w:t xml:space="preserve">Texto pronto para o campo </w:t>
+      </w:r>
+      <w:r>
+        <w:rPr>
+          <w:rFonts w:ascii="Calibri" w:hAnsi="Calibri" w:eastAsia="Calibri"/>
+          <w:b/>
+          <w:i w:val="0"/>
+          <w:color w:val="555555"/>
+          <w:sz w:val="22"/>
+        </w:rPr>
+        <w:t>Justificativa da Recomendação</w:t>
+      </w:r>
+      <w:r>
+        <w:rPr>
+          <w:rFonts w:ascii="Calibri" w:hAnsi="Calibri" w:eastAsia="Calibri"/>
+          <w:b w:val="0"/>
+          <w:i/>
+          <w:color w:val="555555"/>
+          <w:sz w:val="22"/>
+        </w:rPr>
+        <w:t xml:space="preserve">.   Tom alinhado ao último ciclo (quando ainda era estágio), atualizado para </w:t>
+      </w:r>
+      <w:r>
+        <w:rPr>
+          <w:rFonts w:ascii="Calibri" w:hAnsi="Calibri" w:eastAsia="Calibri"/>
+          <w:b/>
+          <w:i w:val="0"/>
+          <w:color w:val="555555"/>
+          <w:sz w:val="22"/>
+        </w:rPr>
+        <w:t>Associate</w:t>
+      </w:r>
+      <w:r>
+        <w:rPr>
+          <w:rFonts w:ascii="Calibri" w:hAnsi="Calibri" w:eastAsia="Calibri"/>
+          <w:b w:val="0"/>
+          <w:i/>
+          <w:color w:val="555555"/>
+          <w:sz w:val="22"/>
+        </w:rPr>
+        <w:t xml:space="preserve"> efetivo.</w:t>
+      </w:r>
+    </w:p>
+    <w:p>
+      <w:pPr>
+        <w:pBdr>
+          <w:bottom w:val="single" w:sz="6" w:space="1" w:color="CCCCCC"/>
+        </w:pBdr>
+      </w:pPr>
+    </w:p>
+    <w:p>
+      <w:pPr>
+        <w:pStyle w:val="Heading3"/>
+      </w:pPr>
+      <w:r>
+        <w:t>Recomendação do People Lead (resumo)</w:t>
+      </w:r>
+    </w:p>
+    <w:tbl>
+      <w:tblPr>
+        <w:tblStyle w:val="TableGrid"/>
+        <w:tblW w:type="auto" w:w="0"/>
+        <w:tblLook w:firstColumn="1" w:firstRow="1" w:lastColumn="0" w:lastRow="0" w:noHBand="0" w:noVBand="1" w:val="04A0"/>
+      </w:tblPr>
+      <w:tblGrid>
+        <w:gridCol w:w="4873"/>
+        <w:gridCol w:w="4873"/>
+      </w:tblGrid>
+      <w:tr>
+        <w:tc>
+          <w:tcPr>
+            <w:tcW w:type="dxa" w:w="4873"/>
+            <w:shd w:fill="1F3A5F" w:val="clear"/>
+          </w:tcPr>
+          <w:p>
+            <w:r>
+              <w:rPr>
+                <w:b/>
+                <w:color w:val="FFFFFF"/>
+                <w:sz w:val="20"/>
+              </w:rPr>
+            </w:r>
+            <w:r>
+              <w:rPr>
+                <w:rFonts w:ascii="Calibri" w:hAnsi="Calibri" w:eastAsia="Calibri"/>
+                <w:b/>
+                <w:i w:val="0"/>
+                <w:color w:val="FFFFFF"/>
+                <w:sz w:val="20"/>
+              </w:rPr>
+              <w:t>Campo</w:t>
+            </w:r>
+          </w:p>
+        </w:tc>
+        <w:tc>
+          <w:tcPr>
+            <w:tcW w:type="dxa" w:w="4873"/>
+            <w:shd w:fill="1F3A5F" w:val="clear"/>
+          </w:tcPr>
+          <w:p>
+            <w:r>
+              <w:rPr>
+                <w:b/>
+                <w:color w:val="FFFFFF"/>
+                <w:sz w:val="20"/>
+              </w:rPr>
+            </w:r>
+            <w:r>
+              <w:rPr>
+                <w:rFonts w:ascii="Calibri" w:hAnsi="Calibri" w:eastAsia="Calibri"/>
+                <w:b/>
+                <w:i w:val="0"/>
+                <w:color w:val="FFFFFF"/>
+                <w:sz w:val="20"/>
+              </w:rPr>
+              <w:t>Posição</w:t>
+            </w:r>
+          </w:p>
+        </w:tc>
+      </w:tr>
+      <w:tr>
+        <w:tc>
+          <w:tcPr>
+            <w:tcW w:type="dxa" w:w="4873"/>
+          </w:tcPr>
+          <w:p>
+            <w:r>
+              <w:rPr>
+                <w:sz w:val="20"/>
+              </w:rPr>
+            </w:r>
+            <w:r>
+              <w:rPr>
+                <w:rFonts w:ascii="Calibri" w:hAnsi="Calibri" w:eastAsia="Calibri"/>
+                <w:b w:val="0"/>
+                <w:i w:val="0"/>
+                <w:sz w:val="20"/>
+              </w:rPr>
+              <w:t>Promoção Associate → Analyst</w:t>
+            </w:r>
+          </w:p>
+        </w:tc>
+        <w:tc>
+          <w:tcPr>
+            <w:tcW w:type="dxa" w:w="4873"/>
+          </w:tcPr>
+          <w:p>
+            <w:r>
+              <w:rPr>
+                <w:sz w:val="20"/>
+              </w:rPr>
+            </w:r>
+            <w:r>
+              <w:rPr>
+                <w:rFonts w:ascii="Calibri" w:hAnsi="Calibri" w:eastAsia="Calibri"/>
+                <w:b/>
+                <w:i w:val="0"/>
+                <w:sz w:val="20"/>
+              </w:rPr>
+              <w:t>Não neste ciclo</w:t>
+            </w:r>
+          </w:p>
+        </w:tc>
+      </w:tr>
+      <w:tr>
+        <w:tc>
+          <w:tcPr>
+            <w:tcW w:type="dxa" w:w="4873"/>
+            <w:shd w:fill="F3F6FA" w:val="clear"/>
+          </w:tcPr>
+          <w:p>
+            <w:r>
+              <w:rPr>
+                <w:sz w:val="20"/>
+              </w:rPr>
+            </w:r>
+            <w:r>
+              <w:rPr>
+                <w:rFonts w:ascii="Calibri" w:hAnsi="Calibri" w:eastAsia="Calibri"/>
+                <w:b w:val="0"/>
+                <w:i w:val="0"/>
+                <w:sz w:val="20"/>
+              </w:rPr>
+              <w:t>Leitura de performance</w:t>
+            </w:r>
+          </w:p>
+        </w:tc>
+        <w:tc>
+          <w:tcPr>
+            <w:tcW w:type="dxa" w:w="4873"/>
+            <w:shd w:fill="F3F6FA" w:val="clear"/>
+          </w:tcPr>
+          <w:p>
+            <w:r>
+              <w:rPr>
+                <w:sz w:val="20"/>
+              </w:rPr>
+            </w:r>
+            <w:r>
+              <w:rPr>
+                <w:rFonts w:ascii="Calibri" w:hAnsi="Calibri" w:eastAsia="Calibri"/>
+                <w:b/>
+                <w:i w:val="0"/>
+                <w:sz w:val="20"/>
+              </w:rPr>
+              <w:t>Consolida bem o nível Associate</w:t>
+            </w:r>
+            <w:r>
+              <w:rPr>
+                <w:rFonts w:ascii="Calibri" w:hAnsi="Calibri" w:eastAsia="Calibri"/>
+                <w:b w:val="0"/>
+                <w:i w:val="0"/>
+                <w:sz w:val="20"/>
+              </w:rPr>
+              <w:t xml:space="preserve"> · potencial alto</w:t>
+            </w:r>
+          </w:p>
+        </w:tc>
+      </w:tr>
+      <w:tr>
+        <w:tc>
+          <w:tcPr>
+            <w:tcW w:type="dxa" w:w="4873"/>
+          </w:tcPr>
+          <w:p>
+            <w:r>
+              <w:rPr>
+                <w:sz w:val="20"/>
+              </w:rPr>
+            </w:r>
+            <w:r>
+              <w:rPr>
+                <w:rFonts w:ascii="Calibri" w:hAnsi="Calibri" w:eastAsia="Calibri"/>
+                <w:b w:val="0"/>
+                <w:i w:val="0"/>
+                <w:sz w:val="20"/>
+              </w:rPr>
+              <w:t>Destaque qualitativo</w:t>
+            </w:r>
+          </w:p>
+        </w:tc>
+        <w:tc>
+          <w:tcPr>
+            <w:tcW w:type="dxa" w:w="4873"/>
+          </w:tcPr>
+          <w:p>
+            <w:r>
+              <w:rPr>
+                <w:sz w:val="20"/>
+              </w:rPr>
+            </w:r>
+            <w:r>
+              <w:rPr>
+                <w:rFonts w:ascii="Calibri" w:hAnsi="Calibri" w:eastAsia="Calibri"/>
+                <w:b/>
+                <w:i w:val="0"/>
+                <w:sz w:val="20"/>
+              </w:rPr>
+              <w:t>Sim</w:t>
+            </w:r>
+            <w:r>
+              <w:rPr>
+                <w:rFonts w:ascii="Calibri" w:hAnsi="Calibri" w:eastAsia="Calibri"/>
+                <w:b w:val="0"/>
+                <w:i w:val="0"/>
+                <w:sz w:val="20"/>
+              </w:rPr>
+              <w:t xml:space="preserve"> (entrega no app + IA aplicada), sujeito a feedback do projeto</w:t>
+            </w:r>
+          </w:p>
+        </w:tc>
+      </w:tr>
+      <w:tr>
+        <w:tc>
+          <w:tcPr>
+            <w:tcW w:type="dxa" w:w="4873"/>
+            <w:shd w:fill="F3F6FA" w:val="clear"/>
+          </w:tcPr>
+          <w:p>
+            <w:r>
+              <w:rPr>
+                <w:sz w:val="20"/>
+              </w:rPr>
+            </w:r>
+            <w:r>
+              <w:rPr>
+                <w:rFonts w:ascii="Calibri" w:hAnsi="Calibri" w:eastAsia="Calibri"/>
+                <w:b w:val="0"/>
+                <w:i w:val="0"/>
+                <w:sz w:val="20"/>
+              </w:rPr>
+              <w:t>Próximo foco</w:t>
+            </w:r>
+          </w:p>
+        </w:tc>
+        <w:tc>
+          <w:tcPr>
+            <w:tcW w:type="dxa" w:w="4873"/>
+            <w:shd w:fill="F3F6FA" w:val="clear"/>
+          </w:tcPr>
+          <w:p>
+            <w:r>
+              <w:rPr>
+                <w:sz w:val="20"/>
+              </w:rPr>
+            </w:r>
+            <w:r>
+              <w:rPr>
+                <w:rFonts w:ascii="Calibri" w:hAnsi="Calibri" w:eastAsia="Calibri"/>
+                <w:b w:val="0"/>
+                <w:i w:val="0"/>
+                <w:sz w:val="20"/>
+              </w:rPr>
+              <w:t>Consolidar Associate excelente → dossiê Analyst no FY27</w:t>
+            </w:r>
+          </w:p>
+        </w:tc>
+      </w:tr>
+    </w:tbl>
+    <w:p/>
+    <w:p>
+      <w:pPr>
+        <w:pBdr>
+          <w:bottom w:val="single" w:sz="6" w:space="1" w:color="CCCCCC"/>
+        </w:pBdr>
+      </w:pPr>
+    </w:p>
+    <w:p>
+      <w:pPr>
+        <w:pStyle w:val="Heading3"/>
+      </w:pPr>
+      <w:r>
+        <w:t>Texto para colar — Justificativa da Recomendação</w:t>
+      </w:r>
+    </w:p>
+    <w:p>
+      <w:r>
+        <w:rPr>
+          <w:rFonts w:ascii="Calibri" w:hAnsi="Calibri" w:eastAsia="Calibri"/>
+          <w:b w:val="0"/>
+          <w:i w:val="0"/>
+          <w:sz w:val="22"/>
+        </w:rPr>
+        <w:t xml:space="preserve">Durante o período acompanhado neste FY26, Ana Karina atuou como </w:t>
+      </w:r>
+      <w:r>
+        <w:rPr>
+          <w:rFonts w:ascii="Calibri" w:hAnsi="Calibri" w:eastAsia="Calibri"/>
+          <w:b/>
+          <w:i w:val="0"/>
+          <w:sz w:val="22"/>
+        </w:rPr>
+        <w:t>Associate, Mobile &amp; Device Dev</w:t>
+      </w:r>
+      <w:r>
+        <w:rPr>
+          <w:rFonts w:ascii="Calibri" w:hAnsi="Calibri" w:eastAsia="Calibri"/>
+          <w:b w:val="0"/>
+          <w:i w:val="0"/>
+          <w:sz w:val="22"/>
+        </w:rPr>
+        <w:t xml:space="preserve">, no cliente </w:t>
+      </w:r>
+      <w:r>
+        <w:rPr>
+          <w:rFonts w:ascii="Calibri" w:hAnsi="Calibri" w:eastAsia="Calibri"/>
+          <w:b/>
+          <w:i w:val="0"/>
+          <w:sz w:val="22"/>
+        </w:rPr>
+        <w:t>BANCO BRADESCO</w:t>
+      </w:r>
+      <w:r>
+        <w:rPr>
+          <w:rFonts w:ascii="Calibri" w:hAnsi="Calibri" w:eastAsia="Calibri"/>
+          <w:b w:val="0"/>
+          <w:i w:val="0"/>
+          <w:sz w:val="22"/>
+        </w:rPr>
+        <w:t xml:space="preserve">, no desenvolvimento do </w:t>
+      </w:r>
+      <w:r>
+        <w:rPr>
+          <w:rFonts w:ascii="Calibri" w:hAnsi="Calibri" w:eastAsia="Calibri"/>
+          <w:b/>
+          <w:i w:val="0"/>
+          <w:sz w:val="22"/>
+        </w:rPr>
+        <w:t>app nativo (Kotlin/Android)</w:t>
+      </w:r>
+      <w:r>
+        <w:rPr>
+          <w:rFonts w:ascii="Calibri" w:hAnsi="Calibri" w:eastAsia="Calibri"/>
+          <w:b w:val="0"/>
+          <w:i w:val="0"/>
+          <w:sz w:val="22"/>
+        </w:rPr>
+        <w:t xml:space="preserve">. Cumpriu o escopo esperado para o nível Associate, com </w:t>
+      </w:r>
+      <w:r>
+        <w:rPr>
+          <w:rFonts w:ascii="Calibri" w:hAnsi="Calibri" w:eastAsia="Calibri"/>
+          <w:b/>
+          <w:i w:val="0"/>
+          <w:sz w:val="22"/>
+        </w:rPr>
+        <w:t>evolução consistente</w:t>
+      </w:r>
+      <w:r>
+        <w:rPr>
+          <w:rFonts w:ascii="Calibri" w:hAnsi="Calibri" w:eastAsia="Calibri"/>
+          <w:b w:val="0"/>
+          <w:i w:val="0"/>
+          <w:sz w:val="22"/>
+        </w:rPr>
+        <w:t xml:space="preserve"> na stack, na qualidade das entregas e na compreensão do produto — incluindo a transição do projeto de </w:t>
+      </w:r>
+      <w:r>
+        <w:rPr>
+          <w:rFonts w:ascii="Calibri" w:hAnsi="Calibri" w:eastAsia="Calibri"/>
+          <w:b/>
+          <w:i w:val="0"/>
+          <w:sz w:val="22"/>
+        </w:rPr>
+        <w:t>desenvolvimento para homologação</w:t>
+      </w:r>
+      <w:r>
+        <w:rPr>
+          <w:rFonts w:ascii="Calibri" w:hAnsi="Calibri" w:eastAsia="Calibri"/>
+          <w:b w:val="0"/>
+          <w:i w:val="0"/>
+          <w:sz w:val="22"/>
+        </w:rPr>
+        <w:t>, marco relevante de maturidade para o cargo e para o tempo de casa (admissão em 01/04/2026).</w:t>
+      </w:r>
+    </w:p>
+    <w:p>
+      <w:r>
+        <w:rPr>
+          <w:rFonts w:ascii="Calibri" w:hAnsi="Calibri" w:eastAsia="Calibri"/>
+          <w:b w:val="0"/>
+          <w:i w:val="0"/>
+          <w:sz w:val="22"/>
+        </w:rPr>
+        <w:t xml:space="preserve">O impacto observado está ligado à </w:t>
+      </w:r>
+      <w:r>
+        <w:rPr>
+          <w:rFonts w:ascii="Calibri" w:hAnsi="Calibri" w:eastAsia="Calibri"/>
+          <w:b/>
+          <w:i w:val="0"/>
+          <w:sz w:val="22"/>
+        </w:rPr>
+        <w:t>entrega contínua no cliente</w:t>
+      </w:r>
+      <w:r>
+        <w:rPr>
+          <w:rFonts w:ascii="Calibri" w:hAnsi="Calibri" w:eastAsia="Calibri"/>
+          <w:b w:val="0"/>
+          <w:i w:val="0"/>
+          <w:sz w:val="22"/>
+        </w:rPr>
+        <w:t xml:space="preserve">, ao aprendizado aplicado no dia a dia e ao </w:t>
+      </w:r>
+      <w:r>
+        <w:rPr>
+          <w:rFonts w:ascii="Calibri" w:hAnsi="Calibri" w:eastAsia="Calibri"/>
+          <w:b/>
+          <w:i w:val="0"/>
+          <w:sz w:val="22"/>
+        </w:rPr>
+        <w:t>uso real de Copilot e agentes de IA</w:t>
+      </w:r>
+      <w:r>
+        <w:rPr>
+          <w:rFonts w:ascii="Calibri" w:hAnsi="Calibri" w:eastAsia="Calibri"/>
+          <w:b w:val="0"/>
+          <w:i w:val="0"/>
+          <w:sz w:val="22"/>
+        </w:rPr>
+        <w:t xml:space="preserve"> no fluxo do time (incluindo iniciativa de agente para analytics e aplicação de IA no frontend), alinhado às prioridades da prática. Também concluiu a certificação </w:t>
+      </w:r>
+      <w:r>
+        <w:rPr>
+          <w:rFonts w:ascii="Calibri" w:hAnsi="Calibri" w:eastAsia="Calibri"/>
+          <w:b/>
+          <w:i w:val="0"/>
+          <w:sz w:val="22"/>
+        </w:rPr>
+        <w:t>AZ-900</w:t>
+      </w:r>
+      <w:r>
+        <w:rPr>
+          <w:rFonts w:ascii="Calibri" w:hAnsi="Calibri" w:eastAsia="Calibri"/>
+          <w:b w:val="0"/>
+          <w:i w:val="0"/>
+          <w:sz w:val="22"/>
+        </w:rPr>
+        <w:t xml:space="preserve"> e evoluiu o inglês de </w:t>
+      </w:r>
+      <w:r>
+        <w:rPr>
+          <w:rFonts w:ascii="Calibri" w:hAnsi="Calibri" w:eastAsia="Calibri"/>
+          <w:b/>
+          <w:i w:val="0"/>
+          <w:sz w:val="22"/>
+        </w:rPr>
+        <w:t>B2 para C1+</w:t>
+      </w:r>
+      <w:r>
+        <w:rPr>
+          <w:rFonts w:ascii="Calibri" w:hAnsi="Calibri" w:eastAsia="Calibri"/>
+          <w:b w:val="0"/>
+          <w:i w:val="0"/>
+          <w:sz w:val="22"/>
+        </w:rPr>
+        <w:t xml:space="preserve"> no goFluent — resultados objetivos do ciclo. Metas de médio prazo (ex.: Swift / AI-900 formal) foram conscientemente priorizadas em segundo plano diante da carga de </w:t>
+      </w:r>
+      <w:r>
+        <w:rPr>
+          <w:rFonts w:ascii="Calibri" w:hAnsi="Calibri" w:eastAsia="Calibri"/>
+          <w:b/>
+          <w:i w:val="0"/>
+          <w:sz w:val="22"/>
+        </w:rPr>
+        <w:t>faculdade presencial + entrega no cliente</w:t>
+      </w:r>
+      <w:r>
+        <w:rPr>
+          <w:rFonts w:ascii="Calibri" w:hAnsi="Calibri" w:eastAsia="Calibri"/>
+          <w:b w:val="0"/>
+          <w:i w:val="0"/>
+          <w:sz w:val="22"/>
+        </w:rPr>
+        <w:t xml:space="preserve">, com plano claro para o </w:t>
+      </w:r>
+      <w:r>
+        <w:rPr>
+          <w:rFonts w:ascii="Calibri" w:hAnsi="Calibri" w:eastAsia="Calibri"/>
+          <w:b/>
+          <w:i w:val="0"/>
+          <w:sz w:val="22"/>
+        </w:rPr>
+        <w:t>FY27</w:t>
+      </w:r>
+      <w:r>
+        <w:rPr>
+          <w:rFonts w:ascii="Calibri" w:hAnsi="Calibri" w:eastAsia="Calibri"/>
+          <w:b w:val="0"/>
+          <w:i w:val="0"/>
+          <w:sz w:val="22"/>
+        </w:rPr>
+        <w:t>.</w:t>
+      </w:r>
+    </w:p>
+    <w:p>
+      <w:r>
+        <w:rPr>
+          <w:rFonts w:ascii="Calibri" w:hAnsi="Calibri" w:eastAsia="Calibri"/>
+          <w:b w:val="0"/>
+          <w:i w:val="0"/>
+          <w:sz w:val="22"/>
+        </w:rPr>
+        <w:t>Nas 1:1 com o People Lead, demonstra disponibilidade para diálogo, escuta ativa e interesse em compreender seu papel, expectativas e próximos passos. Apresenta postura profissional adequada, abertura para aprender, receptividade a feedbacks e clareza de norte de carreira (</w:t>
+      </w:r>
+      <w:r>
+        <w:rPr>
+          <w:rFonts w:ascii="Calibri" w:hAnsi="Calibri" w:eastAsia="Calibri"/>
+          <w:b/>
+          <w:i w:val="0"/>
+          <w:sz w:val="22"/>
+        </w:rPr>
+        <w:t>arquitetura mobile</w:t>
+      </w:r>
+      <w:r>
+        <w:rPr>
+          <w:rFonts w:ascii="Calibri" w:hAnsi="Calibri" w:eastAsia="Calibri"/>
+          <w:b w:val="0"/>
+          <w:i w:val="0"/>
+          <w:sz w:val="22"/>
+        </w:rPr>
+        <w:t xml:space="preserve">). Demonstra responsabilidade com combinados, honestidade no fechamento do ciclo e comportamento alinhado a um ambiente colaborativo e respeitoso. Os comportamentos observados indicam </w:t>
+      </w:r>
+      <w:r>
+        <w:rPr>
+          <w:rFonts w:ascii="Calibri" w:hAnsi="Calibri" w:eastAsia="Calibri"/>
+          <w:b/>
+          <w:i w:val="0"/>
+          <w:sz w:val="22"/>
+        </w:rPr>
+        <w:t>comprometimento com o próprio desenvolvimento</w:t>
+      </w:r>
+      <w:r>
+        <w:rPr>
+          <w:rFonts w:ascii="Calibri" w:hAnsi="Calibri" w:eastAsia="Calibri"/>
+          <w:b w:val="0"/>
+          <w:i w:val="0"/>
+          <w:sz w:val="22"/>
+        </w:rPr>
+        <w:t xml:space="preserve"> e com a experiência no projeto.</w:t>
+      </w:r>
+    </w:p>
+    <w:p>
+      <w:r>
+        <w:rPr>
+          <w:rFonts w:ascii="Calibri" w:hAnsi="Calibri" w:eastAsia="Calibri"/>
+          <w:b w:val="0"/>
+          <w:i w:val="0"/>
+          <w:sz w:val="22"/>
+        </w:rPr>
+        <w:t xml:space="preserve">Segue em fase de </w:t>
+      </w:r>
+      <w:r>
+        <w:rPr>
+          <w:rFonts w:ascii="Calibri" w:hAnsi="Calibri" w:eastAsia="Calibri"/>
+          <w:b/>
+          <w:i w:val="0"/>
+          <w:sz w:val="22"/>
+        </w:rPr>
+        <w:t>consolidação técnica e profissional no nível Associate</w:t>
+      </w:r>
+      <w:r>
+        <w:rPr>
+          <w:rFonts w:ascii="Calibri" w:hAnsi="Calibri" w:eastAsia="Calibri"/>
+          <w:b w:val="0"/>
+          <w:i w:val="0"/>
+          <w:sz w:val="22"/>
+        </w:rPr>
+        <w:t>, com oportunidades claras de evolução em: registro formal de evidências de entrega, formalização de cases de IA, e aprofundamento em arquitetura — base para um eventual movimento a Analyst no FY27, se a trajetória se mantiver. As 1:1 têm sido utilizadas como espaço de reflexão sobre carreira, ciclo de performance e crescimento contínuo, contribuindo para maior clareza sobre expectativas e próximos desafios.</w:t>
+      </w:r>
+    </w:p>
+    <w:p>
+      <w:r>
+        <w:rPr>
+          <w:rFonts w:ascii="Calibri" w:hAnsi="Calibri" w:eastAsia="Calibri"/>
+          <w:b/>
+          <w:i w:val="0"/>
+          <w:sz w:val="22"/>
+        </w:rPr>
+        <w:t>Recomendação:</w:t>
+      </w:r>
+      <w:r>
+        <w:rPr>
+          <w:rFonts w:ascii="Calibri" w:hAnsi="Calibri" w:eastAsia="Calibri"/>
+          <w:b w:val="0"/>
+          <w:i w:val="0"/>
+          <w:sz w:val="22"/>
+        </w:rPr>
+        <w:t xml:space="preserve"> manter no nível </w:t>
+      </w:r>
+      <w:r>
+        <w:rPr>
+          <w:rFonts w:ascii="Calibri" w:hAnsi="Calibri" w:eastAsia="Calibri"/>
+          <w:b/>
+          <w:i w:val="0"/>
+          <w:sz w:val="22"/>
+        </w:rPr>
+        <w:t>Associate</w:t>
+      </w:r>
+      <w:r>
+        <w:rPr>
+          <w:rFonts w:ascii="Calibri" w:hAnsi="Calibri" w:eastAsia="Calibri"/>
+          <w:b w:val="0"/>
+          <w:i w:val="0"/>
+          <w:sz w:val="22"/>
+        </w:rPr>
+        <w:t xml:space="preserve"> neste December Cycle, com reconhecimento qualitativo do desempenho no cliente e da aplicação de IA; </w:t>
+      </w:r>
+      <w:r>
+        <w:rPr>
+          <w:rFonts w:ascii="Calibri" w:hAnsi="Calibri" w:eastAsia="Calibri"/>
+          <w:b/>
+          <w:i w:val="0"/>
+          <w:sz w:val="22"/>
+        </w:rPr>
+        <w:t>não recomendar promoção</w:t>
+      </w:r>
+      <w:r>
+        <w:rPr>
+          <w:rFonts w:ascii="Calibri" w:hAnsi="Calibri" w:eastAsia="Calibri"/>
+          <w:b w:val="0"/>
+          <w:i w:val="0"/>
+          <w:sz w:val="22"/>
+        </w:rPr>
+        <w:t xml:space="preserve"> neste FY, dado o tempo de casa e o pacote ainda em consolidação. Continuar acompanhamento mensal com plano trimestre/semestre/ano e alinhamento com o gestor de projeto (</w:t>
+      </w:r>
+      <w:r>
+        <w:rPr>
+          <w:rFonts w:ascii="Calibri" w:hAnsi="Calibri" w:eastAsia="Calibri"/>
+          <w:b/>
+          <w:i w:val="0"/>
+          <w:sz w:val="22"/>
+        </w:rPr>
+        <w:t>Rafael Coloda</w:t>
+      </w:r>
+      <w:r>
+        <w:rPr>
+          <w:rFonts w:ascii="Calibri" w:hAnsi="Calibri" w:eastAsia="Calibri"/>
+          <w:b w:val="0"/>
+          <w:i w:val="0"/>
+          <w:sz w:val="22"/>
+        </w:rPr>
+        <w:t>).</w:t>
+      </w:r>
+    </w:p>
+    <w:p>
+      <w:pPr>
+        <w:pBdr>
+          <w:bottom w:val="single" w:sz="6" w:space="1" w:color="CCCCCC"/>
+        </w:pBdr>
+      </w:pPr>
+    </w:p>
+    <w:p>
+      <w:pPr>
+        <w:pStyle w:val="Heading3"/>
+      </w:pPr>
+      <w:r>
+        <w:t>Versão curta (se o campo tiver limite de caracteres)</w:t>
+      </w:r>
+    </w:p>
+    <w:p>
+      <w:r>
+        <w:rPr>
+          <w:rFonts w:ascii="Calibri" w:hAnsi="Calibri" w:eastAsia="Calibri"/>
+          <w:b w:val="0"/>
+          <w:i w:val="0"/>
+          <w:sz w:val="22"/>
+        </w:rPr>
+        <w:t xml:space="preserve">Durante o FY26, Ana Karina (Associate, Mobile) no BANCO BRADESCO entregou no app nativo Kotlin/Android com evolução até a fase de homologação, alto engajamento e uso aplicado de Copilot/agentes de IA. Concluiu AZ-900 e inglês C1+. Nas 1:1 demonstra postura profissional, abertura a feedback e clareza de carreira (arquitetura mobile). </w:t>
+      </w:r>
+      <w:r>
+        <w:rPr>
+          <w:rFonts w:ascii="Calibri" w:hAnsi="Calibri" w:eastAsia="Calibri"/>
+          <w:b/>
+          <w:i w:val="0"/>
+          <w:sz w:val="22"/>
+        </w:rPr>
+        <w:t>Recomendação: consolidar Associate neste ciclo; não promover a Analyst agora</w:t>
+      </w:r>
+      <w:r>
+        <w:rPr>
+          <w:rFonts w:ascii="Calibri" w:hAnsi="Calibri" w:eastAsia="Calibri"/>
+          <w:b w:val="0"/>
+          <w:i w:val="0"/>
+          <w:sz w:val="22"/>
+        </w:rPr>
+        <w:t xml:space="preserve"> — potencial alto para FY27 com evidências e feedback de projeto.</w:t>
+      </w:r>
+    </w:p>
+    <w:p>
+      <w:pPr>
+        <w:pBdr>
+          <w:bottom w:val="single" w:sz="6" w:space="1" w:color="CCCCCC"/>
+        </w:pBdr>
+      </w:pPr>
+    </w:p>
+    <w:p>
+      <w:pPr>
+        <w:pStyle w:val="Heading3"/>
+      </w:pPr>
+      <w:r>
+        <w:t>Comparativo com o último ciclo (referência)</w:t>
+      </w:r>
+    </w:p>
+    <w:tbl>
+      <w:tblPr>
+        <w:tblStyle w:val="TableGrid"/>
+        <w:tblW w:type="auto" w:w="0"/>
+        <w:tblLook w:firstColumn="1" w:firstRow="1" w:lastColumn="0" w:lastRow="0" w:noHBand="0" w:noVBand="1" w:val="04A0"/>
+      </w:tblPr>
+      <w:tblGrid>
+        <w:gridCol w:w="4873"/>
+        <w:gridCol w:w="4873"/>
+      </w:tblGrid>
+      <w:tr>
+        <w:tc>
+          <w:tcPr>
+            <w:tcW w:type="dxa" w:w="4873"/>
+            <w:shd w:fill="1F3A5F" w:val="clear"/>
+          </w:tcPr>
+          <w:p>
+            <w:r>
+              <w:rPr>
+                <w:b/>
+                <w:color w:val="FFFFFF"/>
+                <w:sz w:val="20"/>
+              </w:rPr>
+            </w:r>
+            <w:r>
+              <w:rPr>
+                <w:rFonts w:ascii="Calibri" w:hAnsi="Calibri" w:eastAsia="Calibri"/>
+                <w:b/>
+                <w:i w:val="0"/>
+                <w:color w:val="FFFFFF"/>
+                <w:sz w:val="20"/>
+              </w:rPr>
+              <w:t>Último ciclo (estágio)</w:t>
+            </w:r>
+          </w:p>
+        </w:tc>
+        <w:tc>
+          <w:tcPr>
+            <w:tcW w:type="dxa" w:w="4873"/>
+            <w:shd w:fill="1F3A5F" w:val="clear"/>
+          </w:tcPr>
+          <w:p>
+            <w:r>
+              <w:rPr>
+                <w:b/>
+                <w:color w:val="FFFFFF"/>
+                <w:sz w:val="20"/>
+              </w:rPr>
+            </w:r>
+            <w:r>
+              <w:rPr>
+                <w:rFonts w:ascii="Calibri" w:hAnsi="Calibri" w:eastAsia="Calibri"/>
+                <w:b/>
+                <w:i w:val="0"/>
+                <w:color w:val="FFFFFF"/>
+                <w:sz w:val="20"/>
+              </w:rPr>
+              <w:t>Este ciclo (Associate)</w:t>
+            </w:r>
+          </w:p>
+        </w:tc>
+      </w:tr>
+      <w:tr>
+        <w:tc>
+          <w:tcPr>
+            <w:tcW w:type="dxa" w:w="4873"/>
+          </w:tcPr>
+          <w:p>
+            <w:r>
+              <w:rPr>
+                <w:sz w:val="20"/>
+              </w:rPr>
+            </w:r>
+            <w:r>
+              <w:rPr>
+                <w:rFonts w:ascii="Calibri" w:hAnsi="Calibri" w:eastAsia="Calibri"/>
+                <w:b w:val="0"/>
+                <w:i w:val="0"/>
+                <w:sz w:val="20"/>
+              </w:rPr>
+              <w:t>Escopo de estágio / rotinas</w:t>
+            </w:r>
+          </w:p>
+        </w:tc>
+        <w:tc>
+          <w:tcPr>
+            <w:tcW w:type="dxa" w:w="4873"/>
+          </w:tcPr>
+          <w:p>
+            <w:r>
+              <w:rPr>
+                <w:sz w:val="20"/>
+              </w:rPr>
+            </w:r>
+            <w:r>
+              <w:rPr>
+                <w:rFonts w:ascii="Calibri" w:hAnsi="Calibri" w:eastAsia="Calibri"/>
+                <w:b w:val="0"/>
+                <w:i w:val="0"/>
+                <w:sz w:val="20"/>
+              </w:rPr>
+              <w:t>Escopo Associate em app nativo Bradesco</w:t>
+            </w:r>
+          </w:p>
+        </w:tc>
+      </w:tr>
+      <w:tr>
+        <w:tc>
+          <w:tcPr>
+            <w:tcW w:type="dxa" w:w="4873"/>
+            <w:shd w:fill="F3F6FA" w:val="clear"/>
+          </w:tcPr>
+          <w:p>
+            <w:r>
+              <w:rPr>
+                <w:sz w:val="20"/>
+              </w:rPr>
+            </w:r>
+            <w:r>
+              <w:rPr>
+                <w:rFonts w:ascii="Calibri" w:hAnsi="Calibri" w:eastAsia="Calibri"/>
+                <w:b w:val="0"/>
+                <w:i w:val="0"/>
+                <w:sz w:val="20"/>
+              </w:rPr>
+              <w:t>Aprendizado + apoio à equipe</w:t>
+            </w:r>
+          </w:p>
+        </w:tc>
+        <w:tc>
+          <w:tcPr>
+            <w:tcW w:type="dxa" w:w="4873"/>
+            <w:shd w:fill="F3F6FA" w:val="clear"/>
+          </w:tcPr>
+          <w:p>
+            <w:r>
+              <w:rPr>
+                <w:sz w:val="20"/>
+              </w:rPr>
+            </w:r>
+            <w:r>
+              <w:rPr>
+                <w:rFonts w:ascii="Calibri" w:hAnsi="Calibri" w:eastAsia="Calibri"/>
+                <w:b w:val="0"/>
+                <w:i w:val="0"/>
+                <w:sz w:val="20"/>
+              </w:rPr>
+              <w:t>Entrega + homologação + IA aplicada</w:t>
+            </w:r>
+          </w:p>
+        </w:tc>
+      </w:tr>
+      <w:tr>
+        <w:tc>
+          <w:tcPr>
+            <w:tcW w:type="dxa" w:w="4873"/>
+          </w:tcPr>
+          <w:p>
+            <w:r>
+              <w:rPr>
+                <w:sz w:val="20"/>
+              </w:rPr>
+            </w:r>
+            <w:r>
+              <w:rPr>
+                <w:rFonts w:ascii="Calibri" w:hAnsi="Calibri" w:eastAsia="Calibri"/>
+                <w:b w:val="0"/>
+                <w:i w:val="0"/>
+                <w:sz w:val="20"/>
+              </w:rPr>
+              <w:t>Evolução gradual de autonomia</w:t>
+            </w:r>
+          </w:p>
+        </w:tc>
+        <w:tc>
+          <w:tcPr>
+            <w:tcW w:type="dxa" w:w="4873"/>
+          </w:tcPr>
+          <w:p>
+            <w:r>
+              <w:rPr>
+                <w:sz w:val="20"/>
+              </w:rPr>
+            </w:r>
+            <w:r>
+              <w:rPr>
+                <w:rFonts w:ascii="Calibri" w:hAnsi="Calibri" w:eastAsia="Calibri"/>
+                <w:b w:val="0"/>
+                <w:i w:val="0"/>
+                <w:sz w:val="20"/>
+              </w:rPr>
+              <w:t>Autonomia crescente; visão ponta a ponta</w:t>
+            </w:r>
+          </w:p>
+        </w:tc>
+      </w:tr>
+      <w:tr>
+        <w:tc>
+          <w:tcPr>
+            <w:tcW w:type="dxa" w:w="4873"/>
+            <w:shd w:fill="F3F6FA" w:val="clear"/>
+          </w:tcPr>
+          <w:p>
+            <w:r>
+              <w:rPr>
+                <w:sz w:val="20"/>
+              </w:rPr>
+            </w:r>
+            <w:r>
+              <w:rPr>
+                <w:rFonts w:ascii="Calibri" w:hAnsi="Calibri" w:eastAsia="Calibri"/>
+                <w:b w:val="0"/>
+                <w:i w:val="0"/>
+                <w:sz w:val="20"/>
+              </w:rPr>
+              <w:t>Fase de desenvolvimento</w:t>
+            </w:r>
+          </w:p>
+        </w:tc>
+        <w:tc>
+          <w:tcPr>
+            <w:tcW w:type="dxa" w:w="4873"/>
+            <w:shd w:fill="F3F6FA" w:val="clear"/>
+          </w:tcPr>
+          <w:p>
+            <w:r>
+              <w:rPr>
+                <w:sz w:val="20"/>
+              </w:rPr>
+            </w:r>
+            <w:r>
+              <w:rPr>
+                <w:rFonts w:ascii="Calibri" w:hAnsi="Calibri" w:eastAsia="Calibri"/>
+                <w:b w:val="0"/>
+                <w:i w:val="0"/>
+                <w:sz w:val="20"/>
+              </w:rPr>
+              <w:t>Consolidação Associate → trilha Analyst FY27</w:t>
+            </w:r>
+          </w:p>
+        </w:tc>
+      </w:tr>
+      <w:tr>
+        <w:tc>
+          <w:tcPr>
+            <w:tcW w:type="dxa" w:w="4873"/>
+          </w:tcPr>
+          <w:p>
+            <w:r>
+              <w:rPr>
+                <w:sz w:val="20"/>
+              </w:rPr>
+            </w:r>
+            <w:r>
+              <w:rPr>
+                <w:rFonts w:ascii="Calibri" w:hAnsi="Calibri" w:eastAsia="Calibri"/>
+                <w:b w:val="0"/>
+                <w:i w:val="0"/>
+                <w:sz w:val="20"/>
+              </w:rPr>
+              <w:t>Sem promoção implícita</w:t>
+            </w:r>
+          </w:p>
+        </w:tc>
+        <w:tc>
+          <w:tcPr>
+            <w:tcW w:type="dxa" w:w="4873"/>
+          </w:tcPr>
+          <w:p>
+            <w:r>
+              <w:rPr>
+                <w:sz w:val="20"/>
+              </w:rPr>
+            </w:r>
+            <w:r>
+              <w:rPr>
+                <w:rFonts w:ascii="Calibri" w:hAnsi="Calibri" w:eastAsia="Calibri"/>
+                <w:b/>
+                <w:i w:val="0"/>
+                <w:sz w:val="20"/>
+              </w:rPr>
+              <w:t>Explícito: não promover neste FY</w:t>
+            </w:r>
+          </w:p>
+        </w:tc>
+      </w:tr>
+    </w:tbl>
+    <w:p/>
+    <w:p>
+      <w:pPr>
+        <w:pBdr>
+          <w:bottom w:val="single" w:sz="6" w:space="1" w:color="CCCCCC"/>
+        </w:pBdr>
+      </w:pPr>
+    </w:p>
+    <w:p>
+      <w:pPr>
+        <w:pStyle w:val="Heading3"/>
+      </w:pPr>
+      <w:r>
+        <w:t>Checklist antes de colar</w:t>
+      </w:r>
+    </w:p>
+    <w:p>
+      <w:pPr>
+        <w:pStyle w:val="ListBullet"/>
+      </w:pPr>
+      <w:r>
+        <w:rPr>
+          <w:rFonts w:ascii="Calibri" w:hAnsi="Calibri" w:eastAsia="Calibri"/>
+          <w:b w:val="0"/>
+          <w:i w:val="0"/>
+          <w:sz w:val="22"/>
+        </w:rPr>
+        <w:t>☐ Conferir se autorreflexão ABCD dela já foi submetida (cruzar tom)</w:t>
+      </w:r>
+    </w:p>
+    <w:p>
+      <w:pPr>
+        <w:pStyle w:val="ListBullet"/>
+      </w:pPr>
+      <w:r>
+        <w:rPr>
+          <w:rFonts w:ascii="Calibri" w:hAnsi="Calibri" w:eastAsia="Calibri"/>
+          <w:b w:val="0"/>
+          <w:i w:val="0"/>
+          <w:sz w:val="22"/>
+        </w:rPr>
+        <w:t xml:space="preserve">☐ Inserir síntese do feedback de </w:t>
+      </w:r>
+      <w:r>
+        <w:rPr>
+          <w:rFonts w:ascii="Calibri" w:hAnsi="Calibri" w:eastAsia="Calibri"/>
+          <w:b/>
+          <w:i w:val="0"/>
+          <w:sz w:val="22"/>
+        </w:rPr>
+        <w:t>Rafael Coloda</w:t>
+      </w:r>
+      <w:r>
+        <w:rPr>
+          <w:rFonts w:ascii="Calibri" w:hAnsi="Calibri" w:eastAsia="Calibri"/>
+          <w:b w:val="0"/>
+          <w:i w:val="0"/>
+          <w:sz w:val="22"/>
+        </w:rPr>
+        <w:t xml:space="preserve"> / </w:t>
+      </w:r>
+      <w:r>
+        <w:rPr>
+          <w:rFonts w:ascii="Calibri" w:hAnsi="Calibri" w:eastAsia="Calibri"/>
+          <w:b/>
+          <w:i w:val="0"/>
+          <w:sz w:val="22"/>
+        </w:rPr>
+        <w:t>Jessica</w:t>
+      </w:r>
+      <w:r>
+        <w:rPr>
+          <w:rFonts w:ascii="Calibri" w:hAnsi="Calibri" w:eastAsia="Calibri"/>
+          <w:b w:val="0"/>
+          <w:i w:val="0"/>
+          <w:sz w:val="22"/>
+        </w:rPr>
+        <w:t xml:space="preserve"> se já chegou</w:t>
+      </w:r>
+    </w:p>
+    <w:p>
+      <w:pPr>
+        <w:pStyle w:val="ListBullet"/>
+      </w:pPr>
+      <w:r>
+        <w:rPr>
+          <w:rFonts w:ascii="Calibri" w:hAnsi="Calibri" w:eastAsia="Calibri"/>
+          <w:b w:val="0"/>
+          <w:i w:val="0"/>
+          <w:sz w:val="22"/>
+        </w:rPr>
+        <w:t>☐ Confirmar Talent Outcome / Priority no formulário alinhados a esta justificativa</w:t>
+      </w:r>
+    </w:p>
+    <w:p>
+      <w:r>
+        <w:br w:type="page"/>
+      </w:r>
+    </w:p>
+    <w:p>
+      <w:pPr>
+        <w:pStyle w:val="Heading1"/>
+      </w:pPr>
+      <w:r>
+        <w:t>15. Orientação do ciclo (Ana Karina)</w:t>
       </w:r>
     </w:p>
     <w:p>

</xml_diff>

<commit_message>
Incorporar feedbacks Rafael, Jessica e Celline na Ana
Atualiza justificativa de recomendação, insumos, ações e ABCD Form
com evidências de qualidade, colaboração e ponto Jira.

Co-authored-by: Jonatas Andrade <jonatasandradedeveloper@users.noreply.github.com>
</commit_message>
<xml_diff>
--- a/DOCS-PEOPLE-LEAD/Ana-Karina/00-Documento-Unico.docx
+++ b/DOCS-PEOPLE-LEAD/Ana-Karina/00-Documento-Unico.docx
@@ -578,20 +578,6 @@
           <w:sz w:val="22"/>
         </w:rPr>
         <w:t>15. Orientação do ciclo (Ana Karina)</w:t>
-      </w:r>
-    </w:p>
-    <w:p>
-      <w:pPr>
-        <w:spacing w:after="120"/>
-      </w:pPr>
-      <w:r>
-        <w:rPr>
-          <w:rFonts w:ascii="Calibri" w:hAnsi="Calibri" w:eastAsia="Calibri"/>
-          <w:b w:val="0"/>
-          <w:i w:val="0"/>
-          <w:sz w:val="22"/>
-        </w:rPr>
-        <w:t>14. Orientação do ciclo (Ana Karina)</w:t>
       </w:r>
     </w:p>
     <w:p>
@@ -18160,7 +18146,7 @@
                 <w:i w:val="0"/>
                 <w:sz w:val="20"/>
               </w:rPr>
-              <w:t>Não como tese principal deste FY</w:t>
+              <w:t>Não neste FY</w:t>
             </w:r>
             <w:r>
               <w:rPr>
@@ -18169,7 +18155,7 @@
                 <w:i w:val="0"/>
                 <w:sz w:val="20"/>
               </w:rPr>
-              <w:t>, salvo evidência excepcional do projeto</w:t>
+              <w:t xml:space="preserve"> — confirmado pelos feedbacks (consolidação/autonomia)</w:t>
             </w:r>
           </w:p>
         </w:tc>
@@ -18190,16 +18176,7 @@
                 <w:i w:val="0"/>
                 <w:sz w:val="20"/>
               </w:rPr>
-              <w:t xml:space="preserve">Adm. 01/04/2026 (~5 meses) + feedback </w:t>
-            </w:r>
-            <w:r>
-              <w:rPr>
-                <w:rFonts w:ascii="Calibri" w:hAnsi="Calibri" w:eastAsia="Calibri"/>
-                <w:b/>
-                <w:i w:val="0"/>
-                <w:sz w:val="20"/>
-              </w:rPr>
-              <w:t>Rafael Coloda</w:t>
+              <w:t>Feedbacks Rafael + Jessica + Celline (08/09)</w:t>
             </w:r>
           </w:p>
         </w:tc>
@@ -18245,7 +18222,16 @@
                 <w:i w:val="0"/>
                 <w:sz w:val="20"/>
               </w:rPr>
-              <w:t>Sim, se Copilot + entrega aparecerem no Workday</w:t>
+              <w:t>Sim</w:t>
+            </w:r>
+            <w:r>
+              <w:rPr>
+                <w:rFonts w:ascii="Calibri" w:hAnsi="Calibri" w:eastAsia="Calibri"/>
+                <w:b w:val="0"/>
+                <w:i w:val="0"/>
+                <w:sz w:val="20"/>
+              </w:rPr>
+              <w:t xml:space="preserve"> — qualidade, riscos, colaboração</w:t>
             </w:r>
           </w:p>
         </w:tc>
@@ -18267,7 +18253,7 @@
                 <w:i w:val="0"/>
                 <w:sz w:val="20"/>
               </w:rPr>
-              <w:t>Homologação + agentes IA + feedback Jessica</w:t>
+              <w:t>Evidências dos 3 feedbacks</w:t>
             </w:r>
           </w:p>
         </w:tc>
@@ -18311,7 +18297,7 @@
                 <w:i w:val="0"/>
                 <w:sz w:val="20"/>
               </w:rPr>
-              <w:t>“Você priorizou o cliente com razão. O ciclo precisa enxergar isso. Inglês C1+ já é resultado. IA e Swift continuam no plano, com menos itens ao mesmo tempo.”</w:t>
+              <w:t>“Você priorizou o cliente com razão. Qualidade e comunicação de riscos foram reconhecidas. Foque autonomia e disciplina no Jira. Inglês C1+ e AZ-900 já são resultado.”</w:t>
             </w:r>
           </w:p>
         </w:tc>
@@ -18338,7 +18324,7 @@
           <w:i w:val="0"/>
           <w:sz w:val="22"/>
         </w:rPr>
-        <w:t>Justificativa da Recomendação (pronta para colar):</w:t>
+        <w:t>Justificativa da Recomendação (pronta):</w:t>
       </w:r>
       <w:r>
         <w:rPr>
@@ -18364,6 +18350,36 @@
       <w:r>
         <w:rPr>
           <w:rFonts w:ascii="Calibri" w:hAnsi="Calibri" w:eastAsia="Calibri"/>
+          <w:b/>
+          <w:i w:val="0"/>
+          <w:sz w:val="22"/>
+        </w:rPr>
+        <w:t>Feedbacks brutos / síntese:</w:t>
+      </w:r>
+      <w:r>
+        <w:rPr>
+          <w:rFonts w:ascii="Calibri" w:hAnsi="Calibri" w:eastAsia="Calibri"/>
+          <w:b w:val="0"/>
+          <w:i w:val="0"/>
+          <w:sz w:val="22"/>
+        </w:rPr>
+        <w:t xml:space="preserve"> </w:t>
+      </w:r>
+      <w:r>
+        <w:rPr>
+          <w:rFonts w:ascii="Consolas" w:hAnsi="Consolas" w:eastAsia="Consolas"/>
+          <w:b w:val="0"/>
+          <w:i w:val="0"/>
+          <w:color w:val="333333"/>
+          <w:sz w:val="18"/>
+        </w:rPr>
+        <w:t>16-feedbacks-projeto-rafael-jessica-celline.md</w:t>
+      </w:r>
+    </w:p>
+    <w:p>
+      <w:r>
+        <w:rPr>
+          <w:rFonts w:ascii="Calibri" w:hAnsi="Calibri" w:eastAsia="Calibri"/>
           <w:b w:val="0"/>
           <w:i w:val="0"/>
           <w:sz w:val="22"/>
@@ -18377,7 +18393,7 @@
           <w:i w:val="0"/>
           <w:sz w:val="22"/>
         </w:rPr>
-        <w:t>Associate mobile no BANCO BRADESCO (app nativo), homologação em curso, agentes Copilot/IA (analytics + frontend), inglês C1+, norte de arquitetura. Risco: prioridades dispersas no Workday — mitigado na 1:1 #2 com 4 reflexões.</w:t>
+        <w:t>Associate mobile no BANCO BRADESCO, desempenho consistente confirmado por gestor (Rafael Coloda), liderança técnica (Jessica) e par (Celline). Qualidade + comunicação de riscos + colaboração. Desenvolvimento: autonomia em complexidade + horas no Jira. Não promover neste FY.</w:t>
       </w:r>
     </w:p>
     <w:p>
@@ -18893,11 +18909,30 @@
             <w:r>
               <w:rPr>
                 <w:rFonts w:ascii="Calibri" w:hAnsi="Calibri" w:eastAsia="Calibri"/>
+                <w:b/>
+                <w:i w:val="0"/>
+                <w:sz w:val="20"/>
+              </w:rPr>
+              <w:t>Feedback recebido 08/09</w:t>
+            </w:r>
+            <w:r>
+              <w:rPr>
+                <w:rFonts w:ascii="Calibri" w:hAnsi="Calibri" w:eastAsia="Calibri"/>
                 <w:b w:val="0"/>
                 <w:i w:val="0"/>
                 <w:sz w:val="20"/>
               </w:rPr>
-              <w:t>rafael.coloda@avanade.com — Ana agenda café de percepção</w:t>
+              <w:t xml:space="preserve"> — ver </w:t>
+            </w:r>
+            <w:r>
+              <w:rPr>
+                <w:rFonts w:ascii="Consolas" w:hAnsi="Consolas" w:eastAsia="Consolas"/>
+                <w:b w:val="0"/>
+                <w:i w:val="0"/>
+                <w:color w:val="333333"/>
+                <w:sz w:val="20"/>
+              </w:rPr>
+              <w:t>16-feedbacks-projeto-rafael-jessica-celline.md</w:t>
             </w:r>
           </w:p>
         </w:tc>
@@ -18952,7 +18987,7 @@
                 <w:i w:val="0"/>
                 <w:sz w:val="20"/>
               </w:rPr>
-              <w:t>Proximidade técnica; validação Copilot/agentes</w:t>
+              <w:t>Proximidade técnica</w:t>
             </w:r>
           </w:p>
         </w:tc>
@@ -18970,11 +19005,11 @@
             <w:r>
               <w:rPr>
                 <w:rFonts w:ascii="Calibri" w:hAnsi="Calibri" w:eastAsia="Calibri"/>
-                <w:b w:val="0"/>
-                <w:i w:val="0"/>
-                <w:sz w:val="20"/>
-              </w:rPr>
-              <w:t>Ana já pediu antes; reforçar no Workday; PL alinha</w:t>
+                <w:b/>
+                <w:i w:val="0"/>
+                <w:sz w:val="20"/>
+              </w:rPr>
+              <w:t>Feedback recebido 08/09</w:t>
             </w:r>
           </w:p>
         </w:tc>
@@ -18993,11 +19028,20 @@
             <w:r>
               <w:rPr>
                 <w:rFonts w:ascii="Calibri" w:hAnsi="Calibri" w:eastAsia="Calibri"/>
+                <w:b/>
+                <w:i w:val="0"/>
+                <w:sz w:val="20"/>
+              </w:rPr>
+              <w:t>Celline</w:t>
+            </w:r>
+            <w:r>
+              <w:rPr>
+                <w:rFonts w:ascii="Calibri" w:hAnsi="Calibri" w:eastAsia="Calibri"/>
                 <w:b w:val="0"/>
                 <w:i w:val="0"/>
                 <w:sz w:val="20"/>
               </w:rPr>
-              <w:t>Par Android e par iOS</w:t>
+              <w:t xml:space="preserve"> (par)</w:t>
             </w:r>
           </w:p>
         </w:tc>
@@ -19018,7 +19062,7 @@
                 <w:i w:val="0"/>
                 <w:sz w:val="20"/>
               </w:rPr>
-              <w:t>Colaboração e prompt compartilhado</w:t>
+              <w:t>Colaboração no dia a dia</w:t>
             </w:r>
           </w:p>
         </w:tc>
@@ -19035,11 +19079,11 @@
             <w:r>
               <w:rPr>
                 <w:rFonts w:ascii="Calibri" w:hAnsi="Calibri" w:eastAsia="Calibri"/>
-                <w:b w:val="0"/>
-                <w:i w:val="0"/>
-                <w:sz w:val="20"/>
-              </w:rPr>
-              <w:t>Ana pede feedback</w:t>
+                <w:b/>
+                <w:i w:val="0"/>
+                <w:sz w:val="20"/>
+              </w:rPr>
+              <w:t>Feedback recebido 08/09</w:t>
             </w:r>
           </w:p>
         </w:tc>
@@ -19063,7 +19107,7 @@
                 <w:i w:val="0"/>
                 <w:sz w:val="20"/>
               </w:rPr>
-              <w:t>João / IADrops (Bradesco)</w:t>
+              <w:t>Par Android e par iOS</w:t>
             </w:r>
           </w:p>
         </w:tc>
@@ -19085,7 +19129,7 @@
                 <w:i w:val="0"/>
                 <w:sz w:val="20"/>
               </w:rPr>
-              <w:t>Direcionamento de IA</w:t>
+              <w:t>Colaboração e prompt compartilhado</w:t>
             </w:r>
           </w:p>
         </w:tc>
@@ -19107,7 +19151,7 @@
                 <w:i w:val="0"/>
                 <w:sz w:val="20"/>
               </w:rPr>
-              <w:t>Citado na reflexão</w:t>
+              <w:t>Ana pede feedback</w:t>
             </w:r>
           </w:p>
         </w:tc>
@@ -19130,7 +19174,7 @@
                 <w:i w:val="0"/>
                 <w:sz w:val="20"/>
               </w:rPr>
-              <w:t>Osvaldo / alguém de IADrops</w:t>
+              <w:t>João / IADrops (Bradesco)</w:t>
             </w:r>
           </w:p>
         </w:tc>
@@ -19151,7 +19195,7 @@
                 <w:i w:val="0"/>
                 <w:sz w:val="20"/>
               </w:rPr>
-              <w:t>Valida a frente de Copilot, se fizer sentido</w:t>
+              <w:t>Direcionamento de IA</w:t>
             </w:r>
           </w:p>
         </w:tc>
@@ -19172,7 +19216,7 @@
                 <w:i w:val="0"/>
                 <w:sz w:val="20"/>
               </w:rPr>
-              <w:t>Opcional</w:t>
+              <w:t>Citado na reflexão</w:t>
             </w:r>
           </w:p>
         </w:tc>
@@ -19196,7 +19240,7 @@
                 <w:i w:val="0"/>
                 <w:sz w:val="20"/>
               </w:rPr>
-              <w:t>Paula</w:t>
+              <w:t>Osvaldo / alguém de IADrops</w:t>
             </w:r>
           </w:p>
         </w:tc>
@@ -19218,7 +19262,7 @@
                 <w:i w:val="0"/>
                 <w:sz w:val="20"/>
               </w:rPr>
-              <w:t>Contexto de plano de carreira 2025–26</w:t>
+              <w:t>Valida a frente de Copilot, se fizer sentido</w:t>
             </w:r>
           </w:p>
         </w:tc>
@@ -19226,6 +19270,71 @@
           <w:tcPr>
             <w:tcW w:type="dxa" w:w="3249"/>
             <w:shd w:fill="F3F6FA" w:val="clear"/>
+          </w:tcPr>
+          <w:p>
+            <w:r>
+              <w:rPr>
+                <w:sz w:val="20"/>
+              </w:rPr>
+            </w:r>
+            <w:r>
+              <w:rPr>
+                <w:rFonts w:ascii="Calibri" w:hAnsi="Calibri" w:eastAsia="Calibri"/>
+                <w:b w:val="0"/>
+                <w:i w:val="0"/>
+                <w:sz w:val="20"/>
+              </w:rPr>
+              <w:t>Opcional</w:t>
+            </w:r>
+          </w:p>
+        </w:tc>
+      </w:tr>
+      <w:tr>
+        <w:tc>
+          <w:tcPr>
+            <w:tcW w:type="dxa" w:w="3249"/>
+          </w:tcPr>
+          <w:p>
+            <w:r>
+              <w:rPr>
+                <w:sz w:val="20"/>
+              </w:rPr>
+            </w:r>
+            <w:r>
+              <w:rPr>
+                <w:rFonts w:ascii="Calibri" w:hAnsi="Calibri" w:eastAsia="Calibri"/>
+                <w:b w:val="0"/>
+                <w:i w:val="0"/>
+                <w:sz w:val="20"/>
+              </w:rPr>
+              <w:t>Paula</w:t>
+            </w:r>
+          </w:p>
+        </w:tc>
+        <w:tc>
+          <w:tcPr>
+            <w:tcW w:type="dxa" w:w="3249"/>
+          </w:tcPr>
+          <w:p>
+            <w:r>
+              <w:rPr>
+                <w:sz w:val="20"/>
+              </w:rPr>
+            </w:r>
+            <w:r>
+              <w:rPr>
+                <w:rFonts w:ascii="Calibri" w:hAnsi="Calibri" w:eastAsia="Calibri"/>
+                <w:b w:val="0"/>
+                <w:i w:val="0"/>
+                <w:sz w:val="20"/>
+              </w:rPr>
+              <w:t>Contexto de plano de carreira 2025–26</w:t>
+            </w:r>
+          </w:p>
+        </w:tc>
+        <w:tc>
+          <w:tcPr>
+            <w:tcW w:type="dxa" w:w="3249"/>
           </w:tcPr>
           <w:p>
             <w:r>
@@ -19642,7 +19751,7 @@
           <w:i w:val="0"/>
           <w:sz w:val="22"/>
         </w:rPr>
-        <w:t xml:space="preserve">☐ Pedir feedback </w:t>
+        <w:t xml:space="preserve">☑ Pedir feedback </w:t>
       </w:r>
       <w:r>
         <w:rPr>
@@ -19660,7 +19769,144 @@
           <w:i w:val="0"/>
           <w:sz w:val="22"/>
         </w:rPr>
-        <w:t xml:space="preserve"> (e-mail pronto em </w:t>
+        <w:t xml:space="preserve"> — </w:t>
+      </w:r>
+      <w:r>
+        <w:rPr>
+          <w:rFonts w:ascii="Calibri" w:hAnsi="Calibri" w:eastAsia="Calibri"/>
+          <w:b/>
+          <w:i w:val="0"/>
+          <w:sz w:val="22"/>
+        </w:rPr>
+        <w:t>recebido 08/09</w:t>
+      </w:r>
+    </w:p>
+    <w:p>
+      <w:pPr>
+        <w:pStyle w:val="ListBullet"/>
+      </w:pPr>
+      <w:r>
+        <w:rPr>
+          <w:rFonts w:ascii="Calibri" w:hAnsi="Calibri" w:eastAsia="Calibri"/>
+          <w:b w:val="0"/>
+          <w:i w:val="0"/>
+          <w:sz w:val="22"/>
+        </w:rPr>
+        <w:t xml:space="preserve">☑ Pedir feedback </w:t>
+      </w:r>
+      <w:r>
+        <w:rPr>
+          <w:rFonts w:ascii="Calibri" w:hAnsi="Calibri" w:eastAsia="Calibri"/>
+          <w:b/>
+          <w:i w:val="0"/>
+          <w:sz w:val="22"/>
+        </w:rPr>
+        <w:t>Jessica</w:t>
+      </w:r>
+      <w:r>
+        <w:rPr>
+          <w:rFonts w:ascii="Calibri" w:hAnsi="Calibri" w:eastAsia="Calibri"/>
+          <w:b w:val="0"/>
+          <w:i w:val="0"/>
+          <w:sz w:val="22"/>
+        </w:rPr>
+        <w:t xml:space="preserve"> — </w:t>
+      </w:r>
+      <w:r>
+        <w:rPr>
+          <w:rFonts w:ascii="Calibri" w:hAnsi="Calibri" w:eastAsia="Calibri"/>
+          <w:b/>
+          <w:i w:val="0"/>
+          <w:sz w:val="22"/>
+        </w:rPr>
+        <w:t>recebido 08/09</w:t>
+      </w:r>
+    </w:p>
+    <w:p>
+      <w:pPr>
+        <w:pStyle w:val="ListBullet"/>
+      </w:pPr>
+      <w:r>
+        <w:rPr>
+          <w:rFonts w:ascii="Calibri" w:hAnsi="Calibri" w:eastAsia="Calibri"/>
+          <w:b w:val="0"/>
+          <w:i w:val="0"/>
+          <w:sz w:val="22"/>
+        </w:rPr>
+        <w:t xml:space="preserve">☑ Feedback </w:t>
+      </w:r>
+      <w:r>
+        <w:rPr>
+          <w:rFonts w:ascii="Calibri" w:hAnsi="Calibri" w:eastAsia="Calibri"/>
+          <w:b/>
+          <w:i w:val="0"/>
+          <w:sz w:val="22"/>
+        </w:rPr>
+        <w:t>Celline</w:t>
+      </w:r>
+      <w:r>
+        <w:rPr>
+          <w:rFonts w:ascii="Calibri" w:hAnsi="Calibri" w:eastAsia="Calibri"/>
+          <w:b w:val="0"/>
+          <w:i w:val="0"/>
+          <w:sz w:val="22"/>
+        </w:rPr>
+        <w:t xml:space="preserve"> (par) — </w:t>
+      </w:r>
+      <w:r>
+        <w:rPr>
+          <w:rFonts w:ascii="Calibri" w:hAnsi="Calibri" w:eastAsia="Calibri"/>
+          <w:b/>
+          <w:i w:val="0"/>
+          <w:sz w:val="22"/>
+        </w:rPr>
+        <w:t>recebido 08/09</w:t>
+      </w:r>
+    </w:p>
+    <w:p>
+      <w:pPr>
+        <w:pStyle w:val="ListBullet"/>
+      </w:pPr>
+      <w:r>
+        <w:rPr>
+          <w:rFonts w:ascii="Calibri" w:hAnsi="Calibri" w:eastAsia="Calibri"/>
+          <w:b w:val="0"/>
+          <w:i w:val="0"/>
+          <w:sz w:val="22"/>
+        </w:rPr>
+        <w:t>☐ Cobrar Ana: autorreflexão ABCD (ainda pendente no histórico PL)</w:t>
+      </w:r>
+    </w:p>
+    <w:p>
+      <w:pPr>
+        <w:pStyle w:val="ListBullet"/>
+      </w:pPr>
+      <w:r>
+        <w:rPr>
+          <w:rFonts w:ascii="Calibri" w:hAnsi="Calibri" w:eastAsia="Calibri"/>
+          <w:b w:val="0"/>
+          <w:i w:val="0"/>
+          <w:sz w:val="22"/>
+        </w:rPr>
+        <w:t xml:space="preserve">☐ </w:t>
+      </w:r>
+      <w:r>
+        <w:rPr>
+          <w:rFonts w:ascii="Calibri" w:hAnsi="Calibri" w:eastAsia="Calibri"/>
+          <w:b/>
+          <w:i w:val="0"/>
+          <w:sz w:val="22"/>
+        </w:rPr>
+        <w:t>Input ABCD Form + Justificativa</w:t>
+      </w:r>
+      <w:r>
+        <w:rPr>
+          <w:rFonts w:ascii="Calibri" w:hAnsi="Calibri" w:eastAsia="Calibri"/>
+          <w:b w:val="0"/>
+          <w:i w:val="0"/>
+          <w:sz w:val="22"/>
+        </w:rPr>
+        <w:t xml:space="preserve"> — usar </w:t>
       </w:r>
       <w:r>
         <w:rPr>
@@ -19670,16 +19916,16 @@
           <w:color w:val="333333"/>
           <w:sz w:val="18"/>
         </w:rPr>
-        <w:t>14-pedidos-feedback.md</w:t>
-      </w:r>
-      <w:r>
-        <w:rPr>
-          <w:rFonts w:ascii="Calibri" w:hAnsi="Calibri" w:eastAsia="Calibri"/>
-          <w:b w:val="0"/>
-          <w:i w:val="0"/>
-          <w:sz w:val="22"/>
-        </w:rPr>
-        <w:t>)</w:t>
+        <w:t>15-justificativa-recomendacao.md</w:t>
+      </w:r>
+      <w:r>
+        <w:rPr>
+          <w:rFonts w:ascii="Calibri" w:hAnsi="Calibri" w:eastAsia="Calibri"/>
+          <w:b w:val="0"/>
+          <w:i w:val="0"/>
+          <w:sz w:val="22"/>
+        </w:rPr>
+        <w:t xml:space="preserve"> (já com feedbacks)</w:t>
       </w:r>
     </w:p>
     <w:p>
@@ -19693,7 +19939,21 @@
           <w:i w:val="0"/>
           <w:sz w:val="22"/>
         </w:rPr>
-        <w:t xml:space="preserve">☐ Pedir feedback </w:t>
+        <w:t>☐ Na 1:1 #3: alinhar ponto Jira (horas) + autonomia + quadro T/S/A</w:t>
+      </w:r>
+    </w:p>
+    <w:p>
+      <w:pPr>
+        <w:pStyle w:val="ListBullet"/>
+      </w:pPr>
+      <w:r>
+        <w:rPr>
+          <w:rFonts w:ascii="Calibri" w:hAnsi="Calibri" w:eastAsia="Calibri"/>
+          <w:b w:val="0"/>
+          <w:i w:val="0"/>
+          <w:sz w:val="22"/>
+        </w:rPr>
+        <w:t xml:space="preserve">☐ Enviar material Copilot + docs </w:t>
       </w:r>
       <w:r>
         <w:rPr>
@@ -19702,16 +19962,16 @@
           <w:i w:val="0"/>
           <w:sz w:val="22"/>
         </w:rPr>
-        <w:t>Jessica</w:t>
-      </w:r>
-      <w:r>
-        <w:rPr>
-          <w:rFonts w:ascii="Calibri" w:hAnsi="Calibri" w:eastAsia="Calibri"/>
-          <w:b w:val="0"/>
-          <w:i w:val="0"/>
-          <w:sz w:val="22"/>
-        </w:rPr>
-        <w:t xml:space="preserve"> (Teams/Workday)</w:t>
+        <w:t>PUG</w:t>
+      </w:r>
+      <w:r>
+        <w:rPr>
+          <w:rFonts w:ascii="Calibri" w:hAnsi="Calibri" w:eastAsia="Calibri"/>
+          <w:b w:val="0"/>
+          <w:i w:val="0"/>
+          <w:sz w:val="22"/>
+        </w:rPr>
+        <w:t xml:space="preserve"> para Ana</w:t>
       </w:r>
     </w:p>
     <w:p>
@@ -19725,7 +19985,7 @@
           <w:i w:val="0"/>
           <w:sz w:val="22"/>
         </w:rPr>
-        <w:t>☐ Cobrar Ana: autorreflexão + pedido de feedback no Workday</w:t>
+        <w:t>☐ Pegar e-mail da Paula (CA anterior), se ainda não chegou</w:t>
       </w:r>
     </w:p>
     <w:p>
@@ -19739,7 +19999,7 @@
           <w:i w:val="0"/>
           <w:sz w:val="22"/>
         </w:rPr>
-        <w:t xml:space="preserve">☐ Enviar material Copilot + docs </w:t>
+        <w:t xml:space="preserve">☐ Combinar expectativa de cargo (consolidar vs. Analyst) — </w:t>
       </w:r>
       <w:r>
         <w:rPr>
@@ -19748,201 +20008,16 @@
           <w:i w:val="0"/>
           <w:sz w:val="22"/>
         </w:rPr>
-        <w:t>PUG</w:t>
-      </w:r>
-      <w:r>
-        <w:rPr>
-          <w:rFonts w:ascii="Calibri" w:hAnsi="Calibri" w:eastAsia="Calibri"/>
-          <w:b w:val="0"/>
-          <w:i w:val="0"/>
-          <w:sz w:val="22"/>
-        </w:rPr>
-        <w:t xml:space="preserve"> para Ana</w:t>
-      </w:r>
-    </w:p>
-    <w:p>
-      <w:pPr>
-        <w:pStyle w:val="ListBullet"/>
-      </w:pPr>
-      <w:r>
-        <w:rPr>
-          <w:rFonts w:ascii="Calibri" w:hAnsi="Calibri" w:eastAsia="Calibri"/>
-          <w:b w:val="0"/>
-          <w:i w:val="0"/>
-          <w:sz w:val="22"/>
-        </w:rPr>
-        <w:t xml:space="preserve">☐ Falar com </w:t>
-      </w:r>
-      <w:r>
-        <w:rPr>
-          <w:rFonts w:ascii="Calibri" w:hAnsi="Calibri" w:eastAsia="Calibri"/>
-          <w:b/>
-          <w:i w:val="0"/>
-          <w:sz w:val="22"/>
-        </w:rPr>
-        <w:t>Jessica</w:t>
-      </w:r>
-      <w:r>
-        <w:rPr>
-          <w:rFonts w:ascii="Calibri" w:hAnsi="Calibri" w:eastAsia="Calibri"/>
-          <w:b w:val="0"/>
-          <w:i w:val="0"/>
-          <w:sz w:val="22"/>
-        </w:rPr>
-        <w:t xml:space="preserve"> para feedback no Workday</w:t>
-      </w:r>
-    </w:p>
-    <w:p>
-      <w:pPr>
-        <w:pStyle w:val="ListBullet"/>
-      </w:pPr>
-      <w:r>
-        <w:rPr>
-          <w:rFonts w:ascii="Calibri" w:hAnsi="Calibri" w:eastAsia="Calibri"/>
-          <w:b w:val="0"/>
-          <w:i w:val="0"/>
-          <w:sz w:val="22"/>
-        </w:rPr>
-        <w:t>☐ Pegar e-mail da Paula (CA anterior), se ainda não chegou</w:t>
-      </w:r>
-    </w:p>
-    <w:p>
-      <w:pPr>
-        <w:pStyle w:val="ListBullet"/>
-      </w:pPr>
-      <w:r>
-        <w:rPr>
-          <w:rFonts w:ascii="Calibri" w:hAnsi="Calibri" w:eastAsia="Calibri"/>
-          <w:b w:val="0"/>
-          <w:i w:val="0"/>
-          <w:sz w:val="22"/>
-        </w:rPr>
-        <w:t xml:space="preserve">☐ Confirmar submissão da autorreflexão ABCD — </w:t>
-      </w:r>
-      <w:r>
-        <w:rPr>
-          <w:rFonts w:ascii="Calibri" w:hAnsi="Calibri" w:eastAsia="Calibri"/>
-          <w:b/>
-          <w:i w:val="0"/>
-          <w:sz w:val="22"/>
-        </w:rPr>
-        <w:t>não recebida do PL até 28/08</w:t>
-      </w:r>
-    </w:p>
-    <w:p>
-      <w:pPr>
-        <w:pStyle w:val="ListBullet"/>
-      </w:pPr>
-      <w:r>
-        <w:rPr>
-          <w:rFonts w:ascii="Calibri" w:hAnsi="Calibri" w:eastAsia="Calibri"/>
-          <w:b w:val="0"/>
-          <w:i w:val="0"/>
-          <w:sz w:val="22"/>
-        </w:rPr>
-        <w:t xml:space="preserve">☐ </w:t>
-      </w:r>
-      <w:r>
-        <w:rPr>
-          <w:rFonts w:ascii="Calibri" w:hAnsi="Calibri" w:eastAsia="Calibri"/>
-          <w:b/>
-          <w:i w:val="0"/>
-          <w:sz w:val="22"/>
-        </w:rPr>
-        <w:t>Input ABCD Form no Workday — até 11/09/2026</w:t>
-      </w:r>
-      <w:r>
-        <w:rPr>
-          <w:rFonts w:ascii="Calibri" w:hAnsi="Calibri" w:eastAsia="Calibri"/>
-          <w:b w:val="0"/>
-          <w:i w:val="0"/>
-          <w:sz w:val="22"/>
-        </w:rPr>
-        <w:t xml:space="preserve"> — usar </w:t>
-      </w:r>
-      <w:r>
-        <w:rPr>
-          <w:rFonts w:ascii="Consolas" w:hAnsi="Consolas" w:eastAsia="Consolas"/>
-          <w:b w:val="0"/>
-          <w:i w:val="0"/>
-          <w:color w:val="333333"/>
-          <w:sz w:val="18"/>
-        </w:rPr>
-        <w:t>12-abcd-form-people-lead-rascunho.md</w:t>
-      </w:r>
-      <w:r>
-        <w:rPr>
-          <w:rFonts w:ascii="Calibri" w:hAnsi="Calibri" w:eastAsia="Calibri"/>
-          <w:b w:val="0"/>
-          <w:i w:val="0"/>
-          <w:sz w:val="22"/>
-        </w:rPr>
-        <w:t xml:space="preserve"> + </w:t>
-      </w:r>
-      <w:r>
-        <w:rPr>
-          <w:rFonts w:ascii="Calibri" w:hAnsi="Calibri" w:eastAsia="Calibri"/>
-          <w:b/>
-          <w:i w:val="0"/>
-          <w:sz w:val="22"/>
-        </w:rPr>
-        <w:t>`15-justificativa-recomendacao.md`</w:t>
-      </w:r>
-    </w:p>
-    <w:p>
-      <w:pPr>
-        <w:pStyle w:val="ListBullet"/>
-      </w:pPr>
-      <w:r>
-        <w:rPr>
-          <w:rFonts w:ascii="Calibri" w:hAnsi="Calibri" w:eastAsia="Calibri"/>
-          <w:b w:val="0"/>
-          <w:i w:val="0"/>
-          <w:sz w:val="22"/>
-        </w:rPr>
-        <w:t>☐ Revisar insumos (</w:t>
-      </w:r>
-      <w:r>
-        <w:rPr>
-          <w:rFonts w:ascii="Consolas" w:hAnsi="Consolas" w:eastAsia="Consolas"/>
-          <w:b w:val="0"/>
-          <w:i w:val="0"/>
-          <w:color w:val="333333"/>
-          <w:sz w:val="18"/>
-        </w:rPr>
-        <w:t>04-insumos-ciclo.md</w:t>
-      </w:r>
-      <w:r>
-        <w:rPr>
-          <w:rFonts w:ascii="Calibri" w:hAnsi="Calibri" w:eastAsia="Calibri"/>
-          <w:b w:val="0"/>
-          <w:i w:val="0"/>
-          <w:sz w:val="22"/>
-        </w:rPr>
-        <w:t>) antes do input PL</w:t>
-      </w:r>
-    </w:p>
-    <w:p>
-      <w:pPr>
-        <w:pStyle w:val="ListBullet"/>
-      </w:pPr>
-      <w:r>
-        <w:rPr>
-          <w:rFonts w:ascii="Calibri" w:hAnsi="Calibri" w:eastAsia="Calibri"/>
-          <w:b w:val="0"/>
-          <w:i w:val="0"/>
-          <w:sz w:val="22"/>
-        </w:rPr>
-        <w:t xml:space="preserve">☐ Combinar expectativa de cargo (consolidar vs. Analyst) — </w:t>
-      </w:r>
-      <w:r>
-        <w:rPr>
-          <w:rFonts w:ascii="Calibri" w:hAnsi="Calibri" w:eastAsia="Calibri"/>
-          <w:b/>
-          <w:i w:val="0"/>
-          <w:sz w:val="22"/>
-        </w:rPr>
         <w:t>pauta 1:1 #3</w:t>
+      </w:r>
+      <w:r>
+        <w:rPr>
+          <w:rFonts w:ascii="Calibri" w:hAnsi="Calibri" w:eastAsia="Calibri"/>
+          <w:b w:val="0"/>
+          <w:i w:val="0"/>
+          <w:sz w:val="22"/>
+        </w:rPr>
+        <w:t xml:space="preserve"> (feedbacks já apontam consolidação)</w:t>
       </w:r>
     </w:p>
     <w:p>
@@ -20859,6 +20934,92 @@
           </w:p>
         </w:tc>
       </w:tr>
+      <w:tr>
+        <w:tc>
+          <w:tcPr>
+            <w:tcW w:type="dxa" w:w="2436"/>
+          </w:tcPr>
+          <w:p>
+            <w:r>
+              <w:rPr>
+                <w:sz w:val="20"/>
+              </w:rPr>
+            </w:r>
+            <w:r>
+              <w:rPr>
+                <w:rFonts w:ascii="Calibri" w:hAnsi="Calibri" w:eastAsia="Calibri"/>
+                <w:b w:val="0"/>
+                <w:i w:val="0"/>
+                <w:sz w:val="20"/>
+              </w:rPr>
+              <w:t>2026-09-08</w:t>
+            </w:r>
+          </w:p>
+        </w:tc>
+        <w:tc>
+          <w:tcPr>
+            <w:tcW w:type="dxa" w:w="2436"/>
+          </w:tcPr>
+          <w:p>
+            <w:r>
+              <w:rPr>
+                <w:sz w:val="20"/>
+              </w:rPr>
+            </w:r>
+            <w:r>
+              <w:rPr>
+                <w:rFonts w:ascii="Calibri" w:hAnsi="Calibri" w:eastAsia="Calibri"/>
+                <w:b w:val="0"/>
+                <w:i w:val="0"/>
+                <w:sz w:val="20"/>
+              </w:rPr>
+              <w:t>Feedbacks projeto</w:t>
+            </w:r>
+          </w:p>
+        </w:tc>
+        <w:tc>
+          <w:tcPr>
+            <w:tcW w:type="dxa" w:w="2436"/>
+          </w:tcPr>
+          <w:p>
+            <w:r>
+              <w:rPr>
+                <w:sz w:val="20"/>
+              </w:rPr>
+            </w:r>
+            <w:r>
+              <w:rPr>
+                <w:rFonts w:ascii="Calibri" w:hAnsi="Calibri" w:eastAsia="Calibri"/>
+                <w:b w:val="0"/>
+                <w:i w:val="0"/>
+                <w:sz w:val="20"/>
+              </w:rPr>
+              <w:t>Rafael, Jessica, Celline</w:t>
+            </w:r>
+          </w:p>
+        </w:tc>
+        <w:tc>
+          <w:tcPr>
+            <w:tcW w:type="dxa" w:w="2436"/>
+          </w:tcPr>
+          <w:p>
+            <w:r>
+              <w:rPr>
+                <w:sz w:val="20"/>
+              </w:rPr>
+            </w:r>
+            <w:r>
+              <w:rPr>
+                <w:rFonts w:ascii="Calibri" w:hAnsi="Calibri" w:eastAsia="Calibri"/>
+                <w:b w:val="0"/>
+                <w:i w:val="0"/>
+                <w:sz w:val="20"/>
+              </w:rPr>
+              <w:t>Incorporados na justificativa de recomendação</w:t>
+            </w:r>
+          </w:p>
+        </w:tc>
+      </w:tr>
     </w:tbl>
     <w:p/>
     <w:p>
@@ -26597,7 +26758,7 @@
           <w:color w:val="555555"/>
           <w:sz w:val="22"/>
         </w:rPr>
-        <w:t xml:space="preserve"> (jul/ago). A </w:t>
+        <w:t xml:space="preserve"> (jul/ago) + </w:t>
       </w:r>
       <w:r>
         <w:rPr>
@@ -26607,7 +26768,7 @@
           <w:color w:val="555555"/>
           <w:sz w:val="22"/>
         </w:rPr>
-        <w:t>autorreflexão da Ana ainda não foi submetida/enviada</w:t>
+        <w:t>feedbacks Rafael, Jessica e Celline (08/09)</w:t>
       </w:r>
       <w:r>
         <w:rPr>
@@ -26617,7 +26778,7 @@
           <w:color w:val="555555"/>
           <w:sz w:val="22"/>
         </w:rPr>
-        <w:t xml:space="preserve"> — quando chegar, cruzar e ajustar.   Troque </w:t>
+        <w:t xml:space="preserve">.   Justificativa pronta e atualizada: </w:t>
       </w:r>
       <w:r>
         <w:rPr>
@@ -26627,7 +26788,7 @@
           <w:color w:val="555555"/>
           <w:sz w:val="18"/>
         </w:rPr>
-        <w:t>[...]</w:t>
+        <w:t>15-justificativa-recomendacao.md</w:t>
       </w:r>
       <w:r>
         <w:rPr>
@@ -26637,7 +26798,7 @@
           <w:color w:val="555555"/>
           <w:sz w:val="22"/>
         </w:rPr>
-        <w:t xml:space="preserve"> por citações reais quando os feedbacks chegarem.</w:t>
+        <w:t>.   Autorreflexão da Ana: cruzar quando ela submeter.</w:t>
       </w:r>
     </w:p>
     <w:p>
@@ -27411,7 +27572,7 @@
           <w:i w:val="0"/>
           <w:sz w:val="22"/>
         </w:rPr>
-        <w:t xml:space="preserve"> evidências formais do projeto (feedback escrito do </w:t>
+        <w:t xml:space="preserve"> formalizar lista objetiva de features/PRs. Feedback do gestor </w:t>
       </w:r>
       <w:r>
         <w:rPr>
@@ -27420,35 +27581,16 @@
           <w:i w:val="0"/>
           <w:sz w:val="22"/>
         </w:rPr>
-        <w:t>Rafael Coloda</w:t>
-      </w:r>
-      <w:r>
-        <w:rPr>
-          <w:rFonts w:ascii="Calibri" w:hAnsi="Calibri" w:eastAsia="Calibri"/>
-          <w:b w:val="0"/>
-          <w:i w:val="0"/>
-          <w:sz w:val="22"/>
-        </w:rPr>
-        <w:t xml:space="preserve">, lista objetiva de features/PRs/impactos). Recomendo calibrar com o gestor: </w:t>
-      </w:r>
-      <w:r>
-        <w:rPr>
-          <w:rFonts w:ascii="Consolas" w:hAnsi="Consolas" w:eastAsia="Consolas"/>
-          <w:b w:val="0"/>
-          <w:i w:val="0"/>
-          <w:color w:val="333333"/>
-          <w:sz w:val="18"/>
-        </w:rPr>
-        <w:t>[inserir citação ou síntese do feedback de Rafael Coloda quando disponível]</w:t>
-      </w:r>
-      <w:r>
-        <w:rPr>
-          <w:rFonts w:ascii="Calibri" w:hAnsi="Calibri" w:eastAsia="Calibri"/>
-          <w:b w:val="0"/>
-          <w:i w:val="0"/>
-          <w:sz w:val="22"/>
-        </w:rPr>
-        <w:t>.</w:t>
+        <w:t>já recebido</w:t>
+      </w:r>
+      <w:r>
+        <w:rPr>
+          <w:rFonts w:ascii="Calibri" w:hAnsi="Calibri" w:eastAsia="Calibri"/>
+          <w:b w:val="0"/>
+          <w:i w:val="0"/>
+          <w:sz w:val="22"/>
+        </w:rPr>
+        <w:t xml:space="preserve"> (Rafael Coloda, 08/09): desempenho consistente, qualidade, comunicação de riscos; evolução: horas no Jira.</w:t>
       </w:r>
     </w:p>
     <w:p>
@@ -30334,6 +30476,71 @@
       </w:r>
     </w:p>
     <w:p>
+      <w:r>
+        <w:rPr>
+          <w:rFonts w:ascii="Calibri" w:hAnsi="Calibri" w:eastAsia="Calibri"/>
+          <w:b w:val="0"/>
+          <w:i w:val="0"/>
+          <w:sz w:val="22"/>
+        </w:rPr>
+        <w:t xml:space="preserve">Feedbacks de projeto: </w:t>
+      </w:r>
+      <w:r>
+        <w:rPr>
+          <w:rFonts w:ascii="Calibri" w:hAnsi="Calibri" w:eastAsia="Calibri"/>
+          <w:b/>
+          <w:i w:val="0"/>
+          <w:sz w:val="22"/>
+        </w:rPr>
+        <w:t>Rafael Coloda</w:t>
+      </w:r>
+      <w:r>
+        <w:rPr>
+          <w:rFonts w:ascii="Calibri" w:hAnsi="Calibri" w:eastAsia="Calibri"/>
+          <w:b w:val="0"/>
+          <w:i w:val="0"/>
+          <w:sz w:val="22"/>
+        </w:rPr>
+        <w:t xml:space="preserve">, </w:t>
+      </w:r>
+      <w:r>
+        <w:rPr>
+          <w:rFonts w:ascii="Calibri" w:hAnsi="Calibri" w:eastAsia="Calibri"/>
+          <w:b/>
+          <w:i w:val="0"/>
+          <w:sz w:val="22"/>
+        </w:rPr>
+        <w:t>Jessica</w:t>
+      </w:r>
+      <w:r>
+        <w:rPr>
+          <w:rFonts w:ascii="Calibri" w:hAnsi="Calibri" w:eastAsia="Calibri"/>
+          <w:b w:val="0"/>
+          <w:i w:val="0"/>
+          <w:sz w:val="22"/>
+        </w:rPr>
+        <w:t xml:space="preserve">, </w:t>
+      </w:r>
+      <w:r>
+        <w:rPr>
+          <w:rFonts w:ascii="Calibri" w:hAnsi="Calibri" w:eastAsia="Calibri"/>
+          <w:b/>
+          <w:i w:val="0"/>
+          <w:sz w:val="22"/>
+        </w:rPr>
+        <w:t>Celline</w:t>
+      </w:r>
+      <w:r>
+        <w:rPr>
+          <w:rFonts w:ascii="Calibri" w:hAnsi="Calibri" w:eastAsia="Calibri"/>
+          <w:b w:val="0"/>
+          <w:i w:val="0"/>
+          <w:sz w:val="22"/>
+        </w:rPr>
+        <w:t xml:space="preserve"> (registrados 08/09/2026)</w:t>
+      </w:r>
+    </w:p>
+    <w:p>
       <w:pPr>
         <w:ind w:left="425"/>
       </w:pPr>
@@ -30365,27 +30572,7 @@
           <w:color w:val="555555"/>
           <w:sz w:val="22"/>
         </w:rPr>
-        <w:t xml:space="preserve">.   Tom alinhado ao último ciclo (quando ainda era estágio), atualizado para </w:t>
-      </w:r>
-      <w:r>
-        <w:rPr>
-          <w:rFonts w:ascii="Calibri" w:hAnsi="Calibri" w:eastAsia="Calibri"/>
-          <w:b/>
-          <w:i w:val="0"/>
-          <w:color w:val="555555"/>
-          <w:sz w:val="22"/>
-        </w:rPr>
-        <w:t>Associate</w:t>
-      </w:r>
-      <w:r>
-        <w:rPr>
-          <w:rFonts w:ascii="Calibri" w:hAnsi="Calibri" w:eastAsia="Calibri"/>
-          <w:b w:val="0"/>
-          <w:i/>
-          <w:color w:val="555555"/>
-          <w:sz w:val="22"/>
-        </w:rPr>
-        <w:t xml:space="preserve"> efetivo.</w:t>
+        <w:t>.   Tom alinhado ao último ciclo, atualizado com evidências do projeto.</w:t>
       </w:r>
     </w:p>
     <w:p>
@@ -30559,7 +30746,7 @@
                 <w:i w:val="0"/>
                 <w:sz w:val="20"/>
               </w:rPr>
-              <w:t xml:space="preserve"> · potencial alto</w:t>
+              <w:t xml:space="preserve"> (confirmado por gestor + liderança técnica + par)</w:t>
             </w:r>
           </w:p>
         </w:tc>
@@ -30612,7 +30799,7 @@
                 <w:i w:val="0"/>
                 <w:sz w:val="20"/>
               </w:rPr>
-              <w:t xml:space="preserve"> (entrega no app + IA aplicada), sujeito a feedback do projeto</w:t>
+              <w:t xml:space="preserve"> — qualidade, colaboração, comunicação de riscos</w:t>
             </w:r>
           </w:p>
         </w:tc>
@@ -30636,7 +30823,7 @@
                 <w:i w:val="0"/>
                 <w:sz w:val="20"/>
               </w:rPr>
-              <w:t>Próximo foco</w:t>
+              <w:t>Desenvolvimento explícito</w:t>
             </w:r>
           </w:p>
         </w:tc>
@@ -30658,7 +30845,60 @@
                 <w:i w:val="0"/>
                 <w:sz w:val="20"/>
               </w:rPr>
-              <w:t>Consolidar Associate excelente → dossiê Analyst no FY27</w:t>
+              <w:t xml:space="preserve">Autonomia em complexidade + </w:t>
+            </w:r>
+            <w:r>
+              <w:rPr>
+                <w:rFonts w:ascii="Calibri" w:hAnsi="Calibri" w:eastAsia="Calibri"/>
+                <w:b/>
+                <w:i w:val="0"/>
+                <w:sz w:val="20"/>
+              </w:rPr>
+              <w:t>disciplina no lançamento de horas no Jira</w:t>
+            </w:r>
+          </w:p>
+        </w:tc>
+      </w:tr>
+      <w:tr>
+        <w:tc>
+          <w:tcPr>
+            <w:tcW w:type="dxa" w:w="4873"/>
+          </w:tcPr>
+          <w:p>
+            <w:r>
+              <w:rPr>
+                <w:sz w:val="20"/>
+              </w:rPr>
+            </w:r>
+            <w:r>
+              <w:rPr>
+                <w:rFonts w:ascii="Calibri" w:hAnsi="Calibri" w:eastAsia="Calibri"/>
+                <w:b w:val="0"/>
+                <w:i w:val="0"/>
+                <w:sz w:val="20"/>
+              </w:rPr>
+              <w:t>Próximo foco</w:t>
+            </w:r>
+          </w:p>
+        </w:tc>
+        <w:tc>
+          <w:tcPr>
+            <w:tcW w:type="dxa" w:w="4873"/>
+          </w:tcPr>
+          <w:p>
+            <w:r>
+              <w:rPr>
+                <w:sz w:val="20"/>
+              </w:rPr>
+            </w:r>
+            <w:r>
+              <w:rPr>
+                <w:rFonts w:ascii="Calibri" w:hAnsi="Calibri" w:eastAsia="Calibri"/>
+                <w:b w:val="0"/>
+                <w:i w:val="0"/>
+                <w:sz w:val="20"/>
+              </w:rPr>
+              <w:t>Consolidar Associate → dossiê Analyst no FY27</w:t>
             </w:r>
           </w:p>
         </w:tc>
@@ -30760,7 +31000,7 @@
           <w:i w:val="0"/>
           <w:sz w:val="22"/>
         </w:rPr>
-        <w:t xml:space="preserve"> na stack, na qualidade das entregas e na compreensão do produto — incluindo a transição do projeto de </w:t>
+        <w:t xml:space="preserve"> na condução das atividades sob sua responsabilidade e na compreensão do produto — incluindo a transição do projeto de </w:t>
       </w:r>
       <w:r>
         <w:rPr>
@@ -30807,7 +31047,7 @@
           <w:i w:val="0"/>
           <w:sz w:val="22"/>
         </w:rPr>
-        <w:t xml:space="preserve">, ao aprendizado aplicado no dia a dia e ao </w:t>
+        <w:t xml:space="preserve">, à preocupação com a </w:t>
       </w:r>
       <w:r>
         <w:rPr>
@@ -30816,16 +31056,16 @@
           <w:i w:val="0"/>
           <w:sz w:val="22"/>
         </w:rPr>
-        <w:t>uso real de Copilot e agentes de IA</w:t>
-      </w:r>
-      <w:r>
-        <w:rPr>
-          <w:rFonts w:ascii="Calibri" w:hAnsi="Calibri" w:eastAsia="Calibri"/>
-          <w:b w:val="0"/>
-          <w:i w:val="0"/>
-          <w:sz w:val="22"/>
-        </w:rPr>
-        <w:t xml:space="preserve"> no fluxo do time (incluindo iniciativa de agente para analytics e aplicação de IA no frontend), alinhado às prioridades da prática. Também concluiu a certificação </w:t>
+        <w:t>qualidade das implementações</w:t>
+      </w:r>
+      <w:r>
+        <w:rPr>
+          <w:rFonts w:ascii="Calibri" w:hAnsi="Calibri" w:eastAsia="Calibri"/>
+          <w:b w:val="0"/>
+          <w:i w:val="0"/>
+          <w:sz w:val="22"/>
+        </w:rPr>
+        <w:t xml:space="preserve"> e à </w:t>
       </w:r>
       <w:r>
         <w:rPr>
@@ -30834,6 +31074,42 @@
           <w:i w:val="0"/>
           <w:sz w:val="22"/>
         </w:rPr>
+        <w:t>comunicação antecipada de problemas e riscos</w:t>
+      </w:r>
+      <w:r>
+        <w:rPr>
+          <w:rFonts w:ascii="Calibri" w:hAnsi="Calibri" w:eastAsia="Calibri"/>
+          <w:b w:val="0"/>
+          <w:i w:val="0"/>
+          <w:sz w:val="22"/>
+        </w:rPr>
+        <w:t xml:space="preserve"> ao time. Também evoluiu o inglês de </w:t>
+      </w:r>
+      <w:r>
+        <w:rPr>
+          <w:rFonts w:ascii="Calibri" w:hAnsi="Calibri" w:eastAsia="Calibri"/>
+          <w:b/>
+          <w:i w:val="0"/>
+          <w:sz w:val="22"/>
+        </w:rPr>
+        <w:t>B2 para C1+</w:t>
+      </w:r>
+      <w:r>
+        <w:rPr>
+          <w:rFonts w:ascii="Calibri" w:hAnsi="Calibri" w:eastAsia="Calibri"/>
+          <w:b w:val="0"/>
+          <w:i w:val="0"/>
+          <w:sz w:val="22"/>
+        </w:rPr>
+        <w:t xml:space="preserve"> no goFluent e concluiu a certificação </w:t>
+      </w:r>
+      <w:r>
+        <w:rPr>
+          <w:rFonts w:ascii="Calibri" w:hAnsi="Calibri" w:eastAsia="Calibri"/>
+          <w:b/>
+          <w:i w:val="0"/>
+          <w:sz w:val="22"/>
+        </w:rPr>
         <w:t>AZ-900</w:t>
       </w:r>
       <w:r>
@@ -30843,7 +31119,7 @@
           <w:i w:val="0"/>
           <w:sz w:val="22"/>
         </w:rPr>
-        <w:t xml:space="preserve"> e evoluiu o inglês de </w:t>
+        <w:t xml:space="preserve">. Nas 1:1, relatou uso aplicado de Copilot/agentes de IA no fluxo do projeto, alinhado às prioridades da prática. Metas de médio prazo (ex.: Swift / AI-900 formal) foram conscientemente priorizadas em segundo plano diante da carga de </w:t>
       </w:r>
       <w:r>
         <w:rPr>
@@ -30852,16 +31128,16 @@
           <w:i w:val="0"/>
           <w:sz w:val="22"/>
         </w:rPr>
-        <w:t>B2 para C1+</w:t>
-      </w:r>
-      <w:r>
-        <w:rPr>
-          <w:rFonts w:ascii="Calibri" w:hAnsi="Calibri" w:eastAsia="Calibri"/>
-          <w:b w:val="0"/>
-          <w:i w:val="0"/>
-          <w:sz w:val="22"/>
-        </w:rPr>
-        <w:t xml:space="preserve"> no goFluent — resultados objetivos do ciclo. Metas de médio prazo (ex.: Swift / AI-900 formal) foram conscientemente priorizadas em segundo plano diante da carga de </w:t>
+        <w:t>faculdade presencial + entrega no cliente</w:t>
+      </w:r>
+      <w:r>
+        <w:rPr>
+          <w:rFonts w:ascii="Calibri" w:hAnsi="Calibri" w:eastAsia="Calibri"/>
+          <w:b w:val="0"/>
+          <w:i w:val="0"/>
+          <w:sz w:val="22"/>
+        </w:rPr>
+        <w:t xml:space="preserve">, com plano claro para o </w:t>
       </w:r>
       <w:r>
         <w:rPr>
@@ -30870,16 +31146,27 @@
           <w:i w:val="0"/>
           <w:sz w:val="22"/>
         </w:rPr>
-        <w:t>faculdade presencial + entrega no cliente</w:t>
-      </w:r>
-      <w:r>
-        <w:rPr>
-          <w:rFonts w:ascii="Calibri" w:hAnsi="Calibri" w:eastAsia="Calibri"/>
-          <w:b w:val="0"/>
-          <w:i w:val="0"/>
-          <w:sz w:val="22"/>
-        </w:rPr>
-        <w:t xml:space="preserve">, com plano claro para o </w:t>
+        <w:t>FY27</w:t>
+      </w:r>
+      <w:r>
+        <w:rPr>
+          <w:rFonts w:ascii="Calibri" w:hAnsi="Calibri" w:eastAsia="Calibri"/>
+          <w:b w:val="0"/>
+          <w:i w:val="0"/>
+          <w:sz w:val="22"/>
+        </w:rPr>
+        <w:t>.</w:t>
+      </w:r>
+    </w:p>
+    <w:p>
+      <w:r>
+        <w:rPr>
+          <w:rFonts w:ascii="Calibri" w:hAnsi="Calibri" w:eastAsia="Calibri"/>
+          <w:b w:val="0"/>
+          <w:i w:val="0"/>
+          <w:sz w:val="22"/>
+        </w:rPr>
+        <w:t xml:space="preserve">Os feedbacks de projeto </w:t>
       </w:r>
       <w:r>
         <w:rPr>
@@ -30888,7 +31175,229 @@
           <w:i w:val="0"/>
           <w:sz w:val="22"/>
         </w:rPr>
-        <w:t>FY27</w:t>
+        <w:t>confirmam</w:t>
+      </w:r>
+      <w:r>
+        <w:rPr>
+          <w:rFonts w:ascii="Calibri" w:hAnsi="Calibri" w:eastAsia="Calibri"/>
+          <w:b w:val="0"/>
+          <w:i w:val="0"/>
+          <w:sz w:val="22"/>
+        </w:rPr>
+        <w:t xml:space="preserve"> essa leitura. O gestor </w:t>
+      </w:r>
+      <w:r>
+        <w:rPr>
+          <w:rFonts w:ascii="Calibri" w:hAnsi="Calibri" w:eastAsia="Calibri"/>
+          <w:b/>
+          <w:i w:val="0"/>
+          <w:sz w:val="22"/>
+        </w:rPr>
+        <w:t>Rafael Coloda</w:t>
+      </w:r>
+      <w:r>
+        <w:rPr>
+          <w:rFonts w:ascii="Calibri" w:hAnsi="Calibri" w:eastAsia="Calibri"/>
+          <w:b w:val="0"/>
+          <w:i w:val="0"/>
+          <w:sz w:val="22"/>
+        </w:rPr>
+        <w:t xml:space="preserve"> aponta desempenho consistente e alinhado ao nível, qualidade das entregas, cautela nas implementações, comunicação de riscos, busca adequada de apoio e postura colaborativa — destacando, como ponto de atenção, a necessidade de maior disciplina no </w:t>
+      </w:r>
+      <w:r>
+        <w:rPr>
+          <w:rFonts w:ascii="Calibri" w:hAnsi="Calibri" w:eastAsia="Calibri"/>
+          <w:b/>
+          <w:i w:val="0"/>
+          <w:sz w:val="22"/>
+        </w:rPr>
+        <w:t>lançamento de horas no Jira</w:t>
+      </w:r>
+      <w:r>
+        <w:rPr>
+          <w:rFonts w:ascii="Calibri" w:hAnsi="Calibri" w:eastAsia="Calibri"/>
+          <w:b w:val="0"/>
+          <w:i w:val="0"/>
+          <w:sz w:val="22"/>
+        </w:rPr>
+        <w:t xml:space="preserve">, de forma autônoma e consistente. A liderança técnica </w:t>
+      </w:r>
+      <w:r>
+        <w:rPr>
+          <w:rFonts w:ascii="Calibri" w:hAnsi="Calibri" w:eastAsia="Calibri"/>
+          <w:b/>
+          <w:i w:val="0"/>
+          <w:sz w:val="22"/>
+        </w:rPr>
+        <w:t>Jessica</w:t>
+      </w:r>
+      <w:r>
+        <w:rPr>
+          <w:rFonts w:ascii="Calibri" w:hAnsi="Calibri" w:eastAsia="Calibri"/>
+          <w:b w:val="0"/>
+          <w:i w:val="0"/>
+          <w:sz w:val="22"/>
+        </w:rPr>
+        <w:t xml:space="preserve"> reforça evolução consistente, qualidade, comunicação de riscos, curiosidade e colaboração, com expectativa de ampliar autonomia técnica/funcional no próximo ciclo. A par </w:t>
+      </w:r>
+      <w:r>
+        <w:rPr>
+          <w:rFonts w:ascii="Calibri" w:hAnsi="Calibri" w:eastAsia="Calibri"/>
+          <w:b/>
+          <w:i w:val="0"/>
+          <w:sz w:val="22"/>
+        </w:rPr>
+        <w:t>Celline</w:t>
+      </w:r>
+      <w:r>
+        <w:rPr>
+          <w:rFonts w:ascii="Calibri" w:hAnsi="Calibri" w:eastAsia="Calibri"/>
+          <w:b w:val="0"/>
+          <w:i w:val="0"/>
+          <w:sz w:val="22"/>
+        </w:rPr>
+        <w:t xml:space="preserve"> descreve profissional dedicada, transparente, organizada, com preocupação com qualidade e prazos e colaboração positiva no dia a dia.</w:t>
+      </w:r>
+    </w:p>
+    <w:p>
+      <w:r>
+        <w:rPr>
+          <w:rFonts w:ascii="Calibri" w:hAnsi="Calibri" w:eastAsia="Calibri"/>
+          <w:b w:val="0"/>
+          <w:i w:val="0"/>
+          <w:sz w:val="22"/>
+        </w:rPr>
+        <w:t>Nas 1:1 com o People Lead, demonstra disponibilidade para diálogo, escuta ativa e interesse em compreender seu papel, expectativas e próximos passos. Apresenta postura profissional adequada, abertura para aprender, receptividade a feedbacks e clareza de norte de carreira (</w:t>
+      </w:r>
+      <w:r>
+        <w:rPr>
+          <w:rFonts w:ascii="Calibri" w:hAnsi="Calibri" w:eastAsia="Calibri"/>
+          <w:b/>
+          <w:i w:val="0"/>
+          <w:sz w:val="22"/>
+        </w:rPr>
+        <w:t>arquitetura mobile</w:t>
+      </w:r>
+      <w:r>
+        <w:rPr>
+          <w:rFonts w:ascii="Calibri" w:hAnsi="Calibri" w:eastAsia="Calibri"/>
+          <w:b w:val="0"/>
+          <w:i w:val="0"/>
+          <w:sz w:val="22"/>
+        </w:rPr>
+        <w:t>). Demonstra responsabilidade com combinados, honestidade no fechamento do ciclo e comportamento alinhado a um ambiente colaborativo e respeitoso.</w:t>
+      </w:r>
+    </w:p>
+    <w:p>
+      <w:r>
+        <w:rPr>
+          <w:rFonts w:ascii="Calibri" w:hAnsi="Calibri" w:eastAsia="Calibri"/>
+          <w:b w:val="0"/>
+          <w:i w:val="0"/>
+          <w:sz w:val="22"/>
+        </w:rPr>
+        <w:t xml:space="preserve">Segue em fase de </w:t>
+      </w:r>
+      <w:r>
+        <w:rPr>
+          <w:rFonts w:ascii="Calibri" w:hAnsi="Calibri" w:eastAsia="Calibri"/>
+          <w:b/>
+          <w:i w:val="0"/>
+          <w:sz w:val="22"/>
+        </w:rPr>
+        <w:t>consolidação técnica e profissional no nível Associate</w:t>
+      </w:r>
+      <w:r>
+        <w:rPr>
+          <w:rFonts w:ascii="Calibri" w:hAnsi="Calibri" w:eastAsia="Calibri"/>
+          <w:b w:val="0"/>
+          <w:i w:val="0"/>
+          <w:sz w:val="22"/>
+        </w:rPr>
+        <w:t xml:space="preserve">, com oportunidades claras de evolução em: maior autonomia na resolução de problemas e em atividades de maior complexidade; formalização de evidências e cases (incl. IA); e </w:t>
+      </w:r>
+      <w:r>
+        <w:rPr>
+          <w:rFonts w:ascii="Calibri" w:hAnsi="Calibri" w:eastAsia="Calibri"/>
+          <w:b/>
+          <w:i w:val="0"/>
+          <w:sz w:val="22"/>
+        </w:rPr>
+        <w:t>disciplina nas responsabilidades operacionais (lançamento de horas no Jira)</w:t>
+      </w:r>
+      <w:r>
+        <w:rPr>
+          <w:rFonts w:ascii="Calibri" w:hAnsi="Calibri" w:eastAsia="Calibri"/>
+          <w:b w:val="0"/>
+          <w:i w:val="0"/>
+          <w:sz w:val="22"/>
+        </w:rPr>
+        <w:t>. As 1:1 têm sido utilizadas como espaço de reflexão sobre carreira, ciclo de performance e crescimento contínuo.</w:t>
+      </w:r>
+    </w:p>
+    <w:p>
+      <w:r>
+        <w:rPr>
+          <w:rFonts w:ascii="Calibri" w:hAnsi="Calibri" w:eastAsia="Calibri"/>
+          <w:b/>
+          <w:i w:val="0"/>
+          <w:sz w:val="22"/>
+        </w:rPr>
+        <w:t>Recomendação:</w:t>
+      </w:r>
+      <w:r>
+        <w:rPr>
+          <w:rFonts w:ascii="Calibri" w:hAnsi="Calibri" w:eastAsia="Calibri"/>
+          <w:b w:val="0"/>
+          <w:i w:val="0"/>
+          <w:sz w:val="22"/>
+        </w:rPr>
+        <w:t xml:space="preserve"> manter no nível </w:t>
+      </w:r>
+      <w:r>
+        <w:rPr>
+          <w:rFonts w:ascii="Calibri" w:hAnsi="Calibri" w:eastAsia="Calibri"/>
+          <w:b/>
+          <w:i w:val="0"/>
+          <w:sz w:val="22"/>
+        </w:rPr>
+        <w:t>Associate</w:t>
+      </w:r>
+      <w:r>
+        <w:rPr>
+          <w:rFonts w:ascii="Calibri" w:hAnsi="Calibri" w:eastAsia="Calibri"/>
+          <w:b w:val="0"/>
+          <w:i w:val="0"/>
+          <w:sz w:val="22"/>
+        </w:rPr>
+        <w:t xml:space="preserve"> neste December Cycle, com reconhecimento do desempenho alinhado ao cargo e dos feedbacks positivos de gestor, liderança técnica e par; </w:t>
+      </w:r>
+      <w:r>
+        <w:rPr>
+          <w:rFonts w:ascii="Calibri" w:hAnsi="Calibri" w:eastAsia="Calibri"/>
+          <w:b/>
+          <w:i w:val="0"/>
+          <w:sz w:val="22"/>
+        </w:rPr>
+        <w:t>não recomendar promoção</w:t>
+      </w:r>
+      <w:r>
+        <w:rPr>
+          <w:rFonts w:ascii="Calibri" w:hAnsi="Calibri" w:eastAsia="Calibri"/>
+          <w:b w:val="0"/>
+          <w:i w:val="0"/>
+          <w:sz w:val="22"/>
+        </w:rPr>
+        <w:t xml:space="preserve"> a Analyst neste FY, dado o tempo de casa e o próprio direcionamento dos feedbacks (consolidação e autonomia). Continuar acompanhamento mensal com plano trimestre/semestre/ano e alinhamento contínuo com </w:t>
+      </w:r>
+      <w:r>
+        <w:rPr>
+          <w:rFonts w:ascii="Calibri" w:hAnsi="Calibri" w:eastAsia="Calibri"/>
+          <w:b/>
+          <w:i w:val="0"/>
+          <w:sz w:val="22"/>
+        </w:rPr>
+        <w:t>Rafael Coloda</w:t>
       </w:r>
       <w:r>
         <w:rPr>
@@ -30898,156 +31407,6 @@
           <w:sz w:val="22"/>
         </w:rPr>
         <w:t>.</w:t>
-      </w:r>
-    </w:p>
-    <w:p>
-      <w:r>
-        <w:rPr>
-          <w:rFonts w:ascii="Calibri" w:hAnsi="Calibri" w:eastAsia="Calibri"/>
-          <w:b w:val="0"/>
-          <w:i w:val="0"/>
-          <w:sz w:val="22"/>
-        </w:rPr>
-        <w:t>Nas 1:1 com o People Lead, demonstra disponibilidade para diálogo, escuta ativa e interesse em compreender seu papel, expectativas e próximos passos. Apresenta postura profissional adequada, abertura para aprender, receptividade a feedbacks e clareza de norte de carreira (</w:t>
-      </w:r>
-      <w:r>
-        <w:rPr>
-          <w:rFonts w:ascii="Calibri" w:hAnsi="Calibri" w:eastAsia="Calibri"/>
-          <w:b/>
-          <w:i w:val="0"/>
-          <w:sz w:val="22"/>
-        </w:rPr>
-        <w:t>arquitetura mobile</w:t>
-      </w:r>
-      <w:r>
-        <w:rPr>
-          <w:rFonts w:ascii="Calibri" w:hAnsi="Calibri" w:eastAsia="Calibri"/>
-          <w:b w:val="0"/>
-          <w:i w:val="0"/>
-          <w:sz w:val="22"/>
-        </w:rPr>
-        <w:t xml:space="preserve">). Demonstra responsabilidade com combinados, honestidade no fechamento do ciclo e comportamento alinhado a um ambiente colaborativo e respeitoso. Os comportamentos observados indicam </w:t>
-      </w:r>
-      <w:r>
-        <w:rPr>
-          <w:rFonts w:ascii="Calibri" w:hAnsi="Calibri" w:eastAsia="Calibri"/>
-          <w:b/>
-          <w:i w:val="0"/>
-          <w:sz w:val="22"/>
-        </w:rPr>
-        <w:t>comprometimento com o próprio desenvolvimento</w:t>
-      </w:r>
-      <w:r>
-        <w:rPr>
-          <w:rFonts w:ascii="Calibri" w:hAnsi="Calibri" w:eastAsia="Calibri"/>
-          <w:b w:val="0"/>
-          <w:i w:val="0"/>
-          <w:sz w:val="22"/>
-        </w:rPr>
-        <w:t xml:space="preserve"> e com a experiência no projeto.</w:t>
-      </w:r>
-    </w:p>
-    <w:p>
-      <w:r>
-        <w:rPr>
-          <w:rFonts w:ascii="Calibri" w:hAnsi="Calibri" w:eastAsia="Calibri"/>
-          <w:b w:val="0"/>
-          <w:i w:val="0"/>
-          <w:sz w:val="22"/>
-        </w:rPr>
-        <w:t xml:space="preserve">Segue em fase de </w:t>
-      </w:r>
-      <w:r>
-        <w:rPr>
-          <w:rFonts w:ascii="Calibri" w:hAnsi="Calibri" w:eastAsia="Calibri"/>
-          <w:b/>
-          <w:i w:val="0"/>
-          <w:sz w:val="22"/>
-        </w:rPr>
-        <w:t>consolidação técnica e profissional no nível Associate</w:t>
-      </w:r>
-      <w:r>
-        <w:rPr>
-          <w:rFonts w:ascii="Calibri" w:hAnsi="Calibri" w:eastAsia="Calibri"/>
-          <w:b w:val="0"/>
-          <w:i w:val="0"/>
-          <w:sz w:val="22"/>
-        </w:rPr>
-        <w:t>, com oportunidades claras de evolução em: registro formal de evidências de entrega, formalização de cases de IA, e aprofundamento em arquitetura — base para um eventual movimento a Analyst no FY27, se a trajetória se mantiver. As 1:1 têm sido utilizadas como espaço de reflexão sobre carreira, ciclo de performance e crescimento contínuo, contribuindo para maior clareza sobre expectativas e próximos desafios.</w:t>
-      </w:r>
-    </w:p>
-    <w:p>
-      <w:r>
-        <w:rPr>
-          <w:rFonts w:ascii="Calibri" w:hAnsi="Calibri" w:eastAsia="Calibri"/>
-          <w:b/>
-          <w:i w:val="0"/>
-          <w:sz w:val="22"/>
-        </w:rPr>
-        <w:t>Recomendação:</w:t>
-      </w:r>
-      <w:r>
-        <w:rPr>
-          <w:rFonts w:ascii="Calibri" w:hAnsi="Calibri" w:eastAsia="Calibri"/>
-          <w:b w:val="0"/>
-          <w:i w:val="0"/>
-          <w:sz w:val="22"/>
-        </w:rPr>
-        <w:t xml:space="preserve"> manter no nível </w:t>
-      </w:r>
-      <w:r>
-        <w:rPr>
-          <w:rFonts w:ascii="Calibri" w:hAnsi="Calibri" w:eastAsia="Calibri"/>
-          <w:b/>
-          <w:i w:val="0"/>
-          <w:sz w:val="22"/>
-        </w:rPr>
-        <w:t>Associate</w:t>
-      </w:r>
-      <w:r>
-        <w:rPr>
-          <w:rFonts w:ascii="Calibri" w:hAnsi="Calibri" w:eastAsia="Calibri"/>
-          <w:b w:val="0"/>
-          <w:i w:val="0"/>
-          <w:sz w:val="22"/>
-        </w:rPr>
-        <w:t xml:space="preserve"> neste December Cycle, com reconhecimento qualitativo do desempenho no cliente e da aplicação de IA; </w:t>
-      </w:r>
-      <w:r>
-        <w:rPr>
-          <w:rFonts w:ascii="Calibri" w:hAnsi="Calibri" w:eastAsia="Calibri"/>
-          <w:b/>
-          <w:i w:val="0"/>
-          <w:sz w:val="22"/>
-        </w:rPr>
-        <w:t>não recomendar promoção</w:t>
-      </w:r>
-      <w:r>
-        <w:rPr>
-          <w:rFonts w:ascii="Calibri" w:hAnsi="Calibri" w:eastAsia="Calibri"/>
-          <w:b w:val="0"/>
-          <w:i w:val="0"/>
-          <w:sz w:val="22"/>
-        </w:rPr>
-        <w:t xml:space="preserve"> neste FY, dado o tempo de casa e o pacote ainda em consolidação. Continuar acompanhamento mensal com plano trimestre/semestre/ano e alinhamento com o gestor de projeto (</w:t>
-      </w:r>
-      <w:r>
-        <w:rPr>
-          <w:rFonts w:ascii="Calibri" w:hAnsi="Calibri" w:eastAsia="Calibri"/>
-          <w:b/>
-          <w:i w:val="0"/>
-          <w:sz w:val="22"/>
-        </w:rPr>
-        <w:t>Rafael Coloda</w:t>
-      </w:r>
-      <w:r>
-        <w:rPr>
-          <w:rFonts w:ascii="Calibri" w:hAnsi="Calibri" w:eastAsia="Calibri"/>
-          <w:b w:val="0"/>
-          <w:i w:val="0"/>
-          <w:sz w:val="22"/>
-        </w:rPr>
-        <w:t>).</w:t>
       </w:r>
     </w:p>
     <w:p>
@@ -31062,18 +31421,18 @@
         <w:pStyle w:val="Heading3"/>
       </w:pPr>
       <w:r>
-        <w:t>Versão curta (se o campo tiver limite de caracteres)</w:t>
-      </w:r>
-    </w:p>
-    <w:p>
-      <w:r>
-        <w:rPr>
-          <w:rFonts w:ascii="Calibri" w:hAnsi="Calibri" w:eastAsia="Calibri"/>
-          <w:b w:val="0"/>
-          <w:i w:val="0"/>
-          <w:sz w:val="22"/>
-        </w:rPr>
-        <w:t xml:space="preserve">Durante o FY26, Ana Karina (Associate, Mobile) no BANCO BRADESCO entregou no app nativo Kotlin/Android com evolução até a fase de homologação, alto engajamento e uso aplicado de Copilot/agentes de IA. Concluiu AZ-900 e inglês C1+. Nas 1:1 demonstra postura profissional, abertura a feedback e clareza de carreira (arquitetura mobile). </w:t>
+        <w:t>Versão curta (se o campo tiver limite)</w:t>
+      </w:r>
+    </w:p>
+    <w:p>
+      <w:r>
+        <w:rPr>
+          <w:rFonts w:ascii="Calibri" w:hAnsi="Calibri" w:eastAsia="Calibri"/>
+          <w:b w:val="0"/>
+          <w:i w:val="0"/>
+          <w:sz w:val="22"/>
+        </w:rPr>
+        <w:t xml:space="preserve">Durante o FY26, Ana Karina (Associate, Mobile) no BANCO BRADESCO entregou no app nativo com evolução consistente até homologação, preocupação com qualidade e comunicação de riscos. Feedbacks de Rafael Coloda, Jessica e Celline confirmam desempenho alinhado ao nível, colaboração e curiosidade; ponto de evolução: lançamento de horas no Jira de forma autônoma. AZ-900 e inglês C1+ concluídos. </w:t>
       </w:r>
       <w:r>
         <w:rPr>
@@ -31082,16 +31441,16 @@
           <w:i w:val="0"/>
           <w:sz w:val="22"/>
         </w:rPr>
-        <w:t>Recomendação: consolidar Associate neste ciclo; não promover a Analyst agora</w:t>
-      </w:r>
-      <w:r>
-        <w:rPr>
-          <w:rFonts w:ascii="Calibri" w:hAnsi="Calibri" w:eastAsia="Calibri"/>
-          <w:b w:val="0"/>
-          <w:i w:val="0"/>
-          <w:sz w:val="22"/>
-        </w:rPr>
-        <w:t xml:space="preserve"> — potencial alto para FY27 com evidências e feedback de projeto.</w:t>
+        <w:t>Recomendação: consolidar Associate; não promover a Analyst neste ciclo</w:t>
+      </w:r>
+      <w:r>
+        <w:rPr>
+          <w:rFonts w:ascii="Calibri" w:hAnsi="Calibri" w:eastAsia="Calibri"/>
+          <w:b w:val="0"/>
+          <w:i w:val="0"/>
+          <w:sz w:val="22"/>
+        </w:rPr>
+        <w:t xml:space="preserve"> — potencial alto para FY27 com maior autonomia.</w:t>
       </w:r>
     </w:p>
     <w:p>
@@ -31106,310 +31465,7 @@
         <w:pStyle w:val="Heading3"/>
       </w:pPr>
       <w:r>
-        <w:t>Comparativo com o último ciclo (referência)</w:t>
-      </w:r>
-    </w:p>
-    <w:tbl>
-      <w:tblPr>
-        <w:tblStyle w:val="TableGrid"/>
-        <w:tblW w:type="auto" w:w="0"/>
-        <w:tblLook w:firstColumn="1" w:firstRow="1" w:lastColumn="0" w:lastRow="0" w:noHBand="0" w:noVBand="1" w:val="04A0"/>
-      </w:tblPr>
-      <w:tblGrid>
-        <w:gridCol w:w="4873"/>
-        <w:gridCol w:w="4873"/>
-      </w:tblGrid>
-      <w:tr>
-        <w:tc>
-          <w:tcPr>
-            <w:tcW w:type="dxa" w:w="4873"/>
-            <w:shd w:fill="1F3A5F" w:val="clear"/>
-          </w:tcPr>
-          <w:p>
-            <w:r>
-              <w:rPr>
-                <w:b/>
-                <w:color w:val="FFFFFF"/>
-                <w:sz w:val="20"/>
-              </w:rPr>
-            </w:r>
-            <w:r>
-              <w:rPr>
-                <w:rFonts w:ascii="Calibri" w:hAnsi="Calibri" w:eastAsia="Calibri"/>
-                <w:b/>
-                <w:i w:val="0"/>
-                <w:color w:val="FFFFFF"/>
-                <w:sz w:val="20"/>
-              </w:rPr>
-              <w:t>Último ciclo (estágio)</w:t>
-            </w:r>
-          </w:p>
-        </w:tc>
-        <w:tc>
-          <w:tcPr>
-            <w:tcW w:type="dxa" w:w="4873"/>
-            <w:shd w:fill="1F3A5F" w:val="clear"/>
-          </w:tcPr>
-          <w:p>
-            <w:r>
-              <w:rPr>
-                <w:b/>
-                <w:color w:val="FFFFFF"/>
-                <w:sz w:val="20"/>
-              </w:rPr>
-            </w:r>
-            <w:r>
-              <w:rPr>
-                <w:rFonts w:ascii="Calibri" w:hAnsi="Calibri" w:eastAsia="Calibri"/>
-                <w:b/>
-                <w:i w:val="0"/>
-                <w:color w:val="FFFFFF"/>
-                <w:sz w:val="20"/>
-              </w:rPr>
-              <w:t>Este ciclo (Associate)</w:t>
-            </w:r>
-          </w:p>
-        </w:tc>
-      </w:tr>
-      <w:tr>
-        <w:tc>
-          <w:tcPr>
-            <w:tcW w:type="dxa" w:w="4873"/>
-          </w:tcPr>
-          <w:p>
-            <w:r>
-              <w:rPr>
-                <w:sz w:val="20"/>
-              </w:rPr>
-            </w:r>
-            <w:r>
-              <w:rPr>
-                <w:rFonts w:ascii="Calibri" w:hAnsi="Calibri" w:eastAsia="Calibri"/>
-                <w:b w:val="0"/>
-                <w:i w:val="0"/>
-                <w:sz w:val="20"/>
-              </w:rPr>
-              <w:t>Escopo de estágio / rotinas</w:t>
-            </w:r>
-          </w:p>
-        </w:tc>
-        <w:tc>
-          <w:tcPr>
-            <w:tcW w:type="dxa" w:w="4873"/>
-          </w:tcPr>
-          <w:p>
-            <w:r>
-              <w:rPr>
-                <w:sz w:val="20"/>
-              </w:rPr>
-            </w:r>
-            <w:r>
-              <w:rPr>
-                <w:rFonts w:ascii="Calibri" w:hAnsi="Calibri" w:eastAsia="Calibri"/>
-                <w:b w:val="0"/>
-                <w:i w:val="0"/>
-                <w:sz w:val="20"/>
-              </w:rPr>
-              <w:t>Escopo Associate em app nativo Bradesco</w:t>
-            </w:r>
-          </w:p>
-        </w:tc>
-      </w:tr>
-      <w:tr>
-        <w:tc>
-          <w:tcPr>
-            <w:tcW w:type="dxa" w:w="4873"/>
-            <w:shd w:fill="F3F6FA" w:val="clear"/>
-          </w:tcPr>
-          <w:p>
-            <w:r>
-              <w:rPr>
-                <w:sz w:val="20"/>
-              </w:rPr>
-            </w:r>
-            <w:r>
-              <w:rPr>
-                <w:rFonts w:ascii="Calibri" w:hAnsi="Calibri" w:eastAsia="Calibri"/>
-                <w:b w:val="0"/>
-                <w:i w:val="0"/>
-                <w:sz w:val="20"/>
-              </w:rPr>
-              <w:t>Aprendizado + apoio à equipe</w:t>
-            </w:r>
-          </w:p>
-        </w:tc>
-        <w:tc>
-          <w:tcPr>
-            <w:tcW w:type="dxa" w:w="4873"/>
-            <w:shd w:fill="F3F6FA" w:val="clear"/>
-          </w:tcPr>
-          <w:p>
-            <w:r>
-              <w:rPr>
-                <w:sz w:val="20"/>
-              </w:rPr>
-            </w:r>
-            <w:r>
-              <w:rPr>
-                <w:rFonts w:ascii="Calibri" w:hAnsi="Calibri" w:eastAsia="Calibri"/>
-                <w:b w:val="0"/>
-                <w:i w:val="0"/>
-                <w:sz w:val="20"/>
-              </w:rPr>
-              <w:t>Entrega + homologação + IA aplicada</w:t>
-            </w:r>
-          </w:p>
-        </w:tc>
-      </w:tr>
-      <w:tr>
-        <w:tc>
-          <w:tcPr>
-            <w:tcW w:type="dxa" w:w="4873"/>
-          </w:tcPr>
-          <w:p>
-            <w:r>
-              <w:rPr>
-                <w:sz w:val="20"/>
-              </w:rPr>
-            </w:r>
-            <w:r>
-              <w:rPr>
-                <w:rFonts w:ascii="Calibri" w:hAnsi="Calibri" w:eastAsia="Calibri"/>
-                <w:b w:val="0"/>
-                <w:i w:val="0"/>
-                <w:sz w:val="20"/>
-              </w:rPr>
-              <w:t>Evolução gradual de autonomia</w:t>
-            </w:r>
-          </w:p>
-        </w:tc>
-        <w:tc>
-          <w:tcPr>
-            <w:tcW w:type="dxa" w:w="4873"/>
-          </w:tcPr>
-          <w:p>
-            <w:r>
-              <w:rPr>
-                <w:sz w:val="20"/>
-              </w:rPr>
-            </w:r>
-            <w:r>
-              <w:rPr>
-                <w:rFonts w:ascii="Calibri" w:hAnsi="Calibri" w:eastAsia="Calibri"/>
-                <w:b w:val="0"/>
-                <w:i w:val="0"/>
-                <w:sz w:val="20"/>
-              </w:rPr>
-              <w:t>Autonomia crescente; visão ponta a ponta</w:t>
-            </w:r>
-          </w:p>
-        </w:tc>
-      </w:tr>
-      <w:tr>
-        <w:tc>
-          <w:tcPr>
-            <w:tcW w:type="dxa" w:w="4873"/>
-            <w:shd w:fill="F3F6FA" w:val="clear"/>
-          </w:tcPr>
-          <w:p>
-            <w:r>
-              <w:rPr>
-                <w:sz w:val="20"/>
-              </w:rPr>
-            </w:r>
-            <w:r>
-              <w:rPr>
-                <w:rFonts w:ascii="Calibri" w:hAnsi="Calibri" w:eastAsia="Calibri"/>
-                <w:b w:val="0"/>
-                <w:i w:val="0"/>
-                <w:sz w:val="20"/>
-              </w:rPr>
-              <w:t>Fase de desenvolvimento</w:t>
-            </w:r>
-          </w:p>
-        </w:tc>
-        <w:tc>
-          <w:tcPr>
-            <w:tcW w:type="dxa" w:w="4873"/>
-            <w:shd w:fill="F3F6FA" w:val="clear"/>
-          </w:tcPr>
-          <w:p>
-            <w:r>
-              <w:rPr>
-                <w:sz w:val="20"/>
-              </w:rPr>
-            </w:r>
-            <w:r>
-              <w:rPr>
-                <w:rFonts w:ascii="Calibri" w:hAnsi="Calibri" w:eastAsia="Calibri"/>
-                <w:b w:val="0"/>
-                <w:i w:val="0"/>
-                <w:sz w:val="20"/>
-              </w:rPr>
-              <w:t>Consolidação Associate → trilha Analyst FY27</w:t>
-            </w:r>
-          </w:p>
-        </w:tc>
-      </w:tr>
-      <w:tr>
-        <w:tc>
-          <w:tcPr>
-            <w:tcW w:type="dxa" w:w="4873"/>
-          </w:tcPr>
-          <w:p>
-            <w:r>
-              <w:rPr>
-                <w:sz w:val="20"/>
-              </w:rPr>
-            </w:r>
-            <w:r>
-              <w:rPr>
-                <w:rFonts w:ascii="Calibri" w:hAnsi="Calibri" w:eastAsia="Calibri"/>
-                <w:b w:val="0"/>
-                <w:i w:val="0"/>
-                <w:sz w:val="20"/>
-              </w:rPr>
-              <w:t>Sem promoção implícita</w:t>
-            </w:r>
-          </w:p>
-        </w:tc>
-        <w:tc>
-          <w:tcPr>
-            <w:tcW w:type="dxa" w:w="4873"/>
-          </w:tcPr>
-          <w:p>
-            <w:r>
-              <w:rPr>
-                <w:sz w:val="20"/>
-              </w:rPr>
-            </w:r>
-            <w:r>
-              <w:rPr>
-                <w:rFonts w:ascii="Calibri" w:hAnsi="Calibri" w:eastAsia="Calibri"/>
-                <w:b/>
-                <w:i w:val="0"/>
-                <w:sz w:val="20"/>
-              </w:rPr>
-              <w:t>Explícito: não promover neste FY</w:t>
-            </w:r>
-          </w:p>
-        </w:tc>
-      </w:tr>
-    </w:tbl>
-    <w:p/>
-    <w:p>
-      <w:pPr>
-        <w:pBdr>
-          <w:bottom w:val="single" w:sz="6" w:space="1" w:color="CCCCCC"/>
-        </w:pBdr>
-      </w:pPr>
-    </w:p>
-    <w:p>
-      <w:pPr>
-        <w:pStyle w:val="Heading3"/>
-      </w:pPr>
-      <w:r>
-        <w:t>Checklist antes de colar</w:t>
+        <w:t>Checklist</w:t>
       </w:r>
     </w:p>
     <w:p>
@@ -31423,7 +31479,7 @@
           <w:i w:val="0"/>
           <w:sz w:val="22"/>
         </w:rPr>
-        <w:t>☐ Conferir se autorreflexão ABCD dela já foi submetida (cruzar tom)</w:t>
+        <w:t xml:space="preserve">☑ Feedback Rafael Coloda incorporado  </w:t>
       </w:r>
     </w:p>
     <w:p>
@@ -31437,43 +31493,7 @@
           <w:i w:val="0"/>
           <w:sz w:val="22"/>
         </w:rPr>
-        <w:t xml:space="preserve">☐ Inserir síntese do feedback de </w:t>
-      </w:r>
-      <w:r>
-        <w:rPr>
-          <w:rFonts w:ascii="Calibri" w:hAnsi="Calibri" w:eastAsia="Calibri"/>
-          <w:b/>
-          <w:i w:val="0"/>
-          <w:sz w:val="22"/>
-        </w:rPr>
-        <w:t>Rafael Coloda</w:t>
-      </w:r>
-      <w:r>
-        <w:rPr>
-          <w:rFonts w:ascii="Calibri" w:hAnsi="Calibri" w:eastAsia="Calibri"/>
-          <w:b w:val="0"/>
-          <w:i w:val="0"/>
-          <w:sz w:val="22"/>
-        </w:rPr>
-        <w:t xml:space="preserve"> / </w:t>
-      </w:r>
-      <w:r>
-        <w:rPr>
-          <w:rFonts w:ascii="Calibri" w:hAnsi="Calibri" w:eastAsia="Calibri"/>
-          <w:b/>
-          <w:i w:val="0"/>
-          <w:sz w:val="22"/>
-        </w:rPr>
-        <w:t>Jessica</w:t>
-      </w:r>
-      <w:r>
-        <w:rPr>
-          <w:rFonts w:ascii="Calibri" w:hAnsi="Calibri" w:eastAsia="Calibri"/>
-          <w:b w:val="0"/>
-          <w:i w:val="0"/>
-          <w:sz w:val="22"/>
-        </w:rPr>
-        <w:t xml:space="preserve"> se já chegou</w:t>
+        <w:t xml:space="preserve">☑ Feedback Jessica incorporado  </w:t>
       </w:r>
     </w:p>
     <w:p>
@@ -31487,7 +31507,35 @@
           <w:i w:val="0"/>
           <w:sz w:val="22"/>
         </w:rPr>
-        <w:t>☐ Confirmar Talent Outcome / Priority no formulário alinhados a esta justificativa</w:t>
+        <w:t xml:space="preserve">☑ Feedback Celline incorporado  </w:t>
+      </w:r>
+    </w:p>
+    <w:p>
+      <w:pPr>
+        <w:pStyle w:val="ListBullet"/>
+      </w:pPr>
+      <w:r>
+        <w:rPr>
+          <w:rFonts w:ascii="Calibri" w:hAnsi="Calibri" w:eastAsia="Calibri"/>
+          <w:b w:val="0"/>
+          <w:i w:val="0"/>
+          <w:sz w:val="22"/>
+        </w:rPr>
+        <w:t xml:space="preserve">☐ Colar no Workday / ABCD Form (prazo PL)  </w:t>
+      </w:r>
+    </w:p>
+    <w:p>
+      <w:pPr>
+        <w:pStyle w:val="ListBullet"/>
+      </w:pPr>
+      <w:r>
+        <w:rPr>
+          <w:rFonts w:ascii="Calibri" w:hAnsi="Calibri" w:eastAsia="Calibri"/>
+          <w:b w:val="0"/>
+          <w:i w:val="0"/>
+          <w:sz w:val="22"/>
+        </w:rPr>
+        <w:t xml:space="preserve">☐ Cruzar com autorreflexão ABCD dela quando submeter  </w:t>
       </w:r>
     </w:p>
     <w:p>

</xml_diff>

<commit_message>
Encurtar justificativa Ana para limite de 3000 caracteres
Co-authored-by: Jonatas Andrade <jonatasandradedeveloper@users.noreply.github.com>
</commit_message>
<xml_diff>
--- a/DOCS-PEOPLE-LEAD/Ana-Karina/00-Documento-Unico.docx
+++ b/DOCS-PEOPLE-LEAD/Ana-Karina/00-Documento-Unico.docx
@@ -328,7 +328,7 @@
           <w:i w:val="0"/>
           <w:sz w:val="22"/>
         </w:rPr>
-        <w:t>Associate no BANCO BRADESCO (adm. 01/04/2026) com entrega em homologação, Copilot/agentes de IA como diferencial, inglês C1+ e AZ-900. Swift e AI-900 → FY27. Autorreflexão ABCD: ainda não submetida (28/08). Input PL até 11/09/2026.</w:t>
+        <w:t>Associate no BANCO BRADESCO (adm. 01/04/2026). Feedbacks Rafael+Jessica+Celline confirmam desempenho alinhado ao nível (qualidade, riscos, colaboração). Evolução: autonomia + horas no Jira. Não promover neste FY. Justificativa pronta.</w:t>
       </w:r>
     </w:p>
     <w:p>
@@ -577,7 +577,21 @@
           <w:i w:val="0"/>
           <w:sz w:val="22"/>
         </w:rPr>
-        <w:t>15. Orientação do ciclo (Ana Karina)</w:t>
+        <w:t>15. Feedbacks de projeto (Rafael, Jessica, Celline)</w:t>
+      </w:r>
+    </w:p>
+    <w:p>
+      <w:pPr>
+        <w:spacing w:after="120"/>
+      </w:pPr>
+      <w:r>
+        <w:rPr>
+          <w:rFonts w:ascii="Calibri" w:hAnsi="Calibri" w:eastAsia="Calibri"/>
+          <w:b w:val="0"/>
+          <w:i w:val="0"/>
+          <w:sz w:val="22"/>
+        </w:rPr>
+        <w:t>16. Orientação do ciclo (Ana Karina)</w:t>
       </w:r>
     </w:p>
     <w:p>
@@ -28177,7 +28191,7 @@
           <w:i w:val="0"/>
           <w:sz w:val="22"/>
         </w:rPr>
-        <w:t>Validação técnica pendente:</w:t>
+        <w:t>Validação técnica:</w:t>
       </w:r>
       <w:r>
         <w:rPr>
@@ -28204,26 +28218,25 @@
           <w:i w:val="0"/>
           <w:sz w:val="22"/>
         </w:rPr>
-        <w:t xml:space="preserve"> (liderança técnica Avanade): </w:t>
-      </w:r>
-      <w:r>
-        <w:rPr>
-          <w:rFonts w:ascii="Consolas" w:hAnsi="Consolas" w:eastAsia="Consolas"/>
-          <w:b w:val="0"/>
-          <w:i w:val="0"/>
-          <w:color w:val="333333"/>
-          <w:sz w:val="18"/>
-        </w:rPr>
-        <w:t>[inserir citação quando disponível]</w:t>
-      </w:r>
-      <w:r>
-        <w:rPr>
-          <w:rFonts w:ascii="Calibri" w:hAnsi="Calibri" w:eastAsia="Calibri"/>
-          <w:b w:val="0"/>
-          <w:i w:val="0"/>
-          <w:sz w:val="22"/>
-        </w:rPr>
-        <w:t>.</w:t>
+        <w:t xml:space="preserve"> (08/09): evolução consistente, qualidade, comunicação de riscos; próximo ciclo = autonomia técnica/funcional. Par </w:t>
+      </w:r>
+      <w:r>
+        <w:rPr>
+          <w:rFonts w:ascii="Calibri" w:hAnsi="Calibri" w:eastAsia="Calibri"/>
+          <w:b/>
+          <w:i w:val="0"/>
+          <w:sz w:val="22"/>
+        </w:rPr>
+        <w:t>Celline</w:t>
+      </w:r>
+      <w:r>
+        <w:rPr>
+          <w:rFonts w:ascii="Calibri" w:hAnsi="Calibri" w:eastAsia="Calibri"/>
+          <w:b w:val="0"/>
+          <w:i w:val="0"/>
+          <w:sz w:val="22"/>
+        </w:rPr>
+        <w:t>: colaboração positiva, organização, qualidade e prazos.</w:t>
       </w:r>
     </w:p>
     <w:p>
@@ -29750,7 +29763,7 @@
           <w:i w:val="0"/>
           <w:sz w:val="22"/>
         </w:rPr>
-        <w:t>Evidenciar entregas com nomes, PRs e feedback formal do gestor</w:t>
+        <w:t>Maior autonomia em atividades de maior complexidade (Rafael + Jessica)</w:t>
       </w:r>
     </w:p>
     <w:p>
@@ -29764,7 +29777,25 @@
           <w:i w:val="0"/>
           <w:sz w:val="22"/>
         </w:rPr>
-        <w:t>Reduzir dispersão de metas; focar 3 frentes por ciclo</w:t>
+        <w:t xml:space="preserve">Disciplina no </w:t>
+      </w:r>
+      <w:r>
+        <w:rPr>
+          <w:rFonts w:ascii="Calibri" w:hAnsi="Calibri" w:eastAsia="Calibri"/>
+          <w:b/>
+          <w:i w:val="0"/>
+          <w:sz w:val="22"/>
+        </w:rPr>
+        <w:t>lançamento de horas no Jira</w:t>
+      </w:r>
+      <w:r>
+        <w:rPr>
+          <w:rFonts w:ascii="Calibri" w:hAnsi="Calibri" w:eastAsia="Calibri"/>
+          <w:b w:val="0"/>
+          <w:i w:val="0"/>
+          <w:sz w:val="22"/>
+        </w:rPr>
+        <w:t xml:space="preserve"> (Rafael — ponto explícito)</w:t>
       </w:r>
     </w:p>
     <w:p>
@@ -29778,7 +29809,7 @@
           <w:i w:val="0"/>
           <w:sz w:val="22"/>
         </w:rPr>
-        <w:t>Formalizar case de IA (agentes) para replicação na prática</w:t>
+        <w:t>Evidenciar entregas com nomes/PRs; formalizar case de IA</w:t>
       </w:r>
     </w:p>
     <w:p>
@@ -29792,21 +29823,7 @@
           <w:i w:val="0"/>
           <w:sz w:val="22"/>
         </w:rPr>
-        <w:t>Retomar trilha FY27: AI-900, Swift (depende Mac/alocação iOS)</w:t>
-      </w:r>
-    </w:p>
-    <w:p>
-      <w:pPr>
-        <w:pStyle w:val="ListBullet"/>
-      </w:pPr>
-      <w:r>
-        <w:rPr>
-          <w:rFonts w:ascii="Calibri" w:hAnsi="Calibri" w:eastAsia="Calibri"/>
-          <w:b w:val="0"/>
-          <w:i w:val="0"/>
-          <w:sz w:val="22"/>
-        </w:rPr>
-        <w:t>Voluntariado/comunidade: uma ação concreta no próximo FY</w:t>
+        <w:t>Trilha FY27: AI-900, Swift; voluntariado/comunidade com uma ação concreta</w:t>
       </w:r>
     </w:p>
     <w:p>
@@ -29840,20 +29857,29 @@
       <w:r>
         <w:rPr>
           <w:rFonts w:ascii="Calibri" w:hAnsi="Calibri" w:eastAsia="Calibri"/>
+          <w:b w:val="0"/>
+          <w:i w:val="0"/>
+          <w:sz w:val="22"/>
+        </w:rPr>
+        <w:t>Feedbacks de projeto (</w:t>
+      </w:r>
+      <w:r>
+        <w:rPr>
+          <w:rFonts w:ascii="Calibri" w:hAnsi="Calibri" w:eastAsia="Calibri"/>
           <w:b/>
           <w:i w:val="0"/>
           <w:sz w:val="22"/>
         </w:rPr>
-        <w:t>Pendente:</w:t>
-      </w:r>
-      <w:r>
-        <w:rPr>
-          <w:rFonts w:ascii="Calibri" w:hAnsi="Calibri" w:eastAsia="Calibri"/>
-          <w:b w:val="0"/>
-          <w:i w:val="0"/>
-          <w:sz w:val="22"/>
-        </w:rPr>
-        <w:t xml:space="preserve"> Ana Karina </w:t>
+        <w:t>Rafael, Jessica, Celline</w:t>
+      </w:r>
+      <w:r>
+        <w:rPr>
+          <w:rFonts w:ascii="Calibri" w:hAnsi="Calibri" w:eastAsia="Calibri"/>
+          <w:b w:val="0"/>
+          <w:i w:val="0"/>
+          <w:sz w:val="22"/>
+        </w:rPr>
+        <w:t xml:space="preserve"> — 08/09) </w:t>
       </w:r>
       <w:r>
         <w:rPr>
@@ -29862,43 +29888,26 @@
           <w:i w:val="0"/>
           <w:sz w:val="22"/>
         </w:rPr>
-        <w:t>ainda não submeteu</w:t>
-      </w:r>
-      <w:r>
-        <w:rPr>
-          <w:rFonts w:ascii="Calibri" w:hAnsi="Calibri" w:eastAsia="Calibri"/>
-          <w:b w:val="0"/>
-          <w:i w:val="0"/>
-          <w:sz w:val="22"/>
-        </w:rPr>
-        <w:t xml:space="preserve"> a autorreflexão ABCD no Workday (28/08). Este rascunho do PL baseia-se nas </w:t>
-      </w:r>
-      <w:r>
-        <w:rPr>
-          <w:rFonts w:ascii="Calibri" w:hAnsi="Calibri" w:eastAsia="Calibri"/>
-          <w:b/>
-          <w:i w:val="0"/>
-          <w:sz w:val="22"/>
-        </w:rPr>
-        <w:t>1:1s de 28/07 e 28/08</w:t>
-      </w:r>
-      <w:r>
-        <w:rPr>
-          <w:rFonts w:ascii="Calibri" w:hAnsi="Calibri" w:eastAsia="Calibri"/>
-          <w:b w:val="0"/>
-          <w:i w:val="0"/>
-          <w:sz w:val="22"/>
-        </w:rPr>
-        <w:t xml:space="preserve">. Quando ela submeter, revisar alinhamento e ajustar comentários antes do input de </w:t>
-      </w:r>
-      <w:r>
-        <w:rPr>
-          <w:rFonts w:ascii="Calibri" w:hAnsi="Calibri" w:eastAsia="Calibri"/>
-          <w:b/>
-          <w:i w:val="0"/>
-          <w:sz w:val="22"/>
-        </w:rPr>
-        <w:t>11/09</w:t>
+        <w:t>confirmam</w:t>
+      </w:r>
+      <w:r>
+        <w:rPr>
+          <w:rFonts w:ascii="Calibri" w:hAnsi="Calibri" w:eastAsia="Calibri"/>
+          <w:b w:val="0"/>
+          <w:i w:val="0"/>
+          <w:sz w:val="22"/>
+        </w:rPr>
+        <w:t xml:space="preserve"> a leitura das 1:1s: Associate sólido, qualidade, colaboração. Autorreflexão ABCD dela: cruzar quando submeter. Justificativa atualizada em </w:t>
+      </w:r>
+      <w:r>
+        <w:rPr>
+          <w:rFonts w:ascii="Consolas" w:hAnsi="Consolas" w:eastAsia="Consolas"/>
+          <w:b w:val="0"/>
+          <w:i w:val="0"/>
+          <w:color w:val="333333"/>
+          <w:sz w:val="18"/>
+        </w:rPr>
+        <w:t>15-justificativa-recomendacao.md</w:t>
       </w:r>
       <w:r>
         <w:rPr>
@@ -29908,17 +29917,6 @@
           <w:sz w:val="22"/>
         </w:rPr>
         <w:t>.</w:t>
-      </w:r>
-    </w:p>
-    <w:p>
-      <w:r>
-        <w:rPr>
-          <w:rFonts w:ascii="Calibri" w:hAnsi="Calibri" w:eastAsia="Calibri"/>
-          <w:b w:val="0"/>
-          <w:i w:val="0"/>
-          <w:sz w:val="22"/>
-        </w:rPr>
-        <w:t>Expectativa prévia: autoavaliação coerente com o acompanhamento (entrega no cliente, IA aplicada, inglês C1+; Swift/voluntariado honestos para FY27).</w:t>
       </w:r>
     </w:p>
     <w:p>
@@ -30080,14 +30078,6 @@
     </w:p>
     <w:p>
       <w:pPr>
-        <w:pStyle w:val="Heading3"/>
-      </w:pPr>
-      <w:r>
-        <w:t>Antes de enviar (checklist PL)</w:t>
-      </w:r>
-    </w:p>
-    <w:p>
-      <w:pPr>
         <w:pStyle w:val="ListBullet"/>
       </w:pPr>
       <w:r>
@@ -30097,6 +30087,102 @@
           <w:i w:val="0"/>
           <w:sz w:val="22"/>
         </w:rPr>
+        <w:t xml:space="preserve">☑ Feedback de </w:t>
+      </w:r>
+      <w:r>
+        <w:rPr>
+          <w:rFonts w:ascii="Calibri" w:hAnsi="Calibri" w:eastAsia="Calibri"/>
+          <w:b/>
+          <w:i w:val="0"/>
+          <w:sz w:val="22"/>
+        </w:rPr>
+        <w:t>Rafael Coloda</w:t>
+      </w:r>
+      <w:r>
+        <w:rPr>
+          <w:rFonts w:ascii="Calibri" w:hAnsi="Calibri" w:eastAsia="Calibri"/>
+          <w:b w:val="0"/>
+          <w:i w:val="0"/>
+          <w:sz w:val="22"/>
+        </w:rPr>
+        <w:t xml:space="preserve"> (08/09)</w:t>
+      </w:r>
+    </w:p>
+    <w:p>
+      <w:pPr>
+        <w:pStyle w:val="ListBullet"/>
+      </w:pPr>
+      <w:r>
+        <w:rPr>
+          <w:rFonts w:ascii="Calibri" w:hAnsi="Calibri" w:eastAsia="Calibri"/>
+          <w:b w:val="0"/>
+          <w:i w:val="0"/>
+          <w:sz w:val="22"/>
+        </w:rPr>
+        <w:t xml:space="preserve">☑ Feedback de </w:t>
+      </w:r>
+      <w:r>
+        <w:rPr>
+          <w:rFonts w:ascii="Calibri" w:hAnsi="Calibri" w:eastAsia="Calibri"/>
+          <w:b/>
+          <w:i w:val="0"/>
+          <w:sz w:val="22"/>
+        </w:rPr>
+        <w:t>Jessica</w:t>
+      </w:r>
+      <w:r>
+        <w:rPr>
+          <w:rFonts w:ascii="Calibri" w:hAnsi="Calibri" w:eastAsia="Calibri"/>
+          <w:b w:val="0"/>
+          <w:i w:val="0"/>
+          <w:sz w:val="22"/>
+        </w:rPr>
+        <w:t xml:space="preserve"> (08/09)</w:t>
+      </w:r>
+    </w:p>
+    <w:p>
+      <w:pPr>
+        <w:pStyle w:val="ListBullet"/>
+      </w:pPr>
+      <w:r>
+        <w:rPr>
+          <w:rFonts w:ascii="Calibri" w:hAnsi="Calibri" w:eastAsia="Calibri"/>
+          <w:b w:val="0"/>
+          <w:i w:val="0"/>
+          <w:sz w:val="22"/>
+        </w:rPr>
+        <w:t xml:space="preserve">☑ Feedback de </w:t>
+      </w:r>
+      <w:r>
+        <w:rPr>
+          <w:rFonts w:ascii="Calibri" w:hAnsi="Calibri" w:eastAsia="Calibri"/>
+          <w:b/>
+          <w:i w:val="0"/>
+          <w:sz w:val="22"/>
+        </w:rPr>
+        <w:t>Celline</w:t>
+      </w:r>
+      <w:r>
+        <w:rPr>
+          <w:rFonts w:ascii="Calibri" w:hAnsi="Calibri" w:eastAsia="Calibri"/>
+          <w:b w:val="0"/>
+          <w:i w:val="0"/>
+          <w:sz w:val="22"/>
+        </w:rPr>
+        <w:t xml:space="preserve"> (08/09)</w:t>
+      </w:r>
+    </w:p>
+    <w:p>
+      <w:pPr>
+        <w:pStyle w:val="ListBullet"/>
+      </w:pPr>
+      <w:r>
+        <w:rPr>
+          <w:rFonts w:ascii="Calibri" w:hAnsi="Calibri" w:eastAsia="Calibri"/>
+          <w:b w:val="0"/>
+          <w:i w:val="0"/>
+          <w:sz w:val="22"/>
+        </w:rPr>
         <w:t xml:space="preserve">☐ Ana </w:t>
       </w:r>
       <w:r>
@@ -30115,16 +30201,7 @@
           <w:i w:val="0"/>
           <w:sz w:val="22"/>
         </w:rPr>
-        <w:t xml:space="preserve"> autorreflexão ABCD no Workday — </w:t>
-      </w:r>
-      <w:r>
-        <w:rPr>
-          <w:rFonts w:ascii="Calibri" w:hAnsi="Calibri" w:eastAsia="Calibri"/>
-          <w:b/>
-          <w:i w:val="0"/>
-          <w:sz w:val="22"/>
-        </w:rPr>
-        <w:t>NÃO (28/08) — cobrar</w:t>
+        <w:t xml:space="preserve"> autorreflexão ABCD — cruzar quando chegar</w:t>
       </w:r>
     </w:p>
     <w:p>
@@ -30138,85 +30215,7 @@
           <w:i w:val="0"/>
           <w:sz w:val="22"/>
         </w:rPr>
-        <w:t>☐ Quando submeter: ler e cruzar com este rascunho</w:t>
-      </w:r>
-    </w:p>
-    <w:p>
-      <w:pPr>
-        <w:pStyle w:val="ListBullet"/>
-      </w:pPr>
-      <w:r>
-        <w:rPr>
-          <w:rFonts w:ascii="Calibri" w:hAnsi="Calibri" w:eastAsia="Calibri"/>
-          <w:b w:val="0"/>
-          <w:i w:val="0"/>
-          <w:sz w:val="22"/>
-        </w:rPr>
-        <w:t xml:space="preserve">☐ Tenho feedback de </w:t>
-      </w:r>
-      <w:r>
-        <w:rPr>
-          <w:rFonts w:ascii="Calibri" w:hAnsi="Calibri" w:eastAsia="Calibri"/>
-          <w:b/>
-          <w:i w:val="0"/>
-          <w:sz w:val="22"/>
-        </w:rPr>
-        <w:t>Rafael Coloda</w:t>
-      </w:r>
-      <w:r>
-        <w:rPr>
-          <w:rFonts w:ascii="Calibri" w:hAnsi="Calibri" w:eastAsia="Calibri"/>
-          <w:b w:val="0"/>
-          <w:i w:val="0"/>
-          <w:sz w:val="22"/>
-        </w:rPr>
-        <w:t xml:space="preserve"> (ou solicitei por e-mail)</w:t>
-      </w:r>
-    </w:p>
-    <w:p>
-      <w:pPr>
-        <w:pStyle w:val="ListBullet"/>
-      </w:pPr>
-      <w:r>
-        <w:rPr>
-          <w:rFonts w:ascii="Calibri" w:hAnsi="Calibri" w:eastAsia="Calibri"/>
-          <w:b w:val="0"/>
-          <w:i w:val="0"/>
-          <w:sz w:val="22"/>
-        </w:rPr>
-        <w:t xml:space="preserve">☐ Tenho feedback de </w:t>
-      </w:r>
-      <w:r>
-        <w:rPr>
-          <w:rFonts w:ascii="Calibri" w:hAnsi="Calibri" w:eastAsia="Calibri"/>
-          <w:b/>
-          <w:i w:val="0"/>
-          <w:sz w:val="22"/>
-        </w:rPr>
-        <w:t>Jessica</w:t>
-      </w:r>
-      <w:r>
-        <w:rPr>
-          <w:rFonts w:ascii="Calibri" w:hAnsi="Calibri" w:eastAsia="Calibri"/>
-          <w:b w:val="0"/>
-          <w:i w:val="0"/>
-          <w:sz w:val="22"/>
-        </w:rPr>
-        <w:t xml:space="preserve"> (ou combinei com ela)</w:t>
-      </w:r>
-    </w:p>
-    <w:p>
-      <w:pPr>
-        <w:pStyle w:val="ListBullet"/>
-      </w:pPr>
-      <w:r>
-        <w:rPr>
-          <w:rFonts w:ascii="Calibri" w:hAnsi="Calibri" w:eastAsia="Calibri"/>
-          <w:b w:val="0"/>
-          <w:i w:val="0"/>
-          <w:sz w:val="22"/>
-        </w:rPr>
-        <w:t xml:space="preserve">☐ Substituí todos os </w:t>
+        <w:t>☐ Colar Justificativa (</w:t>
       </w:r>
       <w:r>
         <w:rPr>
@@ -30226,16 +30225,16 @@
           <w:color w:val="333333"/>
           <w:sz w:val="18"/>
         </w:rPr>
-        <w:t>[...]</w:t>
-      </w:r>
-      <w:r>
-        <w:rPr>
-          <w:rFonts w:ascii="Calibri" w:hAnsi="Calibri" w:eastAsia="Calibri"/>
-          <w:b w:val="0"/>
-          <w:i w:val="0"/>
-          <w:sz w:val="22"/>
-        </w:rPr>
-        <w:t xml:space="preserve"> por evidências reais</w:t>
+        <w:t>15-justificativa-recomendacao.md</w:t>
+      </w:r>
+      <w:r>
+        <w:rPr>
+          <w:rFonts w:ascii="Calibri" w:hAnsi="Calibri" w:eastAsia="Calibri"/>
+          <w:b w:val="0"/>
+          <w:i w:val="0"/>
+          <w:sz w:val="22"/>
+        </w:rPr>
+        <w:t>) no Workday</w:t>
       </w:r>
     </w:p>
     <w:p>
@@ -30249,7 +30248,7 @@
           <w:i w:val="0"/>
           <w:sz w:val="22"/>
         </w:rPr>
-        <w:t>☐ Revisei impacto sugerido vs. feedback de projeto</w:t>
+        <w:t>☐ Salvei cópia do texto enviado (Talent Discussions podem ajustar)</w:t>
       </w:r>
     </w:p>
     <w:p>
@@ -30263,20 +30262,6 @@
           <w:i w:val="0"/>
           <w:sz w:val="22"/>
         </w:rPr>
-        <w:t>☐ Salvei cópia do texto enviado (Talent Discussions podem ajustar)</w:t>
-      </w:r>
-    </w:p>
-    <w:p>
-      <w:pPr>
-        <w:pStyle w:val="ListBullet"/>
-      </w:pPr>
-      <w:r>
-        <w:rPr>
-          <w:rFonts w:ascii="Calibri" w:hAnsi="Calibri" w:eastAsia="Calibri"/>
-          <w:b w:val="0"/>
-          <w:i w:val="0"/>
-          <w:sz w:val="22"/>
-        </w:rPr>
         <w:t xml:space="preserve">☐ Prazo: </w:t>
       </w:r>
       <w:r>
@@ -30287,6 +30272,15 @@
           <w:sz w:val="22"/>
         </w:rPr>
         <w:t>até 11/09/2026</w:t>
+      </w:r>
+      <w:r>
+        <w:rPr>
+          <w:rFonts w:ascii="Calibri" w:hAnsi="Calibri" w:eastAsia="Calibri"/>
+          <w:b w:val="0"/>
+          <w:i w:val="0"/>
+          <w:sz w:val="22"/>
+        </w:rPr>
+        <w:t xml:space="preserve"> (confirmar se ainda válido)</w:t>
       </w:r>
     </w:p>
     <w:p>
@@ -30924,489 +30918,77 @@
       <w:r>
         <w:rPr>
           <w:rFonts w:ascii="Calibri" w:hAnsi="Calibri" w:eastAsia="Calibri"/>
-          <w:b w:val="0"/>
-          <w:i w:val="0"/>
-          <w:sz w:val="22"/>
-        </w:rPr>
-        <w:t xml:space="preserve">Durante o período acompanhado neste FY26, Ana Karina atuou como </w:t>
-      </w:r>
-      <w:r>
-        <w:rPr>
-          <w:rFonts w:ascii="Calibri" w:hAnsi="Calibri" w:eastAsia="Calibri"/>
           <w:b/>
           <w:i w:val="0"/>
           <w:sz w:val="22"/>
         </w:rPr>
-        <w:t>Associate, Mobile &amp; Device Dev</w:t>
-      </w:r>
-      <w:r>
-        <w:rPr>
-          <w:rFonts w:ascii="Calibri" w:hAnsi="Calibri" w:eastAsia="Calibri"/>
-          <w:b w:val="0"/>
-          <w:i w:val="0"/>
-          <w:sz w:val="22"/>
-        </w:rPr>
-        <w:t xml:space="preserve">, no cliente </w:t>
-      </w:r>
-      <w:r>
-        <w:rPr>
-          <w:rFonts w:ascii="Calibri" w:hAnsi="Calibri" w:eastAsia="Calibri"/>
-          <w:b/>
-          <w:i w:val="0"/>
-          <w:sz w:val="22"/>
-        </w:rPr>
-        <w:t>BANCO BRADESCO</w:t>
-      </w:r>
-      <w:r>
-        <w:rPr>
-          <w:rFonts w:ascii="Calibri" w:hAnsi="Calibri" w:eastAsia="Calibri"/>
-          <w:b w:val="0"/>
-          <w:i w:val="0"/>
-          <w:sz w:val="22"/>
-        </w:rPr>
-        <w:t xml:space="preserve">, no desenvolvimento do </w:t>
-      </w:r>
-      <w:r>
-        <w:rPr>
-          <w:rFonts w:ascii="Calibri" w:hAnsi="Calibri" w:eastAsia="Calibri"/>
-          <w:b/>
-          <w:i w:val="0"/>
-          <w:sz w:val="22"/>
-        </w:rPr>
-        <w:t>app nativo (Kotlin/Android)</w:t>
-      </w:r>
-      <w:r>
-        <w:rPr>
-          <w:rFonts w:ascii="Calibri" w:hAnsi="Calibri" w:eastAsia="Calibri"/>
-          <w:b w:val="0"/>
-          <w:i w:val="0"/>
-          <w:sz w:val="22"/>
-        </w:rPr>
-        <w:t xml:space="preserve">. Cumpriu o escopo esperado para o nível Associate, com </w:t>
-      </w:r>
-      <w:r>
-        <w:rPr>
-          <w:rFonts w:ascii="Calibri" w:hAnsi="Calibri" w:eastAsia="Calibri"/>
-          <w:b/>
-          <w:i w:val="0"/>
-          <w:sz w:val="22"/>
-        </w:rPr>
-        <w:t>evolução consistente</w:t>
-      </w:r>
-      <w:r>
-        <w:rPr>
-          <w:rFonts w:ascii="Calibri" w:hAnsi="Calibri" w:eastAsia="Calibri"/>
-          <w:b w:val="0"/>
-          <w:i w:val="0"/>
-          <w:sz w:val="22"/>
-        </w:rPr>
-        <w:t xml:space="preserve"> na condução das atividades sob sua responsabilidade e na compreensão do produto — incluindo a transição do projeto de </w:t>
-      </w:r>
-      <w:r>
-        <w:rPr>
-          <w:rFonts w:ascii="Calibri" w:hAnsi="Calibri" w:eastAsia="Calibri"/>
-          <w:b/>
-          <w:i w:val="0"/>
-          <w:sz w:val="22"/>
-        </w:rPr>
-        <w:t>desenvolvimento para homologação</w:t>
-      </w:r>
-      <w:r>
-        <w:rPr>
-          <w:rFonts w:ascii="Calibri" w:hAnsi="Calibri" w:eastAsia="Calibri"/>
-          <w:b w:val="0"/>
-          <w:i w:val="0"/>
-          <w:sz w:val="22"/>
-        </w:rPr>
-        <w:t>, marco relevante de maturidade para o cargo e para o tempo de casa (admissão em 01/04/2026).</w:t>
-      </w:r>
-    </w:p>
-    <w:p>
-      <w:r>
-        <w:rPr>
-          <w:rFonts w:ascii="Calibri" w:hAnsi="Calibri" w:eastAsia="Calibri"/>
-          <w:b w:val="0"/>
-          <w:i w:val="0"/>
-          <w:sz w:val="22"/>
-        </w:rPr>
-        <w:t xml:space="preserve">O impacto observado está ligado à </w:t>
-      </w:r>
-      <w:r>
-        <w:rPr>
-          <w:rFonts w:ascii="Calibri" w:hAnsi="Calibri" w:eastAsia="Calibri"/>
-          <w:b/>
-          <w:i w:val="0"/>
-          <w:sz w:val="22"/>
-        </w:rPr>
-        <w:t>entrega contínua no cliente</w:t>
-      </w:r>
-      <w:r>
-        <w:rPr>
-          <w:rFonts w:ascii="Calibri" w:hAnsi="Calibri" w:eastAsia="Calibri"/>
-          <w:b w:val="0"/>
-          <w:i w:val="0"/>
-          <w:sz w:val="22"/>
-        </w:rPr>
-        <w:t xml:space="preserve">, à preocupação com a </w:t>
-      </w:r>
-      <w:r>
-        <w:rPr>
-          <w:rFonts w:ascii="Calibri" w:hAnsi="Calibri" w:eastAsia="Calibri"/>
-          <w:b/>
-          <w:i w:val="0"/>
-          <w:sz w:val="22"/>
-        </w:rPr>
-        <w:t>qualidade das implementações</w:t>
-      </w:r>
-      <w:r>
-        <w:rPr>
-          <w:rFonts w:ascii="Calibri" w:hAnsi="Calibri" w:eastAsia="Calibri"/>
-          <w:b w:val="0"/>
-          <w:i w:val="0"/>
-          <w:sz w:val="22"/>
-        </w:rPr>
-        <w:t xml:space="preserve"> e à </w:t>
-      </w:r>
-      <w:r>
-        <w:rPr>
-          <w:rFonts w:ascii="Calibri" w:hAnsi="Calibri" w:eastAsia="Calibri"/>
-          <w:b/>
-          <w:i w:val="0"/>
-          <w:sz w:val="22"/>
-        </w:rPr>
-        <w:t>comunicação antecipada de problemas e riscos</w:t>
-      </w:r>
-      <w:r>
-        <w:rPr>
-          <w:rFonts w:ascii="Calibri" w:hAnsi="Calibri" w:eastAsia="Calibri"/>
-          <w:b w:val="0"/>
-          <w:i w:val="0"/>
-          <w:sz w:val="22"/>
-        </w:rPr>
-        <w:t xml:space="preserve"> ao time. Também evoluiu o inglês de </w:t>
-      </w:r>
-      <w:r>
-        <w:rPr>
-          <w:rFonts w:ascii="Calibri" w:hAnsi="Calibri" w:eastAsia="Calibri"/>
-          <w:b/>
-          <w:i w:val="0"/>
-          <w:sz w:val="22"/>
-        </w:rPr>
-        <w:t>B2 para C1+</w:t>
-      </w:r>
-      <w:r>
-        <w:rPr>
-          <w:rFonts w:ascii="Calibri" w:hAnsi="Calibri" w:eastAsia="Calibri"/>
-          <w:b w:val="0"/>
-          <w:i w:val="0"/>
-          <w:sz w:val="22"/>
-        </w:rPr>
-        <w:t xml:space="preserve"> no goFluent e concluiu a certificação </w:t>
-      </w:r>
-      <w:r>
-        <w:rPr>
-          <w:rFonts w:ascii="Calibri" w:hAnsi="Calibri" w:eastAsia="Calibri"/>
-          <w:b/>
-          <w:i w:val="0"/>
-          <w:sz w:val="22"/>
-        </w:rPr>
-        <w:t>AZ-900</w:t>
-      </w:r>
-      <w:r>
-        <w:rPr>
-          <w:rFonts w:ascii="Calibri" w:hAnsi="Calibri" w:eastAsia="Calibri"/>
-          <w:b w:val="0"/>
-          <w:i w:val="0"/>
-          <w:sz w:val="22"/>
-        </w:rPr>
-        <w:t xml:space="preserve">. Nas 1:1, relatou uso aplicado de Copilot/agentes de IA no fluxo do projeto, alinhado às prioridades da prática. Metas de médio prazo (ex.: Swift / AI-900 formal) foram conscientemente priorizadas em segundo plano diante da carga de </w:t>
-      </w:r>
-      <w:r>
-        <w:rPr>
-          <w:rFonts w:ascii="Calibri" w:hAnsi="Calibri" w:eastAsia="Calibri"/>
-          <w:b/>
-          <w:i w:val="0"/>
-          <w:sz w:val="22"/>
-        </w:rPr>
-        <w:t>faculdade presencial + entrega no cliente</w:t>
-      </w:r>
-      <w:r>
-        <w:rPr>
-          <w:rFonts w:ascii="Calibri" w:hAnsi="Calibri" w:eastAsia="Calibri"/>
-          <w:b w:val="0"/>
-          <w:i w:val="0"/>
-          <w:sz w:val="22"/>
-        </w:rPr>
-        <w:t xml:space="preserve">, com plano claro para o </w:t>
-      </w:r>
-      <w:r>
-        <w:rPr>
-          <w:rFonts w:ascii="Calibri" w:hAnsi="Calibri" w:eastAsia="Calibri"/>
-          <w:b/>
-          <w:i w:val="0"/>
-          <w:sz w:val="22"/>
-        </w:rPr>
-        <w:t>FY27</w:t>
-      </w:r>
-      <w:r>
-        <w:rPr>
-          <w:rFonts w:ascii="Calibri" w:hAnsi="Calibri" w:eastAsia="Calibri"/>
-          <w:b w:val="0"/>
-          <w:i w:val="0"/>
-          <w:sz w:val="22"/>
-        </w:rPr>
-        <w:t>.</w:t>
-      </w:r>
-    </w:p>
-    <w:p>
-      <w:r>
-        <w:rPr>
-          <w:rFonts w:ascii="Calibri" w:hAnsi="Calibri" w:eastAsia="Calibri"/>
-          <w:b w:val="0"/>
-          <w:i w:val="0"/>
-          <w:sz w:val="22"/>
-        </w:rPr>
-        <w:t xml:space="preserve">Os feedbacks de projeto </w:t>
-      </w:r>
-      <w:r>
-        <w:rPr>
-          <w:rFonts w:ascii="Calibri" w:hAnsi="Calibri" w:eastAsia="Calibri"/>
-          <w:b/>
-          <w:i w:val="0"/>
-          <w:sz w:val="22"/>
-        </w:rPr>
-        <w:t>confirmam</w:t>
-      </w:r>
-      <w:r>
-        <w:rPr>
-          <w:rFonts w:ascii="Calibri" w:hAnsi="Calibri" w:eastAsia="Calibri"/>
-          <w:b w:val="0"/>
-          <w:i w:val="0"/>
-          <w:sz w:val="22"/>
-        </w:rPr>
-        <w:t xml:space="preserve"> essa leitura. O gestor </w:t>
-      </w:r>
-      <w:r>
-        <w:rPr>
-          <w:rFonts w:ascii="Calibri" w:hAnsi="Calibri" w:eastAsia="Calibri"/>
-          <w:b/>
-          <w:i w:val="0"/>
-          <w:sz w:val="22"/>
-        </w:rPr>
-        <w:t>Rafael Coloda</w:t>
-      </w:r>
-      <w:r>
-        <w:rPr>
-          <w:rFonts w:ascii="Calibri" w:hAnsi="Calibri" w:eastAsia="Calibri"/>
-          <w:b w:val="0"/>
-          <w:i w:val="0"/>
-          <w:sz w:val="22"/>
-        </w:rPr>
-        <w:t xml:space="preserve"> aponta desempenho consistente e alinhado ao nível, qualidade das entregas, cautela nas implementações, comunicação de riscos, busca adequada de apoio e postura colaborativa — destacando, como ponto de atenção, a necessidade de maior disciplina no </w:t>
-      </w:r>
-      <w:r>
-        <w:rPr>
-          <w:rFonts w:ascii="Calibri" w:hAnsi="Calibri" w:eastAsia="Calibri"/>
-          <w:b/>
-          <w:i w:val="0"/>
-          <w:sz w:val="22"/>
-        </w:rPr>
-        <w:t>lançamento de horas no Jira</w:t>
-      </w:r>
-      <w:r>
-        <w:rPr>
-          <w:rFonts w:ascii="Calibri" w:hAnsi="Calibri" w:eastAsia="Calibri"/>
-          <w:b w:val="0"/>
-          <w:i w:val="0"/>
-          <w:sz w:val="22"/>
-        </w:rPr>
-        <w:t xml:space="preserve">, de forma autônoma e consistente. A liderança técnica </w:t>
-      </w:r>
-      <w:r>
-        <w:rPr>
-          <w:rFonts w:ascii="Calibri" w:hAnsi="Calibri" w:eastAsia="Calibri"/>
-          <w:b/>
-          <w:i w:val="0"/>
-          <w:sz w:val="22"/>
-        </w:rPr>
-        <w:t>Jessica</w:t>
-      </w:r>
-      <w:r>
-        <w:rPr>
-          <w:rFonts w:ascii="Calibri" w:hAnsi="Calibri" w:eastAsia="Calibri"/>
-          <w:b w:val="0"/>
-          <w:i w:val="0"/>
-          <w:sz w:val="22"/>
-        </w:rPr>
-        <w:t xml:space="preserve"> reforça evolução consistente, qualidade, comunicação de riscos, curiosidade e colaboração, com expectativa de ampliar autonomia técnica/funcional no próximo ciclo. A par </w:t>
-      </w:r>
-      <w:r>
-        <w:rPr>
-          <w:rFonts w:ascii="Calibri" w:hAnsi="Calibri" w:eastAsia="Calibri"/>
-          <w:b/>
-          <w:i w:val="0"/>
-          <w:sz w:val="22"/>
-        </w:rPr>
-        <w:t>Celline</w:t>
-      </w:r>
-      <w:r>
-        <w:rPr>
-          <w:rFonts w:ascii="Calibri" w:hAnsi="Calibri" w:eastAsia="Calibri"/>
-          <w:b w:val="0"/>
-          <w:i w:val="0"/>
-          <w:sz w:val="22"/>
-        </w:rPr>
-        <w:t xml:space="preserve"> descreve profissional dedicada, transparente, organizada, com preocupação com qualidade e prazos e colaboração positiva no dia a dia.</w:t>
-      </w:r>
-    </w:p>
-    <w:p>
-      <w:r>
-        <w:rPr>
-          <w:rFonts w:ascii="Calibri" w:hAnsi="Calibri" w:eastAsia="Calibri"/>
-          <w:b w:val="0"/>
-          <w:i w:val="0"/>
-          <w:sz w:val="22"/>
-        </w:rPr>
-        <w:t>Nas 1:1 com o People Lead, demonstra disponibilidade para diálogo, escuta ativa e interesse em compreender seu papel, expectativas e próximos passos. Apresenta postura profissional adequada, abertura para aprender, receptividade a feedbacks e clareza de norte de carreira (</w:t>
-      </w:r>
-      <w:r>
-        <w:rPr>
-          <w:rFonts w:ascii="Calibri" w:hAnsi="Calibri" w:eastAsia="Calibri"/>
-          <w:b/>
-          <w:i w:val="0"/>
-          <w:sz w:val="22"/>
-        </w:rPr>
-        <w:t>arquitetura mobile</w:t>
-      </w:r>
-      <w:r>
-        <w:rPr>
-          <w:rFonts w:ascii="Calibri" w:hAnsi="Calibri" w:eastAsia="Calibri"/>
-          <w:b w:val="0"/>
-          <w:i w:val="0"/>
-          <w:sz w:val="22"/>
-        </w:rPr>
-        <w:t>). Demonstra responsabilidade com combinados, honestidade no fechamento do ciclo e comportamento alinhado a um ambiente colaborativo e respeitoso.</w:t>
-      </w:r>
-    </w:p>
-    <w:p>
-      <w:r>
-        <w:rPr>
-          <w:rFonts w:ascii="Calibri" w:hAnsi="Calibri" w:eastAsia="Calibri"/>
-          <w:b w:val="0"/>
-          <w:i w:val="0"/>
-          <w:sz w:val="22"/>
-        </w:rPr>
-        <w:t xml:space="preserve">Segue em fase de </w:t>
-      </w:r>
-      <w:r>
-        <w:rPr>
-          <w:rFonts w:ascii="Calibri" w:hAnsi="Calibri" w:eastAsia="Calibri"/>
-          <w:b/>
-          <w:i w:val="0"/>
-          <w:sz w:val="22"/>
-        </w:rPr>
-        <w:t>consolidação técnica e profissional no nível Associate</w:t>
-      </w:r>
-      <w:r>
-        <w:rPr>
-          <w:rFonts w:ascii="Calibri" w:hAnsi="Calibri" w:eastAsia="Calibri"/>
-          <w:b w:val="0"/>
-          <w:i w:val="0"/>
-          <w:sz w:val="22"/>
-        </w:rPr>
-        <w:t xml:space="preserve">, com oportunidades claras de evolução em: maior autonomia na resolução de problemas e em atividades de maior complexidade; formalização de evidências e cases (incl. IA); e </w:t>
-      </w:r>
-      <w:r>
-        <w:rPr>
-          <w:rFonts w:ascii="Calibri" w:hAnsi="Calibri" w:eastAsia="Calibri"/>
-          <w:b/>
-          <w:i w:val="0"/>
-          <w:sz w:val="22"/>
-        </w:rPr>
-        <w:t>disciplina nas responsabilidades operacionais (lançamento de horas no Jira)</w:t>
-      </w:r>
-      <w:r>
-        <w:rPr>
-          <w:rFonts w:ascii="Calibri" w:hAnsi="Calibri" w:eastAsia="Calibri"/>
-          <w:b w:val="0"/>
-          <w:i w:val="0"/>
-          <w:sz w:val="22"/>
-        </w:rPr>
-        <w:t>. As 1:1 têm sido utilizadas como espaço de reflexão sobre carreira, ciclo de performance e crescimento contínuo.</w:t>
-      </w:r>
-    </w:p>
-    <w:p>
-      <w:r>
-        <w:rPr>
-          <w:rFonts w:ascii="Calibri" w:hAnsi="Calibri" w:eastAsia="Calibri"/>
-          <w:b/>
-          <w:i w:val="0"/>
-          <w:sz w:val="22"/>
-        </w:rPr>
-        <w:t>Recomendação:</w:t>
-      </w:r>
-      <w:r>
-        <w:rPr>
-          <w:rFonts w:ascii="Calibri" w:hAnsi="Calibri" w:eastAsia="Calibri"/>
-          <w:b w:val="0"/>
-          <w:i w:val="0"/>
-          <w:sz w:val="22"/>
-        </w:rPr>
-        <w:t xml:space="preserve"> manter no nível </w:t>
-      </w:r>
-      <w:r>
-        <w:rPr>
-          <w:rFonts w:ascii="Calibri" w:hAnsi="Calibri" w:eastAsia="Calibri"/>
-          <w:b/>
-          <w:i w:val="0"/>
-          <w:sz w:val="22"/>
-        </w:rPr>
-        <w:t>Associate</w:t>
-      </w:r>
-      <w:r>
-        <w:rPr>
-          <w:rFonts w:ascii="Calibri" w:hAnsi="Calibri" w:eastAsia="Calibri"/>
-          <w:b w:val="0"/>
-          <w:i w:val="0"/>
-          <w:sz w:val="22"/>
-        </w:rPr>
-        <w:t xml:space="preserve"> neste December Cycle, com reconhecimento do desempenho alinhado ao cargo e dos feedbacks positivos de gestor, liderança técnica e par; </w:t>
-      </w:r>
-      <w:r>
-        <w:rPr>
-          <w:rFonts w:ascii="Calibri" w:hAnsi="Calibri" w:eastAsia="Calibri"/>
-          <w:b/>
-          <w:i w:val="0"/>
-          <w:sz w:val="22"/>
-        </w:rPr>
-        <w:t>não recomendar promoção</w:t>
-      </w:r>
-      <w:r>
-        <w:rPr>
-          <w:rFonts w:ascii="Calibri" w:hAnsi="Calibri" w:eastAsia="Calibri"/>
-          <w:b w:val="0"/>
-          <w:i w:val="0"/>
-          <w:sz w:val="22"/>
-        </w:rPr>
-        <w:t xml:space="preserve"> a Analyst neste FY, dado o tempo de casa e o próprio direcionamento dos feedbacks (consolidação e autonomia). Continuar acompanhamento mensal com plano trimestre/semestre/ano e alinhamento contínuo com </w:t>
-      </w:r>
-      <w:r>
-        <w:rPr>
-          <w:rFonts w:ascii="Calibri" w:hAnsi="Calibri" w:eastAsia="Calibri"/>
-          <w:b/>
-          <w:i w:val="0"/>
-          <w:sz w:val="22"/>
-        </w:rPr>
-        <w:t>Rafael Coloda</w:t>
-      </w:r>
-      <w:r>
-        <w:rPr>
-          <w:rFonts w:ascii="Calibri" w:hAnsi="Calibri" w:eastAsia="Calibri"/>
-          <w:b w:val="0"/>
-          <w:i w:val="0"/>
-          <w:sz w:val="22"/>
-        </w:rPr>
-        <w:t>.</w:t>
+        <w:t>Limite Workday: 3.000 caracteres · este texto: ~2.230</w:t>
+      </w:r>
+    </w:p>
+    <w:p>
+      <w:r>
+        <w:rPr>
+          <w:rFonts w:ascii="Calibri" w:hAnsi="Calibri" w:eastAsia="Calibri"/>
+          <w:b w:val="0"/>
+          <w:i w:val="0"/>
+          <w:sz w:val="22"/>
+        </w:rPr>
+        <w:t>Durante o FY26, Ana Karina atuou como Associate, Mobile &amp; Device Dev, no BANCO BRADESCO, no app nativo (Kotlin/Android). Cumpriu o escopo do nível Associate com evolução consistente nas atividades e no domínio do produto, incluindo a transição de desenvolvimento para homologação — marco relevante para o cargo e o tempo de casa (admissão em 01/04/2026).</w:t>
+      </w:r>
+    </w:p>
+    <w:p>
+      <w:r>
+        <w:rPr>
+          <w:rFonts w:ascii="Calibri" w:hAnsi="Calibri" w:eastAsia="Calibri"/>
+          <w:b w:val="0"/>
+          <w:i w:val="0"/>
+          <w:sz w:val="22"/>
+        </w:rPr>
+        <w:t>O impacto está ligado à entrega no cliente, à qualidade das implementações e à comunicação antecipada de problemas e riscos ao time. Evoluiu o inglês de B2 para C1+ (goFluent) e concluiu a AZ-900. Nas 1:1, relatou uso aplicado de Copilot/agentes de IA no projeto. Metas de médio prazo (Swift / AI-900) ficaram em segundo plano diante da faculdade presencial e da entrega no cliente, com plano para o FY27.</w:t>
+      </w:r>
+    </w:p>
+    <w:p>
+      <w:r>
+        <w:rPr>
+          <w:rFonts w:ascii="Calibri" w:hAnsi="Calibri" w:eastAsia="Calibri"/>
+          <w:b w:val="0"/>
+          <w:i w:val="0"/>
+          <w:sz w:val="22"/>
+        </w:rPr>
+        <w:t>Os feedbacks de projeto confirmam essa leitura. Rafael Coloda (gestor) aponta desempenho consistente e alinhado ao nível, qualidade, cautela nas implementações, comunicação de riscos, busca adequada de apoio e colaboração — com ponto de atenção na disciplina do lançamento de horas no Jira, de forma autônoma. Jessica (liderança técnica) reforça evolução consistente, qualidade, comunicação de riscos, curiosidade e colaboração, com expectativa de maior autonomia técnica/funcional no próximo ciclo. Celline (par) destaca dedicação, transparência, organização, qualidade, prazos e colaboração positiva no dia a dia.</w:t>
+      </w:r>
+    </w:p>
+    <w:p>
+      <w:r>
+        <w:rPr>
+          <w:rFonts w:ascii="Calibri" w:hAnsi="Calibri" w:eastAsia="Calibri"/>
+          <w:b w:val="0"/>
+          <w:i w:val="0"/>
+          <w:sz w:val="22"/>
+        </w:rPr>
+        <w:t>Nas 1:1 com o People Lead, demonstra diálogo, escuta ativa, abertura a feedbacks, postura profissional e norte de carreira em arquitetura mobile. Responsável com combinados, honesta no fechamento do ciclo e alinhada a um ambiente colaborativo.</w:t>
+      </w:r>
+    </w:p>
+    <w:p>
+      <w:r>
+        <w:rPr>
+          <w:rFonts w:ascii="Calibri" w:hAnsi="Calibri" w:eastAsia="Calibri"/>
+          <w:b w:val="0"/>
+          <w:i w:val="0"/>
+          <w:sz w:val="22"/>
+        </w:rPr>
+        <w:t>Segue em consolidação no nível Associate, com evolução em: autonomia em problemas e atividades mais complexas; formalização de evidências/cases (incl. IA); e disciplina operacional (horas no Jira). As 1:1 apoiam reflexão de carreira e ciclo.</w:t>
+      </w:r>
+    </w:p>
+    <w:p>
+      <w:r>
+        <w:rPr>
+          <w:rFonts w:ascii="Calibri" w:hAnsi="Calibri" w:eastAsia="Calibri"/>
+          <w:b w:val="0"/>
+          <w:i w:val="0"/>
+          <w:sz w:val="22"/>
+        </w:rPr>
+        <w:t>Recomendação: manter Associate neste December Cycle, reconhecendo o desempenho alinhado ao cargo e os feedbacks positivos de gestor, liderança técnica e par; não recomendar promoção a Analyst neste FY (tempo de casa e direcionamento dos feedbacks para consolidação/autonomia). Manter 1:1 mensal com plano trimestre/semestre/ano e alinhamento com Rafael Coloda.</w:t>
       </w:r>
     </w:p>
     <w:p>
@@ -31421,36 +31003,18 @@
         <w:pStyle w:val="Heading3"/>
       </w:pPr>
       <w:r>
-        <w:t>Versão curta (se o campo tiver limite)</w:t>
-      </w:r>
-    </w:p>
-    <w:p>
-      <w:r>
-        <w:rPr>
-          <w:rFonts w:ascii="Calibri" w:hAnsi="Calibri" w:eastAsia="Calibri"/>
-          <w:b w:val="0"/>
-          <w:i w:val="0"/>
-          <w:sz w:val="22"/>
-        </w:rPr>
-        <w:t xml:space="preserve">Durante o FY26, Ana Karina (Associate, Mobile) no BANCO BRADESCO entregou no app nativo com evolução consistente até homologação, preocupação com qualidade e comunicação de riscos. Feedbacks de Rafael Coloda, Jessica e Celline confirmam desempenho alinhado ao nível, colaboração e curiosidade; ponto de evolução: lançamento de horas no Jira de forma autônoma. AZ-900 e inglês C1+ concluídos. </w:t>
-      </w:r>
-      <w:r>
-        <w:rPr>
-          <w:rFonts w:ascii="Calibri" w:hAnsi="Calibri" w:eastAsia="Calibri"/>
-          <w:b/>
-          <w:i w:val="0"/>
-          <w:sz w:val="22"/>
-        </w:rPr>
-        <w:t>Recomendação: consolidar Associate; não promover a Analyst neste ciclo</w:t>
-      </w:r>
-      <w:r>
-        <w:rPr>
-          <w:rFonts w:ascii="Calibri" w:hAnsi="Calibri" w:eastAsia="Calibri"/>
-          <w:b w:val="0"/>
-          <w:i w:val="0"/>
-          <w:sz w:val="22"/>
-        </w:rPr>
-        <w:t xml:space="preserve"> — potencial alto para FY27 com maior autonomia.</w:t>
+        <w:t>Versão ainda mais curta (~1.100 caracteres)</w:t>
+      </w:r>
+    </w:p>
+    <w:p>
+      <w:r>
+        <w:rPr>
+          <w:rFonts w:ascii="Calibri" w:hAnsi="Calibri" w:eastAsia="Calibri"/>
+          <w:b w:val="0"/>
+          <w:i w:val="0"/>
+          <w:sz w:val="22"/>
+        </w:rPr>
+        <w:t>Durante o FY26, Ana Karina (Associate, Mobile) no BANCO BRADESCO entregou no app nativo com evolução consistente até homologação, preocupação com qualidade e comunicação de riscos. Feedbacks de Rafael Coloda, Jessica e Celline confirmam desempenho alinhado ao nível, colaboração e curiosidade; ponto de evolução: lançamento de horas no Jira de forma autônoma. AZ-900 e inglês C1+ concluídos. Recomendação: consolidar Associate; não promover a Analyst neste ciclo — potencial alto para FY27 com maior autonomia.</w:t>
       </w:r>
     </w:p>
     <w:p>
@@ -31548,7 +31112,948 @@
         <w:pStyle w:val="Heading1"/>
       </w:pPr>
       <w:r>
-        <w:t>15. Orientação do ciclo (Ana Karina)</w:t>
+        <w:t>15. Feedbacks de projeto (Rafael, Jessica, Celline)</w:t>
+      </w:r>
+    </w:p>
+    <w:p>
+      <w:r>
+        <w:rPr>
+          <w:rFonts w:ascii="Calibri" w:hAnsi="Calibri" w:eastAsia="Calibri"/>
+          <w:b/>
+          <w:i w:val="0"/>
+          <w:sz w:val="22"/>
+        </w:rPr>
+        <w:t>Uso interno People Lead · Registrado em 08/09/2026</w:t>
+      </w:r>
+    </w:p>
+    <w:p>
+      <w:r>
+        <w:rPr>
+          <w:rFonts w:ascii="Calibri" w:hAnsi="Calibri" w:eastAsia="Calibri"/>
+          <w:b w:val="0"/>
+          <w:i w:val="0"/>
+          <w:sz w:val="22"/>
+        </w:rPr>
+        <w:t>Fonte: feedbacks recebidos no ciclo (Rafael Coloda, Jessica, Celline).</w:t>
+      </w:r>
+    </w:p>
+    <w:p>
+      <w:pPr>
+        <w:pBdr>
+          <w:bottom w:val="single" w:sz="6" w:space="1" w:color="CCCCCC"/>
+        </w:pBdr>
+      </w:pPr>
+    </w:p>
+    <w:p>
+      <w:pPr>
+        <w:pStyle w:val="Heading3"/>
+      </w:pPr>
+      <w:r>
+        <w:t>Rafael Coloda — Líder de projeto</w:t>
+      </w:r>
+    </w:p>
+    <w:p>
+      <w:pPr>
+        <w:pStyle w:val="Heading3"/>
+      </w:pPr>
+      <w:r>
+        <w:t>Entregas e Resultados</w:t>
+      </w:r>
+    </w:p>
+    <w:p>
+      <w:r>
+        <w:rPr>
+          <w:rFonts w:ascii="Calibri" w:hAnsi="Calibri" w:eastAsia="Calibri"/>
+          <w:b w:val="0"/>
+          <w:i w:val="0"/>
+          <w:sz w:val="22"/>
+        </w:rPr>
+        <w:t xml:space="preserve">Desempenho </w:t>
+      </w:r>
+      <w:r>
+        <w:rPr>
+          <w:rFonts w:ascii="Calibri" w:hAnsi="Calibri" w:eastAsia="Calibri"/>
+          <w:b/>
+          <w:i w:val="0"/>
+          <w:sz w:val="22"/>
+        </w:rPr>
+        <w:t>consistente e alinhado</w:t>
+      </w:r>
+      <w:r>
+        <w:rPr>
+          <w:rFonts w:ascii="Calibri" w:hAnsi="Calibri" w:eastAsia="Calibri"/>
+          <w:b w:val="0"/>
+          <w:i w:val="0"/>
+          <w:sz w:val="22"/>
+        </w:rPr>
+        <w:t xml:space="preserve"> às expectativas do nível. Boa evolução na condução das atividades. Busca apoio de forma adequada quando tem dúvidas; em algumas situações ainda precisa de suporte — </w:t>
+      </w:r>
+      <w:r>
+        <w:rPr>
+          <w:rFonts w:ascii="Calibri" w:hAnsi="Calibri" w:eastAsia="Calibri"/>
+          <w:b/>
+          <w:i w:val="0"/>
+          <w:sz w:val="22"/>
+        </w:rPr>
+        <w:t>esperado</w:t>
+      </w:r>
+      <w:r>
+        <w:rPr>
+          <w:rFonts w:ascii="Calibri" w:hAnsi="Calibri" w:eastAsia="Calibri"/>
+          <w:b w:val="0"/>
+          <w:i w:val="0"/>
+          <w:sz w:val="22"/>
+        </w:rPr>
+        <w:t xml:space="preserve"> para o momento de carreira.</w:t>
+      </w:r>
+    </w:p>
+    <w:p>
+      <w:r>
+        <w:rPr>
+          <w:rFonts w:ascii="Calibri" w:hAnsi="Calibri" w:eastAsia="Calibri"/>
+          <w:b/>
+          <w:i w:val="0"/>
+          <w:sz w:val="22"/>
+        </w:rPr>
+        <w:t>Ponto forte:</w:t>
+      </w:r>
+      <w:r>
+        <w:rPr>
+          <w:rFonts w:ascii="Calibri" w:hAnsi="Calibri" w:eastAsia="Calibri"/>
+          <w:b w:val="0"/>
+          <w:i w:val="0"/>
+          <w:sz w:val="22"/>
+        </w:rPr>
+        <w:t xml:space="preserve"> preocupação com </w:t>
+      </w:r>
+      <w:r>
+        <w:rPr>
+          <w:rFonts w:ascii="Calibri" w:hAnsi="Calibri" w:eastAsia="Calibri"/>
+          <w:b/>
+          <w:i w:val="0"/>
+          <w:sz w:val="22"/>
+        </w:rPr>
+        <w:t>qualidade</w:t>
+      </w:r>
+      <w:r>
+        <w:rPr>
+          <w:rFonts w:ascii="Calibri" w:hAnsi="Calibri" w:eastAsia="Calibri"/>
+          <w:b w:val="0"/>
+          <w:i w:val="0"/>
+          <w:sz w:val="22"/>
+        </w:rPr>
+        <w:t xml:space="preserve"> das entregas; cautela antes de concluir implementações; atenção a problemas/riscos e </w:t>
+      </w:r>
+      <w:r>
+        <w:rPr>
+          <w:rFonts w:ascii="Calibri" w:hAnsi="Calibri" w:eastAsia="Calibri"/>
+          <w:b/>
+          <w:i w:val="0"/>
+          <w:sz w:val="22"/>
+        </w:rPr>
+        <w:t>comunicação ao time</w:t>
+      </w:r>
+      <w:r>
+        <w:rPr>
+          <w:rFonts w:ascii="Calibri" w:hAnsi="Calibri" w:eastAsia="Calibri"/>
+          <w:b w:val="0"/>
+          <w:i w:val="0"/>
+          <w:sz w:val="22"/>
+        </w:rPr>
+        <w:t>.</w:t>
+      </w:r>
+    </w:p>
+    <w:p>
+      <w:pPr>
+        <w:pStyle w:val="Heading3"/>
+      </w:pPr>
+      <w:r>
+        <w:t>Colaboração e Comportamentos</w:t>
+      </w:r>
+    </w:p>
+    <w:p>
+      <w:r>
+        <w:rPr>
+          <w:rFonts w:ascii="Calibri" w:hAnsi="Calibri" w:eastAsia="Calibri"/>
+          <w:b w:val="0"/>
+          <w:i w:val="0"/>
+          <w:sz w:val="22"/>
+        </w:rPr>
+        <w:t>Postura colaborativa; boa interação com a equipe; curiosidade e interesse em aprender; abertura a orientações → autonomia gradual.</w:t>
+      </w:r>
+    </w:p>
+    <w:p>
+      <w:r>
+        <w:rPr>
+          <w:rFonts w:ascii="Calibri" w:hAnsi="Calibri" w:eastAsia="Calibri"/>
+          <w:b/>
+          <w:i w:val="0"/>
+          <w:sz w:val="22"/>
+        </w:rPr>
+        <w:t>Ponto de atenção:</w:t>
+      </w:r>
+      <w:r>
+        <w:rPr>
+          <w:rFonts w:ascii="Calibri" w:hAnsi="Calibri" w:eastAsia="Calibri"/>
+          <w:b w:val="0"/>
+          <w:i w:val="0"/>
+          <w:sz w:val="22"/>
+        </w:rPr>
+        <w:t xml:space="preserve"> disciplina no </w:t>
+      </w:r>
+      <w:r>
+        <w:rPr>
+          <w:rFonts w:ascii="Calibri" w:hAnsi="Calibri" w:eastAsia="Calibri"/>
+          <w:b/>
+          <w:i w:val="0"/>
+          <w:sz w:val="22"/>
+        </w:rPr>
+        <w:t>lançamento de horas no Jira</w:t>
+      </w:r>
+      <w:r>
+        <w:rPr>
+          <w:rFonts w:ascii="Calibri" w:hAnsi="Calibri" w:eastAsia="Calibri"/>
+          <w:b w:val="0"/>
+          <w:i w:val="0"/>
+          <w:sz w:val="22"/>
+        </w:rPr>
+        <w:t xml:space="preserve"> — em alguns momentos precisou de reforço da liderança. Expectativa: passar a fazer de forma </w:t>
+      </w:r>
+      <w:r>
+        <w:rPr>
+          <w:rFonts w:ascii="Calibri" w:hAnsi="Calibri" w:eastAsia="Calibri"/>
+          <w:b/>
+          <w:i w:val="0"/>
+          <w:sz w:val="22"/>
+        </w:rPr>
+        <w:t>consistente e autônoma</w:t>
+      </w:r>
+      <w:r>
+        <w:rPr>
+          <w:rFonts w:ascii="Calibri" w:hAnsi="Calibri" w:eastAsia="Calibri"/>
+          <w:b w:val="0"/>
+          <w:i w:val="0"/>
+          <w:sz w:val="22"/>
+        </w:rPr>
+        <w:t>, sem cobrança.</w:t>
+      </w:r>
+    </w:p>
+    <w:p>
+      <w:pPr>
+        <w:pStyle w:val="Heading3"/>
+      </w:pPr>
+      <w:r>
+        <w:t>Evidências (Rafael)</w:t>
+      </w:r>
+    </w:p>
+    <w:p>
+      <w:pPr>
+        <w:pStyle w:val="ListBullet"/>
+      </w:pPr>
+      <w:r>
+        <w:rPr>
+          <w:rFonts w:ascii="Calibri" w:hAnsi="Calibri" w:eastAsia="Calibri"/>
+          <w:b w:val="0"/>
+          <w:i w:val="0"/>
+          <w:sz w:val="22"/>
+        </w:rPr>
+        <w:t xml:space="preserve">Preocupação com qualidade das implementações; condução com cautela  </w:t>
+      </w:r>
+    </w:p>
+    <w:p>
+      <w:pPr>
+        <w:pStyle w:val="ListBullet"/>
+      </w:pPr>
+      <w:r>
+        <w:rPr>
+          <w:rFonts w:ascii="Calibri" w:hAnsi="Calibri" w:eastAsia="Calibri"/>
+          <w:b w:val="0"/>
+          <w:i w:val="0"/>
+          <w:sz w:val="22"/>
+        </w:rPr>
+        <w:t xml:space="preserve">Comunica problemas e riscos durante o desenvolvimento  </w:t>
+      </w:r>
+    </w:p>
+    <w:p>
+      <w:pPr>
+        <w:pStyle w:val="ListBullet"/>
+      </w:pPr>
+      <w:r>
+        <w:rPr>
+          <w:rFonts w:ascii="Calibri" w:hAnsi="Calibri" w:eastAsia="Calibri"/>
+          <w:b w:val="0"/>
+          <w:i w:val="0"/>
+          <w:sz w:val="22"/>
+        </w:rPr>
+        <w:t xml:space="preserve">Busca apoio e esclarece dúvidas  </w:t>
+      </w:r>
+    </w:p>
+    <w:p>
+      <w:pPr>
+        <w:pStyle w:val="ListBullet"/>
+      </w:pPr>
+      <w:r>
+        <w:rPr>
+          <w:rFonts w:ascii="Calibri" w:hAnsi="Calibri" w:eastAsia="Calibri"/>
+          <w:b w:val="0"/>
+          <w:i w:val="0"/>
+          <w:sz w:val="22"/>
+        </w:rPr>
+        <w:t xml:space="preserve">Curiosidade e interesse em aprender  </w:t>
+      </w:r>
+    </w:p>
+    <w:p>
+      <w:pPr>
+        <w:pStyle w:val="ListBullet"/>
+      </w:pPr>
+      <w:r>
+        <w:rPr>
+          <w:rFonts w:ascii="Calibri" w:hAnsi="Calibri" w:eastAsia="Calibri"/>
+          <w:b w:val="0"/>
+          <w:i w:val="0"/>
+          <w:sz w:val="22"/>
+        </w:rPr>
+        <w:t xml:space="preserve">Postura colaborativa e boa interação com pares  </w:t>
+      </w:r>
+    </w:p>
+    <w:p>
+      <w:pPr>
+        <w:pStyle w:val="ListBullet"/>
+      </w:pPr>
+      <w:r>
+        <w:rPr>
+          <w:rFonts w:ascii="Calibri" w:hAnsi="Calibri" w:eastAsia="Calibri"/>
+          <w:b w:val="0"/>
+          <w:i w:val="0"/>
+          <w:sz w:val="22"/>
+        </w:rPr>
+        <w:t xml:space="preserve">Em alguns momentos, reforço necessário no lançamento de horas no Jira  </w:t>
+      </w:r>
+    </w:p>
+    <w:p>
+      <w:pPr>
+        <w:pStyle w:val="Heading3"/>
+      </w:pPr>
+      <w:r>
+        <w:t>Próximos passos (Rafael)</w:t>
+      </w:r>
+    </w:p>
+    <w:p>
+      <w:pPr>
+        <w:pStyle w:val="ListBullet"/>
+      </w:pPr>
+      <w:r>
+        <w:rPr>
+          <w:rFonts w:ascii="Calibri" w:hAnsi="Calibri" w:eastAsia="Calibri"/>
+          <w:b w:val="0"/>
+          <w:i w:val="0"/>
+          <w:sz w:val="22"/>
+        </w:rPr>
+        <w:t xml:space="preserve">Aprofundar conhecimentos técnicos e funcionais  </w:t>
+      </w:r>
+    </w:p>
+    <w:p>
+      <w:pPr>
+        <w:pStyle w:val="ListBullet"/>
+      </w:pPr>
+      <w:r>
+        <w:rPr>
+          <w:rFonts w:ascii="Calibri" w:hAnsi="Calibri" w:eastAsia="Calibri"/>
+          <w:b w:val="0"/>
+          <w:i w:val="0"/>
+          <w:sz w:val="22"/>
+        </w:rPr>
+        <w:t xml:space="preserve">Maior autonomia em problemas e atividades de maior complexidade  </w:t>
+      </w:r>
+    </w:p>
+    <w:p>
+      <w:pPr>
+        <w:pStyle w:val="ListBullet"/>
+      </w:pPr>
+      <w:r>
+        <w:rPr>
+          <w:rFonts w:ascii="Calibri" w:hAnsi="Calibri" w:eastAsia="Calibri"/>
+          <w:b w:val="0"/>
+          <w:i w:val="0"/>
+          <w:sz w:val="22"/>
+        </w:rPr>
+        <w:t xml:space="preserve">Manter qualidade e comunicação antecipada de riscos  </w:t>
+      </w:r>
+    </w:p>
+    <w:p>
+      <w:pPr>
+        <w:pStyle w:val="ListBullet"/>
+      </w:pPr>
+      <w:r>
+        <w:rPr>
+          <w:rFonts w:ascii="Calibri" w:hAnsi="Calibri" w:eastAsia="Calibri"/>
+          <w:b/>
+          <w:i w:val="0"/>
+          <w:sz w:val="22"/>
+        </w:rPr>
+        <w:t>Disciplina operacional:</w:t>
+      </w:r>
+      <w:r>
+        <w:rPr>
+          <w:rFonts w:ascii="Calibri" w:hAnsi="Calibri" w:eastAsia="Calibri"/>
+          <w:b w:val="0"/>
+          <w:i w:val="0"/>
+          <w:sz w:val="22"/>
+        </w:rPr>
+        <w:t xml:space="preserve"> horas no Jira de forma consistente  </w:t>
+      </w:r>
+    </w:p>
+    <w:p>
+      <w:pPr>
+        <w:pBdr>
+          <w:bottom w:val="single" w:sz="6" w:space="1" w:color="CCCCCC"/>
+        </w:pBdr>
+      </w:pPr>
+    </w:p>
+    <w:p>
+      <w:pPr>
+        <w:pStyle w:val="Heading3"/>
+      </w:pPr>
+      <w:r>
+        <w:t>Jessica — Liderança técnica</w:t>
+      </w:r>
+    </w:p>
+    <w:p>
+      <w:r>
+        <w:rPr>
+          <w:rFonts w:ascii="Calibri" w:hAnsi="Calibri" w:eastAsia="Calibri"/>
+          <w:b w:val="0"/>
+          <w:i w:val="0"/>
+          <w:sz w:val="22"/>
+        </w:rPr>
+        <w:t xml:space="preserve">Evolução </w:t>
+      </w:r>
+      <w:r>
+        <w:rPr>
+          <w:rFonts w:ascii="Calibri" w:hAnsi="Calibri" w:eastAsia="Calibri"/>
+          <w:b/>
+          <w:i w:val="0"/>
+          <w:sz w:val="22"/>
+        </w:rPr>
+        <w:t>consistente</w:t>
+      </w:r>
+      <w:r>
+        <w:rPr>
+          <w:rFonts w:ascii="Calibri" w:hAnsi="Calibri" w:eastAsia="Calibri"/>
+          <w:b w:val="0"/>
+          <w:i w:val="0"/>
+          <w:sz w:val="22"/>
+        </w:rPr>
+        <w:t>; atuação adequada ao nível. Destaca: qualidade das entregas; identificar e comunicar riscos; curiosidade; colaboração; busca de apoio; abertura a orientações.</w:t>
+      </w:r>
+    </w:p>
+    <w:p>
+      <w:r>
+        <w:rPr>
+          <w:rFonts w:ascii="Calibri" w:hAnsi="Calibri" w:eastAsia="Calibri"/>
+          <w:b/>
+          <w:i w:val="0"/>
+          <w:sz w:val="22"/>
+        </w:rPr>
+        <w:t>Próximo ciclo:</w:t>
+      </w:r>
+      <w:r>
+        <w:rPr>
+          <w:rFonts w:ascii="Calibri" w:hAnsi="Calibri" w:eastAsia="Calibri"/>
+          <w:b w:val="0"/>
+          <w:i w:val="0"/>
+          <w:sz w:val="22"/>
+        </w:rPr>
+        <w:t xml:space="preserve"> ampliar autonomia técnica e funcional; conduzir atividades de maior complexidade com </w:t>
+      </w:r>
+      <w:r>
+        <w:rPr>
+          <w:rFonts w:ascii="Calibri" w:hAnsi="Calibri" w:eastAsia="Calibri"/>
+          <w:b/>
+          <w:i w:val="0"/>
+          <w:sz w:val="22"/>
+        </w:rPr>
+        <w:t>cada vez menos suporte</w:t>
+      </w:r>
+      <w:r>
+        <w:rPr>
+          <w:rFonts w:ascii="Calibri" w:hAnsi="Calibri" w:eastAsia="Calibri"/>
+          <w:b w:val="0"/>
+          <w:i w:val="0"/>
+          <w:sz w:val="22"/>
+        </w:rPr>
+        <w:t>.</w:t>
+      </w:r>
+    </w:p>
+    <w:p>
+      <w:r>
+        <w:rPr>
+          <w:rFonts w:ascii="Calibri" w:hAnsi="Calibri" w:eastAsia="Calibri"/>
+          <w:b w:val="0"/>
+          <w:i w:val="0"/>
+          <w:sz w:val="22"/>
+        </w:rPr>
+        <w:t>Visão geral: evolução positiva; mantendo aprendizado + qualidade, continua aumentando contribuição ao time.</w:t>
+      </w:r>
+    </w:p>
+    <w:p>
+      <w:pPr>
+        <w:pBdr>
+          <w:bottom w:val="single" w:sz="6" w:space="1" w:color="CCCCCC"/>
+        </w:pBdr>
+      </w:pPr>
+    </w:p>
+    <w:p>
+      <w:pPr>
+        <w:pStyle w:val="Heading3"/>
+      </w:pPr>
+      <w:r>
+        <w:t>Celline — Par / colaboração no dia a dia</w:t>
+      </w:r>
+    </w:p>
+    <w:p>
+      <w:r>
+        <w:rPr>
+          <w:rFonts w:ascii="Calibri" w:hAnsi="Calibri" w:eastAsia="Calibri"/>
+          <w:b w:val="0"/>
+          <w:i w:val="0"/>
+          <w:sz w:val="22"/>
+        </w:rPr>
+        <w:t>Profissional excelente; vontade de aprender; humana, transparente e agradável de trabalhar; colaborações positivas. Dedicada e inteligente; disposta a ajudar e tirar dúvidas; conhecimento técnico amplo; não tem medo de novos desafios; organizada com tarefas; resolve conflitos; preocupa-se com qualidade e prazos.</w:t>
+      </w:r>
+    </w:p>
+    <w:p>
+      <w:r>
+        <w:rPr>
+          <w:rFonts w:ascii="Calibri" w:hAnsi="Calibri" w:eastAsia="Calibri"/>
+          <w:b w:val="0"/>
+          <w:i w:val="0"/>
+          <w:sz w:val="22"/>
+        </w:rPr>
+        <w:t>Ainda em desenvolvimento profissional, com potencial claro de se tornar ainda mais competente. Parceria muito satisfatória.</w:t>
+      </w:r>
+    </w:p>
+    <w:p>
+      <w:pPr>
+        <w:pBdr>
+          <w:bottom w:val="single" w:sz="6" w:space="1" w:color="CCCCCC"/>
+        </w:pBdr>
+      </w:pPr>
+    </w:p>
+    <w:p>
+      <w:pPr>
+        <w:pStyle w:val="Heading3"/>
+      </w:pPr>
+      <w:r>
+        <w:t>Síntese para o People Lead (calibração)</w:t>
+      </w:r>
+    </w:p>
+    <w:tbl>
+      <w:tblPr>
+        <w:tblStyle w:val="TableGrid"/>
+        <w:tblW w:type="auto" w:w="0"/>
+        <w:tblLook w:firstColumn="1" w:firstRow="1" w:lastColumn="0" w:lastRow="0" w:noHBand="0" w:noVBand="1" w:val="04A0"/>
+      </w:tblPr>
+      <w:tblGrid>
+        <w:gridCol w:w="4873"/>
+        <w:gridCol w:w="4873"/>
+      </w:tblGrid>
+      <w:tr>
+        <w:tc>
+          <w:tcPr>
+            <w:tcW w:type="dxa" w:w="4873"/>
+            <w:shd w:fill="1F3A5F" w:val="clear"/>
+          </w:tcPr>
+          <w:p>
+            <w:r>
+              <w:rPr>
+                <w:b/>
+                <w:color w:val="FFFFFF"/>
+                <w:sz w:val="20"/>
+              </w:rPr>
+            </w:r>
+            <w:r>
+              <w:rPr>
+                <w:rFonts w:ascii="Calibri" w:hAnsi="Calibri" w:eastAsia="Calibri"/>
+                <w:b/>
+                <w:i w:val="0"/>
+                <w:color w:val="FFFFFF"/>
+                <w:sz w:val="20"/>
+              </w:rPr>
+              <w:t>Tema</w:t>
+            </w:r>
+          </w:p>
+        </w:tc>
+        <w:tc>
+          <w:tcPr>
+            <w:tcW w:type="dxa" w:w="4873"/>
+            <w:shd w:fill="1F3A5F" w:val="clear"/>
+          </w:tcPr>
+          <w:p>
+            <w:r>
+              <w:rPr>
+                <w:b/>
+                <w:color w:val="FFFFFF"/>
+                <w:sz w:val="20"/>
+              </w:rPr>
+            </w:r>
+            <w:r>
+              <w:rPr>
+                <w:rFonts w:ascii="Calibri" w:hAnsi="Calibri" w:eastAsia="Calibri"/>
+                <w:b/>
+                <w:i w:val="0"/>
+                <w:color w:val="FFFFFF"/>
+                <w:sz w:val="20"/>
+              </w:rPr>
+              <w:t>Leitura</w:t>
+            </w:r>
+          </w:p>
+        </w:tc>
+      </w:tr>
+      <w:tr>
+        <w:tc>
+          <w:tcPr>
+            <w:tcW w:type="dxa" w:w="4873"/>
+          </w:tcPr>
+          <w:p>
+            <w:r>
+              <w:rPr>
+                <w:sz w:val="20"/>
+              </w:rPr>
+            </w:r>
+            <w:r>
+              <w:rPr>
+                <w:rFonts w:ascii="Calibri" w:hAnsi="Calibri" w:eastAsia="Calibri"/>
+                <w:b w:val="0"/>
+                <w:i w:val="0"/>
+                <w:sz w:val="20"/>
+              </w:rPr>
+              <w:t>Performance no nível</w:t>
+            </w:r>
+          </w:p>
+        </w:tc>
+        <w:tc>
+          <w:tcPr>
+            <w:tcW w:type="dxa" w:w="4873"/>
+          </w:tcPr>
+          <w:p>
+            <w:r>
+              <w:rPr>
+                <w:sz w:val="20"/>
+              </w:rPr>
+            </w:r>
+            <w:r>
+              <w:rPr>
+                <w:rFonts w:ascii="Calibri" w:hAnsi="Calibri" w:eastAsia="Calibri"/>
+                <w:b/>
+                <w:i w:val="0"/>
+                <w:sz w:val="20"/>
+              </w:rPr>
+              <w:t>Confirma</w:t>
+            </w:r>
+            <w:r>
+              <w:rPr>
+                <w:rFonts w:ascii="Calibri" w:hAnsi="Calibri" w:eastAsia="Calibri"/>
+                <w:b w:val="0"/>
+                <w:i w:val="0"/>
+                <w:sz w:val="20"/>
+              </w:rPr>
+              <w:t xml:space="preserve"> Associate sólido — alinhado ao esperado</w:t>
+            </w:r>
+          </w:p>
+        </w:tc>
+      </w:tr>
+      <w:tr>
+        <w:tc>
+          <w:tcPr>
+            <w:tcW w:type="dxa" w:w="4873"/>
+            <w:shd w:fill="F3F6FA" w:val="clear"/>
+          </w:tcPr>
+          <w:p>
+            <w:r>
+              <w:rPr>
+                <w:sz w:val="20"/>
+              </w:rPr>
+            </w:r>
+            <w:r>
+              <w:rPr>
+                <w:rFonts w:ascii="Calibri" w:hAnsi="Calibri" w:eastAsia="Calibri"/>
+                <w:b w:val="0"/>
+                <w:i w:val="0"/>
+                <w:sz w:val="20"/>
+              </w:rPr>
+              <w:t>Ouro</w:t>
+            </w:r>
+          </w:p>
+        </w:tc>
+        <w:tc>
+          <w:tcPr>
+            <w:tcW w:type="dxa" w:w="4873"/>
+            <w:shd w:fill="F3F6FA" w:val="clear"/>
+          </w:tcPr>
+          <w:p>
+            <w:r>
+              <w:rPr>
+                <w:sz w:val="20"/>
+              </w:rPr>
+            </w:r>
+            <w:r>
+              <w:rPr>
+                <w:rFonts w:ascii="Calibri" w:hAnsi="Calibri" w:eastAsia="Calibri"/>
+                <w:b w:val="0"/>
+                <w:i w:val="0"/>
+                <w:sz w:val="20"/>
+              </w:rPr>
+              <w:t>Qualidade + comunicação de riscos + colaboração + curiosidade</w:t>
+            </w:r>
+          </w:p>
+        </w:tc>
+      </w:tr>
+      <w:tr>
+        <w:tc>
+          <w:tcPr>
+            <w:tcW w:type="dxa" w:w="4873"/>
+          </w:tcPr>
+          <w:p>
+            <w:r>
+              <w:rPr>
+                <w:sz w:val="20"/>
+              </w:rPr>
+            </w:r>
+            <w:r>
+              <w:rPr>
+                <w:rFonts w:ascii="Calibri" w:hAnsi="Calibri" w:eastAsia="Calibri"/>
+                <w:b w:val="0"/>
+                <w:i w:val="0"/>
+                <w:sz w:val="20"/>
+              </w:rPr>
+              <w:t>Validação pares/liderança</w:t>
+            </w:r>
+          </w:p>
+        </w:tc>
+        <w:tc>
+          <w:tcPr>
+            <w:tcW w:type="dxa" w:w="4873"/>
+          </w:tcPr>
+          <w:p>
+            <w:r>
+              <w:rPr>
+                <w:sz w:val="20"/>
+              </w:rPr>
+            </w:r>
+            <w:r>
+              <w:rPr>
+                <w:rFonts w:ascii="Calibri" w:hAnsi="Calibri" w:eastAsia="Calibri"/>
+                <w:b w:val="0"/>
+                <w:i w:val="0"/>
+                <w:sz w:val="20"/>
+              </w:rPr>
+              <w:t xml:space="preserve">Rafael + Jessica + Celline </w:t>
+            </w:r>
+            <w:r>
+              <w:rPr>
+                <w:rFonts w:ascii="Calibri" w:hAnsi="Calibri" w:eastAsia="Calibri"/>
+                <w:b/>
+                <w:i w:val="0"/>
+                <w:sz w:val="20"/>
+              </w:rPr>
+              <w:t>alinhados</w:t>
+            </w:r>
+          </w:p>
+        </w:tc>
+      </w:tr>
+      <w:tr>
+        <w:tc>
+          <w:tcPr>
+            <w:tcW w:type="dxa" w:w="4873"/>
+            <w:shd w:fill="F3F6FA" w:val="clear"/>
+          </w:tcPr>
+          <w:p>
+            <w:r>
+              <w:rPr>
+                <w:sz w:val="20"/>
+              </w:rPr>
+            </w:r>
+            <w:r>
+              <w:rPr>
+                <w:rFonts w:ascii="Calibri" w:hAnsi="Calibri" w:eastAsia="Calibri"/>
+                <w:b w:val="0"/>
+                <w:i w:val="0"/>
+                <w:sz w:val="20"/>
+              </w:rPr>
+              <w:t>Desenvolvimento</w:t>
+            </w:r>
+          </w:p>
+        </w:tc>
+        <w:tc>
+          <w:tcPr>
+            <w:tcW w:type="dxa" w:w="4873"/>
+            <w:shd w:fill="F3F6FA" w:val="clear"/>
+          </w:tcPr>
+          <w:p>
+            <w:r>
+              <w:rPr>
+                <w:sz w:val="20"/>
+              </w:rPr>
+            </w:r>
+            <w:r>
+              <w:rPr>
+                <w:rFonts w:ascii="Calibri" w:hAnsi="Calibri" w:eastAsia="Calibri"/>
+                <w:b w:val="0"/>
+                <w:i w:val="0"/>
+                <w:sz w:val="20"/>
+              </w:rPr>
+              <w:t xml:space="preserve">Autonomia em complexidade; </w:t>
+            </w:r>
+            <w:r>
+              <w:rPr>
+                <w:rFonts w:ascii="Calibri" w:hAnsi="Calibri" w:eastAsia="Calibri"/>
+                <w:b/>
+                <w:i w:val="0"/>
+                <w:sz w:val="20"/>
+              </w:rPr>
+              <w:t>Jira (horas)</w:t>
+            </w:r>
+            <w:r>
+              <w:rPr>
+                <w:rFonts w:ascii="Calibri" w:hAnsi="Calibri" w:eastAsia="Calibri"/>
+                <w:b w:val="0"/>
+                <w:i w:val="0"/>
+                <w:sz w:val="20"/>
+              </w:rPr>
+              <w:t xml:space="preserve"> como ponto operacional concreto</w:t>
+            </w:r>
+          </w:p>
+        </w:tc>
+      </w:tr>
+      <w:tr>
+        <w:tc>
+          <w:tcPr>
+            <w:tcW w:type="dxa" w:w="4873"/>
+          </w:tcPr>
+          <w:p>
+            <w:r>
+              <w:rPr>
+                <w:sz w:val="20"/>
+              </w:rPr>
+            </w:r>
+            <w:r>
+              <w:rPr>
+                <w:rFonts w:ascii="Calibri" w:hAnsi="Calibri" w:eastAsia="Calibri"/>
+                <w:b w:val="0"/>
+                <w:i w:val="0"/>
+                <w:sz w:val="20"/>
+              </w:rPr>
+              <w:t>Promoção neste FY</w:t>
+            </w:r>
+          </w:p>
+        </w:tc>
+        <w:tc>
+          <w:tcPr>
+            <w:tcW w:type="dxa" w:w="4873"/>
+          </w:tcPr>
+          <w:p>
+            <w:r>
+              <w:rPr>
+                <w:sz w:val="20"/>
+              </w:rPr>
+            </w:r>
+            <w:r>
+              <w:rPr>
+                <w:rFonts w:ascii="Calibri" w:hAnsi="Calibri" w:eastAsia="Calibri"/>
+                <w:b w:val="0"/>
+                <w:i w:val="0"/>
+                <w:sz w:val="20"/>
+              </w:rPr>
+              <w:t xml:space="preserve">Feedbacks </w:t>
+            </w:r>
+            <w:r>
+              <w:rPr>
+                <w:rFonts w:ascii="Calibri" w:hAnsi="Calibri" w:eastAsia="Calibri"/>
+                <w:b/>
+                <w:i w:val="0"/>
+                <w:sz w:val="20"/>
+              </w:rPr>
+              <w:t>não pedem promoção</w:t>
+            </w:r>
+            <w:r>
+              <w:rPr>
+                <w:rFonts w:ascii="Calibri" w:hAnsi="Calibri" w:eastAsia="Calibri"/>
+                <w:b w:val="0"/>
+                <w:i w:val="0"/>
+                <w:sz w:val="20"/>
+              </w:rPr>
+              <w:t xml:space="preserve"> — pedem consolidação e autonomia → reforça tese PL</w:t>
+            </w:r>
+          </w:p>
+        </w:tc>
+      </w:tr>
+    </w:tbl>
+    <w:p/>
+    <w:p>
+      <w:pPr>
+        <w:pStyle w:val="Heading3"/>
+      </w:pPr>
+      <w:r>
+        <w:t>Frases úteis para a Justificativa / ABCD Form</w:t>
+      </w:r>
+    </w:p>
+    <w:p>
+      <w:pPr>
+        <w:ind w:left="425"/>
+      </w:pPr>
+      <w:r>
+        <w:rPr>
+          <w:rFonts w:ascii="Calibri" w:hAnsi="Calibri" w:eastAsia="Calibri"/>
+          <w:b w:val="0"/>
+          <w:i/>
+          <w:color w:val="555555"/>
+          <w:sz w:val="22"/>
+        </w:rPr>
+        <w:t>Feedback do gestor (Rafael Coloda): desempenho consistente, qualidade das entregas, comunicação de riscos e colaboração; ponto de evolução: lançamento de horas no Jira de forma autônoma.</w:t>
+      </w:r>
+    </w:p>
+    <w:p>
+      <w:pPr>
+        <w:ind w:left="425"/>
+      </w:pPr>
+      <w:r>
+        <w:rPr>
+          <w:rFonts w:ascii="Calibri" w:hAnsi="Calibri" w:eastAsia="Calibri"/>
+          <w:b w:val="0"/>
+          <w:i/>
+          <w:color w:val="555555"/>
+          <w:sz w:val="22"/>
+        </w:rPr>
+        <w:t>Feedback da liderança técnica (Jessica): evolução consistente, qualidade e comunicação de riscos; próximo ciclo focado em autonomia técnica/funcional.</w:t>
+      </w:r>
+    </w:p>
+    <w:p>
+      <w:pPr>
+        <w:ind w:left="425"/>
+      </w:pPr>
+      <w:r>
+        <w:rPr>
+          <w:rFonts w:ascii="Calibri" w:hAnsi="Calibri" w:eastAsia="Calibri"/>
+          <w:b w:val="0"/>
+          <w:i/>
+          <w:color w:val="555555"/>
+          <w:sz w:val="22"/>
+        </w:rPr>
+        <w:t>Feedback de par (Celline): profissional dedicada, colaborativa, organizada, com qualidade e prazos — parceria satisfatória no dia a dia.</w:t>
+      </w:r>
+    </w:p>
+    <w:p>
+      <w:r>
+        <w:br w:type="page"/>
+      </w:r>
+    </w:p>
+    <w:p>
+      <w:pPr>
+        <w:pStyle w:val="Heading1"/>
+      </w:pPr>
+      <w:r>
+        <w:t>16. Orientação do ciclo (Ana Karina)</w:t>
       </w:r>
     </w:p>
     <w:p>

</xml_diff>

<commit_message>
Adicionar textos Comportamento e Desenvolvimento Workday da Ana
Co-authored-by: Jonatas Andrade <jonatasandradedeveloper@users.noreply.github.com>
</commit_message>
<xml_diff>
--- a/DOCS-PEOPLE-LEAD/Ana-Karina/00-Documento-Unico.docx
+++ b/DOCS-PEOPLE-LEAD/Ana-Karina/00-Documento-Unico.docx
@@ -591,7 +591,21 @@
           <w:i w:val="0"/>
           <w:sz w:val="22"/>
         </w:rPr>
-        <w:t>16. Orientação do ciclo (Ana Karina)</w:t>
+        <w:t>16. Comportamento e Desenvolvimento (Workday)</w:t>
+      </w:r>
+    </w:p>
+    <w:p>
+      <w:pPr>
+        <w:spacing w:after="120"/>
+      </w:pPr>
+      <w:r>
+        <w:rPr>
+          <w:rFonts w:ascii="Calibri" w:hAnsi="Calibri" w:eastAsia="Calibri"/>
+          <w:b w:val="0"/>
+          <w:i w:val="0"/>
+          <w:sz w:val="22"/>
+        </w:rPr>
+        <w:t>17. Orientação do ciclo (Ana Karina)</w:t>
       </w:r>
     </w:p>
     <w:p>
@@ -32053,7 +32067,520 @@
         <w:pStyle w:val="Heading1"/>
       </w:pPr>
       <w:r>
-        <w:t>16. Orientação do ciclo (Ana Karina)</w:t>
+        <w:t>16. Comportamento e Desenvolvimento (Workday)</w:t>
+      </w:r>
+    </w:p>
+    <w:p>
+      <w:r>
+        <w:rPr>
+          <w:rFonts w:ascii="Calibri" w:hAnsi="Calibri" w:eastAsia="Calibri"/>
+          <w:b/>
+          <w:i w:val="0"/>
+          <w:sz w:val="22"/>
+        </w:rPr>
+        <w:t>Uso interno People Lead · Colar no Workday (tela Leadership Essentials / Growth)</w:t>
+      </w:r>
+    </w:p>
+    <w:p>
+      <w:r>
+        <w:rPr>
+          <w:rFonts w:ascii="Calibri" w:hAnsi="Calibri" w:eastAsia="Calibri"/>
+          <w:b w:val="0"/>
+          <w:i w:val="0"/>
+          <w:sz w:val="22"/>
+        </w:rPr>
+        <w:t>Atualizado: 10/09/2026</w:t>
+      </w:r>
+    </w:p>
+    <w:p>
+      <w:pPr>
+        <w:pBdr>
+          <w:bottom w:val="single" w:sz="6" w:space="1" w:color="CCCCCC"/>
+        </w:pBdr>
+      </w:pPr>
+    </w:p>
+    <w:p>
+      <w:pPr>
+        <w:pStyle w:val="Heading3"/>
+      </w:pPr>
+      <w:r>
+        <w:t>Slider — Comportamento e Colaboração</w:t>
+      </w:r>
+    </w:p>
+    <w:p>
+      <w:r>
+        <w:rPr>
+          <w:rFonts w:ascii="Calibri" w:hAnsi="Calibri" w:eastAsia="Calibri"/>
+          <w:b/>
+          <w:i w:val="0"/>
+          <w:sz w:val="22"/>
+        </w:rPr>
+        <w:t>Posição sugerida:</w:t>
+      </w:r>
+      <w:r>
+        <w:rPr>
+          <w:rFonts w:ascii="Calibri" w:hAnsi="Calibri" w:eastAsia="Calibri"/>
+          <w:b w:val="0"/>
+          <w:i w:val="0"/>
+          <w:sz w:val="22"/>
+        </w:rPr>
+        <w:t xml:space="preserve"> </w:t>
+      </w:r>
+      <w:r>
+        <w:rPr>
+          <w:rFonts w:ascii="Calibri" w:hAnsi="Calibri" w:eastAsia="Calibri"/>
+          <w:b/>
+          <w:i w:val="0"/>
+          <w:sz w:val="22"/>
+        </w:rPr>
+        <w:t>Comportamentos Esperados (médio de intervalo)</w:t>
+      </w:r>
+    </w:p>
+    <w:p>
+      <w:r>
+        <w:rPr>
+          <w:rFonts w:ascii="Calibri" w:hAnsi="Calibri" w:eastAsia="Calibri"/>
+          <w:b w:val="0"/>
+          <w:i w:val="0"/>
+          <w:sz w:val="22"/>
+        </w:rPr>
+        <w:t xml:space="preserve">Alinha com feedbacks de Rafael, Jessica e Celline: desempenho e postura </w:t>
+      </w:r>
+      <w:r>
+        <w:rPr>
+          <w:rFonts w:ascii="Calibri" w:hAnsi="Calibri" w:eastAsia="Calibri"/>
+          <w:b/>
+          <w:i w:val="0"/>
+          <w:sz w:val="22"/>
+        </w:rPr>
+        <w:t>adequados ao nível Associate</w:t>
+      </w:r>
+      <w:r>
+        <w:rPr>
+          <w:rFonts w:ascii="Calibri" w:hAnsi="Calibri" w:eastAsia="Calibri"/>
+          <w:b w:val="0"/>
+          <w:i w:val="0"/>
+          <w:sz w:val="22"/>
+        </w:rPr>
+        <w:t>, sem indicação de “acima” excepcional nem abaixo.</w:t>
+      </w:r>
+    </w:p>
+    <w:p>
+      <w:pPr>
+        <w:pBdr>
+          <w:bottom w:val="single" w:sz="6" w:space="1" w:color="CCCCCC"/>
+        </w:pBdr>
+      </w:pPr>
+    </w:p>
+    <w:p>
+      <w:pPr>
+        <w:pStyle w:val="Heading3"/>
+      </w:pPr>
+      <w:r>
+        <w:t>Comentário — Comportamento e Colaboração (colar)</w:t>
+      </w:r>
+    </w:p>
+    <w:p>
+      <w:r>
+        <w:rPr>
+          <w:rFonts w:ascii="Calibri" w:hAnsi="Calibri" w:eastAsia="Calibri"/>
+          <w:b w:val="0"/>
+          <w:i w:val="0"/>
+          <w:sz w:val="22"/>
+        </w:rPr>
+        <w:t>Ana Karina demonstra comportamentos alinhados ao esperado para Associate. Nas 1:1 e nos feedbacks de projeto (Rafael Coloda, Jessica e Celline), destaca-se pela preocupação com a qualidade das entregas, cautela nas implementações e comunicação antecipada de problemas e riscos ao time — reforçando confiança e colaboração. Busca apoio de forma adequada quando encontra dúvidas, mantém postura aberta a orientações e feedbacks, e contribui para um ambiente colaborativo: a par Celline destaca transparência, disposição para ajudar e parceria positiva no dia a dia. No cliente BANCO BRADESCO (Kotlin/Android), evoluiu de forma consistente, incluindo a fase de homologação, com curiosidade e interesse contínuo em aprender. Como People Lead, observo responsabilidade com combinados, honestidade no fechamento do ciclo e clareza de desenvolvimento (norte em arquitetura mobile). Ponto de evolução comportamental/operacional apontado pelo gestor: maior disciplina e autonomia no lançamento de horas no Jira, sem necessidade de reforço da liderança.</w:t>
+      </w:r>
+    </w:p>
+    <w:p>
+      <w:pPr>
+        <w:pBdr>
+          <w:bottom w:val="single" w:sz="6" w:space="1" w:color="CCCCCC"/>
+        </w:pBdr>
+      </w:pPr>
+    </w:p>
+    <w:p>
+      <w:pPr>
+        <w:pStyle w:val="Heading3"/>
+      </w:pPr>
+      <w:r>
+        <w:t>Comentário — Desenvolvimento &amp; Crescimento (colar)</w:t>
+      </w:r>
+    </w:p>
+    <w:p>
+      <w:r>
+        <w:rPr>
+          <w:rFonts w:ascii="Calibri" w:hAnsi="Calibri" w:eastAsia="Calibri"/>
+          <w:b w:val="0"/>
+          <w:i w:val="0"/>
+          <w:sz w:val="22"/>
+        </w:rPr>
+        <w:t>Para o próximo ciclo, o foco principal é ampliar a autonomia técnica e funcional no app nativo Bradesco (Kotlin/Android): conduzir atividades de maior complexidade com menos suporte da liderança técnica, fortalecendo análise, investigação e resolução de problemas de forma independente — alinhado aos feedbacks de Rafael Coloda e Jessica. Manter a preocupação com qualidade e a comunicação antecipada de riscos, já reconhecidas como pontos fortes. Formalizar evidências de entrega e cases de uso de Copilot/agentes de IA no fluxo do time. Incorporar de forma consistente o lançamento de horas no Jira à rotina operacional. Em carreira, consolidar Associate com plano trimestre/semestre/ano: AZ-900 já concluída e inglês C1+; AI-900 formal e Swift/iOS (dependente de MacBook/alocação) como trilha FY27, sem sobrecarregar o ciclo atual. Continuar 1:1 mensais com o People Lead e alinhamento com o gestor Rafael Coloda.</w:t>
+      </w:r>
+    </w:p>
+    <w:p>
+      <w:pPr>
+        <w:pBdr>
+          <w:bottom w:val="single" w:sz="6" w:space="1" w:color="CCCCCC"/>
+        </w:pBdr>
+      </w:pPr>
+    </w:p>
+    <w:p>
+      <w:pPr>
+        <w:pStyle w:val="Heading3"/>
+      </w:pPr>
+      <w:r>
+        <w:t>Atenção — Areas of Impact (sistema)</w:t>
+      </w:r>
+    </w:p>
+    <w:p>
+      <w:r>
+        <w:rPr>
+          <w:rFonts w:ascii="Calibri" w:hAnsi="Calibri" w:eastAsia="Calibri"/>
+          <w:b w:val="0"/>
+          <w:i w:val="0"/>
+          <w:sz w:val="22"/>
+        </w:rPr>
+        <w:t xml:space="preserve">O texto automático/áreas de impacto que veio no perfil tem pontos a </w:t>
+      </w:r>
+      <w:r>
+        <w:rPr>
+          <w:rFonts w:ascii="Calibri" w:hAnsi="Calibri" w:eastAsia="Calibri"/>
+          <w:b/>
+          <w:i w:val="0"/>
+          <w:sz w:val="22"/>
+        </w:rPr>
+        <w:t>não repetir</w:t>
+      </w:r>
+      <w:r>
+        <w:rPr>
+          <w:rFonts w:ascii="Calibri" w:hAnsi="Calibri" w:eastAsia="Calibri"/>
+          <w:b w:val="0"/>
+          <w:i w:val="0"/>
+          <w:sz w:val="22"/>
+        </w:rPr>
+        <w:t xml:space="preserve"> sem evidência:</w:t>
+      </w:r>
+    </w:p>
+    <w:tbl>
+      <w:tblPr>
+        <w:tblStyle w:val="TableGrid"/>
+        <w:tblW w:type="auto" w:w="0"/>
+        <w:tblLook w:firstColumn="1" w:firstRow="1" w:lastColumn="0" w:lastRow="0" w:noHBand="0" w:noVBand="1" w:val="04A0"/>
+      </w:tblPr>
+      <w:tblGrid>
+        <w:gridCol w:w="4873"/>
+        <w:gridCol w:w="4873"/>
+      </w:tblGrid>
+      <w:tr>
+        <w:tc>
+          <w:tcPr>
+            <w:tcW w:type="dxa" w:w="4873"/>
+            <w:shd w:fill="1F3A5F" w:val="clear"/>
+          </w:tcPr>
+          <w:p>
+            <w:r>
+              <w:rPr>
+                <w:b/>
+                <w:color w:val="FFFFFF"/>
+                <w:sz w:val="20"/>
+              </w:rPr>
+            </w:r>
+            <w:r>
+              <w:rPr>
+                <w:rFonts w:ascii="Calibri" w:hAnsi="Calibri" w:eastAsia="Calibri"/>
+                <w:b/>
+                <w:i w:val="0"/>
+                <w:color w:val="FFFFFF"/>
+                <w:sz w:val="20"/>
+              </w:rPr>
+              <w:t>Item no sistema</w:t>
+            </w:r>
+          </w:p>
+        </w:tc>
+        <w:tc>
+          <w:tcPr>
+            <w:tcW w:type="dxa" w:w="4873"/>
+            <w:shd w:fill="1F3A5F" w:val="clear"/>
+          </w:tcPr>
+          <w:p>
+            <w:r>
+              <w:rPr>
+                <w:b/>
+                <w:color w:val="FFFFFF"/>
+                <w:sz w:val="20"/>
+              </w:rPr>
+            </w:r>
+            <w:r>
+              <w:rPr>
+                <w:rFonts w:ascii="Calibri" w:hAnsi="Calibri" w:eastAsia="Calibri"/>
+                <w:b/>
+                <w:i w:val="0"/>
+                <w:color w:val="FFFFFF"/>
+                <w:sz w:val="20"/>
+              </w:rPr>
+              <w:t>Nossa leitura</w:t>
+            </w:r>
+          </w:p>
+        </w:tc>
+      </w:tr>
+      <w:tr>
+        <w:tc>
+          <w:tcPr>
+            <w:tcW w:type="dxa" w:w="4873"/>
+          </w:tcPr>
+          <w:p>
+            <w:r>
+              <w:rPr>
+                <w:sz w:val="20"/>
+              </w:rPr>
+            </w:r>
+            <w:r>
+              <w:rPr>
+                <w:rFonts w:ascii="Calibri" w:hAnsi="Calibri" w:eastAsia="Calibri"/>
+                <w:b w:val="0"/>
+                <w:i w:val="0"/>
+                <w:sz w:val="20"/>
+              </w:rPr>
+              <w:t>AI-900 concluída</w:t>
+            </w:r>
+          </w:p>
+        </w:tc>
+        <w:tc>
+          <w:tcPr>
+            <w:tcW w:type="dxa" w:w="4873"/>
+          </w:tcPr>
+          <w:p>
+            <w:r>
+              <w:rPr>
+                <w:sz w:val="20"/>
+              </w:rPr>
+            </w:r>
+            <w:r>
+              <w:rPr>
+                <w:rFonts w:ascii="Calibri" w:hAnsi="Calibri" w:eastAsia="Calibri"/>
+                <w:b w:val="0"/>
+                <w:i w:val="0"/>
+                <w:sz w:val="20"/>
+              </w:rPr>
+              <w:t xml:space="preserve">No histórico PL: </w:t>
+            </w:r>
+            <w:r>
+              <w:rPr>
+                <w:rFonts w:ascii="Calibri" w:hAnsi="Calibri" w:eastAsia="Calibri"/>
+                <w:b/>
+                <w:i w:val="0"/>
+                <w:sz w:val="20"/>
+              </w:rPr>
+              <w:t>AZ-900</w:t>
+            </w:r>
+            <w:r>
+              <w:rPr>
+                <w:rFonts w:ascii="Calibri" w:hAnsi="Calibri" w:eastAsia="Calibri"/>
+                <w:b w:val="0"/>
+                <w:i w:val="0"/>
+                <w:sz w:val="20"/>
+              </w:rPr>
+              <w:t xml:space="preserve"> concluída; AI-900 era FY27 / a confirmar</w:t>
+            </w:r>
+          </w:p>
+        </w:tc>
+      </w:tr>
+      <w:tr>
+        <w:tc>
+          <w:tcPr>
+            <w:tcW w:type="dxa" w:w="4873"/>
+            <w:shd w:fill="F3F6FA" w:val="clear"/>
+          </w:tcPr>
+          <w:p>
+            <w:r>
+              <w:rPr>
+                <w:sz w:val="20"/>
+              </w:rPr>
+            </w:r>
+            <w:r>
+              <w:rPr>
+                <w:rFonts w:ascii="Calibri" w:hAnsi="Calibri" w:eastAsia="Calibri"/>
+                <w:b w:val="0"/>
+                <w:i w:val="0"/>
+                <w:sz w:val="20"/>
+              </w:rPr>
+              <w:t>Client Value Creation sem reflexão</w:t>
+            </w:r>
+          </w:p>
+        </w:tc>
+        <w:tc>
+          <w:tcPr>
+            <w:tcW w:type="dxa" w:w="4873"/>
+            <w:shd w:fill="F3F6FA" w:val="clear"/>
+          </w:tcPr>
+          <w:p>
+            <w:r>
+              <w:rPr>
+                <w:sz w:val="20"/>
+              </w:rPr>
+            </w:r>
+            <w:r>
+              <w:rPr>
+                <w:rFonts w:ascii="Calibri" w:hAnsi="Calibri" w:eastAsia="Calibri"/>
+                <w:b w:val="0"/>
+                <w:i w:val="0"/>
+                <w:sz w:val="20"/>
+              </w:rPr>
+              <w:t>Combinar com ela ou reforçar entrega Bradesco/homologação na narrativa PL</w:t>
+            </w:r>
+          </w:p>
+        </w:tc>
+      </w:tr>
+      <w:tr>
+        <w:tc>
+          <w:tcPr>
+            <w:tcW w:type="dxa" w:w="4873"/>
+          </w:tcPr>
+          <w:p>
+            <w:r>
+              <w:rPr>
+                <w:sz w:val="20"/>
+              </w:rPr>
+            </w:r>
+            <w:r>
+              <w:rPr>
+                <w:rFonts w:ascii="Calibri" w:hAnsi="Calibri" w:eastAsia="Calibri"/>
+                <w:b w:val="0"/>
+                <w:i w:val="0"/>
+                <w:sz w:val="20"/>
+              </w:rPr>
+              <w:t>Community (saúde / escolas técnicas)</w:t>
+            </w:r>
+          </w:p>
+        </w:tc>
+        <w:tc>
+          <w:tcPr>
+            <w:tcW w:type="dxa" w:w="4873"/>
+          </w:tcPr>
+          <w:p>
+            <w:r>
+              <w:rPr>
+                <w:sz w:val="20"/>
+              </w:rPr>
+            </w:r>
+            <w:r>
+              <w:rPr>
+                <w:rFonts w:ascii="Calibri" w:hAnsi="Calibri" w:eastAsia="Calibri"/>
+                <w:b w:val="0"/>
+                <w:i w:val="0"/>
+                <w:sz w:val="20"/>
+              </w:rPr>
+              <w:t xml:space="preserve">Nas 1:1 a frente comunidade estava </w:t>
+            </w:r>
+            <w:r>
+              <w:rPr>
+                <w:rFonts w:ascii="Calibri" w:hAnsi="Calibri" w:eastAsia="Calibri"/>
+                <w:b/>
+                <w:i w:val="0"/>
+                <w:sz w:val="20"/>
+              </w:rPr>
+              <w:t>limitada</w:t>
+            </w:r>
+            <w:r>
+              <w:rPr>
+                <w:rFonts w:ascii="Calibri" w:hAnsi="Calibri" w:eastAsia="Calibri"/>
+                <w:b w:val="0"/>
+                <w:i w:val="0"/>
+                <w:sz w:val="20"/>
+              </w:rPr>
+              <w:t xml:space="preserve"> (faculdade + projeto) — não inflar</w:t>
+            </w:r>
+          </w:p>
+        </w:tc>
+      </w:tr>
+      <w:tr>
+        <w:tc>
+          <w:tcPr>
+            <w:tcW w:type="dxa" w:w="4873"/>
+            <w:shd w:fill="F3F6FA" w:val="clear"/>
+          </w:tcPr>
+          <w:p>
+            <w:r>
+              <w:rPr>
+                <w:sz w:val="20"/>
+              </w:rPr>
+            </w:r>
+            <w:r>
+              <w:rPr>
+                <w:rFonts w:ascii="Calibri" w:hAnsi="Calibri" w:eastAsia="Calibri"/>
+                <w:b w:val="0"/>
+                <w:i w:val="0"/>
+                <w:sz w:val="20"/>
+              </w:rPr>
+              <w:t>Swift como foco imediato</w:t>
+            </w:r>
+          </w:p>
+        </w:tc>
+        <w:tc>
+          <w:tcPr>
+            <w:tcW w:type="dxa" w:w="4873"/>
+            <w:shd w:fill="F3F6FA" w:val="clear"/>
+          </w:tcPr>
+          <w:p>
+            <w:r>
+              <w:rPr>
+                <w:sz w:val="20"/>
+              </w:rPr>
+            </w:r>
+            <w:r>
+              <w:rPr>
+                <w:rFonts w:ascii="Calibri" w:hAnsi="Calibri" w:eastAsia="Calibri"/>
+                <w:b w:val="0"/>
+                <w:i w:val="0"/>
+                <w:sz w:val="20"/>
+              </w:rPr>
+              <w:t xml:space="preserve">Combinado </w:t>
+            </w:r>
+            <w:r>
+              <w:rPr>
+                <w:rFonts w:ascii="Calibri" w:hAnsi="Calibri" w:eastAsia="Calibri"/>
+                <w:b/>
+                <w:i w:val="0"/>
+                <w:sz w:val="20"/>
+              </w:rPr>
+              <w:t>FY27</w:t>
+            </w:r>
+            <w:r>
+              <w:rPr>
+                <w:rFonts w:ascii="Calibri" w:hAnsi="Calibri" w:eastAsia="Calibri"/>
+                <w:b w:val="0"/>
+                <w:i w:val="0"/>
+                <w:sz w:val="20"/>
+              </w:rPr>
+              <w:t xml:space="preserve"> (sem MacBook) — crescimento agora = autonomia Kotlin/Android + Jira</w:t>
+            </w:r>
+          </w:p>
+        </w:tc>
+      </w:tr>
+    </w:tbl>
+    <w:p/>
+    <w:p>
+      <w:r>
+        <w:rPr>
+          <w:rFonts w:ascii="Calibri" w:hAnsi="Calibri" w:eastAsia="Calibri"/>
+          <w:b w:val="0"/>
+          <w:i w:val="0"/>
+          <w:sz w:val="22"/>
+        </w:rPr>
+        <w:t>Use os textos desta página (baseados em Rafael / Jessica / Celline + 1:1s).</w:t>
+      </w:r>
+    </w:p>
+    <w:p>
+      <w:r>
+        <w:br w:type="page"/>
+      </w:r>
+    </w:p>
+    <w:p>
+      <w:pPr>
+        <w:pStyle w:val="Heading1"/>
+      </w:pPr>
+      <w:r>
+        <w:t>17. Orientação do ciclo (Ana Karina)</w:t>
       </w:r>
     </w:p>
     <w:p>

</xml_diff>

<commit_message>
Adicionar textos Áreas de Impacto da Ana (Cliente, IA, GPTW, Comunidade)
Co-authored-by: Jonatas Andrade <jonatasandradedeveloper@users.noreply.github.com>
</commit_message>
<xml_diff>
--- a/DOCS-PEOPLE-LEAD/Ana-Karina/00-Documento-Unico.docx
+++ b/DOCS-PEOPLE-LEAD/Ana-Karina/00-Documento-Unico.docx
@@ -32229,345 +32229,67 @@
         <w:pStyle w:val="Heading3"/>
       </w:pPr>
       <w:r>
-        <w:t>Atenção — Areas of Impact (sistema)</w:t>
-      </w:r>
-    </w:p>
-    <w:p>
-      <w:r>
-        <w:rPr>
-          <w:rFonts w:ascii="Calibri" w:hAnsi="Calibri" w:eastAsia="Calibri"/>
-          <w:b w:val="0"/>
-          <w:i w:val="0"/>
-          <w:sz w:val="22"/>
-        </w:rPr>
-        <w:t xml:space="preserve">O texto automático/áreas de impacto que veio no perfil tem pontos a </w:t>
-      </w:r>
-      <w:r>
-        <w:rPr>
-          <w:rFonts w:ascii="Calibri" w:hAnsi="Calibri" w:eastAsia="Calibri"/>
-          <w:b/>
-          <w:i w:val="0"/>
-          <w:sz w:val="22"/>
-        </w:rPr>
-        <w:t>não repetir</w:t>
-      </w:r>
-      <w:r>
-        <w:rPr>
-          <w:rFonts w:ascii="Calibri" w:hAnsi="Calibri" w:eastAsia="Calibri"/>
-          <w:b w:val="0"/>
-          <w:i w:val="0"/>
-          <w:sz w:val="22"/>
-        </w:rPr>
-        <w:t xml:space="preserve"> sem evidência:</w:t>
-      </w:r>
-    </w:p>
-    <w:tbl>
-      <w:tblPr>
-        <w:tblStyle w:val="TableGrid"/>
-        <w:tblW w:type="auto" w:w="0"/>
-        <w:tblLook w:firstColumn="1" w:firstRow="1" w:lastColumn="0" w:lastRow="0" w:noHBand="0" w:noVBand="1" w:val="04A0"/>
-      </w:tblPr>
-      <w:tblGrid>
-        <w:gridCol w:w="4873"/>
-        <w:gridCol w:w="4873"/>
-      </w:tblGrid>
-      <w:tr>
-        <w:tc>
-          <w:tcPr>
-            <w:tcW w:type="dxa" w:w="4873"/>
-            <w:shd w:fill="1F3A5F" w:val="clear"/>
-          </w:tcPr>
-          <w:p>
-            <w:r>
-              <w:rPr>
-                <w:b/>
-                <w:color w:val="FFFFFF"/>
-                <w:sz w:val="20"/>
-              </w:rPr>
-            </w:r>
-            <w:r>
-              <w:rPr>
-                <w:rFonts w:ascii="Calibri" w:hAnsi="Calibri" w:eastAsia="Calibri"/>
-                <w:b/>
-                <w:i w:val="0"/>
-                <w:color w:val="FFFFFF"/>
-                <w:sz w:val="20"/>
-              </w:rPr>
-              <w:t>Item no sistema</w:t>
-            </w:r>
-          </w:p>
-        </w:tc>
-        <w:tc>
-          <w:tcPr>
-            <w:tcW w:type="dxa" w:w="4873"/>
-            <w:shd w:fill="1F3A5F" w:val="clear"/>
-          </w:tcPr>
-          <w:p>
-            <w:r>
-              <w:rPr>
-                <w:b/>
-                <w:color w:val="FFFFFF"/>
-                <w:sz w:val="20"/>
-              </w:rPr>
-            </w:r>
-            <w:r>
-              <w:rPr>
-                <w:rFonts w:ascii="Calibri" w:hAnsi="Calibri" w:eastAsia="Calibri"/>
-                <w:b/>
-                <w:i w:val="0"/>
-                <w:color w:val="FFFFFF"/>
-                <w:sz w:val="20"/>
-              </w:rPr>
-              <w:t>Nossa leitura</w:t>
-            </w:r>
-          </w:p>
-        </w:tc>
-      </w:tr>
-      <w:tr>
-        <w:tc>
-          <w:tcPr>
-            <w:tcW w:type="dxa" w:w="4873"/>
-          </w:tcPr>
-          <w:p>
-            <w:r>
-              <w:rPr>
-                <w:sz w:val="20"/>
-              </w:rPr>
-            </w:r>
-            <w:r>
-              <w:rPr>
-                <w:rFonts w:ascii="Calibri" w:hAnsi="Calibri" w:eastAsia="Calibri"/>
-                <w:b w:val="0"/>
-                <w:i w:val="0"/>
-                <w:sz w:val="20"/>
-              </w:rPr>
-              <w:t>AI-900 concluída</w:t>
-            </w:r>
-          </w:p>
-        </w:tc>
-        <w:tc>
-          <w:tcPr>
-            <w:tcW w:type="dxa" w:w="4873"/>
-          </w:tcPr>
-          <w:p>
-            <w:r>
-              <w:rPr>
-                <w:sz w:val="20"/>
-              </w:rPr>
-            </w:r>
-            <w:r>
-              <w:rPr>
-                <w:rFonts w:ascii="Calibri" w:hAnsi="Calibri" w:eastAsia="Calibri"/>
-                <w:b w:val="0"/>
-                <w:i w:val="0"/>
-                <w:sz w:val="20"/>
-              </w:rPr>
-              <w:t xml:space="preserve">No histórico PL: </w:t>
-            </w:r>
-            <w:r>
-              <w:rPr>
-                <w:rFonts w:ascii="Calibri" w:hAnsi="Calibri" w:eastAsia="Calibri"/>
-                <w:b/>
-                <w:i w:val="0"/>
-                <w:sz w:val="20"/>
-              </w:rPr>
-              <w:t>AZ-900</w:t>
-            </w:r>
-            <w:r>
-              <w:rPr>
-                <w:rFonts w:ascii="Calibri" w:hAnsi="Calibri" w:eastAsia="Calibri"/>
-                <w:b w:val="0"/>
-                <w:i w:val="0"/>
-                <w:sz w:val="20"/>
-              </w:rPr>
-              <w:t xml:space="preserve"> concluída; AI-900 era FY27 / a confirmar</w:t>
-            </w:r>
-          </w:p>
-        </w:tc>
-      </w:tr>
-      <w:tr>
-        <w:tc>
-          <w:tcPr>
-            <w:tcW w:type="dxa" w:w="4873"/>
-            <w:shd w:fill="F3F6FA" w:val="clear"/>
-          </w:tcPr>
-          <w:p>
-            <w:r>
-              <w:rPr>
-                <w:sz w:val="20"/>
-              </w:rPr>
-            </w:r>
-            <w:r>
-              <w:rPr>
-                <w:rFonts w:ascii="Calibri" w:hAnsi="Calibri" w:eastAsia="Calibri"/>
-                <w:b w:val="0"/>
-                <w:i w:val="0"/>
-                <w:sz w:val="20"/>
-              </w:rPr>
-              <w:t>Client Value Creation sem reflexão</w:t>
-            </w:r>
-          </w:p>
-        </w:tc>
-        <w:tc>
-          <w:tcPr>
-            <w:tcW w:type="dxa" w:w="4873"/>
-            <w:shd w:fill="F3F6FA" w:val="clear"/>
-          </w:tcPr>
-          <w:p>
-            <w:r>
-              <w:rPr>
-                <w:sz w:val="20"/>
-              </w:rPr>
-            </w:r>
-            <w:r>
-              <w:rPr>
-                <w:rFonts w:ascii="Calibri" w:hAnsi="Calibri" w:eastAsia="Calibri"/>
-                <w:b w:val="0"/>
-                <w:i w:val="0"/>
-                <w:sz w:val="20"/>
-              </w:rPr>
-              <w:t>Combinar com ela ou reforçar entrega Bradesco/homologação na narrativa PL</w:t>
-            </w:r>
-          </w:p>
-        </w:tc>
-      </w:tr>
-      <w:tr>
-        <w:tc>
-          <w:tcPr>
-            <w:tcW w:type="dxa" w:w="4873"/>
-          </w:tcPr>
-          <w:p>
-            <w:r>
-              <w:rPr>
-                <w:sz w:val="20"/>
-              </w:rPr>
-            </w:r>
-            <w:r>
-              <w:rPr>
-                <w:rFonts w:ascii="Calibri" w:hAnsi="Calibri" w:eastAsia="Calibri"/>
-                <w:b w:val="0"/>
-                <w:i w:val="0"/>
-                <w:sz w:val="20"/>
-              </w:rPr>
-              <w:t>Community (saúde / escolas técnicas)</w:t>
-            </w:r>
-          </w:p>
-        </w:tc>
-        <w:tc>
-          <w:tcPr>
-            <w:tcW w:type="dxa" w:w="4873"/>
-          </w:tcPr>
-          <w:p>
-            <w:r>
-              <w:rPr>
-                <w:sz w:val="20"/>
-              </w:rPr>
-            </w:r>
-            <w:r>
-              <w:rPr>
-                <w:rFonts w:ascii="Calibri" w:hAnsi="Calibri" w:eastAsia="Calibri"/>
-                <w:b w:val="0"/>
-                <w:i w:val="0"/>
-                <w:sz w:val="20"/>
-              </w:rPr>
-              <w:t xml:space="preserve">Nas 1:1 a frente comunidade estava </w:t>
-            </w:r>
-            <w:r>
-              <w:rPr>
-                <w:rFonts w:ascii="Calibri" w:hAnsi="Calibri" w:eastAsia="Calibri"/>
-                <w:b/>
-                <w:i w:val="0"/>
-                <w:sz w:val="20"/>
-              </w:rPr>
-              <w:t>limitada</w:t>
-            </w:r>
-            <w:r>
-              <w:rPr>
-                <w:rFonts w:ascii="Calibri" w:hAnsi="Calibri" w:eastAsia="Calibri"/>
-                <w:b w:val="0"/>
-                <w:i w:val="0"/>
-                <w:sz w:val="20"/>
-              </w:rPr>
-              <w:t xml:space="preserve"> (faculdade + projeto) — não inflar</w:t>
-            </w:r>
-          </w:p>
-        </w:tc>
-      </w:tr>
-      <w:tr>
-        <w:tc>
-          <w:tcPr>
-            <w:tcW w:type="dxa" w:w="4873"/>
-            <w:shd w:fill="F3F6FA" w:val="clear"/>
-          </w:tcPr>
-          <w:p>
-            <w:r>
-              <w:rPr>
-                <w:sz w:val="20"/>
-              </w:rPr>
-            </w:r>
-            <w:r>
-              <w:rPr>
-                <w:rFonts w:ascii="Calibri" w:hAnsi="Calibri" w:eastAsia="Calibri"/>
-                <w:b w:val="0"/>
-                <w:i w:val="0"/>
-                <w:sz w:val="20"/>
-              </w:rPr>
-              <w:t>Swift como foco imediato</w:t>
-            </w:r>
-          </w:p>
-        </w:tc>
-        <w:tc>
-          <w:tcPr>
-            <w:tcW w:type="dxa" w:w="4873"/>
-            <w:shd w:fill="F3F6FA" w:val="clear"/>
-          </w:tcPr>
-          <w:p>
-            <w:r>
-              <w:rPr>
-                <w:sz w:val="20"/>
-              </w:rPr>
-            </w:r>
-            <w:r>
-              <w:rPr>
-                <w:rFonts w:ascii="Calibri" w:hAnsi="Calibri" w:eastAsia="Calibri"/>
-                <w:b w:val="0"/>
-                <w:i w:val="0"/>
-                <w:sz w:val="20"/>
-              </w:rPr>
-              <w:t xml:space="preserve">Combinado </w:t>
-            </w:r>
-            <w:r>
-              <w:rPr>
-                <w:rFonts w:ascii="Calibri" w:hAnsi="Calibri" w:eastAsia="Calibri"/>
-                <w:b/>
-                <w:i w:val="0"/>
-                <w:sz w:val="20"/>
-              </w:rPr>
-              <w:t>FY27</w:t>
-            </w:r>
-            <w:r>
-              <w:rPr>
-                <w:rFonts w:ascii="Calibri" w:hAnsi="Calibri" w:eastAsia="Calibri"/>
-                <w:b w:val="0"/>
-                <w:i w:val="0"/>
-                <w:sz w:val="20"/>
-              </w:rPr>
-              <w:t xml:space="preserve"> (sem MacBook) — crescimento agora = autonomia Kotlin/Android + Jira</w:t>
-            </w:r>
-          </w:p>
-        </w:tc>
-      </w:tr>
-    </w:tbl>
-    <w:p/>
-    <w:p>
-      <w:r>
-        <w:rPr>
-          <w:rFonts w:ascii="Calibri" w:hAnsi="Calibri" w:eastAsia="Calibri"/>
-          <w:b w:val="0"/>
-          <w:i w:val="0"/>
-          <w:sz w:val="22"/>
-        </w:rPr>
-        <w:t>Use os textos desta página (baseados em Rafael / Jessica / Celline + 1:1s).</w:t>
+        <w:t>Atenção — Areas of Impact</w:t>
+      </w:r>
+    </w:p>
+    <w:p>
+      <w:r>
+        <w:rPr>
+          <w:rFonts w:ascii="Calibri" w:hAnsi="Calibri" w:eastAsia="Calibri"/>
+          <w:b w:val="0"/>
+          <w:i w:val="0"/>
+          <w:sz w:val="22"/>
+        </w:rPr>
+        <w:t xml:space="preserve">Textos prontos do PL (corrigidos): </w:t>
+      </w:r>
+      <w:r>
+        <w:rPr>
+          <w:rFonts w:ascii="Consolas" w:hAnsi="Consolas" w:eastAsia="Consolas"/>
+          <w:b w:val="0"/>
+          <w:i w:val="0"/>
+          <w:color w:val="333333"/>
+          <w:sz w:val="18"/>
+        </w:rPr>
+        <w:t>18-areas-de-impacto-workday.md</w:t>
+      </w:r>
+      <w:r>
+        <w:rPr>
+          <w:rFonts w:ascii="Calibri" w:hAnsi="Calibri" w:eastAsia="Calibri"/>
+          <w:b w:val="0"/>
+          <w:i w:val="0"/>
+          <w:sz w:val="22"/>
+        </w:rPr>
+        <w:t xml:space="preserve"> / </w:t>
+      </w:r>
+      <w:r>
+        <w:rPr>
+          <w:rFonts w:ascii="Consolas" w:hAnsi="Consolas" w:eastAsia="Consolas"/>
+          <w:b w:val="0"/>
+          <w:i w:val="0"/>
+          <w:color w:val="333333"/>
+          <w:sz w:val="18"/>
+        </w:rPr>
+        <w:t>13-Areas-de-Impacto.docx</w:t>
+      </w:r>
+      <w:r>
+        <w:rPr>
+          <w:rFonts w:ascii="Calibri" w:hAnsi="Calibri" w:eastAsia="Calibri"/>
+          <w:b w:val="0"/>
+          <w:i w:val="0"/>
+          <w:sz w:val="22"/>
+        </w:rPr>
+        <w:t>.</w:t>
+      </w:r>
+    </w:p>
+    <w:p>
+      <w:r>
+        <w:rPr>
+          <w:rFonts w:ascii="Calibri" w:hAnsi="Calibri" w:eastAsia="Calibri"/>
+          <w:b w:val="0"/>
+          <w:i w:val="0"/>
+          <w:sz w:val="22"/>
+        </w:rPr>
+        <w:t>Não repetir sem evidência: AI-900 como concluída; Community inflada; Swift como foco imediato.</w:t>
       </w:r>
     </w:p>
     <w:p>

</xml_diff>

<commit_message>
Reforçar Áreas de Impacto da Ana (PT + EN + bloco único)
Co-authored-by: Jonatas Andrade <jonatasandradedeveloper@users.noreply.github.com>
</commit_message>
<xml_diff>
--- a/DOCS-PEOPLE-LEAD/Ana-Karina/00-Documento-Unico.docx
+++ b/DOCS-PEOPLE-LEAD/Ana-Karina/00-Documento-Unico.docx
@@ -605,7 +605,21 @@
           <w:i w:val="0"/>
           <w:sz w:val="22"/>
         </w:rPr>
-        <w:t>17. Orientação do ciclo (Ana Karina)</w:t>
+        <w:t>17. Áreas de Impacto (Workday)</w:t>
+      </w:r>
+    </w:p>
+    <w:p>
+      <w:pPr>
+        <w:spacing w:after="120"/>
+      </w:pPr>
+      <w:r>
+        <w:rPr>
+          <w:rFonts w:ascii="Calibri" w:hAnsi="Calibri" w:eastAsia="Calibri"/>
+          <w:b w:val="0"/>
+          <w:i w:val="0"/>
+          <w:sz w:val="22"/>
+        </w:rPr>
+        <w:t>18. Orientação do ciclo (Ana Karina)</w:t>
       </w:r>
     </w:p>
     <w:p>
@@ -32302,7 +32316,297 @@
         <w:pStyle w:val="Heading1"/>
       </w:pPr>
       <w:r>
-        <w:t>17. Orientação do ciclo (Ana Karina)</w:t>
+        <w:t>17. Áreas de Impacto (Workday)</w:t>
+      </w:r>
+    </w:p>
+    <w:p>
+      <w:r>
+        <w:rPr>
+          <w:rFonts w:ascii="Calibri" w:hAnsi="Calibri" w:eastAsia="Calibri"/>
+          <w:b/>
+          <w:i w:val="0"/>
+          <w:sz w:val="22"/>
+        </w:rPr>
+        <w:t>People Lead · Jônatas · 10/09/2026</w:t>
+      </w:r>
+    </w:p>
+    <w:p>
+      <w:r>
+        <w:rPr>
+          <w:rFonts w:ascii="Calibri" w:hAnsi="Calibri" w:eastAsia="Calibri"/>
+          <w:b w:val="0"/>
+          <w:i w:val="0"/>
+          <w:sz w:val="22"/>
+        </w:rPr>
+        <w:t xml:space="preserve">O sistema mostrou: </w:t>
+      </w:r>
+      <w:r>
+        <w:rPr>
+          <w:rFonts w:ascii="Calibri" w:hAnsi="Calibri" w:eastAsia="Calibri"/>
+          <w:b w:val="0"/>
+          <w:i/>
+          <w:sz w:val="22"/>
+        </w:rPr>
+        <w:t>“User either does not have a priority in Client Value Creation or has no reflections”</w:t>
+      </w:r>
+      <w:r>
+        <w:rPr>
+          <w:rFonts w:ascii="Calibri" w:hAnsi="Calibri" w:eastAsia="Calibri"/>
+          <w:b w:val="0"/>
+          <w:i w:val="0"/>
+          <w:sz w:val="22"/>
+        </w:rPr>
+        <w:t xml:space="preserve"> → use o bloco </w:t>
+      </w:r>
+      <w:r>
+        <w:rPr>
+          <w:rFonts w:ascii="Calibri" w:hAnsi="Calibri" w:eastAsia="Calibri"/>
+          <w:b/>
+          <w:i w:val="0"/>
+          <w:sz w:val="22"/>
+        </w:rPr>
+        <w:t>1) Cliente</w:t>
+      </w:r>
+      <w:r>
+        <w:rPr>
+          <w:rFonts w:ascii="Calibri" w:hAnsi="Calibri" w:eastAsia="Calibri"/>
+          <w:b w:val="0"/>
+          <w:i w:val="0"/>
+          <w:sz w:val="22"/>
+        </w:rPr>
+        <w:t xml:space="preserve"> abaixo.</w:t>
+      </w:r>
+    </w:p>
+    <w:p>
+      <w:pPr>
+        <w:pBdr>
+          <w:bottom w:val="single" w:sz="6" w:space="1" w:color="CCCCCC"/>
+        </w:pBdr>
+      </w:pPr>
+    </w:p>
+    <w:p>
+      <w:pPr>
+        <w:pStyle w:val="Heading2"/>
+      </w:pPr>
+      <w:r>
+        <w:t>COPIAR — Português (4 áreas)</w:t>
+      </w:r>
+    </w:p>
+    <w:p>
+      <w:pPr>
+        <w:pStyle w:val="Heading3"/>
+      </w:pPr>
+      <w:r>
+        <w:t>1) Client Value Creation / Criação de Valor para o Cliente</w:t>
+      </w:r>
+    </w:p>
+    <w:p>
+      <w:r>
+        <w:rPr>
+          <w:rFonts w:ascii="Calibri" w:hAnsi="Calibri" w:eastAsia="Calibri"/>
+          <w:b w:val="0"/>
+          <w:i w:val="0"/>
+          <w:sz w:val="22"/>
+        </w:rPr>
+        <w:t>Ana Karina gerou valor no cliente BANCO BRADESCO no desenvolvimento do app nativo (Kotlin/Android), com evolução consistente nas entregas e na compreensão do produto, incluindo a transição de desenvolvimento para homologação. Os feedbacks de Rafael Coloda, Jessica e Celline confirmam desempenho alinhado ao nível Associate: qualidade das implementações, comunicação antecipada de riscos e colaboração no time. Ainda precisa de suporte em alguns temas — esperado para o momento de carreira — e o próximo ciclo deve ampliar autonomia em demandas de maior complexidade.</w:t>
+      </w:r>
+    </w:p>
+    <w:p>
+      <w:pPr>
+        <w:pStyle w:val="Heading3"/>
+      </w:pPr>
+      <w:r>
+        <w:t>2) AI Enablement / Habilitação de IA</w:t>
+      </w:r>
+    </w:p>
+    <w:p>
+      <w:r>
+        <w:rPr>
+          <w:rFonts w:ascii="Calibri" w:hAnsi="Calibri" w:eastAsia="Calibri"/>
+          <w:b w:val="0"/>
+          <w:i w:val="0"/>
+          <w:sz w:val="22"/>
+        </w:rPr>
+        <w:t>Ana Karina aplicou IA de forma prática no projeto Bradesco, com uso de Copilot (incluindo VS Code no cliente) e agentes derivados no fluxo do time (analytics e frontend), alinhado à habilitação de IA da prática. Concluiu a certificação AZ-900; a AI-900 formal permanece como trilha do próximo ciclo. Deve formalizar cases (problema → agente → efeito) para tornar o impacto mais visível e replicável.</w:t>
+      </w:r>
+    </w:p>
+    <w:p>
+      <w:pPr>
+        <w:pStyle w:val="Heading3"/>
+      </w:pPr>
+      <w:r>
+        <w:t>3) Great Place to Work for Reinventors / Ótimo Lugar</w:t>
+      </w:r>
+    </w:p>
+    <w:p>
+      <w:r>
+        <w:rPr>
+          <w:rFonts w:ascii="Calibri" w:hAnsi="Calibri" w:eastAsia="Calibri"/>
+          <w:b w:val="0"/>
+          <w:i w:val="0"/>
+          <w:sz w:val="22"/>
+        </w:rPr>
+        <w:t>Ana Karina contribui para um ambiente colaborativo e de aprendizado contínuo: curiosidade, abertura a feedbacks e boa interação com pares (reforçado por Celline e Jessica). Evoluiu o inglês de B2 para C1+ no goFluent e mantém engajamento nas 1:1 de carreira com o People Lead, com norte em arquitetura mobile. Ponto de evolução: disciplina no lançamento de horas no Jira, de forma autônoma e consistente.</w:t>
+      </w:r>
+    </w:p>
+    <w:p>
+      <w:pPr>
+        <w:pStyle w:val="Heading3"/>
+      </w:pPr>
+      <w:r>
+        <w:t>4) Community / Comunidade</w:t>
+      </w:r>
+    </w:p>
+    <w:p>
+      <w:r>
+        <w:rPr>
+          <w:rFonts w:ascii="Calibri" w:hAnsi="Calibri" w:eastAsia="Calibri"/>
+          <w:b w:val="0"/>
+          <w:i w:val="0"/>
+          <w:sz w:val="22"/>
+        </w:rPr>
+        <w:t>Neste FY, a prioridade de comunidade avançou de forma limitada diante da carga de faculdade presencial e da entrega no cliente Bradesco. Mantém intenção de impacto e colaboração; para o próximo ciclo, recomenda-se uma iniciativa objetiva (voluntariado ou compartilhamento de case técnico/IA na prática), compatível com a agenda.</w:t>
+      </w:r>
+    </w:p>
+    <w:p>
+      <w:pPr>
+        <w:pBdr>
+          <w:bottom w:val="single" w:sz="6" w:space="1" w:color="CCCCCC"/>
+        </w:pBdr>
+      </w:pPr>
+    </w:p>
+    <w:p>
+      <w:pPr>
+        <w:pStyle w:val="Heading2"/>
+      </w:pPr>
+      <w:r>
+        <w:t>COPIAR — English (se o campo estiver em inglês)</w:t>
+      </w:r>
+    </w:p>
+    <w:p>
+      <w:pPr>
+        <w:pStyle w:val="Heading3"/>
+      </w:pPr>
+      <w:r>
+        <w:t>1) Client Value Creation</w:t>
+      </w:r>
+    </w:p>
+    <w:p>
+      <w:r>
+        <w:rPr>
+          <w:rFonts w:ascii="Calibri" w:hAnsi="Calibri" w:eastAsia="Calibri"/>
+          <w:b w:val="0"/>
+          <w:i w:val="0"/>
+          <w:sz w:val="22"/>
+        </w:rPr>
+        <w:t>Ana Karina delivered client value at BANCO BRADESCO on the native mobile app (Kotlin/Android), with consistent progress in delivery quality and product understanding, including the move from development into homologation. Feedback from Rafael Coloda, Jessica, and Celline confirms performance aligned with Associate expectations: quality focus, early communication of risks, and strong collaboration. Some support is still needed on certain topics—expected at this career stage—and the next cycle should increase autonomy on more complex work.</w:t>
+      </w:r>
+    </w:p>
+    <w:p>
+      <w:pPr>
+        <w:pStyle w:val="Heading3"/>
+      </w:pPr>
+      <w:r>
+        <w:t>2) AI Enablement</w:t>
+      </w:r>
+    </w:p>
+    <w:p>
+      <w:r>
+        <w:rPr>
+          <w:rFonts w:ascii="Calibri" w:hAnsi="Calibri" w:eastAsia="Calibri"/>
+          <w:b w:val="0"/>
+          <w:i w:val="0"/>
+          <w:sz w:val="22"/>
+        </w:rPr>
+        <w:t>Ana Karina applied AI in day-to-day work at Bradesco through Copilot (including the client VS Code setup) and agent-based workflows (analytics and frontend), aligned with practice AI enablement. She completed AZ-900; formal AI-900 remains a next-cycle goal. Next step: document clear AI use cases (problem → agent → outcome) to make impact more visible and reusable.</w:t>
+      </w:r>
+    </w:p>
+    <w:p>
+      <w:pPr>
+        <w:pStyle w:val="Heading3"/>
+      </w:pPr>
+      <w:r>
+        <w:t>3) Great Place to Work for Reinventors</w:t>
+      </w:r>
+    </w:p>
+    <w:p>
+      <w:r>
+        <w:rPr>
+          <w:rFonts w:ascii="Calibri" w:hAnsi="Calibri" w:eastAsia="Calibri"/>
+          <w:b w:val="0"/>
+          <w:i w:val="0"/>
+          <w:sz w:val="22"/>
+        </w:rPr>
+        <w:t>Ana Karina contributes to a collaborative, learning-oriented environment: curiosity, openness to feedback, and positive peer interaction (reinforced by Celline and Jessica). She progressed English from B2 to C1+ on goFluent and engages consistently in career 1:1s with her People Lead, with a clear interest in mobile architecture. Growth area: consistent, autonomous Jira time logging without leadership follow-up.</w:t>
+      </w:r>
+    </w:p>
+    <w:p>
+      <w:pPr>
+        <w:pStyle w:val="Heading3"/>
+      </w:pPr>
+      <w:r>
+        <w:t>4) Community</w:t>
+      </w:r>
+    </w:p>
+    <w:p>
+      <w:r>
+        <w:rPr>
+          <w:rFonts w:ascii="Calibri" w:hAnsi="Calibri" w:eastAsia="Calibri"/>
+          <w:b w:val="0"/>
+          <w:i w:val="0"/>
+          <w:sz w:val="22"/>
+        </w:rPr>
+        <w:t>Community impact this FY was limited due to in-person university load plus client delivery at Bradesco. Intent remains; for the next cycle, pursue one concrete initiative (volunteering or sharing a technical/AI case with the practice) that fits her schedule—without overstating participation not evidenced in project feedback.</w:t>
+      </w:r>
+    </w:p>
+    <w:p>
+      <w:pPr>
+        <w:pBdr>
+          <w:bottom w:val="single" w:sz="6" w:space="1" w:color="CCCCCC"/>
+        </w:pBdr>
+      </w:pPr>
+    </w:p>
+    <w:p>
+      <w:pPr>
+        <w:pStyle w:val="Heading2"/>
+      </w:pPr>
+      <w:r>
+        <w:t>Se o Workday tiver UM único campo “Areas of Impact”</w:t>
+      </w:r>
+    </w:p>
+    <w:p>
+      <w:r>
+        <w:rPr>
+          <w:rFonts w:ascii="Calibri" w:hAnsi="Calibri" w:eastAsia="Calibri"/>
+          <w:b w:val="0"/>
+          <w:i w:val="0"/>
+          <w:sz w:val="22"/>
+        </w:rPr>
+        <w:t>Cole este bloco único:</w:t>
+      </w:r>
+    </w:p>
+    <w:p>
+      <w:r>
+        <w:rPr>
+          <w:rFonts w:ascii="Calibri" w:hAnsi="Calibri" w:eastAsia="Calibri"/>
+          <w:b w:val="0"/>
+          <w:i w:val="0"/>
+          <w:sz w:val="22"/>
+        </w:rPr>
+        <w:t>Areas of Impact — People Lead summary: (1) Client Value Creation — consistent delivery on BANCO BRADESCO native Android/Kotlin app through homologation; quality and risk communication confirmed by Rafael Coloda, Jessica, and Celline; next focus is greater autonomy on complex work. (2) AI Enablement — practical Copilot/agent usage on the project; AZ-900 completed; AI-900 formal planned next cycle; formalize AI cases. (3) Great Place to Work — collaborative, feedback-open, English B2→C1+; improve autonomous Jira time logging. (4) Community — limited advancement this FY due to university + client load; plan one concrete community/knowledge-sharing action next cycle.</w:t>
+      </w:r>
+    </w:p>
+    <w:p>
+      <w:r>
+        <w:br w:type="page"/>
+      </w:r>
+    </w:p>
+    <w:p>
+      <w:pPr>
+        <w:pStyle w:val="Heading1"/>
+      </w:pPr>
+      <w:r>
+        <w:t>18. Orientação do ciclo (Ana Karina)</w:t>
       </w:r>
     </w:p>
     <w:p>

</xml_diff>